<commit_message>
ZP-DOC-08 Test Summary Report 0.9: 1,053 executed cases from the 20-agent campaign, 13 findings, limits; README docs table and test counts
Co-Authored-By: Claude Opus 5.5 (1M context) <noreply@anthropic.com>
</commit_message>
<xml_diff>
--- a/docs/08-test-plan/ZP-DOC-08_Test-Plan.docx
+++ b/docs/08-test-plan/ZP-DOC-08_Test-Plan.docx
@@ -90,7 +90,7 @@
           <w:left w:w="10" w:type="dxa"/>
           <w:right w:w="10" w:type="dxa"/>
         </w:tblCellMar>
-        <w:tblLook w:val="0000" w:firstRow="0" w:lastRow="0" w:firstColumn="0" w:lastColumn="0" w:noHBand="0" w:noVBand="0"/>
+        <w:tblLook w:val="04A0" w:firstRow="1" w:lastRow="0" w:firstColumn="1" w:lastColumn="0" w:noHBand="0" w:noVBand="1"/>
       </w:tblPr>
       <w:tblGrid>
         <w:gridCol w:w="2600"/>
@@ -494,7 +494,7 @@
           <w:left w:w="10" w:type="dxa"/>
           <w:right w:w="10" w:type="dxa"/>
         </w:tblCellMar>
-        <w:tblLook w:val="0000" w:firstRow="0" w:lastRow="0" w:firstColumn="0" w:lastColumn="0" w:noHBand="0" w:noVBand="0"/>
+        <w:tblLook w:val="04A0" w:firstRow="1" w:lastRow="0" w:firstColumn="1" w:lastColumn="0" w:noHBand="0" w:noVBand="1"/>
       </w:tblPr>
       <w:tblGrid>
         <w:gridCol w:w="2600"/>
@@ -1189,7 +1189,7 @@
           <w:left w:w="10" w:type="dxa"/>
           <w:right w:w="10" w:type="dxa"/>
         </w:tblCellMar>
-        <w:tblLook w:val="0000" w:firstRow="0" w:lastRow="0" w:firstColumn="0" w:lastColumn="0" w:noHBand="0" w:noVBand="0"/>
+        <w:tblLook w:val="04A0" w:firstRow="1" w:lastRow="0" w:firstColumn="1" w:lastColumn="0" w:noHBand="0" w:noVBand="1"/>
       </w:tblPr>
       <w:tblGrid>
         <w:gridCol w:w="964"/>
@@ -1486,7 +1486,7 @@
           <w:left w:w="10" w:type="dxa"/>
           <w:right w:w="10" w:type="dxa"/>
         </w:tblCellMar>
-        <w:tblLook w:val="0000" w:firstRow="0" w:lastRow="0" w:firstColumn="0" w:lastColumn="0" w:noHBand="0" w:noVBand="0"/>
+        <w:tblLook w:val="04A0" w:firstRow="1" w:lastRow="0" w:firstColumn="1" w:lastColumn="0" w:noHBand="0" w:noVBand="1"/>
       </w:tblPr>
       <w:tblGrid>
         <w:gridCol w:w="2120"/>
@@ -1843,7 +1843,7 @@
     <w:sdt>
       <w:sdtPr>
         <w:alias w:val="Contents"/>
-        <w:id w:val="-2136635713"/>
+        <w:id w:val="2126584650"/>
       </w:sdtPr>
       <w:sdtEndPr/>
       <w:sdtContent>
@@ -1872,7 +1872,7 @@
           <w:r>
             <w:fldChar w:fldCharType="separate"/>
           </w:r>
-          <w:hyperlink w:anchor="_Toc242656299" w:history="1">
+          <w:hyperlink w:anchor="_Toc242659187" w:history="1">
             <w:r>
               <w:rPr>
                 <w:rStyle w:val="Hyperlink"/>
@@ -1896,7 +1896,7 @@
               <w:rPr>
                 <w:noProof/>
               </w:rPr>
-              <w:instrText xml:space="preserve"> PAGEREF _Toc242656299 \h </w:instrText>
+              <w:instrText xml:space="preserve"> PAGEREF _Toc242659187 \h </w:instrText>
             </w:r>
             <w:r>
               <w:rPr>
@@ -1939,7 +1939,7 @@
               <w14:ligatures w14:val="standardContextual"/>
             </w:rPr>
           </w:pPr>
-          <w:hyperlink w:anchor="_Toc242656300" w:history="1">
+          <w:hyperlink w:anchor="_Toc242659188" w:history="1">
             <w:r>
               <w:rPr>
                 <w:rStyle w:val="Hyperlink"/>
@@ -1963,7 +1963,7 @@
               <w:rPr>
                 <w:noProof/>
               </w:rPr>
-              <w:instrText xml:space="preserve"> PAGEREF _Toc242656300 \h </w:instrText>
+              <w:instrText xml:space="preserve"> PAGEREF _Toc242659188 \h </w:instrText>
             </w:r>
             <w:r>
               <w:rPr>
@@ -2006,7 +2006,7 @@
               <w14:ligatures w14:val="standardContextual"/>
             </w:rPr>
           </w:pPr>
-          <w:hyperlink w:anchor="_Toc242656301" w:history="1">
+          <w:hyperlink w:anchor="_Toc242659189" w:history="1">
             <w:r>
               <w:rPr>
                 <w:rStyle w:val="Hyperlink"/>
@@ -2030,7 +2030,7 @@
               <w:rPr>
                 <w:noProof/>
               </w:rPr>
-              <w:instrText xml:space="preserve"> PAGEREF _Toc242656301 \h </w:instrText>
+              <w:instrText xml:space="preserve"> PAGEREF _Toc242659189 \h </w:instrText>
             </w:r>
             <w:r>
               <w:rPr>
@@ -2073,7 +2073,7 @@
               <w14:ligatures w14:val="standardContextual"/>
             </w:rPr>
           </w:pPr>
-          <w:hyperlink w:anchor="_Toc242656302" w:history="1">
+          <w:hyperlink w:anchor="_Toc242659190" w:history="1">
             <w:r>
               <w:rPr>
                 <w:rStyle w:val="Hyperlink"/>
@@ -2097,7 +2097,7 @@
               <w:rPr>
                 <w:noProof/>
               </w:rPr>
-              <w:instrText xml:space="preserve"> PAGEREF _Toc242656302 \h </w:instrText>
+              <w:instrText xml:space="preserve"> PAGEREF _Toc242659190 \h </w:instrText>
             </w:r>
             <w:r>
               <w:rPr>
@@ -2140,7 +2140,7 @@
               <w14:ligatures w14:val="standardContextual"/>
             </w:rPr>
           </w:pPr>
-          <w:hyperlink w:anchor="_Toc242656303" w:history="1">
+          <w:hyperlink w:anchor="_Toc242659191" w:history="1">
             <w:r>
               <w:rPr>
                 <w:rStyle w:val="Hyperlink"/>
@@ -2164,7 +2164,7 @@
               <w:rPr>
                 <w:noProof/>
               </w:rPr>
-              <w:instrText xml:space="preserve"> PAGEREF _Toc242656303 \h </w:instrText>
+              <w:instrText xml:space="preserve"> PAGEREF _Toc242659191 \h </w:instrText>
             </w:r>
             <w:r>
               <w:rPr>
@@ -2207,7 +2207,7 @@
               <w14:ligatures w14:val="standardContextual"/>
             </w:rPr>
           </w:pPr>
-          <w:hyperlink w:anchor="_Toc242656304" w:history="1">
+          <w:hyperlink w:anchor="_Toc242659192" w:history="1">
             <w:r>
               <w:rPr>
                 <w:rStyle w:val="Hyperlink"/>
@@ -2231,7 +2231,7 @@
               <w:rPr>
                 <w:noProof/>
               </w:rPr>
-              <w:instrText xml:space="preserve"> PAGEREF _Toc242656304 \h </w:instrText>
+              <w:instrText xml:space="preserve"> PAGEREF _Toc242659192 \h </w:instrText>
             </w:r>
             <w:r>
               <w:rPr>
@@ -2274,7 +2274,7 @@
               <w14:ligatures w14:val="standardContextual"/>
             </w:rPr>
           </w:pPr>
-          <w:hyperlink w:anchor="_Toc242656305" w:history="1">
+          <w:hyperlink w:anchor="_Toc242659193" w:history="1">
             <w:r>
               <w:rPr>
                 <w:rStyle w:val="Hyperlink"/>
@@ -2298,7 +2298,7 @@
               <w:rPr>
                 <w:noProof/>
               </w:rPr>
-              <w:instrText xml:space="preserve"> PAGEREF _Toc242656305 \h </w:instrText>
+              <w:instrText xml:space="preserve"> PAGEREF _Toc242659193 \h </w:instrText>
             </w:r>
             <w:r>
               <w:rPr>
@@ -2341,7 +2341,7 @@
               <w14:ligatures w14:val="standardContextual"/>
             </w:rPr>
           </w:pPr>
-          <w:hyperlink w:anchor="_Toc242656306" w:history="1">
+          <w:hyperlink w:anchor="_Toc242659194" w:history="1">
             <w:r>
               <w:rPr>
                 <w:rStyle w:val="Hyperlink"/>
@@ -2365,7 +2365,7 @@
               <w:rPr>
                 <w:noProof/>
               </w:rPr>
-              <w:instrText xml:space="preserve"> PAGEREF _Toc242656306 \h </w:instrText>
+              <w:instrText xml:space="preserve"> PAGEREF _Toc242659194 \h </w:instrText>
             </w:r>
             <w:r>
               <w:rPr>
@@ -2408,7 +2408,7 @@
               <w14:ligatures w14:val="standardContextual"/>
             </w:rPr>
           </w:pPr>
-          <w:hyperlink w:anchor="_Toc242656307" w:history="1">
+          <w:hyperlink w:anchor="_Toc242659195" w:history="1">
             <w:r>
               <w:rPr>
                 <w:rStyle w:val="Hyperlink"/>
@@ -2432,7 +2432,7 @@
               <w:rPr>
                 <w:noProof/>
               </w:rPr>
-              <w:instrText xml:space="preserve"> PAGEREF _Toc242656307 \h </w:instrText>
+              <w:instrText xml:space="preserve"> PAGEREF _Toc242659195 \h </w:instrText>
             </w:r>
             <w:r>
               <w:rPr>
@@ -2475,7 +2475,7 @@
               <w14:ligatures w14:val="standardContextual"/>
             </w:rPr>
           </w:pPr>
-          <w:hyperlink w:anchor="_Toc242656308" w:history="1">
+          <w:hyperlink w:anchor="_Toc242659196" w:history="1">
             <w:r>
               <w:rPr>
                 <w:rStyle w:val="Hyperlink"/>
@@ -2499,7 +2499,7 @@
               <w:rPr>
                 <w:noProof/>
               </w:rPr>
-              <w:instrText xml:space="preserve"> PAGEREF _Toc242656308 \h </w:instrText>
+              <w:instrText xml:space="preserve"> PAGEREF _Toc242659196 \h </w:instrText>
             </w:r>
             <w:r>
               <w:rPr>
@@ -2542,7 +2542,7 @@
               <w14:ligatures w14:val="standardContextual"/>
             </w:rPr>
           </w:pPr>
-          <w:hyperlink w:anchor="_Toc242656309" w:history="1">
+          <w:hyperlink w:anchor="_Toc242659197" w:history="1">
             <w:r>
               <w:rPr>
                 <w:rStyle w:val="Hyperlink"/>
@@ -2566,7 +2566,7 @@
               <w:rPr>
                 <w:noProof/>
               </w:rPr>
-              <w:instrText xml:space="preserve"> PAGEREF _Toc242656309 \h </w:instrText>
+              <w:instrText xml:space="preserve"> PAGEREF _Toc242659197 \h </w:instrText>
             </w:r>
             <w:r>
               <w:rPr>
@@ -2609,7 +2609,7 @@
               <w14:ligatures w14:val="standardContextual"/>
             </w:rPr>
           </w:pPr>
-          <w:hyperlink w:anchor="_Toc242656310" w:history="1">
+          <w:hyperlink w:anchor="_Toc242659198" w:history="1">
             <w:r>
               <w:rPr>
                 <w:rStyle w:val="Hyperlink"/>
@@ -2633,7 +2633,7 @@
               <w:rPr>
                 <w:noProof/>
               </w:rPr>
-              <w:instrText xml:space="preserve"> PAGEREF _Toc242656310 \h </w:instrText>
+              <w:instrText xml:space="preserve"> PAGEREF _Toc242659198 \h </w:instrText>
             </w:r>
             <w:r>
               <w:rPr>
@@ -2676,7 +2676,7 @@
               <w14:ligatures w14:val="standardContextual"/>
             </w:rPr>
           </w:pPr>
-          <w:hyperlink w:anchor="_Toc242656311" w:history="1">
+          <w:hyperlink w:anchor="_Toc242659199" w:history="1">
             <w:r>
               <w:rPr>
                 <w:rStyle w:val="Hyperlink"/>
@@ -2700,7 +2700,7 @@
               <w:rPr>
                 <w:noProof/>
               </w:rPr>
-              <w:instrText xml:space="preserve"> PAGEREF _Toc242656311 \h </w:instrText>
+              <w:instrText xml:space="preserve"> PAGEREF _Toc242659199 \h </w:instrText>
             </w:r>
             <w:r>
               <w:rPr>
@@ -2743,7 +2743,7 @@
               <w14:ligatures w14:val="standardContextual"/>
             </w:rPr>
           </w:pPr>
-          <w:hyperlink w:anchor="_Toc242656312" w:history="1">
+          <w:hyperlink w:anchor="_Toc242659200" w:history="1">
             <w:r>
               <w:rPr>
                 <w:rStyle w:val="Hyperlink"/>
@@ -2767,7 +2767,7 @@
               <w:rPr>
                 <w:noProof/>
               </w:rPr>
-              <w:instrText xml:space="preserve"> PAGEREF _Toc242656312 \h </w:instrText>
+              <w:instrText xml:space="preserve"> PAGEREF _Toc242659200 \h </w:instrText>
             </w:r>
             <w:r>
               <w:rPr>
@@ -2810,7 +2810,7 @@
               <w14:ligatures w14:val="standardContextual"/>
             </w:rPr>
           </w:pPr>
-          <w:hyperlink w:anchor="_Toc242656313" w:history="1">
+          <w:hyperlink w:anchor="_Toc242659201" w:history="1">
             <w:r>
               <w:rPr>
                 <w:rStyle w:val="Hyperlink"/>
@@ -2834,7 +2834,7 @@
               <w:rPr>
                 <w:noProof/>
               </w:rPr>
-              <w:instrText xml:space="preserve"> PAGEREF _Toc242656313 \h </w:instrText>
+              <w:instrText xml:space="preserve"> PAGEREF _Toc242659201 \h </w:instrText>
             </w:r>
             <w:r>
               <w:rPr>
@@ -2877,7 +2877,7 @@
               <w14:ligatures w14:val="standardContextual"/>
             </w:rPr>
           </w:pPr>
-          <w:hyperlink w:anchor="_Toc242656314" w:history="1">
+          <w:hyperlink w:anchor="_Toc242659202" w:history="1">
             <w:r>
               <w:rPr>
                 <w:rStyle w:val="Hyperlink"/>
@@ -2901,7 +2901,7 @@
               <w:rPr>
                 <w:noProof/>
               </w:rPr>
-              <w:instrText xml:space="preserve"> PAGEREF _Toc242656314 \h </w:instrText>
+              <w:instrText xml:space="preserve"> PAGEREF _Toc242659202 \h </w:instrText>
             </w:r>
             <w:r>
               <w:rPr>
@@ -2944,7 +2944,7 @@
               <w14:ligatures w14:val="standardContextual"/>
             </w:rPr>
           </w:pPr>
-          <w:hyperlink w:anchor="_Toc242656315" w:history="1">
+          <w:hyperlink w:anchor="_Toc242659203" w:history="1">
             <w:r>
               <w:rPr>
                 <w:rStyle w:val="Hyperlink"/>
@@ -2968,7 +2968,7 @@
               <w:rPr>
                 <w:noProof/>
               </w:rPr>
-              <w:instrText xml:space="preserve"> PAGEREF _Toc242656315 \h </w:instrText>
+              <w:instrText xml:space="preserve"> PAGEREF _Toc242659203 \h </w:instrText>
             </w:r>
             <w:r>
               <w:rPr>
@@ -3011,7 +3011,7 @@
               <w14:ligatures w14:val="standardContextual"/>
             </w:rPr>
           </w:pPr>
-          <w:hyperlink w:anchor="_Toc242656316" w:history="1">
+          <w:hyperlink w:anchor="_Toc242659204" w:history="1">
             <w:r>
               <w:rPr>
                 <w:rStyle w:val="Hyperlink"/>
@@ -3035,7 +3035,7 @@
               <w:rPr>
                 <w:noProof/>
               </w:rPr>
-              <w:instrText xml:space="preserve"> PAGEREF _Toc242656316 \h </w:instrText>
+              <w:instrText xml:space="preserve"> PAGEREF _Toc242659204 \h </w:instrText>
             </w:r>
             <w:r>
               <w:rPr>
@@ -3078,7 +3078,7 @@
               <w14:ligatures w14:val="standardContextual"/>
             </w:rPr>
           </w:pPr>
-          <w:hyperlink w:anchor="_Toc242656317" w:history="1">
+          <w:hyperlink w:anchor="_Toc242659205" w:history="1">
             <w:r>
               <w:rPr>
                 <w:rStyle w:val="Hyperlink"/>
@@ -3102,7 +3102,7 @@
               <w:rPr>
                 <w:noProof/>
               </w:rPr>
-              <w:instrText xml:space="preserve"> PAGEREF _Toc242656317 \h </w:instrText>
+              <w:instrText xml:space="preserve"> PAGEREF _Toc242659205 \h </w:instrText>
             </w:r>
             <w:r>
               <w:rPr>
@@ -3145,7 +3145,7 @@
               <w14:ligatures w14:val="standardContextual"/>
             </w:rPr>
           </w:pPr>
-          <w:hyperlink w:anchor="_Toc242656318" w:history="1">
+          <w:hyperlink w:anchor="_Toc242659206" w:history="1">
             <w:r>
               <w:rPr>
                 <w:rStyle w:val="Hyperlink"/>
@@ -3169,7 +3169,7 @@
               <w:rPr>
                 <w:noProof/>
               </w:rPr>
-              <w:instrText xml:space="preserve"> PAGEREF _Toc242656318 \h </w:instrText>
+              <w:instrText xml:space="preserve"> PAGEREF _Toc242659206 \h </w:instrText>
             </w:r>
             <w:r>
               <w:rPr>
@@ -3212,7 +3212,7 @@
               <w14:ligatures w14:val="standardContextual"/>
             </w:rPr>
           </w:pPr>
-          <w:hyperlink w:anchor="_Toc242656319" w:history="1">
+          <w:hyperlink w:anchor="_Toc242659207" w:history="1">
             <w:r>
               <w:rPr>
                 <w:rStyle w:val="Hyperlink"/>
@@ -3236,7 +3236,7 @@
               <w:rPr>
                 <w:noProof/>
               </w:rPr>
-              <w:instrText xml:space="preserve"> PAGEREF _Toc242656319 \h </w:instrText>
+              <w:instrText xml:space="preserve"> PAGEREF _Toc242659207 \h </w:instrText>
             </w:r>
             <w:r>
               <w:rPr>
@@ -3279,7 +3279,7 @@
               <w14:ligatures w14:val="standardContextual"/>
             </w:rPr>
           </w:pPr>
-          <w:hyperlink w:anchor="_Toc242656320" w:history="1">
+          <w:hyperlink w:anchor="_Toc242659208" w:history="1">
             <w:r>
               <w:rPr>
                 <w:rStyle w:val="Hyperlink"/>
@@ -3303,7 +3303,7 @@
               <w:rPr>
                 <w:noProof/>
               </w:rPr>
-              <w:instrText xml:space="preserve"> PAGEREF _Toc242656320 \h </w:instrText>
+              <w:instrText xml:space="preserve"> PAGEREF _Toc242659208 \h </w:instrText>
             </w:r>
             <w:r>
               <w:rPr>
@@ -3346,7 +3346,7 @@
               <w14:ligatures w14:val="standardContextual"/>
             </w:rPr>
           </w:pPr>
-          <w:hyperlink w:anchor="_Toc242656321" w:history="1">
+          <w:hyperlink w:anchor="_Toc242659209" w:history="1">
             <w:r>
               <w:rPr>
                 <w:rStyle w:val="Hyperlink"/>
@@ -3370,7 +3370,7 @@
               <w:rPr>
                 <w:noProof/>
               </w:rPr>
-              <w:instrText xml:space="preserve"> PAGEREF _Toc242656321 \h </w:instrText>
+              <w:instrText xml:space="preserve"> PAGEREF _Toc242659209 \h </w:instrText>
             </w:r>
             <w:r>
               <w:rPr>
@@ -3416,7 +3416,7 @@
     <w:sdt>
       <w:sdtPr>
         <w:alias w:val="Tables"/>
-        <w:id w:val="-1428499946"/>
+        <w:id w:val="1000313425"/>
       </w:sdtPr>
       <w:sdtEndPr/>
       <w:sdtContent>
@@ -3445,7 +3445,7 @@
           <w:r>
             <w:fldChar w:fldCharType="separate"/>
           </w:r>
-          <w:hyperlink w:anchor="_Toc242656322" w:history="1">
+          <w:hyperlink w:anchor="_Toc242659210" w:history="1">
             <w:r>
               <w:rPr>
                 <w:rStyle w:val="Hyperlink"/>
@@ -3469,7 +3469,7 @@
               <w:rPr>
                 <w:noProof/>
               </w:rPr>
-              <w:instrText xml:space="preserve"> PAGEREF _Toc242656322 \h </w:instrText>
+              <w:instrText xml:space="preserve"> PAGEREF _Toc242659210 \h </w:instrText>
             </w:r>
             <w:r>
               <w:rPr>
@@ -3512,7 +3512,7 @@
               <w14:ligatures w14:val="standardContextual"/>
             </w:rPr>
           </w:pPr>
-          <w:hyperlink w:anchor="_Toc242656323" w:history="1">
+          <w:hyperlink w:anchor="_Toc242659211" w:history="1">
             <w:r>
               <w:rPr>
                 <w:rStyle w:val="Hyperlink"/>
@@ -3536,7 +3536,7 @@
               <w:rPr>
                 <w:noProof/>
               </w:rPr>
-              <w:instrText xml:space="preserve"> PAGEREF _Toc242656323 \h </w:instrText>
+              <w:instrText xml:space="preserve"> PAGEREF _Toc242659211 \h </w:instrText>
             </w:r>
             <w:r>
               <w:rPr>
@@ -3579,7 +3579,7 @@
               <w14:ligatures w14:val="standardContextual"/>
             </w:rPr>
           </w:pPr>
-          <w:hyperlink w:anchor="_Toc242656324" w:history="1">
+          <w:hyperlink w:anchor="_Toc242659212" w:history="1">
             <w:r>
               <w:rPr>
                 <w:rStyle w:val="Hyperlink"/>
@@ -3603,7 +3603,7 @@
               <w:rPr>
                 <w:noProof/>
               </w:rPr>
-              <w:instrText xml:space="preserve"> PAGEREF _Toc242656324 \h </w:instrText>
+              <w:instrText xml:space="preserve"> PAGEREF _Toc242659212 \h </w:instrText>
             </w:r>
             <w:r>
               <w:rPr>
@@ -3646,7 +3646,7 @@
               <w14:ligatures w14:val="standardContextual"/>
             </w:rPr>
           </w:pPr>
-          <w:hyperlink w:anchor="_Toc242656325" w:history="1">
+          <w:hyperlink w:anchor="_Toc242659213" w:history="1">
             <w:r>
               <w:rPr>
                 <w:rStyle w:val="Hyperlink"/>
@@ -3670,7 +3670,7 @@
               <w:rPr>
                 <w:noProof/>
               </w:rPr>
-              <w:instrText xml:space="preserve"> PAGEREF _Toc242656325 \h </w:instrText>
+              <w:instrText xml:space="preserve"> PAGEREF _Toc242659213 \h </w:instrText>
             </w:r>
             <w:r>
               <w:rPr>
@@ -3713,7 +3713,7 @@
               <w14:ligatures w14:val="standardContextual"/>
             </w:rPr>
           </w:pPr>
-          <w:hyperlink w:anchor="_Toc242656326" w:history="1">
+          <w:hyperlink w:anchor="_Toc242659214" w:history="1">
             <w:r>
               <w:rPr>
                 <w:rStyle w:val="Hyperlink"/>
@@ -3737,7 +3737,7 @@
               <w:rPr>
                 <w:noProof/>
               </w:rPr>
-              <w:instrText xml:space="preserve"> PAGEREF _Toc242656326 \h </w:instrText>
+              <w:instrText xml:space="preserve"> PAGEREF _Toc242659214 \h </w:instrText>
             </w:r>
             <w:r>
               <w:rPr>
@@ -3780,7 +3780,7 @@
               <w14:ligatures w14:val="standardContextual"/>
             </w:rPr>
           </w:pPr>
-          <w:hyperlink w:anchor="_Toc242656327" w:history="1">
+          <w:hyperlink w:anchor="_Toc242659215" w:history="1">
             <w:r>
               <w:rPr>
                 <w:rStyle w:val="Hyperlink"/>
@@ -3804,7 +3804,7 @@
               <w:rPr>
                 <w:noProof/>
               </w:rPr>
-              <w:instrText xml:space="preserve"> PAGEREF _Toc242656327 \h </w:instrText>
+              <w:instrText xml:space="preserve"> PAGEREF _Toc242659215 \h </w:instrText>
             </w:r>
             <w:r>
               <w:rPr>
@@ -3847,7 +3847,7 @@
               <w14:ligatures w14:val="standardContextual"/>
             </w:rPr>
           </w:pPr>
-          <w:hyperlink w:anchor="_Toc242656328" w:history="1">
+          <w:hyperlink w:anchor="_Toc242659216" w:history="1">
             <w:r>
               <w:rPr>
                 <w:rStyle w:val="Hyperlink"/>
@@ -3871,7 +3871,7 @@
               <w:rPr>
                 <w:noProof/>
               </w:rPr>
-              <w:instrText xml:space="preserve"> PAGEREF _Toc242656328 \h </w:instrText>
+              <w:instrText xml:space="preserve"> PAGEREF _Toc242659216 \h </w:instrText>
             </w:r>
             <w:r>
               <w:rPr>
@@ -3914,7 +3914,7 @@
               <w14:ligatures w14:val="standardContextual"/>
             </w:rPr>
           </w:pPr>
-          <w:hyperlink w:anchor="_Toc242656329" w:history="1">
+          <w:hyperlink w:anchor="_Toc242659217" w:history="1">
             <w:r>
               <w:rPr>
                 <w:rStyle w:val="Hyperlink"/>
@@ -3938,7 +3938,7 @@
               <w:rPr>
                 <w:noProof/>
               </w:rPr>
-              <w:instrText xml:space="preserve"> PAGEREF _Toc242656329 \h </w:instrText>
+              <w:instrText xml:space="preserve"> PAGEREF _Toc242659217 \h </w:instrText>
             </w:r>
             <w:r>
               <w:rPr>
@@ -3981,7 +3981,7 @@
               <w14:ligatures w14:val="standardContextual"/>
             </w:rPr>
           </w:pPr>
-          <w:hyperlink w:anchor="_Toc242656330" w:history="1">
+          <w:hyperlink w:anchor="_Toc242659218" w:history="1">
             <w:r>
               <w:rPr>
                 <w:rStyle w:val="Hyperlink"/>
@@ -4005,7 +4005,7 @@
               <w:rPr>
                 <w:noProof/>
               </w:rPr>
-              <w:instrText xml:space="preserve"> PAGEREF _Toc242656330 \h </w:instrText>
+              <w:instrText xml:space="preserve"> PAGEREF _Toc242659218 \h </w:instrText>
             </w:r>
             <w:r>
               <w:rPr>
@@ -4048,7 +4048,7 @@
               <w14:ligatures w14:val="standardContextual"/>
             </w:rPr>
           </w:pPr>
-          <w:hyperlink w:anchor="_Toc242656331" w:history="1">
+          <w:hyperlink w:anchor="_Toc242659219" w:history="1">
             <w:r>
               <w:rPr>
                 <w:rStyle w:val="Hyperlink"/>
@@ -4072,7 +4072,7 @@
               <w:rPr>
                 <w:noProof/>
               </w:rPr>
-              <w:instrText xml:space="preserve"> PAGEREF _Toc242656331 \h </w:instrText>
+              <w:instrText xml:space="preserve"> PAGEREF _Toc242659219 \h </w:instrText>
             </w:r>
             <w:r>
               <w:rPr>
@@ -4115,7 +4115,7 @@
               <w14:ligatures w14:val="standardContextual"/>
             </w:rPr>
           </w:pPr>
-          <w:hyperlink w:anchor="_Toc242656332" w:history="1">
+          <w:hyperlink w:anchor="_Toc242659220" w:history="1">
             <w:r>
               <w:rPr>
                 <w:rStyle w:val="Hyperlink"/>
@@ -4139,7 +4139,7 @@
               <w:rPr>
                 <w:noProof/>
               </w:rPr>
-              <w:instrText xml:space="preserve"> PAGEREF _Toc242656332 \h </w:instrText>
+              <w:instrText xml:space="preserve"> PAGEREF _Toc242659220 \h </w:instrText>
             </w:r>
             <w:r>
               <w:rPr>
@@ -4182,7 +4182,7 @@
               <w14:ligatures w14:val="standardContextual"/>
             </w:rPr>
           </w:pPr>
-          <w:hyperlink w:anchor="_Toc242656333" w:history="1">
+          <w:hyperlink w:anchor="_Toc242659221" w:history="1">
             <w:r>
               <w:rPr>
                 <w:rStyle w:val="Hyperlink"/>
@@ -4206,7 +4206,7 @@
               <w:rPr>
                 <w:noProof/>
               </w:rPr>
-              <w:instrText xml:space="preserve"> PAGEREF _Toc242656333 \h </w:instrText>
+              <w:instrText xml:space="preserve"> PAGEREF _Toc242659221 \h </w:instrText>
             </w:r>
             <w:r>
               <w:rPr>
@@ -4249,7 +4249,7 @@
               <w14:ligatures w14:val="standardContextual"/>
             </w:rPr>
           </w:pPr>
-          <w:hyperlink w:anchor="_Toc242656334" w:history="1">
+          <w:hyperlink w:anchor="_Toc242659222" w:history="1">
             <w:r>
               <w:rPr>
                 <w:rStyle w:val="Hyperlink"/>
@@ -4273,7 +4273,7 @@
               <w:rPr>
                 <w:noProof/>
               </w:rPr>
-              <w:instrText xml:space="preserve"> PAGEREF _Toc242656334 \h </w:instrText>
+              <w:instrText xml:space="preserve"> PAGEREF _Toc242659222 \h </w:instrText>
             </w:r>
             <w:r>
               <w:rPr>
@@ -4315,7 +4315,7 @@
         <w:keepLines/>
         <w:pageBreakBefore/>
       </w:pPr>
-      <w:bookmarkStart w:id="0" w:name="_Toc242656299"/>
+      <w:bookmarkStart w:id="0" w:name="_Toc242659187"/>
       <w:r>
         <w:lastRenderedPageBreak/>
         <w:t>1 Introduction</w:t>
@@ -4328,7 +4328,7 @@
         <w:keepNext/>
         <w:keepLines/>
       </w:pPr>
-      <w:bookmarkStart w:id="1" w:name="_Toc242656300"/>
+      <w:bookmarkStart w:id="1" w:name="_Toc242659188"/>
       <w:r>
         <w:t>1.1 Purpose</w:t>
       </w:r>
@@ -4351,7 +4351,7 @@
         <w:keepNext/>
         <w:keepLines/>
       </w:pPr>
-      <w:bookmarkStart w:id="2" w:name="_Toc242656301"/>
+      <w:bookmarkStart w:id="2" w:name="_Toc242659189"/>
       <w:r>
         <w:t>1.2 Scope</w:t>
       </w:r>
@@ -4374,7 +4374,7 @@
         <w:keepNext/>
         <w:keepLines/>
       </w:pPr>
-      <w:bookmarkStart w:id="3" w:name="_Toc242656302"/>
+      <w:bookmarkStart w:id="3" w:name="_Toc242659190"/>
       <w:r>
         <w:t>1.3 Intended audience</w:t>
       </w:r>
@@ -4394,7 +4394,7 @@
         <w:keepNext/>
         <w:keepLines/>
       </w:pPr>
-      <w:bookmarkStart w:id="4" w:name="_Toc242656303"/>
+      <w:bookmarkStart w:id="4" w:name="_Toc242659191"/>
       <w:r>
         <w:t>1.4 Relationship to other documents</w:t>
       </w:r>
@@ -4405,7 +4405,7 @@
         <w:pStyle w:val="Caption"/>
         <w:keepNext/>
       </w:pPr>
-      <w:bookmarkStart w:id="5" w:name="_Toc242656322"/>
+      <w:bookmarkStart w:id="5" w:name="_Toc242659210"/>
       <w:r>
         <w:t xml:space="preserve">Table </w:t>
       </w:r>
@@ -4447,7 +4447,7 @@
           <w:left w:w="10" w:type="dxa"/>
           <w:right w:w="10" w:type="dxa"/>
         </w:tblCellMar>
-        <w:tblLook w:val="0000" w:firstRow="0" w:lastRow="0" w:firstColumn="0" w:lastColumn="0" w:noHBand="0" w:noVBand="0"/>
+        <w:tblLook w:val="04A0" w:firstRow="1" w:lastRow="0" w:firstColumn="1" w:lastColumn="0" w:noHBand="0" w:noVBand="1"/>
       </w:tblPr>
       <w:tblGrid>
         <w:gridCol w:w="3327"/>
@@ -4923,7 +4923,7 @@
         <w:keepLines/>
         <w:pageBreakBefore/>
       </w:pPr>
-      <w:bookmarkStart w:id="6" w:name="_Toc242656304"/>
+      <w:bookmarkStart w:id="6" w:name="_Toc242659192"/>
       <w:r>
         <w:lastRenderedPageBreak/>
         <w:t>2 Test strategy</w:t>
@@ -4936,7 +4936,7 @@
         <w:keepNext/>
         <w:keepLines/>
       </w:pPr>
-      <w:bookmarkStart w:id="7" w:name="_Toc242656305"/>
+      <w:bookmarkStart w:id="7" w:name="_Toc242659193"/>
       <w:r>
         <w:t>2.1 Test levels</w:t>
       </w:r>
@@ -4947,7 +4947,7 @@
         <w:pStyle w:val="Caption"/>
         <w:keepNext/>
       </w:pPr>
-      <w:bookmarkStart w:id="8" w:name="_Toc242656323"/>
+      <w:bookmarkStart w:id="8" w:name="_Toc242659211"/>
       <w:r>
         <w:t xml:space="preserve">Table </w:t>
       </w:r>
@@ -4989,7 +4989,7 @@
           <w:left w:w="10" w:type="dxa"/>
           <w:right w:w="10" w:type="dxa"/>
         </w:tblCellMar>
-        <w:tblLook w:val="0000" w:firstRow="0" w:lastRow="0" w:firstColumn="0" w:lastColumn="0" w:noHBand="0" w:noVBand="0"/>
+        <w:tblLook w:val="04A0" w:firstRow="1" w:lastRow="0" w:firstColumn="1" w:lastColumn="0" w:noHBand="0" w:noVBand="1"/>
       </w:tblPr>
       <w:tblGrid>
         <w:gridCol w:w="1967"/>
@@ -6189,7 +6189,7 @@
         <w:keepNext/>
         <w:keepLines/>
       </w:pPr>
-      <w:bookmarkStart w:id="9" w:name="_Toc242656306"/>
+      <w:bookmarkStart w:id="9" w:name="_Toc242659194"/>
       <w:r>
         <w:t>2.2 Test types</w:t>
       </w:r>
@@ -6200,7 +6200,7 @@
         <w:pStyle w:val="Caption"/>
         <w:keepNext/>
       </w:pPr>
-      <w:bookmarkStart w:id="10" w:name="_Toc242656324"/>
+      <w:bookmarkStart w:id="10" w:name="_Toc242659212"/>
       <w:r>
         <w:t xml:space="preserve">Table </w:t>
       </w:r>
@@ -6242,7 +6242,7 @@
           <w:left w:w="10" w:type="dxa"/>
           <w:right w:w="10" w:type="dxa"/>
         </w:tblCellMar>
-        <w:tblLook w:val="0000" w:firstRow="0" w:lastRow="0" w:firstColumn="0" w:lastColumn="0" w:noHBand="0" w:noVBand="0"/>
+        <w:tblLook w:val="04A0" w:firstRow="1" w:lastRow="0" w:firstColumn="1" w:lastColumn="0" w:noHBand="0" w:noVBand="1"/>
       </w:tblPr>
       <w:tblGrid>
         <w:gridCol w:w="3173"/>
@@ -6988,7 +6988,7 @@
         <w:keepNext/>
         <w:keepLines/>
       </w:pPr>
-      <w:bookmarkStart w:id="11" w:name="_Toc242656307"/>
+      <w:bookmarkStart w:id="11" w:name="_Toc242659195"/>
       <w:r>
         <w:t>2.3 Approach</w:t>
       </w:r>
@@ -7024,7 +7024,7 @@
         <w:keepLines/>
         <w:pageBreakBefore/>
       </w:pPr>
-      <w:bookmarkStart w:id="12" w:name="_Toc242656308"/>
+      <w:bookmarkStart w:id="12" w:name="_Toc242659196"/>
       <w:r>
         <w:lastRenderedPageBreak/>
         <w:t>3 Test environment</w:t>
@@ -7036,7 +7036,7 @@
         <w:pStyle w:val="Caption"/>
         <w:keepNext/>
       </w:pPr>
-      <w:bookmarkStart w:id="13" w:name="_Toc242656325"/>
+      <w:bookmarkStart w:id="13" w:name="_Toc242659213"/>
       <w:r>
         <w:t xml:space="preserve">Table </w:t>
       </w:r>
@@ -7078,7 +7078,7 @@
           <w:left w:w="10" w:type="dxa"/>
           <w:right w:w="10" w:type="dxa"/>
         </w:tblCellMar>
-        <w:tblLook w:val="0000" w:firstRow="0" w:lastRow="0" w:firstColumn="0" w:lastColumn="0" w:noHBand="0" w:noVBand="0"/>
+        <w:tblLook w:val="04A0" w:firstRow="1" w:lastRow="0" w:firstColumn="1" w:lastColumn="0" w:noHBand="0" w:noVBand="1"/>
       </w:tblPr>
       <w:tblGrid>
         <w:gridCol w:w="2276"/>
@@ -7699,7 +7699,7 @@
         <w:keepLines/>
         <w:pageBreakBefore/>
       </w:pPr>
-      <w:bookmarkStart w:id="14" w:name="_Toc242656309"/>
+      <w:bookmarkStart w:id="14" w:name="_Toc242659197"/>
       <w:r>
         <w:lastRenderedPageBreak/>
         <w:t>4 </w:t>
@@ -7715,7 +7715,7 @@
         <w:keepNext/>
         <w:keepLines/>
       </w:pPr>
-      <w:bookmarkStart w:id="15" w:name="_Toc242656310"/>
+      <w:bookmarkStart w:id="15" w:name="_Toc242659198"/>
       <w:r>
         <w:t>4.1 Entry criteria</w:t>
       </w:r>
@@ -7735,7 +7735,7 @@
         <w:keepNext/>
         <w:keepLines/>
       </w:pPr>
-      <w:bookmarkStart w:id="16" w:name="_Toc242656311"/>
+      <w:bookmarkStart w:id="16" w:name="_Toc242659199"/>
       <w:r>
         <w:t>4.2 Exit criteria (Definition of Done)</w:t>
       </w:r>
@@ -7943,7 +7943,7 @@
         <w:keepNext/>
         <w:keepLines/>
       </w:pPr>
-      <w:bookmarkStart w:id="17" w:name="_Toc242656312"/>
+      <w:bookmarkStart w:id="17" w:name="_Toc242659200"/>
       <w:r>
         <w:t>4.3 Suspension and resumption</w:t>
       </w:r>
@@ -7967,7 +7967,7 @@
         <w:keepLines/>
         <w:pageBreakBefore/>
       </w:pPr>
-      <w:bookmarkStart w:id="18" w:name="_Toc242656313"/>
+      <w:bookmarkStart w:id="18" w:name="_Toc242659201"/>
       <w:r>
         <w:lastRenderedPageBreak/>
         <w:t>5 Test items and features</w:t>
@@ -7979,7 +7979,7 @@
         <w:pStyle w:val="Caption"/>
         <w:keepNext/>
       </w:pPr>
-      <w:bookmarkStart w:id="19" w:name="_Toc242656326"/>
+      <w:bookmarkStart w:id="19" w:name="_Toc242659214"/>
       <w:r>
         <w:t xml:space="preserve">Table </w:t>
       </w:r>
@@ -8021,7 +8021,7 @@
           <w:left w:w="10" w:type="dxa"/>
           <w:right w:w="10" w:type="dxa"/>
         </w:tblCellMar>
-        <w:tblLook w:val="0000" w:firstRow="0" w:lastRow="0" w:firstColumn="0" w:lastColumn="0" w:noHBand="0" w:noVBand="0"/>
+        <w:tblLook w:val="04A0" w:firstRow="1" w:lastRow="0" w:firstColumn="1" w:lastColumn="0" w:noHBand="0" w:noVBand="1"/>
       </w:tblPr>
       <w:tblGrid>
         <w:gridCol w:w="2038"/>
@@ -9705,7 +9705,7 @@
         <w:keepLines/>
         <w:pageBreakBefore/>
       </w:pPr>
-      <w:bookmarkStart w:id="20" w:name="_Toc242656314"/>
+      <w:bookmarkStart w:id="20" w:name="_Toc242659202"/>
       <w:r>
         <w:lastRenderedPageBreak/>
         <w:t>6 Test case catalogue</w:t>
@@ -9737,7 +9737,7 @@
         <w:pStyle w:val="Caption"/>
         <w:keepNext/>
       </w:pPr>
-      <w:bookmarkStart w:id="21" w:name="_Toc242656327"/>
+      <w:bookmarkStart w:id="21" w:name="_Toc242659215"/>
       <w:r>
         <w:t xml:space="preserve">Table </w:t>
       </w:r>
@@ -9779,7 +9779,7 @@
           <w:left w:w="10" w:type="dxa"/>
           <w:right w:w="10" w:type="dxa"/>
         </w:tblCellMar>
-        <w:tblLook w:val="0000" w:firstRow="0" w:lastRow="0" w:firstColumn="0" w:lastColumn="0" w:noHBand="0" w:noVBand="0"/>
+        <w:tblLook w:val="04A0" w:firstRow="1" w:lastRow="0" w:firstColumn="1" w:lastColumn="0" w:noHBand="0" w:noVBand="1"/>
       </w:tblPr>
       <w:tblGrid>
         <w:gridCol w:w="728"/>
@@ -13941,7 +13941,7 @@
         <w:keepLines/>
         <w:pageBreakBefore/>
       </w:pPr>
-      <w:bookmarkStart w:id="22" w:name="_Toc242656315"/>
+      <w:bookmarkStart w:id="22" w:name="_Toc242659203"/>
       <w:r>
         <w:lastRenderedPageBreak/>
         <w:t>7 Security tests</w:t>
@@ -13953,7 +13953,7 @@
         <w:pStyle w:val="Caption"/>
         <w:keepNext/>
       </w:pPr>
-      <w:bookmarkStart w:id="23" w:name="_Toc242656328"/>
+      <w:bookmarkStart w:id="23" w:name="_Toc242659216"/>
       <w:r>
         <w:t xml:space="preserve">Table </w:t>
       </w:r>
@@ -13995,7 +13995,7 @@
           <w:left w:w="10" w:type="dxa"/>
           <w:right w:w="10" w:type="dxa"/>
         </w:tblCellMar>
-        <w:tblLook w:val="0000" w:firstRow="0" w:lastRow="0" w:firstColumn="0" w:lastColumn="0" w:noHBand="0" w:noVBand="0"/>
+        <w:tblLook w:val="04A0" w:firstRow="1" w:lastRow="0" w:firstColumn="1" w:lastColumn="0" w:noHBand="0" w:noVBand="1"/>
       </w:tblPr>
       <w:tblGrid>
         <w:gridCol w:w="3082"/>
@@ -15491,7 +15491,7 @@
         <w:keepLines/>
         <w:pageBreakBefore/>
       </w:pPr>
-      <w:bookmarkStart w:id="24" w:name="_Toc242656316"/>
+      <w:bookmarkStart w:id="24" w:name="_Toc242659204"/>
       <w:r>
         <w:lastRenderedPageBreak/>
         <w:t>8 Results summary</w:t>
@@ -15523,7 +15523,7 @@
         <w:pStyle w:val="Caption"/>
         <w:keepNext/>
       </w:pPr>
-      <w:bookmarkStart w:id="25" w:name="_Toc242656329"/>
+      <w:bookmarkStart w:id="25" w:name="_Toc242659217"/>
       <w:r>
         <w:t xml:space="preserve">Table </w:t>
       </w:r>
@@ -15565,7 +15565,7 @@
           <w:left w:w="10" w:type="dxa"/>
           <w:right w:w="10" w:type="dxa"/>
         </w:tblCellMar>
-        <w:tblLook w:val="0000" w:firstRow="0" w:lastRow="0" w:firstColumn="0" w:lastColumn="0" w:noHBand="0" w:noVBand="0"/>
+        <w:tblLook w:val="04A0" w:firstRow="1" w:lastRow="0" w:firstColumn="1" w:lastColumn="0" w:noHBand="0" w:noVBand="1"/>
       </w:tblPr>
       <w:tblGrid>
         <w:gridCol w:w="4337"/>
@@ -16320,7 +16320,7 @@
         <w:keepLines/>
         <w:pageBreakBefore/>
       </w:pPr>
-      <w:bookmarkStart w:id="26" w:name="_Toc242656317"/>
+      <w:bookmarkStart w:id="26" w:name="_Toc242659205"/>
       <w:r>
         <w:lastRenderedPageBreak/>
         <w:t>9 Defects found and fixed</w:t>
@@ -16332,7 +16332,7 @@
         <w:pStyle w:val="Caption"/>
         <w:keepNext/>
       </w:pPr>
-      <w:bookmarkStart w:id="27" w:name="_Toc242656330"/>
+      <w:bookmarkStart w:id="27" w:name="_Toc242659218"/>
       <w:r>
         <w:t xml:space="preserve">Table </w:t>
       </w:r>
@@ -16374,7 +16374,7 @@
           <w:left w:w="10" w:type="dxa"/>
           <w:right w:w="10" w:type="dxa"/>
         </w:tblCellMar>
-        <w:tblLook w:val="0000" w:firstRow="0" w:lastRow="0" w:firstColumn="0" w:lastColumn="0" w:noHBand="0" w:noVBand="0"/>
+        <w:tblLook w:val="04A0" w:firstRow="1" w:lastRow="0" w:firstColumn="1" w:lastColumn="0" w:noHBand="0" w:noVBand="1"/>
       </w:tblPr>
       <w:tblGrid>
         <w:gridCol w:w="3558"/>
@@ -17487,7 +17487,7 @@
         <w:keepLines/>
         <w:pageBreakBefore/>
       </w:pPr>
-      <w:bookmarkStart w:id="28" w:name="_Toc242656318"/>
+      <w:bookmarkStart w:id="28" w:name="_Toc242659206"/>
       <w:r>
         <w:lastRenderedPageBreak/>
         <w:t>10 Known gaps and risks</w:t>
@@ -17499,7 +17499,7 @@
         <w:pStyle w:val="Caption"/>
         <w:keepNext/>
       </w:pPr>
-      <w:bookmarkStart w:id="29" w:name="_Toc242656331"/>
+      <w:bookmarkStart w:id="29" w:name="_Toc242659219"/>
       <w:r>
         <w:t xml:space="preserve">Table </w:t>
       </w:r>
@@ -17541,7 +17541,7 @@
           <w:left w:w="10" w:type="dxa"/>
           <w:right w:w="10" w:type="dxa"/>
         </w:tblCellMar>
-        <w:tblLook w:val="0000" w:firstRow="0" w:lastRow="0" w:firstColumn="0" w:lastColumn="0" w:noHBand="0" w:noVBand="0"/>
+        <w:tblLook w:val="04A0" w:firstRow="1" w:lastRow="0" w:firstColumn="1" w:lastColumn="0" w:noHBand="0" w:noVBand="1"/>
       </w:tblPr>
       <w:tblGrid>
         <w:gridCol w:w="3213"/>
@@ -18527,7 +18527,7 @@
         <w:keepLines/>
         <w:pageBreakBefore/>
       </w:pPr>
-      <w:bookmarkStart w:id="30" w:name="_Toc242656319"/>
+      <w:bookmarkStart w:id="30" w:name="_Toc242659207"/>
       <w:r>
         <w:lastRenderedPageBreak/>
         <w:t>11 Traceability</w:t>
@@ -18547,7 +18547,7 @@
         <w:pStyle w:val="Caption"/>
         <w:keepNext/>
       </w:pPr>
-      <w:bookmarkStart w:id="31" w:name="_Toc242656332"/>
+      <w:bookmarkStart w:id="31" w:name="_Toc242659220"/>
       <w:r>
         <w:t xml:space="preserve">Table </w:t>
       </w:r>
@@ -18589,7 +18589,7 @@
           <w:left w:w="10" w:type="dxa"/>
           <w:right w:w="10" w:type="dxa"/>
         </w:tblCellMar>
-        <w:tblLook w:val="0000" w:firstRow="0" w:lastRow="0" w:firstColumn="0" w:lastColumn="0" w:noHBand="0" w:noVBand="0"/>
+        <w:tblLook w:val="04A0" w:firstRow="1" w:lastRow="0" w:firstColumn="1" w:lastColumn="0" w:noHBand="0" w:noVBand="1"/>
       </w:tblPr>
       <w:tblGrid>
         <w:gridCol w:w="4775"/>
@@ -19840,7 +19840,7 @@
         <w:keepLines/>
         <w:pageBreakBefore/>
       </w:pPr>
-      <w:bookmarkStart w:id="32" w:name="_Toc242656320"/>
+      <w:bookmarkStart w:id="32" w:name="_Toc242659208"/>
       <w:r>
         <w:lastRenderedPageBreak/>
         <w:t>Appendix A: Glossary</w:t>
@@ -19852,7 +19852,7 @@
         <w:pStyle w:val="Caption"/>
         <w:keepNext/>
       </w:pPr>
-      <w:bookmarkStart w:id="33" w:name="_Toc242656333"/>
+      <w:bookmarkStart w:id="33" w:name="_Toc242659221"/>
       <w:r>
         <w:t xml:space="preserve">Table </w:t>
       </w:r>
@@ -19894,7 +19894,7 @@
           <w:left w:w="10" w:type="dxa"/>
           <w:right w:w="10" w:type="dxa"/>
         </w:tblCellMar>
-        <w:tblLook w:val="0000" w:firstRow="0" w:lastRow="0" w:firstColumn="0" w:lastColumn="0" w:noHBand="0" w:noVBand="0"/>
+        <w:tblLook w:val="04A0" w:firstRow="1" w:lastRow="0" w:firstColumn="1" w:lastColumn="0" w:noHBand="0" w:noVBand="1"/>
       </w:tblPr>
       <w:tblGrid>
         <w:gridCol w:w="2570"/>
@@ -20713,7 +20713,7 @@
         <w:keepLines/>
         <w:pageBreakBefore/>
       </w:pPr>
-      <w:bookmarkStart w:id="34" w:name="_Toc242656321"/>
+      <w:bookmarkStart w:id="34" w:name="_Toc242659209"/>
       <w:r>
         <w:lastRenderedPageBreak/>
         <w:t>Appendix B: References</w:t>
@@ -20725,7 +20725,7 @@
         <w:pStyle w:val="Caption"/>
         <w:keepNext/>
       </w:pPr>
-      <w:bookmarkStart w:id="35" w:name="_Toc242656334"/>
+      <w:bookmarkStart w:id="35" w:name="_Toc242659222"/>
       <w:r>
         <w:t xml:space="preserve">Table </w:t>
       </w:r>
@@ -20767,7 +20767,7 @@
           <w:left w:w="10" w:type="dxa"/>
           <w:right w:w="10" w:type="dxa"/>
         </w:tblCellMar>
-        <w:tblLook w:val="0000" w:firstRow="0" w:lastRow="0" w:firstColumn="0" w:lastColumn="0" w:noHBand="0" w:noVBand="0"/>
+        <w:tblLook w:val="04A0" w:firstRow="1" w:lastRow="0" w:firstColumn="1" w:lastColumn="0" w:noHBand="0" w:noVBand="1"/>
       </w:tblPr>
       <w:tblGrid>
         <w:gridCol w:w="803"/>
@@ -21642,10 +21642,10 @@
 <file path=word/numbering.xml><?xml version="1.0" encoding="utf-8"?>
 <w:numbering xmlns:wpc="http://schemas.microsoft.com/office/word/2010/wordprocessingCanvas" xmlns:cx="http://schemas.microsoft.com/office/drawing/2014/chartex" xmlns:cx1="http://schemas.microsoft.com/office/drawing/2015/9/8/chartex" xmlns:cx2="http://schemas.microsoft.com/office/drawing/2015/10/21/chartex" xmlns:cx3="http://schemas.microsoft.com/office/drawing/2016/5/9/chartex" xmlns:cx4="http://schemas.microsoft.com/office/drawing/2016/5/10/chartex" xmlns:cx5="http://schemas.microsoft.com/office/drawing/2016/5/11/chartex" xmlns:cx6="http://schemas.microsoft.com/office/drawing/2016/5/12/chartex" xmlns:cx7="http://schemas.microsoft.com/office/drawing/2016/5/13/chartex" xmlns:cx8="http://schemas.microsoft.com/office/drawing/2016/5/14/chartex" xmlns:mc="http://schemas.openxmlformats.org/markup-compatibility/2006" xmlns:aink="http://schemas.microsoft.com/office/drawing/2016/ink" xmlns:am3d="http://schemas.microsoft.com/office/drawing/2017/model3d" xmlns:o="urn:schemas-microsoft-com:office:office" xmlns:oel="http://schemas.microsoft.com/office/2019/extlst" xmlns:r="http://schemas.openxmlformats.org/officeDocument/2006/relationships" xmlns:m="http://schemas.openxmlformats.org/officeDocument/2006/math" xmlns:v="urn:schemas-microsoft-com:vml" xmlns:wp14="http://schemas.microsoft.com/office/word/2010/wordprocessingDrawing" xmlns:wp="http://schemas.openxmlformats.org/drawingml/2006/wordprocessingDrawing" xmlns:w10="urn:schemas-microsoft-com:office:word" xmlns:w="http://schemas.openxmlformats.org/wordprocessingml/2006/main" xmlns:w14="http://schemas.microsoft.com/office/word/2010/wordml" xmlns:w15="http://schemas.microsoft.com/office/word/2012/wordml" xmlns:w16cex="http://schemas.microsoft.com/office/word/2018/wordml/cex" xmlns:w16cid="http://schemas.microsoft.com/office/word/2016/wordml/cid" xmlns:w16="http://schemas.microsoft.com/office/word/2018/wordml" xmlns:w16du="http://schemas.microsoft.com/office/word/2023/wordml/word16du" xmlns:w16sdtdh="http://schemas.microsoft.com/office/word/2020/wordml/sdtdatahash" xmlns:w16sdtfl="http://schemas.microsoft.com/office/word/2024/wordml/sdtformatlock" xmlns:w16se="http://schemas.microsoft.com/office/word/2015/wordml/symex" xmlns:wpg="http://schemas.microsoft.com/office/word/2010/wordprocessingGroup" xmlns:wpi="http://schemas.microsoft.com/office/word/2010/wordprocessingInk" xmlns:wne="http://schemas.microsoft.com/office/word/2006/wordml" xmlns:wps="http://schemas.microsoft.com/office/word/2010/wordprocessingShape" mc:Ignorable="w14 w15 w16se w16cid w16 w16cex w16sdtdh w16sdtfl w16du wp14">
   <w:abstractNum w:abstractNumId="0" w15:restartNumberingAfterBreak="0">
-    <w:nsid w:val="1BE605C9"/>
+    <w:nsid w:val="00E5740F"/>
     <w:multiLevelType w:val="hybridMultilevel"/>
-    <w:tmpl w:val="C7DE1CF4"/>
-    <w:lvl w:ilvl="0" w:tplc="2B24632C" w:tentative="1">
+    <w:tmpl w:val="65D86D82"/>
+    <w:lvl w:ilvl="0" w:tplc="9BBE4A54" w:tentative="1">
       <w:start w:val="1"/>
       <w:numFmt w:val="bullet"/>
       <w:lvlText w:val="●"/>
@@ -21654,7 +21654,7 @@
         <w:ind w:left="720" w:hanging="360"/>
       </w:pPr>
     </w:lvl>
-    <w:lvl w:ilvl="1" w:tplc="19E4BB8E" w:tentative="1">
+    <w:lvl w:ilvl="1" w:tplc="CF523A96" w:tentative="1">
       <w:start w:val="1"/>
       <w:numFmt w:val="bullet"/>
       <w:lvlText w:val="○"/>
@@ -21663,7 +21663,7 @@
         <w:ind w:left="1440" w:hanging="360"/>
       </w:pPr>
     </w:lvl>
-    <w:lvl w:ilvl="2" w:tplc="DF2C2E76" w:tentative="1">
+    <w:lvl w:ilvl="2" w:tplc="E2BA8250" w:tentative="1">
       <w:start w:val="1"/>
       <w:numFmt w:val="bullet"/>
       <w:lvlText w:val="■"/>
@@ -21672,7 +21672,7 @@
         <w:ind w:left="2160" w:hanging="360"/>
       </w:pPr>
     </w:lvl>
-    <w:lvl w:ilvl="3" w:tplc="CCFA33B8" w:tentative="1">
+    <w:lvl w:ilvl="3" w:tplc="D57EE72A" w:tentative="1">
       <w:start w:val="1"/>
       <w:numFmt w:val="bullet"/>
       <w:lvlText w:val="●"/>
@@ -21681,7 +21681,7 @@
         <w:ind w:left="2880" w:hanging="360"/>
       </w:pPr>
     </w:lvl>
-    <w:lvl w:ilvl="4" w:tplc="7F127108" w:tentative="1">
+    <w:lvl w:ilvl="4" w:tplc="DADA69B4" w:tentative="1">
       <w:start w:val="1"/>
       <w:numFmt w:val="bullet"/>
       <w:lvlText w:val="○"/>
@@ -21690,7 +21690,7 @@
         <w:ind w:left="3600" w:hanging="360"/>
       </w:pPr>
     </w:lvl>
-    <w:lvl w:ilvl="5" w:tplc="DFBCBD06" w:tentative="1">
+    <w:lvl w:ilvl="5" w:tplc="9AE25490" w:tentative="1">
       <w:start w:val="1"/>
       <w:numFmt w:val="bullet"/>
       <w:lvlText w:val="■"/>
@@ -21699,7 +21699,7 @@
         <w:ind w:left="4320" w:hanging="360"/>
       </w:pPr>
     </w:lvl>
-    <w:lvl w:ilvl="6" w:tplc="FE965190" w:tentative="1">
+    <w:lvl w:ilvl="6" w:tplc="7EEA7990" w:tentative="1">
       <w:start w:val="1"/>
       <w:numFmt w:val="bullet"/>
       <w:lvlText w:val="●"/>
@@ -21708,7 +21708,7 @@
         <w:ind w:left="5040" w:hanging="360"/>
       </w:pPr>
     </w:lvl>
-    <w:lvl w:ilvl="7" w:tplc="7BC0E172" w:tentative="1">
+    <w:lvl w:ilvl="7" w:tplc="07DA734E" w:tentative="1">
       <w:start w:val="1"/>
       <w:numFmt w:val="bullet"/>
       <w:lvlText w:val="●"/>
@@ -21717,7 +21717,7 @@
         <w:ind w:left="5760" w:hanging="360"/>
       </w:pPr>
     </w:lvl>
-    <w:lvl w:ilvl="8" w:tplc="5D2E3682" w:tentative="1">
+    <w:lvl w:ilvl="8" w:tplc="D5D4D7BA" w:tentative="1">
       <w:start w:val="1"/>
       <w:numFmt w:val="bullet"/>
       <w:lvlText w:val="●"/>
@@ -21728,10 +21728,10 @@
     </w:lvl>
   </w:abstractNum>
   <w:abstractNum w:abstractNumId="1" w15:restartNumberingAfterBreak="0">
-    <w:nsid w:val="51E04516"/>
+    <w:nsid w:val="1C116C5C"/>
     <w:multiLevelType w:val="hybridMultilevel"/>
-    <w:tmpl w:val="27902872"/>
-    <w:lvl w:ilvl="0" w:tplc="FD7AFE5A" w:tentative="1">
+    <w:tmpl w:val="9738B80C"/>
+    <w:lvl w:ilvl="0" w:tplc="199E4B82" w:tentative="1">
       <w:start w:val="1"/>
       <w:numFmt w:val="bullet"/>
       <w:lvlText w:val="•"/>
@@ -21740,7 +21740,7 @@
         <w:ind w:left="720" w:hanging="280"/>
       </w:pPr>
     </w:lvl>
-    <w:lvl w:ilvl="1" w:tplc="472E1390" w:tentative="1">
+    <w:lvl w:ilvl="1" w:tplc="10E22B90" w:tentative="1">
       <w:start w:val="1"/>
       <w:numFmt w:val="bullet"/>
       <w:lvlText w:val="–"/>
@@ -21749,7 +21749,7 @@
         <w:ind w:left="1080" w:hanging="280"/>
       </w:pPr>
     </w:lvl>
-    <w:lvl w:ilvl="2" w:tplc="D1DA510E" w:tentative="1">
+    <w:lvl w:ilvl="2" w:tplc="C2688898" w:tentative="1">
       <w:start w:val="1"/>
       <w:numFmt w:val="bullet"/>
       <w:lvlText w:val="▪"/>
@@ -21758,42 +21758,42 @@
         <w:ind w:left="1440" w:hanging="280"/>
       </w:pPr>
     </w:lvl>
-    <w:lvl w:ilvl="3" w:tplc="194E2472">
+    <w:lvl w:ilvl="3" w:tplc="D2989E0E">
       <w:numFmt w:val="decimal"/>
       <w:lvlText w:val=""/>
       <w:lvlJc w:val="left"/>
     </w:lvl>
-    <w:lvl w:ilvl="4" w:tplc="6D1A18E0">
+    <w:lvl w:ilvl="4" w:tplc="04FCAC60">
       <w:numFmt w:val="decimal"/>
       <w:lvlText w:val=""/>
       <w:lvlJc w:val="left"/>
     </w:lvl>
-    <w:lvl w:ilvl="5" w:tplc="90BC24EA">
+    <w:lvl w:ilvl="5" w:tplc="88DCCEC2">
       <w:numFmt w:val="decimal"/>
       <w:lvlText w:val=""/>
       <w:lvlJc w:val="left"/>
     </w:lvl>
-    <w:lvl w:ilvl="6" w:tplc="7CB6F8CC">
+    <w:lvl w:ilvl="6" w:tplc="73F4BEC8">
       <w:numFmt w:val="decimal"/>
       <w:lvlText w:val=""/>
       <w:lvlJc w:val="left"/>
     </w:lvl>
-    <w:lvl w:ilvl="7" w:tplc="4F68A6B0">
+    <w:lvl w:ilvl="7" w:tplc="87D4300A">
       <w:numFmt w:val="decimal"/>
       <w:lvlText w:val=""/>
       <w:lvlJc w:val="left"/>
     </w:lvl>
-    <w:lvl w:ilvl="8" w:tplc="440E506C">
+    <w:lvl w:ilvl="8" w:tplc="7ED8842E">
       <w:numFmt w:val="decimal"/>
       <w:lvlText w:val=""/>
       <w:lvlJc w:val="left"/>
     </w:lvl>
   </w:abstractNum>
   <w:abstractNum w:abstractNumId="2" w15:restartNumberingAfterBreak="0">
-    <w:nsid w:val="7B33164C"/>
+    <w:nsid w:val="5B952F66"/>
     <w:multiLevelType w:val="hybridMultilevel"/>
-    <w:tmpl w:val="2FAC2078"/>
-    <w:lvl w:ilvl="0" w:tplc="09FA0C74">
+    <w:tmpl w:val="0DD02CC4"/>
+    <w:lvl w:ilvl="0" w:tplc="BBD8DBC4">
       <w:start w:val="1"/>
       <w:numFmt w:val="decimal"/>
       <w:lvlText w:val="%1."/>
@@ -21802,7 +21802,7 @@
         <w:ind w:left="720" w:hanging="360"/>
       </w:pPr>
     </w:lvl>
-    <w:lvl w:ilvl="1" w:tplc="3CCA9DD8" w:tentative="1">
+    <w:lvl w:ilvl="1" w:tplc="8AAA18C0" w:tentative="1">
       <w:start w:val="1"/>
       <w:numFmt w:val="lowerLetter"/>
       <w:lvlText w:val="%2."/>
@@ -21811,7 +21811,7 @@
         <w:ind w:left="1080" w:hanging="360"/>
       </w:pPr>
     </w:lvl>
-    <w:lvl w:ilvl="2" w:tplc="DD0E042A" w:tentative="1">
+    <w:lvl w:ilvl="2" w:tplc="DC5653A4" w:tentative="1">
       <w:start w:val="1"/>
       <w:numFmt w:val="lowerRoman"/>
       <w:lvlText w:val="%3."/>
@@ -21820,44 +21820,44 @@
         <w:ind w:left="1440" w:hanging="360"/>
       </w:pPr>
     </w:lvl>
-    <w:lvl w:ilvl="3" w:tplc="083AE8B0">
+    <w:lvl w:ilvl="3" w:tplc="0CF8F9B0">
       <w:numFmt w:val="decimal"/>
       <w:lvlText w:val=""/>
       <w:lvlJc w:val="left"/>
     </w:lvl>
-    <w:lvl w:ilvl="4" w:tplc="6510A82A">
+    <w:lvl w:ilvl="4" w:tplc="89A6417A">
       <w:numFmt w:val="decimal"/>
       <w:lvlText w:val=""/>
       <w:lvlJc w:val="left"/>
     </w:lvl>
-    <w:lvl w:ilvl="5" w:tplc="E558170E">
+    <w:lvl w:ilvl="5" w:tplc="5BA068A2">
       <w:numFmt w:val="decimal"/>
       <w:lvlText w:val=""/>
       <w:lvlJc w:val="left"/>
     </w:lvl>
-    <w:lvl w:ilvl="6" w:tplc="BC966B5C">
+    <w:lvl w:ilvl="6" w:tplc="713461C8">
       <w:numFmt w:val="decimal"/>
       <w:lvlText w:val=""/>
       <w:lvlJc w:val="left"/>
     </w:lvl>
-    <w:lvl w:ilvl="7" w:tplc="4A169676">
+    <w:lvl w:ilvl="7" w:tplc="9722900A">
       <w:numFmt w:val="decimal"/>
       <w:lvlText w:val=""/>
       <w:lvlJc w:val="left"/>
     </w:lvl>
-    <w:lvl w:ilvl="8" w:tplc="9AAE9AA6">
+    <w:lvl w:ilvl="8" w:tplc="621A14B6">
       <w:numFmt w:val="decimal"/>
       <w:lvlText w:val=""/>
       <w:lvlJc w:val="left"/>
     </w:lvl>
   </w:abstractNum>
-  <w:num w:numId="1" w16cid:durableId="1871261492">
+  <w:num w:numId="1" w16cid:durableId="357698894">
     <w:abstractNumId w:val="0"/>
     <w:lvlOverride w:ilvl="0">
       <w:startOverride w:val="1"/>
     </w:lvlOverride>
   </w:num>
-  <w:num w:numId="2" w16cid:durableId="367948952">
+  <w:num w:numId="2" w16cid:durableId="187760990">
     <w:abstractNumId w:val="2"/>
     <w:lvlOverride w:ilvl="0">
       <w:startOverride w:val="1"/>
@@ -22562,7 +22562,7 @@
     <w:autoRedefine/>
     <w:uiPriority w:val="39"/>
     <w:unhideWhenUsed/>
-    <w:rsid w:val="00BA007D"/>
+    <w:rsid w:val="00A02649"/>
     <w:pPr>
       <w:spacing w:after="100"/>
     </w:pPr>
@@ -22574,7 +22574,7 @@
     <w:autoRedefine/>
     <w:uiPriority w:val="39"/>
     <w:unhideWhenUsed/>
-    <w:rsid w:val="00BA007D"/>
+    <w:rsid w:val="00A02649"/>
     <w:pPr>
       <w:spacing w:after="100"/>
       <w:ind w:left="210"/>
@@ -22586,7 +22586,7 @@
     <w:next w:val="Normal"/>
     <w:uiPriority w:val="99"/>
     <w:unhideWhenUsed/>
-    <w:rsid w:val="00BA007D"/>
+    <w:rsid w:val="00A02649"/>
   </w:style>
 </w:styles>
 </file>

</xml_diff>

<commit_message>
Docs for VR3: ZP-DOC-07 desktop layout section (breakpoint, collapsible side menu and glass menu button, content widths, Paths dashboard, two-column course page) plus the Compare fixes, tip box and limit message; ZP-DOC-08 TC-139 and results of 21 October (536 passed, guard 40/40, live checks); Test Summary Report update; README counts; all rebuilt
Co-Authored-By: Claude Opus 5.5 (1M context) <noreply@anthropic.com>
</commit_message>
<xml_diff>
--- a/docs/08-test-plan/ZP-DOC-08_Test-Plan.docx
+++ b/docs/08-test-plan/ZP-DOC-08_Test-Plan.docx
@@ -289,7 +289,7 @@
                 <w:sz w:val="19"/>
                 <w:szCs w:val="19"/>
               </w:rPr>
-              <w:t>15 October 2026</w:t>
+              <w:t>21 October 2026</w:t>
             </w:r>
           </w:p>
         </w:tc>
@@ -1567,6 +1567,122 @@
           </w:p>
         </w:tc>
       </w:tr>
+      <w:tr>
+        <w:tblPrEx>
+          <w:tblCellMar>
+            <w:top w:w="0" w:type="dxa"/>
+            <w:bottom w:w="0" w:type="dxa"/>
+          </w:tblCellMar>
+        </w:tblPrEx>
+        <w:trPr>
+          <w:cantSplit/>
+          <w:trHeight w:val="420"/>
+        </w:trPr>
+        <w:tc>
+          <w:tcPr>
+            <w:tcW w:w="964" w:type="dxa"/>
+            <w:tcBorders>
+              <w:top w:val="single" w:sz="4" w:space="0" w:color="C9D3D0"/>
+              <w:left w:val="single" w:sz="4" w:space="0" w:color="C9D3D0"/>
+              <w:bottom w:val="single" w:sz="4" w:space="0" w:color="C9D3D0"/>
+              <w:right w:val="single" w:sz="4" w:space="0" w:color="C9D3D0"/>
+            </w:tcBorders>
+            <w:tcMar>
+              <w:top w:w="50" w:type="dxa"/>
+              <w:left w:w="100" w:type="dxa"/>
+              <w:bottom w:w="50" w:type="dxa"/>
+              <w:right w:w="100" w:type="dxa"/>
+            </w:tcMar>
+          </w:tcPr>
+          <w:p>
+            <w:r>
+              <w:rPr>
+                <w:sz w:val="19"/>
+                <w:szCs w:val="19"/>
+              </w:rPr>
+              <w:t>0.9</w:t>
+            </w:r>
+          </w:p>
+        </w:tc>
+        <w:tc>
+          <w:tcPr>
+            <w:tcW w:w="1542" w:type="dxa"/>
+            <w:tcBorders>
+              <w:top w:val="single" w:sz="4" w:space="0" w:color="C9D3D0"/>
+              <w:left w:val="single" w:sz="4" w:space="0" w:color="C9D3D0"/>
+              <w:bottom w:val="single" w:sz="4" w:space="0" w:color="C9D3D0"/>
+              <w:right w:val="single" w:sz="4" w:space="0" w:color="C9D3D0"/>
+            </w:tcBorders>
+            <w:tcMar>
+              <w:top w:w="50" w:type="dxa"/>
+              <w:left w:w="100" w:type="dxa"/>
+              <w:bottom w:w="50" w:type="dxa"/>
+              <w:right w:w="100" w:type="dxa"/>
+            </w:tcMar>
+          </w:tcPr>
+          <w:p>
+            <w:r>
+              <w:rPr>
+                <w:sz w:val="19"/>
+                <w:szCs w:val="19"/>
+              </w:rPr>
+              <w:t>21 Oct 2026</w:t>
+            </w:r>
+          </w:p>
+        </w:tc>
+        <w:tc>
+          <w:tcPr>
+            <w:tcW w:w="1928" w:type="dxa"/>
+            <w:tcBorders>
+              <w:top w:val="single" w:sz="4" w:space="0" w:color="C9D3D0"/>
+              <w:left w:val="single" w:sz="4" w:space="0" w:color="C9D3D0"/>
+              <w:bottom w:val="single" w:sz="4" w:space="0" w:color="C9D3D0"/>
+              <w:right w:val="single" w:sz="4" w:space="0" w:color="C9D3D0"/>
+            </w:tcBorders>
+            <w:tcMar>
+              <w:top w:w="50" w:type="dxa"/>
+              <w:left w:w="100" w:type="dxa"/>
+              <w:bottom w:w="50" w:type="dxa"/>
+              <w:right w:w="100" w:type="dxa"/>
+            </w:tcMar>
+          </w:tcPr>
+          <w:p>
+            <w:r>
+              <w:rPr>
+                <w:sz w:val="19"/>
+                <w:szCs w:val="19"/>
+              </w:rPr>
+              <w:t>Team Kestrel</w:t>
+            </w:r>
+          </w:p>
+        </w:tc>
+        <w:tc>
+          <w:tcPr>
+            <w:tcW w:w="5204" w:type="dxa"/>
+            <w:tcBorders>
+              <w:top w:val="single" w:sz="4" w:space="0" w:color="C9D3D0"/>
+              <w:left w:val="single" w:sz="4" w:space="0" w:color="C9D3D0"/>
+              <w:bottom w:val="single" w:sz="4" w:space="0" w:color="C9D3D0"/>
+              <w:right w:val="single" w:sz="4" w:space="0" w:color="C9D3D0"/>
+            </w:tcBorders>
+            <w:tcMar>
+              <w:top w:w="50" w:type="dxa"/>
+              <w:left w:w="100" w:type="dxa"/>
+              <w:bottom w:w="50" w:type="dxa"/>
+              <w:right w:w="100" w:type="dxa"/>
+            </w:tcMar>
+          </w:tcPr>
+          <w:p>
+            <w:r>
+              <w:rPr>
+                <w:sz w:val="19"/>
+                <w:szCs w:val="19"/>
+              </w:rPr>
+              <w:t>VR3: TC-139 added (desktop side menu preference, `src/nav-pref.test.ts`); results of 21 October 2026 (536 passed) and live checks of the Compare fixes and the desktop layout</w:t>
+            </w:r>
+          </w:p>
+        </w:tc>
+      </w:tr>
     </w:tbl>
     <w:p>
       <w:pPr>
@@ -1966,7 +2082,7 @@
     <w:sdt>
       <w:sdtPr>
         <w:alias w:val="Contents"/>
-        <w:id w:val="-285894641"/>
+        <w:id w:val="1160109676"/>
       </w:sdtPr>
       <w:sdtEndPr/>
       <w:sdtContent>
@@ -1995,7 +2111,7 @@
           <w:r>
             <w:fldChar w:fldCharType="separate"/>
           </w:r>
-          <w:hyperlink w:anchor="_Toc242944020" w:history="1">
+          <w:hyperlink w:anchor="_Toc243516476" w:history="1">
             <w:r>
               <w:rPr>
                 <w:rStyle w:val="Hyperlink"/>
@@ -2019,7 +2135,7 @@
               <w:rPr>
                 <w:noProof/>
               </w:rPr>
-              <w:instrText xml:space="preserve"> PAGEREF _Toc242944020 \h </w:instrText>
+              <w:instrText xml:space="preserve"> PAGEREF _Toc243516476 \h </w:instrText>
             </w:r>
             <w:r>
               <w:rPr>
@@ -2062,7 +2178,7 @@
               <w14:ligatures w14:val="standardContextual"/>
             </w:rPr>
           </w:pPr>
-          <w:hyperlink w:anchor="_Toc242944021" w:history="1">
+          <w:hyperlink w:anchor="_Toc243516477" w:history="1">
             <w:r>
               <w:rPr>
                 <w:rStyle w:val="Hyperlink"/>
@@ -2086,7 +2202,7 @@
               <w:rPr>
                 <w:noProof/>
               </w:rPr>
-              <w:instrText xml:space="preserve"> PAGEREF _Toc242944021 \h </w:instrText>
+              <w:instrText xml:space="preserve"> PAGEREF _Toc243516477 \h </w:instrText>
             </w:r>
             <w:r>
               <w:rPr>
@@ -2129,7 +2245,7 @@
               <w14:ligatures w14:val="standardContextual"/>
             </w:rPr>
           </w:pPr>
-          <w:hyperlink w:anchor="_Toc242944022" w:history="1">
+          <w:hyperlink w:anchor="_Toc243516478" w:history="1">
             <w:r>
               <w:rPr>
                 <w:rStyle w:val="Hyperlink"/>
@@ -2153,7 +2269,7 @@
               <w:rPr>
                 <w:noProof/>
               </w:rPr>
-              <w:instrText xml:space="preserve"> PAGEREF _Toc242944022 \h </w:instrText>
+              <w:instrText xml:space="preserve"> PAGEREF _Toc243516478 \h </w:instrText>
             </w:r>
             <w:r>
               <w:rPr>
@@ -2196,7 +2312,7 @@
               <w14:ligatures w14:val="standardContextual"/>
             </w:rPr>
           </w:pPr>
-          <w:hyperlink w:anchor="_Toc242944023" w:history="1">
+          <w:hyperlink w:anchor="_Toc243516479" w:history="1">
             <w:r>
               <w:rPr>
                 <w:rStyle w:val="Hyperlink"/>
@@ -2220,7 +2336,7 @@
               <w:rPr>
                 <w:noProof/>
               </w:rPr>
-              <w:instrText xml:space="preserve"> PAGEREF _Toc242944023 \h </w:instrText>
+              <w:instrText xml:space="preserve"> PAGEREF _Toc243516479 \h </w:instrText>
             </w:r>
             <w:r>
               <w:rPr>
@@ -2263,7 +2379,7 @@
               <w14:ligatures w14:val="standardContextual"/>
             </w:rPr>
           </w:pPr>
-          <w:hyperlink w:anchor="_Toc242944024" w:history="1">
+          <w:hyperlink w:anchor="_Toc243516480" w:history="1">
             <w:r>
               <w:rPr>
                 <w:rStyle w:val="Hyperlink"/>
@@ -2287,7 +2403,7 @@
               <w:rPr>
                 <w:noProof/>
               </w:rPr>
-              <w:instrText xml:space="preserve"> PAGEREF _Toc242944024 \h </w:instrText>
+              <w:instrText xml:space="preserve"> PAGEREF _Toc243516480 \h </w:instrText>
             </w:r>
             <w:r>
               <w:rPr>
@@ -2330,7 +2446,7 @@
               <w14:ligatures w14:val="standardContextual"/>
             </w:rPr>
           </w:pPr>
-          <w:hyperlink w:anchor="_Toc242944025" w:history="1">
+          <w:hyperlink w:anchor="_Toc243516481" w:history="1">
             <w:r>
               <w:rPr>
                 <w:rStyle w:val="Hyperlink"/>
@@ -2354,7 +2470,7 @@
               <w:rPr>
                 <w:noProof/>
               </w:rPr>
-              <w:instrText xml:space="preserve"> PAGEREF _Toc242944025 \h </w:instrText>
+              <w:instrText xml:space="preserve"> PAGEREF _Toc243516481 \h </w:instrText>
             </w:r>
             <w:r>
               <w:rPr>
@@ -2397,7 +2513,7 @@
               <w14:ligatures w14:val="standardContextual"/>
             </w:rPr>
           </w:pPr>
-          <w:hyperlink w:anchor="_Toc242944026" w:history="1">
+          <w:hyperlink w:anchor="_Toc243516482" w:history="1">
             <w:r>
               <w:rPr>
                 <w:rStyle w:val="Hyperlink"/>
@@ -2421,7 +2537,7 @@
               <w:rPr>
                 <w:noProof/>
               </w:rPr>
-              <w:instrText xml:space="preserve"> PAGEREF _Toc242944026 \h </w:instrText>
+              <w:instrText xml:space="preserve"> PAGEREF _Toc243516482 \h </w:instrText>
             </w:r>
             <w:r>
               <w:rPr>
@@ -2464,7 +2580,7 @@
               <w14:ligatures w14:val="standardContextual"/>
             </w:rPr>
           </w:pPr>
-          <w:hyperlink w:anchor="_Toc242944027" w:history="1">
+          <w:hyperlink w:anchor="_Toc243516483" w:history="1">
             <w:r>
               <w:rPr>
                 <w:rStyle w:val="Hyperlink"/>
@@ -2488,7 +2604,7 @@
               <w:rPr>
                 <w:noProof/>
               </w:rPr>
-              <w:instrText xml:space="preserve"> PAGEREF _Toc242944027 \h </w:instrText>
+              <w:instrText xml:space="preserve"> PAGEREF _Toc243516483 \h </w:instrText>
             </w:r>
             <w:r>
               <w:rPr>
@@ -2531,7 +2647,7 @@
               <w14:ligatures w14:val="standardContextual"/>
             </w:rPr>
           </w:pPr>
-          <w:hyperlink w:anchor="_Toc242944028" w:history="1">
+          <w:hyperlink w:anchor="_Toc243516484" w:history="1">
             <w:r>
               <w:rPr>
                 <w:rStyle w:val="Hyperlink"/>
@@ -2555,7 +2671,7 @@
               <w:rPr>
                 <w:noProof/>
               </w:rPr>
-              <w:instrText xml:space="preserve"> PAGEREF _Toc242944028 \h </w:instrText>
+              <w:instrText xml:space="preserve"> PAGEREF _Toc243516484 \h </w:instrText>
             </w:r>
             <w:r>
               <w:rPr>
@@ -2598,7 +2714,7 @@
               <w14:ligatures w14:val="standardContextual"/>
             </w:rPr>
           </w:pPr>
-          <w:hyperlink w:anchor="_Toc242944029" w:history="1">
+          <w:hyperlink w:anchor="_Toc243516485" w:history="1">
             <w:r>
               <w:rPr>
                 <w:rStyle w:val="Hyperlink"/>
@@ -2622,7 +2738,7 @@
               <w:rPr>
                 <w:noProof/>
               </w:rPr>
-              <w:instrText xml:space="preserve"> PAGEREF _Toc242944029 \h </w:instrText>
+              <w:instrText xml:space="preserve"> PAGEREF _Toc243516485 \h </w:instrText>
             </w:r>
             <w:r>
               <w:rPr>
@@ -2665,7 +2781,7 @@
               <w14:ligatures w14:val="standardContextual"/>
             </w:rPr>
           </w:pPr>
-          <w:hyperlink w:anchor="_Toc242944030" w:history="1">
+          <w:hyperlink w:anchor="_Toc243516486" w:history="1">
             <w:r>
               <w:rPr>
                 <w:rStyle w:val="Hyperlink"/>
@@ -2689,7 +2805,7 @@
               <w:rPr>
                 <w:noProof/>
               </w:rPr>
-              <w:instrText xml:space="preserve"> PAGEREF _Toc242944030 \h </w:instrText>
+              <w:instrText xml:space="preserve"> PAGEREF _Toc243516486 \h </w:instrText>
             </w:r>
             <w:r>
               <w:rPr>
@@ -2732,7 +2848,7 @@
               <w14:ligatures w14:val="standardContextual"/>
             </w:rPr>
           </w:pPr>
-          <w:hyperlink w:anchor="_Toc242944031" w:history="1">
+          <w:hyperlink w:anchor="_Toc243516487" w:history="1">
             <w:r>
               <w:rPr>
                 <w:rStyle w:val="Hyperlink"/>
@@ -2756,7 +2872,7 @@
               <w:rPr>
                 <w:noProof/>
               </w:rPr>
-              <w:instrText xml:space="preserve"> PAGEREF _Toc242944031 \h </w:instrText>
+              <w:instrText xml:space="preserve"> PAGEREF _Toc243516487 \h </w:instrText>
             </w:r>
             <w:r>
               <w:rPr>
@@ -2799,7 +2915,7 @@
               <w14:ligatures w14:val="standardContextual"/>
             </w:rPr>
           </w:pPr>
-          <w:hyperlink w:anchor="_Toc242944032" w:history="1">
+          <w:hyperlink w:anchor="_Toc243516488" w:history="1">
             <w:r>
               <w:rPr>
                 <w:rStyle w:val="Hyperlink"/>
@@ -2823,7 +2939,7 @@
               <w:rPr>
                 <w:noProof/>
               </w:rPr>
-              <w:instrText xml:space="preserve"> PAGEREF _Toc242944032 \h </w:instrText>
+              <w:instrText xml:space="preserve"> PAGEREF _Toc243516488 \h </w:instrText>
             </w:r>
             <w:r>
               <w:rPr>
@@ -2866,7 +2982,7 @@
               <w14:ligatures w14:val="standardContextual"/>
             </w:rPr>
           </w:pPr>
-          <w:hyperlink w:anchor="_Toc242944033" w:history="1">
+          <w:hyperlink w:anchor="_Toc243516489" w:history="1">
             <w:r>
               <w:rPr>
                 <w:rStyle w:val="Hyperlink"/>
@@ -2890,7 +3006,7 @@
               <w:rPr>
                 <w:noProof/>
               </w:rPr>
-              <w:instrText xml:space="preserve"> PAGEREF _Toc242944033 \h </w:instrText>
+              <w:instrText xml:space="preserve"> PAGEREF _Toc243516489 \h </w:instrText>
             </w:r>
             <w:r>
               <w:rPr>
@@ -2933,7 +3049,7 @@
               <w14:ligatures w14:val="standardContextual"/>
             </w:rPr>
           </w:pPr>
-          <w:hyperlink w:anchor="_Toc242944034" w:history="1">
+          <w:hyperlink w:anchor="_Toc243516490" w:history="1">
             <w:r>
               <w:rPr>
                 <w:rStyle w:val="Hyperlink"/>
@@ -2957,7 +3073,7 @@
               <w:rPr>
                 <w:noProof/>
               </w:rPr>
-              <w:instrText xml:space="preserve"> PAGEREF _Toc242944034 \h </w:instrText>
+              <w:instrText xml:space="preserve"> PAGEREF _Toc243516490 \h </w:instrText>
             </w:r>
             <w:r>
               <w:rPr>
@@ -3000,7 +3116,7 @@
               <w14:ligatures w14:val="standardContextual"/>
             </w:rPr>
           </w:pPr>
-          <w:hyperlink w:anchor="_Toc242944035" w:history="1">
+          <w:hyperlink w:anchor="_Toc243516491" w:history="1">
             <w:r>
               <w:rPr>
                 <w:rStyle w:val="Hyperlink"/>
@@ -3024,7 +3140,7 @@
               <w:rPr>
                 <w:noProof/>
               </w:rPr>
-              <w:instrText xml:space="preserve"> PAGEREF _Toc242944035 \h </w:instrText>
+              <w:instrText xml:space="preserve"> PAGEREF _Toc243516491 \h </w:instrText>
             </w:r>
             <w:r>
               <w:rPr>
@@ -3067,7 +3183,7 @@
               <w14:ligatures w14:val="standardContextual"/>
             </w:rPr>
           </w:pPr>
-          <w:hyperlink w:anchor="_Toc242944036" w:history="1">
+          <w:hyperlink w:anchor="_Toc243516492" w:history="1">
             <w:r>
               <w:rPr>
                 <w:rStyle w:val="Hyperlink"/>
@@ -3091,7 +3207,7 @@
               <w:rPr>
                 <w:noProof/>
               </w:rPr>
-              <w:instrText xml:space="preserve"> PAGEREF _Toc242944036 \h </w:instrText>
+              <w:instrText xml:space="preserve"> PAGEREF _Toc243516492 \h </w:instrText>
             </w:r>
             <w:r>
               <w:rPr>
@@ -3134,7 +3250,7 @@
               <w14:ligatures w14:val="standardContextual"/>
             </w:rPr>
           </w:pPr>
-          <w:hyperlink w:anchor="_Toc242944037" w:history="1">
+          <w:hyperlink w:anchor="_Toc243516493" w:history="1">
             <w:r>
               <w:rPr>
                 <w:rStyle w:val="Hyperlink"/>
@@ -3158,7 +3274,7 @@
               <w:rPr>
                 <w:noProof/>
               </w:rPr>
-              <w:instrText xml:space="preserve"> PAGEREF _Toc242944037 \h </w:instrText>
+              <w:instrText xml:space="preserve"> PAGEREF _Toc243516493 \h </w:instrText>
             </w:r>
             <w:r>
               <w:rPr>
@@ -3201,7 +3317,7 @@
               <w14:ligatures w14:val="standardContextual"/>
             </w:rPr>
           </w:pPr>
-          <w:hyperlink w:anchor="_Toc242944038" w:history="1">
+          <w:hyperlink w:anchor="_Toc243516494" w:history="1">
             <w:r>
               <w:rPr>
                 <w:rStyle w:val="Hyperlink"/>
@@ -3225,7 +3341,7 @@
               <w:rPr>
                 <w:noProof/>
               </w:rPr>
-              <w:instrText xml:space="preserve"> PAGEREF _Toc242944038 \h </w:instrText>
+              <w:instrText xml:space="preserve"> PAGEREF _Toc243516494 \h </w:instrText>
             </w:r>
             <w:r>
               <w:rPr>
@@ -3242,7 +3358,7 @@
               <w:rPr>
                 <w:noProof/>
               </w:rPr>
-              <w:t>21</w:t>
+              <w:t>22</w:t>
             </w:r>
             <w:r>
               <w:rPr>
@@ -3268,7 +3384,7 @@
               <w14:ligatures w14:val="standardContextual"/>
             </w:rPr>
           </w:pPr>
-          <w:hyperlink w:anchor="_Toc242944039" w:history="1">
+          <w:hyperlink w:anchor="_Toc243516495" w:history="1">
             <w:r>
               <w:rPr>
                 <w:rStyle w:val="Hyperlink"/>
@@ -3292,7 +3408,7 @@
               <w:rPr>
                 <w:noProof/>
               </w:rPr>
-              <w:instrText xml:space="preserve"> PAGEREF _Toc242944039 \h </w:instrText>
+              <w:instrText xml:space="preserve"> PAGEREF _Toc243516495 \h </w:instrText>
             </w:r>
             <w:r>
               <w:rPr>
@@ -3309,7 +3425,7 @@
               <w:rPr>
                 <w:noProof/>
               </w:rPr>
-              <w:t>22</w:t>
+              <w:t>23</w:t>
             </w:r>
             <w:r>
               <w:rPr>
@@ -3335,7 +3451,7 @@
               <w14:ligatures w14:val="standardContextual"/>
             </w:rPr>
           </w:pPr>
-          <w:hyperlink w:anchor="_Toc242944040" w:history="1">
+          <w:hyperlink w:anchor="_Toc243516496" w:history="1">
             <w:r>
               <w:rPr>
                 <w:rStyle w:val="Hyperlink"/>
@@ -3359,7 +3475,7 @@
               <w:rPr>
                 <w:noProof/>
               </w:rPr>
-              <w:instrText xml:space="preserve"> PAGEREF _Toc242944040 \h </w:instrText>
+              <w:instrText xml:space="preserve"> PAGEREF _Toc243516496 \h </w:instrText>
             </w:r>
             <w:r>
               <w:rPr>
@@ -3376,7 +3492,7 @@
               <w:rPr>
                 <w:noProof/>
               </w:rPr>
-              <w:t>23</w:t>
+              <w:t>24</w:t>
             </w:r>
             <w:r>
               <w:rPr>
@@ -3402,7 +3518,7 @@
               <w14:ligatures w14:val="standardContextual"/>
             </w:rPr>
           </w:pPr>
-          <w:hyperlink w:anchor="_Toc242944041" w:history="1">
+          <w:hyperlink w:anchor="_Toc243516497" w:history="1">
             <w:r>
               <w:rPr>
                 <w:rStyle w:val="Hyperlink"/>
@@ -3426,7 +3542,7 @@
               <w:rPr>
                 <w:noProof/>
               </w:rPr>
-              <w:instrText xml:space="preserve"> PAGEREF _Toc242944041 \h </w:instrText>
+              <w:instrText xml:space="preserve"> PAGEREF _Toc243516497 \h </w:instrText>
             </w:r>
             <w:r>
               <w:rPr>
@@ -3443,7 +3559,7 @@
               <w:rPr>
                 <w:noProof/>
               </w:rPr>
-              <w:t>24</w:t>
+              <w:t>25</w:t>
             </w:r>
             <w:r>
               <w:rPr>
@@ -3469,7 +3585,7 @@
               <w14:ligatures w14:val="standardContextual"/>
             </w:rPr>
           </w:pPr>
-          <w:hyperlink w:anchor="_Toc242944042" w:history="1">
+          <w:hyperlink w:anchor="_Toc243516498" w:history="1">
             <w:r>
               <w:rPr>
                 <w:rStyle w:val="Hyperlink"/>
@@ -3493,7 +3609,7 @@
               <w:rPr>
                 <w:noProof/>
               </w:rPr>
-              <w:instrText xml:space="preserve"> PAGEREF _Toc242944042 \h </w:instrText>
+              <w:instrText xml:space="preserve"> PAGEREF _Toc243516498 \h </w:instrText>
             </w:r>
             <w:r>
               <w:rPr>
@@ -3510,7 +3626,7 @@
               <w:rPr>
                 <w:noProof/>
               </w:rPr>
-              <w:t>25</w:t>
+              <w:t>26</w:t>
             </w:r>
             <w:r>
               <w:rPr>
@@ -3539,7 +3655,7 @@
     <w:sdt>
       <w:sdtPr>
         <w:alias w:val="Tables"/>
-        <w:id w:val="-537665179"/>
+        <w:id w:val="852075398"/>
       </w:sdtPr>
       <w:sdtEndPr/>
       <w:sdtContent>
@@ -3568,7 +3684,7 @@
           <w:r>
             <w:fldChar w:fldCharType="separate"/>
           </w:r>
-          <w:hyperlink w:anchor="_Toc242944043" w:history="1">
+          <w:hyperlink w:anchor="_Toc243516499" w:history="1">
             <w:r>
               <w:rPr>
                 <w:rStyle w:val="Hyperlink"/>
@@ -3592,7 +3708,7 @@
               <w:rPr>
                 <w:noProof/>
               </w:rPr>
-              <w:instrText xml:space="preserve"> PAGEREF _Toc242944043 \h </w:instrText>
+              <w:instrText xml:space="preserve"> PAGEREF _Toc243516499 \h </w:instrText>
             </w:r>
             <w:r>
               <w:rPr>
@@ -3635,7 +3751,7 @@
               <w14:ligatures w14:val="standardContextual"/>
             </w:rPr>
           </w:pPr>
-          <w:hyperlink w:anchor="_Toc242944044" w:history="1">
+          <w:hyperlink w:anchor="_Toc243516500" w:history="1">
             <w:r>
               <w:rPr>
                 <w:rStyle w:val="Hyperlink"/>
@@ -3659,7 +3775,7 @@
               <w:rPr>
                 <w:noProof/>
               </w:rPr>
-              <w:instrText xml:space="preserve"> PAGEREF _Toc242944044 \h </w:instrText>
+              <w:instrText xml:space="preserve"> PAGEREF _Toc243516500 \h </w:instrText>
             </w:r>
             <w:r>
               <w:rPr>
@@ -3702,7 +3818,7 @@
               <w14:ligatures w14:val="standardContextual"/>
             </w:rPr>
           </w:pPr>
-          <w:hyperlink w:anchor="_Toc242944045" w:history="1">
+          <w:hyperlink w:anchor="_Toc243516501" w:history="1">
             <w:r>
               <w:rPr>
                 <w:rStyle w:val="Hyperlink"/>
@@ -3726,7 +3842,7 @@
               <w:rPr>
                 <w:noProof/>
               </w:rPr>
-              <w:instrText xml:space="preserve"> PAGEREF _Toc242944045 \h </w:instrText>
+              <w:instrText xml:space="preserve"> PAGEREF _Toc243516501 \h </w:instrText>
             </w:r>
             <w:r>
               <w:rPr>
@@ -3769,7 +3885,7 @@
               <w14:ligatures w14:val="standardContextual"/>
             </w:rPr>
           </w:pPr>
-          <w:hyperlink w:anchor="_Toc242944046" w:history="1">
+          <w:hyperlink w:anchor="_Toc243516502" w:history="1">
             <w:r>
               <w:rPr>
                 <w:rStyle w:val="Hyperlink"/>
@@ -3793,7 +3909,7 @@
               <w:rPr>
                 <w:noProof/>
               </w:rPr>
-              <w:instrText xml:space="preserve"> PAGEREF _Toc242944046 \h </w:instrText>
+              <w:instrText xml:space="preserve"> PAGEREF _Toc243516502 \h </w:instrText>
             </w:r>
             <w:r>
               <w:rPr>
@@ -3836,7 +3952,7 @@
               <w14:ligatures w14:val="standardContextual"/>
             </w:rPr>
           </w:pPr>
-          <w:hyperlink w:anchor="_Toc242944047" w:history="1">
+          <w:hyperlink w:anchor="_Toc243516503" w:history="1">
             <w:r>
               <w:rPr>
                 <w:rStyle w:val="Hyperlink"/>
@@ -3860,7 +3976,7 @@
               <w:rPr>
                 <w:noProof/>
               </w:rPr>
-              <w:instrText xml:space="preserve"> PAGEREF _Toc242944047 \h </w:instrText>
+              <w:instrText xml:space="preserve"> PAGEREF _Toc243516503 \h </w:instrText>
             </w:r>
             <w:r>
               <w:rPr>
@@ -3903,7 +4019,7 @@
               <w14:ligatures w14:val="standardContextual"/>
             </w:rPr>
           </w:pPr>
-          <w:hyperlink w:anchor="_Toc242944048" w:history="1">
+          <w:hyperlink w:anchor="_Toc243516504" w:history="1">
             <w:r>
               <w:rPr>
                 <w:rStyle w:val="Hyperlink"/>
@@ -3927,7 +4043,7 @@
               <w:rPr>
                 <w:noProof/>
               </w:rPr>
-              <w:instrText xml:space="preserve"> PAGEREF _Toc242944048 \h </w:instrText>
+              <w:instrText xml:space="preserve"> PAGEREF _Toc243516504 \h </w:instrText>
             </w:r>
             <w:r>
               <w:rPr>
@@ -3970,7 +4086,7 @@
               <w14:ligatures w14:val="standardContextual"/>
             </w:rPr>
           </w:pPr>
-          <w:hyperlink w:anchor="_Toc242944049" w:history="1">
+          <w:hyperlink w:anchor="_Toc243516505" w:history="1">
             <w:r>
               <w:rPr>
                 <w:rStyle w:val="Hyperlink"/>
@@ -3994,7 +4110,7 @@
               <w:rPr>
                 <w:noProof/>
               </w:rPr>
-              <w:instrText xml:space="preserve"> PAGEREF _Toc242944049 \h </w:instrText>
+              <w:instrText xml:space="preserve"> PAGEREF _Toc243516505 \h </w:instrText>
             </w:r>
             <w:r>
               <w:rPr>
@@ -4037,7 +4153,7 @@
               <w14:ligatures w14:val="standardContextual"/>
             </w:rPr>
           </w:pPr>
-          <w:hyperlink w:anchor="_Toc242944050" w:history="1">
+          <w:hyperlink w:anchor="_Toc243516506" w:history="1">
             <w:r>
               <w:rPr>
                 <w:rStyle w:val="Hyperlink"/>
@@ -4061,7 +4177,7 @@
               <w:rPr>
                 <w:noProof/>
               </w:rPr>
-              <w:instrText xml:space="preserve"> PAGEREF _Toc242944050 \h </w:instrText>
+              <w:instrText xml:space="preserve"> PAGEREF _Toc243516506 \h </w:instrText>
             </w:r>
             <w:r>
               <w:rPr>
@@ -4104,13 +4220,13 @@
               <w14:ligatures w14:val="standardContextual"/>
             </w:rPr>
           </w:pPr>
-          <w:hyperlink w:anchor="_Toc242944051" w:history="1">
+          <w:hyperlink w:anchor="_Toc243516507" w:history="1">
             <w:r>
               <w:rPr>
                 <w:rStyle w:val="Hyperlink"/>
                 <w:noProof/>
               </w:rPr>
-              <w:t>Table 9: Results of 15 October 2026 (developer machine, commit f704d0b)</w:t>
+              <w:t>Table 9: Results of 21 October 2026 (developer machine)</w:t>
             </w:r>
             <w:r>
               <w:rPr>
@@ -4128,7 +4244,7 @@
               <w:rPr>
                 <w:noProof/>
               </w:rPr>
-              <w:instrText xml:space="preserve"> PAGEREF _Toc242944051 \h </w:instrText>
+              <w:instrText xml:space="preserve"> PAGEREF _Toc243516507 \h </w:instrText>
             </w:r>
             <w:r>
               <w:rPr>
@@ -4171,13 +4287,13 @@
               <w14:ligatures w14:val="standardContextual"/>
             </w:rPr>
           </w:pPr>
-          <w:hyperlink w:anchor="_Toc242944052" w:history="1">
+          <w:hyperlink w:anchor="_Toc243516508" w:history="1">
             <w:r>
               <w:rPr>
                 <w:rStyle w:val="Hyperlink"/>
                 <w:noProof/>
               </w:rPr>
-              <w:t>Table 10: Defects found by testing and fixed</w:t>
+              <w:t>Table 10: Results of 15 October 2026 (developer machine, commit f704d0b)</w:t>
             </w:r>
             <w:r>
               <w:rPr>
@@ -4195,7 +4311,7 @@
               <w:rPr>
                 <w:noProof/>
               </w:rPr>
-              <w:instrText xml:space="preserve"> PAGEREF _Toc242944052 \h </w:instrText>
+              <w:instrText xml:space="preserve"> PAGEREF _Toc243516508 \h </w:instrText>
             </w:r>
             <w:r>
               <w:rPr>
@@ -4238,13 +4354,13 @@
               <w14:ligatures w14:val="standardContextual"/>
             </w:rPr>
           </w:pPr>
-          <w:hyperlink w:anchor="_Toc242944053" w:history="1">
+          <w:hyperlink w:anchor="_Toc243516509" w:history="1">
             <w:r>
               <w:rPr>
                 <w:rStyle w:val="Hyperlink"/>
                 <w:noProof/>
               </w:rPr>
-              <w:t>Table 11: Known gaps</w:t>
+              <w:t>Table 11: Defects found by testing and fixed</w:t>
             </w:r>
             <w:r>
               <w:rPr>
@@ -4262,7 +4378,7 @@
               <w:rPr>
                 <w:noProof/>
               </w:rPr>
-              <w:instrText xml:space="preserve"> PAGEREF _Toc242944053 \h </w:instrText>
+              <w:instrText xml:space="preserve"> PAGEREF _Toc243516509 \h </w:instrText>
             </w:r>
             <w:r>
               <w:rPr>
@@ -4305,13 +4421,13 @@
               <w14:ligatures w14:val="standardContextual"/>
             </w:rPr>
           </w:pPr>
-          <w:hyperlink w:anchor="_Toc242944054" w:history="1">
+          <w:hyperlink w:anchor="_Toc243516510" w:history="1">
             <w:r>
               <w:rPr>
                 <w:rStyle w:val="Hyperlink"/>
                 <w:noProof/>
               </w:rPr>
-              <w:t>Table 12: Requirements to test cases</w:t>
+              <w:t>Table 12: Known gaps</w:t>
             </w:r>
             <w:r>
               <w:rPr>
@@ -4329,7 +4445,7 @@
               <w:rPr>
                 <w:noProof/>
               </w:rPr>
-              <w:instrText xml:space="preserve"> PAGEREF _Toc242944054 \h </w:instrText>
+              <w:instrText xml:space="preserve"> PAGEREF _Toc243516510 \h </w:instrText>
             </w:r>
             <w:r>
               <w:rPr>
@@ -4372,13 +4488,13 @@
               <w14:ligatures w14:val="standardContextual"/>
             </w:rPr>
           </w:pPr>
-          <w:hyperlink w:anchor="_Toc242944055" w:history="1">
+          <w:hyperlink w:anchor="_Toc243516511" w:history="1">
             <w:r>
               <w:rPr>
                 <w:rStyle w:val="Hyperlink"/>
                 <w:noProof/>
               </w:rPr>
-              <w:t>Table 13: Terms used in this document</w:t>
+              <w:t>Table 13: Requirements to test cases</w:t>
             </w:r>
             <w:r>
               <w:rPr>
@@ -4396,7 +4512,7 @@
               <w:rPr>
                 <w:noProof/>
               </w:rPr>
-              <w:instrText xml:space="preserve"> PAGEREF _Toc242944055 \h </w:instrText>
+              <w:instrText xml:space="preserve"> PAGEREF _Toc243516511 \h </w:instrText>
             </w:r>
             <w:r>
               <w:rPr>
@@ -4439,13 +4555,13 @@
               <w14:ligatures w14:val="standardContextual"/>
             </w:rPr>
           </w:pPr>
-          <w:hyperlink w:anchor="_Toc242944056" w:history="1">
+          <w:hyperlink w:anchor="_Toc243516512" w:history="1">
             <w:r>
               <w:rPr>
                 <w:rStyle w:val="Hyperlink"/>
                 <w:noProof/>
               </w:rPr>
-              <w:t>Table 14: Sources referred to in this document</w:t>
+              <w:t>Table 14: Terms used in this document</w:t>
             </w:r>
             <w:r>
               <w:rPr>
@@ -4463,7 +4579,7 @@
               <w:rPr>
                 <w:noProof/>
               </w:rPr>
-              <w:instrText xml:space="preserve"> PAGEREF _Toc242944056 \h </w:instrText>
+              <w:instrText xml:space="preserve"> PAGEREF _Toc243516512 \h </w:instrText>
             </w:r>
             <w:r>
               <w:rPr>
@@ -4481,6 +4597,73 @@
                 <w:noProof/>
               </w:rPr>
               <w:t>25</w:t>
+            </w:r>
+            <w:r>
+              <w:rPr>
+                <w:noProof/>
+              </w:rPr>
+              <w:fldChar w:fldCharType="end"/>
+            </w:r>
+          </w:hyperlink>
+        </w:p>
+        <w:p>
+          <w:pPr>
+            <w:pStyle w:val="TableofFigures"/>
+            <w:tabs>
+              <w:tab w:val="right" w:leader="dot" w:pos="9628"/>
+            </w:tabs>
+            <w:rPr>
+              <w:rFonts w:asciiTheme="minorHAnsi" w:eastAsiaTheme="minorEastAsia" w:hAnsiTheme="minorHAnsi" w:cstheme="minorBidi"/>
+              <w:noProof/>
+              <w:color w:val="auto"/>
+              <w:kern w:val="2"/>
+              <w:sz w:val="24"/>
+              <w:szCs w:val="24"/>
+              <w14:ligatures w14:val="standardContextual"/>
+            </w:rPr>
+          </w:pPr>
+          <w:hyperlink w:anchor="_Toc243516513" w:history="1">
+            <w:r>
+              <w:rPr>
+                <w:rStyle w:val="Hyperlink"/>
+                <w:noProof/>
+              </w:rPr>
+              <w:t>Table 15: Sources referred to in this document</w:t>
+            </w:r>
+            <w:r>
+              <w:rPr>
+                <w:noProof/>
+              </w:rPr>
+              <w:tab/>
+            </w:r>
+            <w:r>
+              <w:rPr>
+                <w:noProof/>
+              </w:rPr>
+              <w:fldChar w:fldCharType="begin"/>
+            </w:r>
+            <w:r>
+              <w:rPr>
+                <w:noProof/>
+              </w:rPr>
+              <w:instrText xml:space="preserve"> PAGEREF _Toc243516513 \h </w:instrText>
+            </w:r>
+            <w:r>
+              <w:rPr>
+                <w:noProof/>
+              </w:rPr>
+            </w:r>
+            <w:r>
+              <w:rPr>
+                <w:noProof/>
+              </w:rPr>
+              <w:fldChar w:fldCharType="separate"/>
+            </w:r>
+            <w:r>
+              <w:rPr>
+                <w:noProof/>
+              </w:rPr>
+              <w:t>26</w:t>
             </w:r>
             <w:r>
               <w:rPr>
@@ -4504,7 +4687,7 @@
         <w:keepLines/>
         <w:pageBreakBefore/>
       </w:pPr>
-      <w:bookmarkStart w:id="0" w:name="_Toc242944020"/>
+      <w:bookmarkStart w:id="0" w:name="_Toc243516476"/>
       <w:r>
         <w:lastRenderedPageBreak/>
         <w:t>1 Introduction</w:t>
@@ -4517,7 +4700,7 @@
         <w:keepNext/>
         <w:keepLines/>
       </w:pPr>
-      <w:bookmarkStart w:id="1" w:name="_Toc242944021"/>
+      <w:bookmarkStart w:id="1" w:name="_Toc243516477"/>
       <w:r>
         <w:t>1.1 Purpose</w:t>
       </w:r>
@@ -4528,10 +4711,7 @@
         <w:spacing w:after="120"/>
       </w:pPr>
       <w:r>
-        <w:t xml:space="preserve">This document states how ZedPath is tested, what is tested, on what, and with what result. It follows the </w:t>
-      </w:r>
-      <w:r>
-        <w:t>structure of IEEE 829 and ISO/IEC/IEEE 29119-3 (test plan and test summary content), scaled to a three-week buildathon product. It also gives the matrix from requirement to test case that ZP-DOC-00 requires of this document.</w:t>
+        <w:t>This document states how ZedPath is tested, what is tested, on what, and with what result. It follows the structure of IEEE 829 and ISO/IEC/IEEE 29119-3 (test plan and test summary content), scaled to a three-week buildathon product. It also gives the matrix from requirement to test case that ZP-DOC-00 requires of this document.</w:t>
       </w:r>
     </w:p>
     <w:p>
@@ -4540,7 +4720,7 @@
         <w:keepNext/>
         <w:keepLines/>
       </w:pPr>
-      <w:bookmarkStart w:id="2" w:name="_Toc242944022"/>
+      <w:bookmarkStart w:id="2" w:name="_Toc243516478"/>
       <w:r>
         <w:t>1.2 Scope</w:t>
       </w:r>
@@ -4551,10 +4731,10 @@
         <w:spacing w:after="120"/>
       </w:pPr>
       <w:r>
-        <w:t xml:space="preserve">All software of Releases R1 and R2 as live on 11 October 2026, and as built on 15 October 2026 (VR2 and CR-007 to </w:t>
+        <w:t xml:space="preserve">All software of Releases R1 and R2 as live on 11 October 2026, and as built on 15 October 2026 (VR2 and CR-007 to CR-010): the React single-page app, the Hono API in one Cloudflare Worker, the D1 database and its migrations 0001 to 0012, the group-room Durable Object, Ask ZedPath, and the project's safety tooling (deploy guard and leak scanner). Out of scope: features not yet built (results-photo reading, curator review queue, Gazette job, share card, teacher view) and third-party services </w:t>
       </w:r>
       <w:r>
-        <w:t>CR-010): the React single-page app, the Hono API in one Cloudflare Worker, the D1 database and its migrations 0001 to 0012, the group-room Durable Object, Ask ZedPath, and the project's safety tooling (deploy guard and leak scanner). Out of scope: features not yet built (results-photo reading, curator review queue, Gazette job, share card, teacher view) and third-party services themselves (Gemini, Cloudflare platform), which are tested only through ZedPath's handling of their answers.</w:t>
+        <w:t>themselves (Gemini, Cloudflare platform), which are tested only through ZedPath's handling of their answers.</w:t>
       </w:r>
     </w:p>
     <w:p>
@@ -4563,7 +4743,7 @@
         <w:keepNext/>
         <w:keepLines/>
       </w:pPr>
-      <w:bookmarkStart w:id="3" w:name="_Toc242944023"/>
+      <w:bookmarkStart w:id="3" w:name="_Toc243516479"/>
       <w:r>
         <w:t>1.3 Intended audience</w:t>
       </w:r>
@@ -4583,7 +4763,7 @@
         <w:keepNext/>
         <w:keepLines/>
       </w:pPr>
-      <w:bookmarkStart w:id="4" w:name="_Toc242944024"/>
+      <w:bookmarkStart w:id="4" w:name="_Toc243516480"/>
       <w:r>
         <w:t>1.4 Relationship to other documents</w:t>
       </w:r>
@@ -4594,7 +4774,7 @@
         <w:pStyle w:val="Caption"/>
         <w:keepNext/>
       </w:pPr>
-      <w:bookmarkStart w:id="5" w:name="_Toc242944043"/>
+      <w:bookmarkStart w:id="5" w:name="_Toc243516499"/>
       <w:r>
         <w:t xml:space="preserve">Table </w:t>
       </w:r>
@@ -5112,7 +5292,7 @@
         <w:keepLines/>
         <w:pageBreakBefore/>
       </w:pPr>
-      <w:bookmarkStart w:id="6" w:name="_Toc242944025"/>
+      <w:bookmarkStart w:id="6" w:name="_Toc243516481"/>
       <w:r>
         <w:lastRenderedPageBreak/>
         <w:t>2 Test strategy</w:t>
@@ -5125,7 +5305,7 @@
         <w:keepNext/>
         <w:keepLines/>
       </w:pPr>
-      <w:bookmarkStart w:id="7" w:name="_Toc242944026"/>
+      <w:bookmarkStart w:id="7" w:name="_Toc243516482"/>
       <w:r>
         <w:t>2.1 Test levels</w:t>
       </w:r>
@@ -5136,7 +5316,7 @@
         <w:pStyle w:val="Caption"/>
         <w:keepNext/>
       </w:pPr>
-      <w:bookmarkStart w:id="8" w:name="_Toc242944044"/>
+      <w:bookmarkStart w:id="8" w:name="_Toc243516500"/>
       <w:r>
         <w:t xml:space="preserve">Table </w:t>
       </w:r>
@@ -6378,7 +6558,7 @@
         <w:keepNext/>
         <w:keepLines/>
       </w:pPr>
-      <w:bookmarkStart w:id="9" w:name="_Toc242944027"/>
+      <w:bookmarkStart w:id="9" w:name="_Toc243516483"/>
       <w:r>
         <w:t>2.2 Test types</w:t>
       </w:r>
@@ -6389,7 +6569,7 @@
         <w:pStyle w:val="Caption"/>
         <w:keepNext/>
       </w:pPr>
-      <w:bookmarkStart w:id="10" w:name="_Toc242944045"/>
+      <w:bookmarkStart w:id="10" w:name="_Toc243516501"/>
       <w:r>
         <w:t xml:space="preserve">Table </w:t>
       </w:r>
@@ -7177,7 +7357,7 @@
         <w:keepNext/>
         <w:keepLines/>
       </w:pPr>
-      <w:bookmarkStart w:id="11" w:name="_Toc242944028"/>
+      <w:bookmarkStart w:id="11" w:name="_Toc243516484"/>
       <w:r>
         <w:t>2.3 Approach</w:t>
       </w:r>
@@ -7210,7 +7390,7 @@
         <w:keepLines/>
         <w:pageBreakBefore/>
       </w:pPr>
-      <w:bookmarkStart w:id="12" w:name="_Toc242944029"/>
+      <w:bookmarkStart w:id="12" w:name="_Toc243516485"/>
       <w:r>
         <w:lastRenderedPageBreak/>
         <w:t>3 Test environment</w:t>
@@ -7222,7 +7402,7 @@
         <w:pStyle w:val="Caption"/>
         <w:keepNext/>
       </w:pPr>
-      <w:bookmarkStart w:id="13" w:name="_Toc242944046"/>
+      <w:bookmarkStart w:id="13" w:name="_Toc243516502"/>
       <w:r>
         <w:t xml:space="preserve">Table </w:t>
       </w:r>
@@ -7885,7 +8065,7 @@
         <w:keepLines/>
         <w:pageBreakBefore/>
       </w:pPr>
-      <w:bookmarkStart w:id="14" w:name="_Toc242944030"/>
+      <w:bookmarkStart w:id="14" w:name="_Toc243516486"/>
       <w:r>
         <w:lastRenderedPageBreak/>
         <w:t>4 Entry and exit criteria</w:t>
@@ -7898,7 +8078,7 @@
         <w:keepNext/>
         <w:keepLines/>
       </w:pPr>
-      <w:bookmarkStart w:id="15" w:name="_Toc242944031"/>
+      <w:bookmarkStart w:id="15" w:name="_Toc243516487"/>
       <w:r>
         <w:t>4.1 Entry criteria</w:t>
       </w:r>
@@ -7918,7 +8098,7 @@
         <w:keepNext/>
         <w:keepLines/>
       </w:pPr>
-      <w:bookmarkStart w:id="16" w:name="_Toc242944032"/>
+      <w:bookmarkStart w:id="16" w:name="_Toc243516488"/>
       <w:r>
         <w:t>4.2 Exit criteria (Definition of Done)</w:t>
       </w:r>
@@ -8126,7 +8306,7 @@
         <w:keepNext/>
         <w:keepLines/>
       </w:pPr>
-      <w:bookmarkStart w:id="17" w:name="_Toc242944033"/>
+      <w:bookmarkStart w:id="17" w:name="_Toc243516489"/>
       <w:r>
         <w:t>4.3 </w:t>
       </w:r>
@@ -8150,7 +8330,7 @@
         <w:keepLines/>
         <w:pageBreakBefore/>
       </w:pPr>
-      <w:bookmarkStart w:id="18" w:name="_Toc242944034"/>
+      <w:bookmarkStart w:id="18" w:name="_Toc243516490"/>
       <w:r>
         <w:lastRenderedPageBreak/>
         <w:t>5 Test items and features</w:t>
@@ -8162,7 +8342,7 @@
         <w:pStyle w:val="Caption"/>
         <w:keepNext/>
       </w:pPr>
-      <w:bookmarkStart w:id="19" w:name="_Toc242944047"/>
+      <w:bookmarkStart w:id="19" w:name="_Toc243516503"/>
       <w:r>
         <w:t xml:space="preserve">Table </w:t>
       </w:r>
@@ -11019,7 +11199,7 @@
         <w:keepLines/>
         <w:pageBreakBefore/>
       </w:pPr>
-      <w:bookmarkStart w:id="20" w:name="_Toc242944035"/>
+      <w:bookmarkStart w:id="20" w:name="_Toc243516491"/>
       <w:r>
         <w:lastRenderedPageBreak/>
         <w:t>6 Test case catalogue</w:t>
@@ -11051,7 +11231,7 @@
         <w:pStyle w:val="Caption"/>
         <w:keepNext/>
       </w:pPr>
-      <w:bookmarkStart w:id="21" w:name="_Toc242944048"/>
+      <w:bookmarkStart w:id="21" w:name="_Toc243516504"/>
       <w:r>
         <w:t xml:space="preserve">Table </w:t>
       </w:r>
@@ -17947,6 +18127,176 @@
           </w:p>
         </w:tc>
       </w:tr>
+      <w:tr>
+        <w:tblPrEx>
+          <w:tblCellMar>
+            <w:top w:w="0" w:type="dxa"/>
+            <w:bottom w:w="0" w:type="dxa"/>
+          </w:tblCellMar>
+        </w:tblPrEx>
+        <w:trPr>
+          <w:cantSplit/>
+        </w:trPr>
+        <w:tc>
+          <w:tcPr>
+            <w:tcW w:w="741" w:type="dxa"/>
+            <w:tcBorders>
+              <w:top w:val="single" w:sz="4" w:space="0" w:color="C9D3D0"/>
+              <w:left w:val="single" w:sz="4" w:space="0" w:color="C9D3D0"/>
+              <w:bottom w:val="single" w:sz="4" w:space="0" w:color="C9D3D0"/>
+              <w:right w:val="single" w:sz="4" w:space="0" w:color="C9D3D0"/>
+            </w:tcBorders>
+            <w:tcMar>
+              <w:top w:w="50" w:type="dxa"/>
+              <w:left w:w="100" w:type="dxa"/>
+              <w:bottom w:w="50" w:type="dxa"/>
+              <w:right w:w="100" w:type="dxa"/>
+            </w:tcMar>
+            <w:vAlign w:val="center"/>
+          </w:tcPr>
+          <w:p>
+            <w:pPr>
+              <w:spacing w:line="252" w:lineRule="auto"/>
+            </w:pPr>
+            <w:r>
+              <w:rPr>
+                <w:sz w:val="19"/>
+                <w:szCs w:val="19"/>
+              </w:rPr>
+              <w:t>TC-139</w:t>
+            </w:r>
+          </w:p>
+        </w:tc>
+        <w:tc>
+          <w:tcPr>
+            <w:tcW w:w="1266" w:type="dxa"/>
+            <w:tcBorders>
+              <w:top w:val="single" w:sz="4" w:space="0" w:color="C9D3D0"/>
+              <w:left w:val="single" w:sz="4" w:space="0" w:color="C9D3D0"/>
+              <w:bottom w:val="single" w:sz="4" w:space="0" w:color="C9D3D0"/>
+              <w:right w:val="single" w:sz="4" w:space="0" w:color="C9D3D0"/>
+            </w:tcBorders>
+            <w:tcMar>
+              <w:top w:w="50" w:type="dxa"/>
+              <w:left w:w="100" w:type="dxa"/>
+              <w:bottom w:w="50" w:type="dxa"/>
+              <w:right w:w="100" w:type="dxa"/>
+            </w:tcMar>
+            <w:vAlign w:val="center"/>
+          </w:tcPr>
+          <w:p>
+            <w:pPr>
+              <w:spacing w:line="252" w:lineRule="auto"/>
+            </w:pPr>
+            <w:r>
+              <w:rPr>
+                <w:sz w:val="19"/>
+                <w:szCs w:val="19"/>
+              </w:rPr>
+              <w:t>Desktop side menu</w:t>
+            </w:r>
+          </w:p>
+        </w:tc>
+        <w:tc>
+          <w:tcPr>
+            <w:tcW w:w="3103" w:type="dxa"/>
+            <w:tcBorders>
+              <w:top w:val="single" w:sz="4" w:space="0" w:color="C9D3D0"/>
+              <w:left w:val="single" w:sz="4" w:space="0" w:color="C9D3D0"/>
+              <w:bottom w:val="single" w:sz="4" w:space="0" w:color="C9D3D0"/>
+              <w:right w:val="single" w:sz="4" w:space="0" w:color="C9D3D0"/>
+            </w:tcBorders>
+            <w:tcMar>
+              <w:top w:w="50" w:type="dxa"/>
+              <w:left w:w="100" w:type="dxa"/>
+              <w:bottom w:w="50" w:type="dxa"/>
+              <w:right w:w="100" w:type="dxa"/>
+            </w:tcMar>
+            <w:vAlign w:val="center"/>
+          </w:tcPr>
+          <w:p>
+            <w:pPr>
+              <w:spacing w:line="252" w:lineRule="auto"/>
+            </w:pPr>
+            <w:r>
+              <w:rPr>
+                <w:rFonts w:ascii="Consolas" w:eastAsia="Consolas" w:hAnsi="Consolas" w:cs="Consolas"/>
+                <w:sz w:val="17"/>
+                <w:szCs w:val="17"/>
+                <w:shd w:val="clear" w:color="auto" w:fill="F2F4F3"/>
+              </w:rPr>
+              <w:t>src/nav-pref.test.ts</w:t>
+            </w:r>
+            <w:r>
+              <w:rPr>
+                <w:sz w:val="19"/>
+                <w:szCs w:val="19"/>
+              </w:rPr>
+              <w:t xml:space="preserve"> (4)</w:t>
+            </w:r>
+          </w:p>
+        </w:tc>
+        <w:tc>
+          <w:tcPr>
+            <w:tcW w:w="2264" w:type="dxa"/>
+            <w:tcBorders>
+              <w:top w:val="single" w:sz="4" w:space="0" w:color="C9D3D0"/>
+              <w:left w:val="single" w:sz="4" w:space="0" w:color="C9D3D0"/>
+              <w:bottom w:val="single" w:sz="4" w:space="0" w:color="C9D3D0"/>
+              <w:right w:val="single" w:sz="4" w:space="0" w:color="C9D3D0"/>
+            </w:tcBorders>
+            <w:tcMar>
+              <w:top w:w="50" w:type="dxa"/>
+              <w:left w:w="100" w:type="dxa"/>
+              <w:bottom w:w="50" w:type="dxa"/>
+              <w:right w:w="100" w:type="dxa"/>
+            </w:tcMar>
+            <w:vAlign w:val="center"/>
+          </w:tcPr>
+          <w:p>
+            <w:pPr>
+              <w:spacing w:line="252" w:lineRule="auto"/>
+            </w:pPr>
+            <w:r>
+              <w:rPr>
+                <w:sz w:val="19"/>
+                <w:szCs w:val="19"/>
+              </w:rPr>
+              <w:t>Open by default (pinned); collapsed and open remembered; open and no error when storage is blocked; "Clear this phone" forgets it, clearing student data keeps it</w:t>
+            </w:r>
+          </w:p>
+        </w:tc>
+        <w:tc>
+          <w:tcPr>
+            <w:tcW w:w="2264" w:type="dxa"/>
+            <w:tcBorders>
+              <w:top w:val="single" w:sz="4" w:space="0" w:color="C9D3D0"/>
+              <w:left w:val="single" w:sz="4" w:space="0" w:color="C9D3D0"/>
+              <w:bottom w:val="single" w:sz="4" w:space="0" w:color="C9D3D0"/>
+              <w:right w:val="single" w:sz="4" w:space="0" w:color="C9D3D0"/>
+            </w:tcBorders>
+            <w:tcMar>
+              <w:top w:w="50" w:type="dxa"/>
+              <w:left w:w="100" w:type="dxa"/>
+              <w:bottom w:w="50" w:type="dxa"/>
+              <w:right w:w="100" w:type="dxa"/>
+            </w:tcMar>
+            <w:vAlign w:val="center"/>
+          </w:tcPr>
+          <w:p>
+            <w:pPr>
+              <w:spacing w:line="252" w:lineRule="auto"/>
+            </w:pPr>
+            <w:r>
+              <w:rPr>
+                <w:sz w:val="19"/>
+                <w:szCs w:val="19"/>
+              </w:rPr>
+              <w:t>ZP-DOC-07 Desktop layout</w:t>
+            </w:r>
+          </w:p>
+        </w:tc>
+      </w:tr>
     </w:tbl>
     <w:p>
       <w:pPr>
@@ -17960,13 +18310,10 @@
         <w:keepLines/>
         <w:pageBreakBefore/>
       </w:pPr>
-      <w:bookmarkStart w:id="22" w:name="_Toc242944036"/>
+      <w:bookmarkStart w:id="22" w:name="_Toc243516492"/>
       <w:r>
         <w:lastRenderedPageBreak/>
-        <w:t>7 </w:t>
-      </w:r>
-      <w:r>
-        <w:t>Security tests</w:t>
+        <w:t>7 Security tests</w:t>
       </w:r>
       <w:bookmarkEnd w:id="22"/>
     </w:p>
@@ -17975,7 +18322,7 @@
         <w:pStyle w:val="Caption"/>
         <w:keepNext/>
       </w:pPr>
-      <w:bookmarkStart w:id="23" w:name="_Toc242944049"/>
+      <w:bookmarkStart w:id="23" w:name="_Toc243516505"/>
       <w:r>
         <w:t xml:space="preserve">Table </w:t>
       </w:r>
@@ -20508,7 +20855,10 @@
         <w:t>Security audit run-1 (15 October 2026).</w:t>
       </w:r>
       <w:r>
-        <w:t xml:space="preserve"> The Cloudflare security-audit skill (37 agents, report kept outside the public repository) produced 0 confirmed findings, 17 leads needing validation and 1 rejected lead. Every lead except lead 9 (accepted risk: the log-in limit stays per username because school laboratories share an address; a Turnstile human check is planned) was fixed on 15 October 2026. The method, each lead, its fix and its test are listed in the ZP-DOC-08 Test Summary Report.</w:t>
+        <w:t xml:space="preserve"> The Cloudflare security-audit skill (37 agents, report kept outside the public repository) produced 0 confirmed findings, 17 leads needing validation and 1 rejected lead. Every lead except lead 9 (accepted risk: the log-in limit stays per username because school laboratories share an address; a Turnstile </w:t>
+      </w:r>
+      <w:r>
+        <w:t>human check is planned) was fixed on 15 October 2026. The method, each lead, its fix and its test are listed in the ZP-DOC-08 Test Summary Report.</w:t>
       </w:r>
     </w:p>
     <w:p>
@@ -20518,7 +20868,7 @@
         <w:keepLines/>
         <w:pageBreakBefore/>
       </w:pPr>
-      <w:bookmarkStart w:id="24" w:name="_Toc242944037"/>
+      <w:bookmarkStart w:id="24" w:name="_Toc243516493"/>
       <w:r>
         <w:lastRenderedPageBreak/>
         <w:t>8 Results summary</w:t>
@@ -20550,7 +20900,7 @@
         <w:pStyle w:val="Caption"/>
         <w:keepNext/>
       </w:pPr>
-      <w:bookmarkStart w:id="25" w:name="_Toc242944050"/>
+      <w:bookmarkStart w:id="25" w:name="_Toc243516506"/>
       <w:r>
         <w:t xml:space="preserve">Table </w:t>
       </w:r>
@@ -21337,10 +21687,10 @@
         <w:spacing w:after="120"/>
       </w:pPr>
       <w:r>
-        <w:t xml:space="preserve">Automated test count over the build: 79 (5 October), 126, 152, 164, 179, 185 (11 October), 515 with 6 expected-fail </w:t>
+        <w:t xml:space="preserve">Automated test count over the build: 79 (5 October), 126, 152, 164, 179, 185 (11 October), 515 with 6 expected-fail and 21 opt-in (12 to 15 October, after the test campaign and CR-007 to CR-009), 532 with 0 expected-fail and 21 opt-in </w:t>
       </w:r>
       <w:r>
-        <w:t>and 21 opt-in (12 to 15 October, after the test campaign and CR-007 to CR-009), 532 with 0 expected-fail and 21 opt-in (15 October, after the hardening of CR-010).</w:t>
+        <w:t>(15 October, after the hardening of CR-010), 536 (21 October, after VR3 and the desktop side menu, TC-139).</w:t>
       </w:r>
     </w:p>
     <w:p>
@@ -21348,7 +21698,7 @@
         <w:pStyle w:val="Caption"/>
         <w:keepNext/>
       </w:pPr>
-      <w:bookmarkStart w:id="26" w:name="_Toc242944051"/>
+      <w:bookmarkStart w:id="26" w:name="_Toc243516507"/>
       <w:r>
         <w:t xml:space="preserve">Table </w:t>
       </w:r>
@@ -21371,9 +21721,525 @@
         <w:fldChar w:fldCharType="end"/>
       </w:r>
       <w:r>
+        <w:t>: Results of 21 October 2026 (developer machine)</w:t>
+      </w:r>
+      <w:bookmarkEnd w:id="26"/>
+    </w:p>
+    <w:tbl>
+      <w:tblPr>
+        <w:tblW w:w="9638" w:type="dxa"/>
+        <w:tblBorders>
+          <w:top w:val="single" w:sz="4" w:space="0" w:color="auto"/>
+          <w:left w:val="single" w:sz="4" w:space="0" w:color="auto"/>
+          <w:bottom w:val="single" w:sz="4" w:space="0" w:color="auto"/>
+          <w:right w:val="single" w:sz="4" w:space="0" w:color="auto"/>
+          <w:insideH w:val="single" w:sz="4" w:space="0" w:color="auto"/>
+          <w:insideV w:val="single" w:sz="4" w:space="0" w:color="auto"/>
+        </w:tblBorders>
+        <w:tblCellMar>
+          <w:left w:w="10" w:type="dxa"/>
+          <w:right w:w="10" w:type="dxa"/>
+        </w:tblCellMar>
+        <w:tblLook w:val="0000" w:firstRow="0" w:lastRow="0" w:firstColumn="0" w:lastColumn="0" w:noHBand="0" w:noVBand="0"/>
+      </w:tblPr>
+      <w:tblGrid>
+        <w:gridCol w:w="4819"/>
+        <w:gridCol w:w="4819"/>
+      </w:tblGrid>
+      <w:tr>
+        <w:tblPrEx>
+          <w:tblCellMar>
+            <w:top w:w="0" w:type="dxa"/>
+            <w:bottom w:w="0" w:type="dxa"/>
+          </w:tblCellMar>
+        </w:tblPrEx>
+        <w:trPr>
+          <w:cantSplit/>
+          <w:tblHeader/>
+        </w:trPr>
+        <w:tc>
+          <w:tcPr>
+            <w:tcW w:w="4819" w:type="dxa"/>
+            <w:tcBorders>
+              <w:top w:val="single" w:sz="4" w:space="0" w:color="C9D3D0"/>
+              <w:left w:val="single" w:sz="4" w:space="0" w:color="C9D3D0"/>
+              <w:bottom w:val="single" w:sz="4" w:space="0" w:color="C9D3D0"/>
+              <w:right w:val="single" w:sz="4" w:space="0" w:color="C9D3D0"/>
+            </w:tcBorders>
+            <w:shd w:val="clear" w:color="auto" w:fill="006B5F"/>
+            <w:tcMar>
+              <w:top w:w="50" w:type="dxa"/>
+              <w:left w:w="100" w:type="dxa"/>
+              <w:bottom w:w="50" w:type="dxa"/>
+              <w:right w:w="100" w:type="dxa"/>
+            </w:tcMar>
+            <w:vAlign w:val="center"/>
+          </w:tcPr>
+          <w:p>
+            <w:pPr>
+              <w:spacing w:line="252" w:lineRule="auto"/>
+            </w:pPr>
+            <w:r>
+              <w:rPr>
+                <w:b/>
+                <w:bCs/>
+                <w:color w:val="FFFFFF"/>
+                <w:sz w:val="19"/>
+                <w:szCs w:val="19"/>
+              </w:rPr>
+              <w:t>Check</w:t>
+            </w:r>
+          </w:p>
+        </w:tc>
+        <w:tc>
+          <w:tcPr>
+            <w:tcW w:w="4819" w:type="dxa"/>
+            <w:tcBorders>
+              <w:top w:val="single" w:sz="4" w:space="0" w:color="C9D3D0"/>
+              <w:left w:val="single" w:sz="4" w:space="0" w:color="C9D3D0"/>
+              <w:bottom w:val="single" w:sz="4" w:space="0" w:color="C9D3D0"/>
+              <w:right w:val="single" w:sz="4" w:space="0" w:color="C9D3D0"/>
+            </w:tcBorders>
+            <w:shd w:val="clear" w:color="auto" w:fill="006B5F"/>
+            <w:tcMar>
+              <w:top w:w="50" w:type="dxa"/>
+              <w:left w:w="100" w:type="dxa"/>
+              <w:bottom w:w="50" w:type="dxa"/>
+              <w:right w:w="100" w:type="dxa"/>
+            </w:tcMar>
+            <w:vAlign w:val="center"/>
+          </w:tcPr>
+          <w:p>
+            <w:pPr>
+              <w:spacing w:line="252" w:lineRule="auto"/>
+            </w:pPr>
+            <w:r>
+              <w:rPr>
+                <w:b/>
+                <w:bCs/>
+                <w:color w:val="FFFFFF"/>
+                <w:sz w:val="19"/>
+                <w:szCs w:val="19"/>
+              </w:rPr>
+              <w:t>Result</w:t>
+            </w:r>
+          </w:p>
+        </w:tc>
+      </w:tr>
+      <w:tr>
+        <w:tblPrEx>
+          <w:tblCellMar>
+            <w:top w:w="0" w:type="dxa"/>
+            <w:bottom w:w="0" w:type="dxa"/>
+          </w:tblCellMar>
+        </w:tblPrEx>
+        <w:trPr>
+          <w:cantSplit/>
+        </w:trPr>
+        <w:tc>
+          <w:tcPr>
+            <w:tcW w:w="4819" w:type="dxa"/>
+            <w:tcBorders>
+              <w:top w:val="single" w:sz="4" w:space="0" w:color="C9D3D0"/>
+              <w:left w:val="single" w:sz="4" w:space="0" w:color="C9D3D0"/>
+              <w:bottom w:val="single" w:sz="4" w:space="0" w:color="C9D3D0"/>
+              <w:right w:val="single" w:sz="4" w:space="0" w:color="C9D3D0"/>
+            </w:tcBorders>
+            <w:tcMar>
+              <w:top w:w="50" w:type="dxa"/>
+              <w:left w:w="100" w:type="dxa"/>
+              <w:bottom w:w="50" w:type="dxa"/>
+              <w:right w:w="100" w:type="dxa"/>
+            </w:tcMar>
+            <w:vAlign w:val="center"/>
+          </w:tcPr>
+          <w:p>
+            <w:pPr>
+              <w:spacing w:line="252" w:lineRule="auto"/>
+            </w:pPr>
+            <w:r>
+              <w:rPr>
+                <w:rFonts w:ascii="Consolas" w:eastAsia="Consolas" w:hAnsi="Consolas" w:cs="Consolas"/>
+                <w:sz w:val="17"/>
+                <w:szCs w:val="17"/>
+                <w:shd w:val="clear" w:color="auto" w:fill="F2F4F3"/>
+              </w:rPr>
+              <w:t>npx vitest run</w:t>
+            </w:r>
+          </w:p>
+        </w:tc>
+        <w:tc>
+          <w:tcPr>
+            <w:tcW w:w="4819" w:type="dxa"/>
+            <w:tcBorders>
+              <w:top w:val="single" w:sz="4" w:space="0" w:color="C9D3D0"/>
+              <w:left w:val="single" w:sz="4" w:space="0" w:color="C9D3D0"/>
+              <w:bottom w:val="single" w:sz="4" w:space="0" w:color="C9D3D0"/>
+              <w:right w:val="single" w:sz="4" w:space="0" w:color="C9D3D0"/>
+            </w:tcBorders>
+            <w:tcMar>
+              <w:top w:w="50" w:type="dxa"/>
+              <w:left w:w="100" w:type="dxa"/>
+              <w:bottom w:w="50" w:type="dxa"/>
+              <w:right w:w="100" w:type="dxa"/>
+            </w:tcMar>
+            <w:vAlign w:val="center"/>
+          </w:tcPr>
+          <w:p>
+            <w:pPr>
+              <w:spacing w:line="252" w:lineRule="auto"/>
+            </w:pPr>
+            <w:r>
+              <w:rPr>
+                <w:b/>
+                <w:bCs/>
+                <w:sz w:val="19"/>
+                <w:szCs w:val="19"/>
+              </w:rPr>
+              <w:t>35 test files (34 passed, 1 opt-in skipped); 557 tests: 536 passed, 0 failed, 0 expected-fail, 21 skipped (the opt-in CPU budget, TC-131)</w:t>
+            </w:r>
+          </w:p>
+        </w:tc>
+      </w:tr>
+      <w:tr>
+        <w:tblPrEx>
+          <w:tblCellMar>
+            <w:top w:w="0" w:type="dxa"/>
+            <w:bottom w:w="0" w:type="dxa"/>
+          </w:tblCellMar>
+        </w:tblPrEx>
+        <w:trPr>
+          <w:cantSplit/>
+        </w:trPr>
+        <w:tc>
+          <w:tcPr>
+            <w:tcW w:w="4819" w:type="dxa"/>
+            <w:tcBorders>
+              <w:top w:val="single" w:sz="4" w:space="0" w:color="C9D3D0"/>
+              <w:left w:val="single" w:sz="4" w:space="0" w:color="C9D3D0"/>
+              <w:bottom w:val="single" w:sz="4" w:space="0" w:color="C9D3D0"/>
+              <w:right w:val="single" w:sz="4" w:space="0" w:color="C9D3D0"/>
+            </w:tcBorders>
+            <w:shd w:val="clear" w:color="auto" w:fill="F3F8F6"/>
+            <w:tcMar>
+              <w:top w:w="50" w:type="dxa"/>
+              <w:left w:w="100" w:type="dxa"/>
+              <w:bottom w:w="50" w:type="dxa"/>
+              <w:right w:w="100" w:type="dxa"/>
+            </w:tcMar>
+            <w:vAlign w:val="center"/>
+          </w:tcPr>
+          <w:p>
+            <w:pPr>
+              <w:spacing w:line="252" w:lineRule="auto"/>
+            </w:pPr>
+            <w:r>
+              <w:rPr>
+                <w:rFonts w:ascii="Consolas" w:eastAsia="Consolas" w:hAnsi="Consolas" w:cs="Consolas"/>
+                <w:sz w:val="17"/>
+                <w:szCs w:val="17"/>
+                <w:shd w:val="clear" w:color="auto" w:fill="F2F4F3"/>
+              </w:rPr>
+              <w:t>npx tsc -b</w:t>
+            </w:r>
+          </w:p>
+        </w:tc>
+        <w:tc>
+          <w:tcPr>
+            <w:tcW w:w="4819" w:type="dxa"/>
+            <w:tcBorders>
+              <w:top w:val="single" w:sz="4" w:space="0" w:color="C9D3D0"/>
+              <w:left w:val="single" w:sz="4" w:space="0" w:color="C9D3D0"/>
+              <w:bottom w:val="single" w:sz="4" w:space="0" w:color="C9D3D0"/>
+              <w:right w:val="single" w:sz="4" w:space="0" w:color="C9D3D0"/>
+            </w:tcBorders>
+            <w:shd w:val="clear" w:color="auto" w:fill="F3F8F6"/>
+            <w:tcMar>
+              <w:top w:w="50" w:type="dxa"/>
+              <w:left w:w="100" w:type="dxa"/>
+              <w:bottom w:w="50" w:type="dxa"/>
+              <w:right w:w="100" w:type="dxa"/>
+            </w:tcMar>
+            <w:vAlign w:val="center"/>
+          </w:tcPr>
+          <w:p>
+            <w:pPr>
+              <w:spacing w:line="252" w:lineRule="auto"/>
+            </w:pPr>
+            <w:r>
+              <w:rPr>
+                <w:sz w:val="19"/>
+                <w:szCs w:val="19"/>
+              </w:rPr>
+              <w:t>Exit code 0, no errors</w:t>
+            </w:r>
+          </w:p>
+        </w:tc>
+      </w:tr>
+      <w:tr>
+        <w:tblPrEx>
+          <w:tblCellMar>
+            <w:top w:w="0" w:type="dxa"/>
+            <w:bottom w:w="0" w:type="dxa"/>
+          </w:tblCellMar>
+        </w:tblPrEx>
+        <w:trPr>
+          <w:cantSplit/>
+        </w:trPr>
+        <w:tc>
+          <w:tcPr>
+            <w:tcW w:w="4819" w:type="dxa"/>
+            <w:tcBorders>
+              <w:top w:val="single" w:sz="4" w:space="0" w:color="C9D3D0"/>
+              <w:left w:val="single" w:sz="4" w:space="0" w:color="C9D3D0"/>
+              <w:bottom w:val="single" w:sz="4" w:space="0" w:color="C9D3D0"/>
+              <w:right w:val="single" w:sz="4" w:space="0" w:color="C9D3D0"/>
+            </w:tcBorders>
+            <w:tcMar>
+              <w:top w:w="50" w:type="dxa"/>
+              <w:left w:w="100" w:type="dxa"/>
+              <w:bottom w:w="50" w:type="dxa"/>
+              <w:right w:w="100" w:type="dxa"/>
+            </w:tcMar>
+            <w:vAlign w:val="center"/>
+          </w:tcPr>
+          <w:p>
+            <w:pPr>
+              <w:spacing w:line="252" w:lineRule="auto"/>
+            </w:pPr>
+            <w:r>
+              <w:rPr>
+                <w:rFonts w:ascii="Consolas" w:eastAsia="Consolas" w:hAnsi="Consolas" w:cs="Consolas"/>
+                <w:sz w:val="17"/>
+                <w:szCs w:val="17"/>
+                <w:shd w:val="clear" w:color="auto" w:fill="F2F4F3"/>
+              </w:rPr>
+              <w:t>bash .claude/hooks/test-guard.sh</w:t>
+            </w:r>
+          </w:p>
+        </w:tc>
+        <w:tc>
+          <w:tcPr>
+            <w:tcW w:w="4819" w:type="dxa"/>
+            <w:tcBorders>
+              <w:top w:val="single" w:sz="4" w:space="0" w:color="C9D3D0"/>
+              <w:left w:val="single" w:sz="4" w:space="0" w:color="C9D3D0"/>
+              <w:bottom w:val="single" w:sz="4" w:space="0" w:color="C9D3D0"/>
+              <w:right w:val="single" w:sz="4" w:space="0" w:color="C9D3D0"/>
+            </w:tcBorders>
+            <w:tcMar>
+              <w:top w:w="50" w:type="dxa"/>
+              <w:left w:w="100" w:type="dxa"/>
+              <w:bottom w:w="50" w:type="dxa"/>
+              <w:right w:w="100" w:type="dxa"/>
+            </w:tcMar>
+            <w:vAlign w:val="center"/>
+          </w:tcPr>
+          <w:p>
+            <w:pPr>
+              <w:spacing w:line="252" w:lineRule="auto"/>
+            </w:pPr>
+            <w:r>
+              <w:rPr>
+                <w:b/>
+                <w:bCs/>
+                <w:sz w:val="19"/>
+                <w:szCs w:val="19"/>
+              </w:rPr>
+              <w:t>40 passed, 0 failed</w:t>
+            </w:r>
+            <w:r>
+              <w:rPr>
+                <w:sz w:val="19"/>
+                <w:szCs w:val="19"/>
+              </w:rPr>
+              <w:t xml:space="preserve"> of 40</w:t>
+            </w:r>
+          </w:p>
+        </w:tc>
+      </w:tr>
+      <w:tr>
+        <w:tblPrEx>
+          <w:tblCellMar>
+            <w:top w:w="0" w:type="dxa"/>
+            <w:bottom w:w="0" w:type="dxa"/>
+          </w:tblCellMar>
+        </w:tblPrEx>
+        <w:trPr>
+          <w:cantSplit/>
+        </w:trPr>
+        <w:tc>
+          <w:tcPr>
+            <w:tcW w:w="4819" w:type="dxa"/>
+            <w:tcBorders>
+              <w:top w:val="single" w:sz="4" w:space="0" w:color="C9D3D0"/>
+              <w:left w:val="single" w:sz="4" w:space="0" w:color="C9D3D0"/>
+              <w:bottom w:val="single" w:sz="4" w:space="0" w:color="C9D3D0"/>
+              <w:right w:val="single" w:sz="4" w:space="0" w:color="C9D3D0"/>
+            </w:tcBorders>
+            <w:shd w:val="clear" w:color="auto" w:fill="F3F8F6"/>
+            <w:tcMar>
+              <w:top w:w="50" w:type="dxa"/>
+              <w:left w:w="100" w:type="dxa"/>
+              <w:bottom w:w="50" w:type="dxa"/>
+              <w:right w:w="100" w:type="dxa"/>
+            </w:tcMar>
+            <w:vAlign w:val="center"/>
+          </w:tcPr>
+          <w:p>
+            <w:pPr>
+              <w:spacing w:line="252" w:lineRule="auto"/>
+            </w:pPr>
+            <w:r>
+              <w:rPr>
+                <w:sz w:val="19"/>
+                <w:szCs w:val="19"/>
+              </w:rPr>
+              <w:t>Live check, version 2b11af0d (VR3 Compare fixes)</w:t>
+            </w:r>
+          </w:p>
+        </w:tc>
+        <w:tc>
+          <w:tcPr>
+            <w:tcW w:w="4819" w:type="dxa"/>
+            <w:tcBorders>
+              <w:top w:val="single" w:sz="4" w:space="0" w:color="C9D3D0"/>
+              <w:left w:val="single" w:sz="4" w:space="0" w:color="C9D3D0"/>
+              <w:bottom w:val="single" w:sz="4" w:space="0" w:color="C9D3D0"/>
+              <w:right w:val="single" w:sz="4" w:space="0" w:color="C9D3D0"/>
+            </w:tcBorders>
+            <w:shd w:val="clear" w:color="auto" w:fill="F3F8F6"/>
+            <w:tcMar>
+              <w:top w:w="50" w:type="dxa"/>
+              <w:left w:w="100" w:type="dxa"/>
+              <w:bottom w:w="50" w:type="dxa"/>
+              <w:right w:w="100" w:type="dxa"/>
+            </w:tcMar>
+            <w:vAlign w:val="center"/>
+          </w:tcPr>
+          <w:p>
+            <w:pPr>
+              <w:spacing w:line="252" w:lineRule="auto"/>
+            </w:pPr>
+            <w:r>
+              <w:rPr>
+                <w:sz w:val="19"/>
+                <w:szCs w:val="19"/>
+              </w:rPr>
+              <w:t>Courses at 390 × 844 in the demo: tip box shown; 4 ticked: Compare off and the limit message above the bar, buttons on one row; 2 ticked: Compare, then "+" opens the picker; the added course's column fully visible beside the labels</w:t>
+            </w:r>
+          </w:p>
+        </w:tc>
+      </w:tr>
+      <w:tr>
+        <w:tblPrEx>
+          <w:tblCellMar>
+            <w:top w:w="0" w:type="dxa"/>
+            <w:bottom w:w="0" w:type="dxa"/>
+          </w:tblCellMar>
+        </w:tblPrEx>
+        <w:trPr>
+          <w:cantSplit/>
+        </w:trPr>
+        <w:tc>
+          <w:tcPr>
+            <w:tcW w:w="4819" w:type="dxa"/>
+            <w:tcBorders>
+              <w:top w:val="single" w:sz="4" w:space="0" w:color="C9D3D0"/>
+              <w:left w:val="single" w:sz="4" w:space="0" w:color="C9D3D0"/>
+              <w:bottom w:val="single" w:sz="4" w:space="0" w:color="C9D3D0"/>
+              <w:right w:val="single" w:sz="4" w:space="0" w:color="C9D3D0"/>
+            </w:tcBorders>
+            <w:tcMar>
+              <w:top w:w="50" w:type="dxa"/>
+              <w:left w:w="100" w:type="dxa"/>
+              <w:bottom w:w="50" w:type="dxa"/>
+              <w:right w:w="100" w:type="dxa"/>
+            </w:tcMar>
+            <w:vAlign w:val="center"/>
+          </w:tcPr>
+          <w:p>
+            <w:pPr>
+              <w:spacing w:line="252" w:lineRule="auto"/>
+            </w:pPr>
+            <w:r>
+              <w:rPr>
+                <w:sz w:val="19"/>
+                <w:szCs w:val="19"/>
+              </w:rPr>
+              <w:t>Live check, versions dd209eea, 709586ee and 209a0c04 (desktop layout)</w:t>
+            </w:r>
+          </w:p>
+        </w:tc>
+        <w:tc>
+          <w:tcPr>
+            <w:tcW w:w="4819" w:type="dxa"/>
+            <w:tcBorders>
+              <w:top w:val="single" w:sz="4" w:space="0" w:color="C9D3D0"/>
+              <w:left w:val="single" w:sz="4" w:space="0" w:color="C9D3D0"/>
+              <w:bottom w:val="single" w:sz="4" w:space="0" w:color="C9D3D0"/>
+              <w:right w:val="single" w:sz="4" w:space="0" w:color="C9D3D0"/>
+            </w:tcBorders>
+            <w:tcMar>
+              <w:top w:w="50" w:type="dxa"/>
+              <w:left w:w="100" w:type="dxa"/>
+              <w:bottom w:w="50" w:type="dxa"/>
+              <w:right w:w="100" w:type="dxa"/>
+            </w:tcMar>
+            <w:vAlign w:val="center"/>
+          </w:tcPr>
+          <w:p>
+            <w:pPr>
+              <w:spacing w:line="252" w:lineRule="auto"/>
+            </w:pPr>
+            <w:r>
+              <w:rPr>
+                <w:sz w:val="19"/>
+                <w:szCs w:val="19"/>
+              </w:rPr>
+              <w:t>Paths and course 081E at 1440 × 900, 1871 × 900 and 1280 × 800; Paths at 390 × 844 unchanged (screenshots compared pixel by pixel apart from the ring animation)</w:t>
+            </w:r>
+          </w:p>
+        </w:tc>
+      </w:tr>
+    </w:tbl>
+    <w:p>
+      <w:pPr>
+        <w:spacing w:after="100"/>
+      </w:pPr>
+    </w:p>
+    <w:p>
+      <w:pPr>
+        <w:pStyle w:val="Caption"/>
+        <w:keepNext/>
+      </w:pPr>
+      <w:bookmarkStart w:id="27" w:name="_Toc243516508"/>
+      <w:r>
+        <w:lastRenderedPageBreak/>
+        <w:t xml:space="preserve">Table </w:t>
+      </w:r>
+      <w:r>
+        <w:fldChar w:fldCharType="begin"/>
+      </w:r>
+      <w:r>
+        <w:instrText>SEQ Table</w:instrText>
+      </w:r>
+      <w:r>
+        <w:fldChar w:fldCharType="separate"/>
+      </w:r>
+      <w:r>
+        <w:rPr>
+          <w:noProof/>
+        </w:rPr>
+        <w:t>10</w:t>
+      </w:r>
+      <w:r>
+        <w:fldChar w:fldCharType="end"/>
+      </w:r>
+      <w:r>
         <w:t>: Results of 15 October 2026 (developer machine, commit f704d0b)</w:t>
       </w:r>
-      <w:bookmarkEnd w:id="26"/>
+      <w:bookmarkEnd w:id="27"/>
     </w:p>
     <w:tbl>
       <w:tblPr>
@@ -21922,19 +22788,19 @@
         <w:keepLines/>
         <w:pageBreakBefore/>
       </w:pPr>
-      <w:bookmarkStart w:id="27" w:name="_Toc242944038"/>
+      <w:bookmarkStart w:id="28" w:name="_Toc243516494"/>
       <w:r>
         <w:lastRenderedPageBreak/>
         <w:t>9 Defects found and fixed</w:t>
       </w:r>
-      <w:bookmarkEnd w:id="27"/>
+      <w:bookmarkEnd w:id="28"/>
     </w:p>
     <w:p>
       <w:pPr>
         <w:pStyle w:val="Caption"/>
         <w:keepNext/>
       </w:pPr>
-      <w:bookmarkStart w:id="28" w:name="_Toc242944052"/>
+      <w:bookmarkStart w:id="29" w:name="_Toc243516509"/>
       <w:r>
         <w:t xml:space="preserve">Table </w:t>
       </w:r>
@@ -21951,7 +22817,7 @@
         <w:rPr>
           <w:noProof/>
         </w:rPr>
-        <w:t>10</w:t>
+        <w:t>11</w:t>
       </w:r>
       <w:r>
         <w:fldChar w:fldCharType="end"/>
@@ -21959,7 +22825,7 @@
       <w:r>
         <w:t>: Defects found by testing and fixed</w:t>
       </w:r>
-      <w:bookmarkEnd w:id="28"/>
+      <w:bookmarkEnd w:id="29"/>
     </w:p>
     <w:tbl>
       <w:tblPr>
@@ -23079,7 +23945,10 @@
         <w:spacing w:after="120"/>
       </w:pPr>
       <w:r>
-        <w:t>The product owner's screen-recorded reviews produced change requests CR-001 to CR-006; each was designed in ZP-DOC-05 first and arrived with its own tests.</w:t>
+        <w:t xml:space="preserve">The product owner's screen-recorded reviews produced change requests CR-001 to CR-006; each was designed in </w:t>
+      </w:r>
+      <w:r>
+        <w:t>ZP-DOC-05 first and arrived with its own tests.</w:t>
       </w:r>
     </w:p>
     <w:p>
@@ -23089,19 +23958,19 @@
         <w:keepLines/>
         <w:pageBreakBefore/>
       </w:pPr>
-      <w:bookmarkStart w:id="29" w:name="_Toc242944039"/>
+      <w:bookmarkStart w:id="30" w:name="_Toc243516495"/>
       <w:r>
         <w:lastRenderedPageBreak/>
         <w:t>10 Known gaps and risks</w:t>
       </w:r>
-      <w:bookmarkEnd w:id="29"/>
+      <w:bookmarkEnd w:id="30"/>
     </w:p>
     <w:p>
       <w:pPr>
         <w:pStyle w:val="Caption"/>
         <w:keepNext/>
       </w:pPr>
-      <w:bookmarkStart w:id="30" w:name="_Toc242944053"/>
+      <w:bookmarkStart w:id="31" w:name="_Toc243516510"/>
       <w:r>
         <w:t xml:space="preserve">Table </w:t>
       </w:r>
@@ -23118,7 +23987,7 @@
         <w:rPr>
           <w:noProof/>
         </w:rPr>
-        <w:t>11</w:t>
+        <w:t>12</w:t>
       </w:r>
       <w:r>
         <w:fldChar w:fldCharType="end"/>
@@ -23126,7 +23995,7 @@
       <w:r>
         <w:t>: Known gaps</w:t>
       </w:r>
-      <w:bookmarkEnd w:id="30"/>
+      <w:bookmarkEnd w:id="31"/>
     </w:p>
     <w:tbl>
       <w:tblPr>
@@ -24366,12 +25235,12 @@
         <w:keepLines/>
         <w:pageBreakBefore/>
       </w:pPr>
-      <w:bookmarkStart w:id="31" w:name="_Toc242944040"/>
+      <w:bookmarkStart w:id="32" w:name="_Toc243516496"/>
       <w:r>
         <w:lastRenderedPageBreak/>
         <w:t>11 Traceability</w:t>
       </w:r>
-      <w:bookmarkEnd w:id="31"/>
+      <w:bookmarkEnd w:id="32"/>
     </w:p>
     <w:p>
       <w:pPr>
@@ -24386,7 +25255,7 @@
         <w:pStyle w:val="Caption"/>
         <w:keepNext/>
       </w:pPr>
-      <w:bookmarkStart w:id="32" w:name="_Toc242944054"/>
+      <w:bookmarkStart w:id="33" w:name="_Toc243516511"/>
       <w:r>
         <w:t xml:space="preserve">Table </w:t>
       </w:r>
@@ -24403,7 +25272,7 @@
         <w:rPr>
           <w:noProof/>
         </w:rPr>
-        <w:t>12</w:t>
+        <w:t>13</w:t>
       </w:r>
       <w:r>
         <w:fldChar w:fldCharType="end"/>
@@ -24411,7 +25280,7 @@
       <w:r>
         <w:t>: Requirements to test cases</w:t>
       </w:r>
-      <w:bookmarkEnd w:id="32"/>
+      <w:bookmarkEnd w:id="33"/>
     </w:p>
     <w:tbl>
       <w:tblPr>
@@ -26255,19 +27124,19 @@
         <w:keepLines/>
         <w:pageBreakBefore/>
       </w:pPr>
-      <w:bookmarkStart w:id="33" w:name="_Toc242944041"/>
+      <w:bookmarkStart w:id="34" w:name="_Toc243516497"/>
       <w:r>
         <w:lastRenderedPageBreak/>
         <w:t>Appendix A: Glossary</w:t>
       </w:r>
-      <w:bookmarkEnd w:id="33"/>
+      <w:bookmarkEnd w:id="34"/>
     </w:p>
     <w:p>
       <w:pPr>
         <w:pStyle w:val="Caption"/>
         <w:keepNext/>
       </w:pPr>
-      <w:bookmarkStart w:id="34" w:name="_Toc242944055"/>
+      <w:bookmarkStart w:id="35" w:name="_Toc243516512"/>
       <w:r>
         <w:t xml:space="preserve">Table </w:t>
       </w:r>
@@ -26284,7 +27153,7 @@
         <w:rPr>
           <w:noProof/>
         </w:rPr>
-        <w:t>13</w:t>
+        <w:t>14</w:t>
       </w:r>
       <w:r>
         <w:fldChar w:fldCharType="end"/>
@@ -26292,7 +27161,7 @@
       <w:r>
         <w:t>: Terms used in this document</w:t>
       </w:r>
-      <w:bookmarkEnd w:id="34"/>
+      <w:bookmarkEnd w:id="35"/>
     </w:p>
     <w:tbl>
       <w:tblPr>
@@ -27288,19 +28157,19 @@
         <w:keepLines/>
         <w:pageBreakBefore/>
       </w:pPr>
-      <w:bookmarkStart w:id="35" w:name="_Toc242944042"/>
+      <w:bookmarkStart w:id="36" w:name="_Toc243516498"/>
       <w:r>
         <w:lastRenderedPageBreak/>
         <w:t>Appendix B: References</w:t>
       </w:r>
-      <w:bookmarkEnd w:id="35"/>
+      <w:bookmarkEnd w:id="36"/>
     </w:p>
     <w:p>
       <w:pPr>
         <w:pStyle w:val="Caption"/>
         <w:keepNext/>
       </w:pPr>
-      <w:bookmarkStart w:id="36" w:name="_Toc242944056"/>
+      <w:bookmarkStart w:id="37" w:name="_Toc243516513"/>
       <w:r>
         <w:t xml:space="preserve">Table </w:t>
       </w:r>
@@ -27317,7 +28186,7 @@
         <w:rPr>
           <w:noProof/>
         </w:rPr>
-        <w:t>14</w:t>
+        <w:t>15</w:t>
       </w:r>
       <w:r>
         <w:fldChar w:fldCharType="end"/>
@@ -27325,7 +28194,7 @@
       <w:r>
         <w:t>: Sources referred to in this document</w:t>
       </w:r>
-      <w:bookmarkEnd w:id="36"/>
+      <w:bookmarkEnd w:id="37"/>
     </w:p>
     <w:tbl>
       <w:tblPr>
@@ -28217,10 +29086,134 @@
 <file path=word/numbering.xml><?xml version="1.0" encoding="utf-8"?>
 <w:numbering xmlns:wpc="http://schemas.microsoft.com/office/word/2010/wordprocessingCanvas" xmlns:cx="http://schemas.microsoft.com/office/drawing/2014/chartex" xmlns:cx1="http://schemas.microsoft.com/office/drawing/2015/9/8/chartex" xmlns:cx2="http://schemas.microsoft.com/office/drawing/2015/10/21/chartex" xmlns:cx3="http://schemas.microsoft.com/office/drawing/2016/5/9/chartex" xmlns:cx4="http://schemas.microsoft.com/office/drawing/2016/5/10/chartex" xmlns:cx5="http://schemas.microsoft.com/office/drawing/2016/5/11/chartex" xmlns:cx6="http://schemas.microsoft.com/office/drawing/2016/5/12/chartex" xmlns:cx7="http://schemas.microsoft.com/office/drawing/2016/5/13/chartex" xmlns:cx8="http://schemas.microsoft.com/office/drawing/2016/5/14/chartex" xmlns:mc="http://schemas.openxmlformats.org/markup-compatibility/2006" xmlns:aink="http://schemas.microsoft.com/office/drawing/2016/ink" xmlns:am3d="http://schemas.microsoft.com/office/drawing/2017/model3d" xmlns:o="urn:schemas-microsoft-com:office:office" xmlns:oel="http://schemas.microsoft.com/office/2019/extlst" xmlns:r="http://schemas.openxmlformats.org/officeDocument/2006/relationships" xmlns:m="http://schemas.openxmlformats.org/officeDocument/2006/math" xmlns:v="urn:schemas-microsoft-com:vml" xmlns:wp14="http://schemas.microsoft.com/office/word/2010/wordprocessingDrawing" xmlns:wp="http://schemas.openxmlformats.org/drawingml/2006/wordprocessingDrawing" xmlns:w10="urn:schemas-microsoft-com:office:word" xmlns:w="http://schemas.openxmlformats.org/wordprocessingml/2006/main" xmlns:w14="http://schemas.microsoft.com/office/word/2010/wordml" xmlns:w15="http://schemas.microsoft.com/office/word/2012/wordml" xmlns:w16cex="http://schemas.microsoft.com/office/word/2018/wordml/cex" xmlns:w16cid="http://schemas.microsoft.com/office/word/2016/wordml/cid" xmlns:w16="http://schemas.microsoft.com/office/word/2018/wordml" xmlns:w16du="http://schemas.microsoft.com/office/word/2023/wordml/word16du" xmlns:w16sdtdh="http://schemas.microsoft.com/office/word/2020/wordml/sdtdatahash" xmlns:w16sdtfl="http://schemas.microsoft.com/office/word/2024/wordml/sdtformatlock" xmlns:w16se="http://schemas.microsoft.com/office/word/2015/wordml/symex" xmlns:wpg="http://schemas.microsoft.com/office/word/2010/wordprocessingGroup" xmlns:wpi="http://schemas.microsoft.com/office/word/2010/wordprocessingInk" xmlns:wne="http://schemas.microsoft.com/office/word/2006/wordml" xmlns:wps="http://schemas.microsoft.com/office/word/2010/wordprocessingShape" mc:Ignorable="w14 w15 w16se w16cid w16 w16cex w16sdtdh w16sdtfl w16du wp14">
   <w:abstractNum w:abstractNumId="0" w15:restartNumberingAfterBreak="0">
-    <w:nsid w:val="04F43BF4"/>
+    <w:nsid w:val="1A3A5544"/>
     <w:multiLevelType w:val="hybridMultilevel"/>
-    <w:tmpl w:val="339A27A8"/>
-    <w:lvl w:ilvl="0" w:tplc="B66AA5A8" w:tentative="1">
+    <w:tmpl w:val="96326052"/>
+    <w:lvl w:ilvl="0" w:tplc="B0120DB6">
+      <w:start w:val="1"/>
+      <w:numFmt w:val="decimal"/>
+      <w:lvlText w:val="%1."/>
+      <w:lvlJc w:val="left"/>
+      <w:pPr>
+        <w:ind w:left="720" w:hanging="360"/>
+      </w:pPr>
+    </w:lvl>
+    <w:lvl w:ilvl="1" w:tplc="4AA05124" w:tentative="1">
+      <w:start w:val="1"/>
+      <w:numFmt w:val="lowerLetter"/>
+      <w:lvlText w:val="%2."/>
+      <w:lvlJc w:val="left"/>
+      <w:pPr>
+        <w:ind w:left="1080" w:hanging="360"/>
+      </w:pPr>
+    </w:lvl>
+    <w:lvl w:ilvl="2" w:tplc="2C448812" w:tentative="1">
+      <w:start w:val="1"/>
+      <w:numFmt w:val="lowerRoman"/>
+      <w:lvlText w:val="%3."/>
+      <w:lvlJc w:val="left"/>
+      <w:pPr>
+        <w:ind w:left="1440" w:hanging="360"/>
+      </w:pPr>
+    </w:lvl>
+    <w:lvl w:ilvl="3" w:tplc="82AA5290">
+      <w:numFmt w:val="decimal"/>
+      <w:lvlText w:val=""/>
+      <w:lvlJc w:val="left"/>
+    </w:lvl>
+    <w:lvl w:ilvl="4" w:tplc="CAD607C4">
+      <w:numFmt w:val="decimal"/>
+      <w:lvlText w:val=""/>
+      <w:lvlJc w:val="left"/>
+    </w:lvl>
+    <w:lvl w:ilvl="5" w:tplc="6A7485F4">
+      <w:numFmt w:val="decimal"/>
+      <w:lvlText w:val=""/>
+      <w:lvlJc w:val="left"/>
+    </w:lvl>
+    <w:lvl w:ilvl="6" w:tplc="7908BE0A">
+      <w:numFmt w:val="decimal"/>
+      <w:lvlText w:val=""/>
+      <w:lvlJc w:val="left"/>
+    </w:lvl>
+    <w:lvl w:ilvl="7" w:tplc="FF76D6F8">
+      <w:numFmt w:val="decimal"/>
+      <w:lvlText w:val=""/>
+      <w:lvlJc w:val="left"/>
+    </w:lvl>
+    <w:lvl w:ilvl="8" w:tplc="78E4408C">
+      <w:numFmt w:val="decimal"/>
+      <w:lvlText w:val=""/>
+      <w:lvlJc w:val="left"/>
+    </w:lvl>
+  </w:abstractNum>
+  <w:abstractNum w:abstractNumId="1" w15:restartNumberingAfterBreak="0">
+    <w:nsid w:val="1FC61F63"/>
+    <w:multiLevelType w:val="hybridMultilevel"/>
+    <w:tmpl w:val="9C304BF0"/>
+    <w:lvl w:ilvl="0" w:tplc="B70854E0" w:tentative="1">
+      <w:start w:val="1"/>
+      <w:numFmt w:val="bullet"/>
+      <w:lvlText w:val="•"/>
+      <w:lvlJc w:val="left"/>
+      <w:pPr>
+        <w:ind w:left="720" w:hanging="280"/>
+      </w:pPr>
+    </w:lvl>
+    <w:lvl w:ilvl="1" w:tplc="79A08E5A" w:tentative="1">
+      <w:start w:val="1"/>
+      <w:numFmt w:val="bullet"/>
+      <w:lvlText w:val="–"/>
+      <w:lvlJc w:val="left"/>
+      <w:pPr>
+        <w:ind w:left="1080" w:hanging="280"/>
+      </w:pPr>
+    </w:lvl>
+    <w:lvl w:ilvl="2" w:tplc="7C16FE8E" w:tentative="1">
+      <w:start w:val="1"/>
+      <w:numFmt w:val="bullet"/>
+      <w:lvlText w:val="▪"/>
+      <w:lvlJc w:val="left"/>
+      <w:pPr>
+        <w:ind w:left="1440" w:hanging="280"/>
+      </w:pPr>
+    </w:lvl>
+    <w:lvl w:ilvl="3" w:tplc="3A7E75A4">
+      <w:numFmt w:val="decimal"/>
+      <w:lvlText w:val=""/>
+      <w:lvlJc w:val="left"/>
+    </w:lvl>
+    <w:lvl w:ilvl="4" w:tplc="9CF63716">
+      <w:numFmt w:val="decimal"/>
+      <w:lvlText w:val=""/>
+      <w:lvlJc w:val="left"/>
+    </w:lvl>
+    <w:lvl w:ilvl="5" w:tplc="BF64148E">
+      <w:numFmt w:val="decimal"/>
+      <w:lvlText w:val=""/>
+      <w:lvlJc w:val="left"/>
+    </w:lvl>
+    <w:lvl w:ilvl="6" w:tplc="0180FD8C">
+      <w:numFmt w:val="decimal"/>
+      <w:lvlText w:val=""/>
+      <w:lvlJc w:val="left"/>
+    </w:lvl>
+    <w:lvl w:ilvl="7" w:tplc="B0485D22">
+      <w:numFmt w:val="decimal"/>
+      <w:lvlText w:val=""/>
+      <w:lvlJc w:val="left"/>
+    </w:lvl>
+    <w:lvl w:ilvl="8" w:tplc="4DC04EA8">
+      <w:numFmt w:val="decimal"/>
+      <w:lvlText w:val=""/>
+      <w:lvlJc w:val="left"/>
+    </w:lvl>
+  </w:abstractNum>
+  <w:abstractNum w:abstractNumId="2" w15:restartNumberingAfterBreak="0">
+    <w:nsid w:val="6AF90F63"/>
+    <w:multiLevelType w:val="hybridMultilevel"/>
+    <w:tmpl w:val="57863988"/>
+    <w:lvl w:ilvl="0" w:tplc="8ED63062" w:tentative="1">
       <w:start w:val="1"/>
       <w:numFmt w:val="bullet"/>
       <w:lvlText w:val="●"/>
@@ -28229,7 +29222,7 @@
         <w:ind w:left="720" w:hanging="360"/>
       </w:pPr>
     </w:lvl>
-    <w:lvl w:ilvl="1" w:tplc="AB0A3382" w:tentative="1">
+    <w:lvl w:ilvl="1" w:tplc="9384D4CE" w:tentative="1">
       <w:start w:val="1"/>
       <w:numFmt w:val="bullet"/>
       <w:lvlText w:val="○"/>
@@ -28238,7 +29231,7 @@
         <w:ind w:left="1440" w:hanging="360"/>
       </w:pPr>
     </w:lvl>
-    <w:lvl w:ilvl="2" w:tplc="5F5E33C8" w:tentative="1">
+    <w:lvl w:ilvl="2" w:tplc="8DD83E6A" w:tentative="1">
       <w:start w:val="1"/>
       <w:numFmt w:val="bullet"/>
       <w:lvlText w:val="■"/>
@@ -28247,7 +29240,7 @@
         <w:ind w:left="2160" w:hanging="360"/>
       </w:pPr>
     </w:lvl>
-    <w:lvl w:ilvl="3" w:tplc="CCFA3114" w:tentative="1">
+    <w:lvl w:ilvl="3" w:tplc="C74C4826" w:tentative="1">
       <w:start w:val="1"/>
       <w:numFmt w:val="bullet"/>
       <w:lvlText w:val="●"/>
@@ -28256,7 +29249,7 @@
         <w:ind w:left="2880" w:hanging="360"/>
       </w:pPr>
     </w:lvl>
-    <w:lvl w:ilvl="4" w:tplc="57A6F298" w:tentative="1">
+    <w:lvl w:ilvl="4" w:tplc="2E003FE8" w:tentative="1">
       <w:start w:val="1"/>
       <w:numFmt w:val="bullet"/>
       <w:lvlText w:val="○"/>
@@ -28265,7 +29258,7 @@
         <w:ind w:left="3600" w:hanging="360"/>
       </w:pPr>
     </w:lvl>
-    <w:lvl w:ilvl="5" w:tplc="55229426" w:tentative="1">
+    <w:lvl w:ilvl="5" w:tplc="25C681A4" w:tentative="1">
       <w:start w:val="1"/>
       <w:numFmt w:val="bullet"/>
       <w:lvlText w:val="■"/>
@@ -28274,7 +29267,7 @@
         <w:ind w:left="4320" w:hanging="360"/>
       </w:pPr>
     </w:lvl>
-    <w:lvl w:ilvl="6" w:tplc="E608665E" w:tentative="1">
+    <w:lvl w:ilvl="6" w:tplc="F2C06B38" w:tentative="1">
       <w:start w:val="1"/>
       <w:numFmt w:val="bullet"/>
       <w:lvlText w:val="●"/>
@@ -28283,7 +29276,7 @@
         <w:ind w:left="5040" w:hanging="360"/>
       </w:pPr>
     </w:lvl>
-    <w:lvl w:ilvl="7" w:tplc="99BC4B9C" w:tentative="1">
+    <w:lvl w:ilvl="7" w:tplc="BA5C0950" w:tentative="1">
       <w:start w:val="1"/>
       <w:numFmt w:val="bullet"/>
       <w:lvlText w:val="●"/>
@@ -28292,7 +29285,7 @@
         <w:ind w:left="5760" w:hanging="360"/>
       </w:pPr>
     </w:lvl>
-    <w:lvl w:ilvl="8" w:tplc="24D44546" w:tentative="1">
+    <w:lvl w:ilvl="8" w:tplc="A7F4E304" w:tentative="1">
       <w:start w:val="1"/>
       <w:numFmt w:val="bullet"/>
       <w:lvlText w:val="●"/>
@@ -28302,138 +29295,14 @@
       </w:pPr>
     </w:lvl>
   </w:abstractNum>
-  <w:abstractNum w:abstractNumId="1" w15:restartNumberingAfterBreak="0">
-    <w:nsid w:val="43AF5F6D"/>
-    <w:multiLevelType w:val="hybridMultilevel"/>
-    <w:tmpl w:val="3E2A4952"/>
-    <w:lvl w:ilvl="0" w:tplc="2E18A9D4">
-      <w:start w:val="1"/>
-      <w:numFmt w:val="decimal"/>
-      <w:lvlText w:val="%1."/>
-      <w:lvlJc w:val="left"/>
-      <w:pPr>
-        <w:ind w:left="720" w:hanging="360"/>
-      </w:pPr>
-    </w:lvl>
-    <w:lvl w:ilvl="1" w:tplc="CA0E1610" w:tentative="1">
-      <w:start w:val="1"/>
-      <w:numFmt w:val="lowerLetter"/>
-      <w:lvlText w:val="%2."/>
-      <w:lvlJc w:val="left"/>
-      <w:pPr>
-        <w:ind w:left="1080" w:hanging="360"/>
-      </w:pPr>
-    </w:lvl>
-    <w:lvl w:ilvl="2" w:tplc="A15CDDDA" w:tentative="1">
-      <w:start w:val="1"/>
-      <w:numFmt w:val="lowerRoman"/>
-      <w:lvlText w:val="%3."/>
-      <w:lvlJc w:val="left"/>
-      <w:pPr>
-        <w:ind w:left="1440" w:hanging="360"/>
-      </w:pPr>
-    </w:lvl>
-    <w:lvl w:ilvl="3" w:tplc="A13039FA">
-      <w:numFmt w:val="decimal"/>
-      <w:lvlText w:val=""/>
-      <w:lvlJc w:val="left"/>
-    </w:lvl>
-    <w:lvl w:ilvl="4" w:tplc="74AC69F2">
-      <w:numFmt w:val="decimal"/>
-      <w:lvlText w:val=""/>
-      <w:lvlJc w:val="left"/>
-    </w:lvl>
-    <w:lvl w:ilvl="5" w:tplc="C170A174">
-      <w:numFmt w:val="decimal"/>
-      <w:lvlText w:val=""/>
-      <w:lvlJc w:val="left"/>
-    </w:lvl>
-    <w:lvl w:ilvl="6" w:tplc="87FAEFC2">
-      <w:numFmt w:val="decimal"/>
-      <w:lvlText w:val=""/>
-      <w:lvlJc w:val="left"/>
-    </w:lvl>
-    <w:lvl w:ilvl="7" w:tplc="A2F0711A">
-      <w:numFmt w:val="decimal"/>
-      <w:lvlText w:val=""/>
-      <w:lvlJc w:val="left"/>
-    </w:lvl>
-    <w:lvl w:ilvl="8" w:tplc="631A3262">
-      <w:numFmt w:val="decimal"/>
-      <w:lvlText w:val=""/>
-      <w:lvlJc w:val="left"/>
-    </w:lvl>
-  </w:abstractNum>
-  <w:abstractNum w:abstractNumId="2" w15:restartNumberingAfterBreak="0">
-    <w:nsid w:val="6F7B02C7"/>
-    <w:multiLevelType w:val="hybridMultilevel"/>
-    <w:tmpl w:val="9B02229E"/>
-    <w:lvl w:ilvl="0" w:tplc="8DD4A76C" w:tentative="1">
-      <w:start w:val="1"/>
-      <w:numFmt w:val="bullet"/>
-      <w:lvlText w:val="•"/>
-      <w:lvlJc w:val="left"/>
-      <w:pPr>
-        <w:ind w:left="720" w:hanging="280"/>
-      </w:pPr>
-    </w:lvl>
-    <w:lvl w:ilvl="1" w:tplc="6D2C9202" w:tentative="1">
-      <w:start w:val="1"/>
-      <w:numFmt w:val="bullet"/>
-      <w:lvlText w:val="–"/>
-      <w:lvlJc w:val="left"/>
-      <w:pPr>
-        <w:ind w:left="1080" w:hanging="280"/>
-      </w:pPr>
-    </w:lvl>
-    <w:lvl w:ilvl="2" w:tplc="EE3E6DC6" w:tentative="1">
-      <w:start w:val="1"/>
-      <w:numFmt w:val="bullet"/>
-      <w:lvlText w:val="▪"/>
-      <w:lvlJc w:val="left"/>
-      <w:pPr>
-        <w:ind w:left="1440" w:hanging="280"/>
-      </w:pPr>
-    </w:lvl>
-    <w:lvl w:ilvl="3" w:tplc="BDEA5FA6">
-      <w:numFmt w:val="decimal"/>
-      <w:lvlText w:val=""/>
-      <w:lvlJc w:val="left"/>
-    </w:lvl>
-    <w:lvl w:ilvl="4" w:tplc="DB341422">
-      <w:numFmt w:val="decimal"/>
-      <w:lvlText w:val=""/>
-      <w:lvlJc w:val="left"/>
-    </w:lvl>
-    <w:lvl w:ilvl="5" w:tplc="E396A850">
-      <w:numFmt w:val="decimal"/>
-      <w:lvlText w:val=""/>
-      <w:lvlJc w:val="left"/>
-    </w:lvl>
-    <w:lvl w:ilvl="6" w:tplc="7526B0A4">
-      <w:numFmt w:val="decimal"/>
-      <w:lvlText w:val=""/>
-      <w:lvlJc w:val="left"/>
-    </w:lvl>
-    <w:lvl w:ilvl="7" w:tplc="392C98A0">
-      <w:numFmt w:val="decimal"/>
-      <w:lvlText w:val=""/>
-      <w:lvlJc w:val="left"/>
-    </w:lvl>
-    <w:lvl w:ilvl="8" w:tplc="D09C78E6">
-      <w:numFmt w:val="decimal"/>
-      <w:lvlText w:val=""/>
-      <w:lvlJc w:val="left"/>
-    </w:lvl>
-  </w:abstractNum>
-  <w:num w:numId="1" w16cid:durableId="964385330">
-    <w:abstractNumId w:val="0"/>
+  <w:num w:numId="1" w16cid:durableId="1542598321">
+    <w:abstractNumId w:val="2"/>
     <w:lvlOverride w:ilvl="0">
       <w:startOverride w:val="1"/>
     </w:lvlOverride>
   </w:num>
-  <w:num w:numId="2" w16cid:durableId="254168445">
-    <w:abstractNumId w:val="1"/>
+  <w:num w:numId="2" w16cid:durableId="177472400">
+    <w:abstractNumId w:val="0"/>
     <w:lvlOverride w:ilvl="0">
       <w:startOverride w:val="1"/>
     </w:lvlOverride>
@@ -29137,7 +30006,7 @@
     <w:autoRedefine/>
     <w:uiPriority w:val="39"/>
     <w:unhideWhenUsed/>
-    <w:rsid w:val="00ED44E1"/>
+    <w:rsid w:val="006C2889"/>
     <w:pPr>
       <w:spacing w:after="100"/>
     </w:pPr>
@@ -29149,7 +30018,7 @@
     <w:autoRedefine/>
     <w:uiPriority w:val="39"/>
     <w:unhideWhenUsed/>
-    <w:rsid w:val="00ED44E1"/>
+    <w:rsid w:val="006C2889"/>
     <w:pPr>
       <w:spacing w:after="100"/>
       <w:ind w:left="210"/>
@@ -29161,7 +30030,7 @@
     <w:next w:val="Normal"/>
     <w:uiPriority w:val="99"/>
     <w:unhideWhenUsed/>
-    <w:rsid w:val="00ED44E1"/>
+    <w:rsid w:val="006C2889"/>
   </w:style>
 </w:styles>
 </file>

</xml_diff>

<commit_message>
Other paths refreshed to 23 Oct 2026 (Praveen: "I want the latest version")
All 52 routes re-checked on official sources; every change spot-checked on the official page.
- routes-2026-10-23.json (51): Section 25A register now 34 institutes / 308 programmes; OUSL Software
  Engineering closes 7 Nov 2026 (was 15 Nov) and gets an Alert; ITUM NDT closed 19.10.2026 (Gazette
  No. 2507); NAITA and Customs deadlines passed; ICCR needs IELTS 6.0 / TOEFL B2 from 2027/28; SLIATE
  links moved to apply.sliate.ac.lk; BIT linked to UCSC with unverifiable facts withdrawn; CMA withdrawn.
- Four hosts returned unsafe content and join BLOCKED_HOSTS (now exported). Ask never links them, even
  from an older index entry (safeUrl, ASK-047).
- OUSL alert test; TC-143 in ZP-DOC-08; 553 tests. ROUTES_REPORT and WORKLOG updated.

Co-Authored-By: Claude Opus 5.5 (1M context) <noreply@anthropic.com>
</commit_message>
<xml_diff>
--- a/docs/08-test-plan/ZP-DOC-08_Test-Plan.docx
+++ b/docs/08-test-plan/ZP-DOC-08_Test-Plan.docx
@@ -2147,6 +2147,122 @@
           </w:p>
         </w:tc>
       </w:tr>
+      <w:tr>
+        <w:tblPrEx>
+          <w:tblCellMar>
+            <w:top w:w="0" w:type="dxa"/>
+            <w:bottom w:w="0" w:type="dxa"/>
+          </w:tblCellMar>
+        </w:tblPrEx>
+        <w:trPr>
+          <w:cantSplit/>
+          <w:trHeight w:val="420"/>
+        </w:trPr>
+        <w:tc>
+          <w:tcPr>
+            <w:tcW w:w="964" w:type="dxa"/>
+            <w:tcBorders>
+              <w:top w:val="single" w:sz="4" w:space="0" w:color="C9D3D0"/>
+              <w:left w:val="single" w:sz="4" w:space="0" w:color="C9D3D0"/>
+              <w:bottom w:val="single" w:sz="4" w:space="0" w:color="C9D3D0"/>
+              <w:right w:val="single" w:sz="4" w:space="0" w:color="C9D3D0"/>
+            </w:tcBorders>
+            <w:tcMar>
+              <w:top w:w="50" w:type="dxa"/>
+              <w:left w:w="100" w:type="dxa"/>
+              <w:bottom w:w="50" w:type="dxa"/>
+              <w:right w:w="100" w:type="dxa"/>
+            </w:tcMar>
+          </w:tcPr>
+          <w:p>
+            <w:r>
+              <w:rPr>
+                <w:sz w:val="19"/>
+                <w:szCs w:val="19"/>
+              </w:rPr>
+              <w:t>0.9</w:t>
+            </w:r>
+          </w:p>
+        </w:tc>
+        <w:tc>
+          <w:tcPr>
+            <w:tcW w:w="1542" w:type="dxa"/>
+            <w:tcBorders>
+              <w:top w:val="single" w:sz="4" w:space="0" w:color="C9D3D0"/>
+              <w:left w:val="single" w:sz="4" w:space="0" w:color="C9D3D0"/>
+              <w:bottom w:val="single" w:sz="4" w:space="0" w:color="C9D3D0"/>
+              <w:right w:val="single" w:sz="4" w:space="0" w:color="C9D3D0"/>
+            </w:tcBorders>
+            <w:tcMar>
+              <w:top w:w="50" w:type="dxa"/>
+              <w:left w:w="100" w:type="dxa"/>
+              <w:bottom w:w="50" w:type="dxa"/>
+              <w:right w:w="100" w:type="dxa"/>
+            </w:tcMar>
+          </w:tcPr>
+          <w:p>
+            <w:r>
+              <w:rPr>
+                <w:sz w:val="19"/>
+                <w:szCs w:val="19"/>
+              </w:rPr>
+              <w:t>23 Oct 2026</w:t>
+            </w:r>
+          </w:p>
+        </w:tc>
+        <w:tc>
+          <w:tcPr>
+            <w:tcW w:w="1928" w:type="dxa"/>
+            <w:tcBorders>
+              <w:top w:val="single" w:sz="4" w:space="0" w:color="C9D3D0"/>
+              <w:left w:val="single" w:sz="4" w:space="0" w:color="C9D3D0"/>
+              <w:bottom w:val="single" w:sz="4" w:space="0" w:color="C9D3D0"/>
+              <w:right w:val="single" w:sz="4" w:space="0" w:color="C9D3D0"/>
+            </w:tcBorders>
+            <w:tcMar>
+              <w:top w:w="50" w:type="dxa"/>
+              <w:left w:w="100" w:type="dxa"/>
+              <w:bottom w:w="50" w:type="dxa"/>
+              <w:right w:w="100" w:type="dxa"/>
+            </w:tcMar>
+          </w:tcPr>
+          <w:p>
+            <w:r>
+              <w:rPr>
+                <w:sz w:val="19"/>
+                <w:szCs w:val="19"/>
+              </w:rPr>
+              <w:t>Team Kestrel</w:t>
+            </w:r>
+          </w:p>
+        </w:tc>
+        <w:tc>
+          <w:tcPr>
+            <w:tcW w:w="5204" w:type="dxa"/>
+            <w:tcBorders>
+              <w:top w:val="single" w:sz="4" w:space="0" w:color="C9D3D0"/>
+              <w:left w:val="single" w:sz="4" w:space="0" w:color="C9D3D0"/>
+              <w:bottom w:val="single" w:sz="4" w:space="0" w:color="C9D3D0"/>
+              <w:right w:val="single" w:sz="4" w:space="0" w:color="C9D3D0"/>
+            </w:tcBorders>
+            <w:tcMar>
+              <w:top w:w="50" w:type="dxa"/>
+              <w:left w:w="100" w:type="dxa"/>
+              <w:bottom w:w="50" w:type="dxa"/>
+              <w:right w:w="100" w:type="dxa"/>
+            </w:tcMar>
+          </w:tcPr>
+          <w:p>
+            <w:r>
+              <w:rPr>
+                <w:sz w:val="19"/>
+                <w:szCs w:val="19"/>
+              </w:rPr>
+              <w:t>Other paths refreshed (routes 23 Oct, OUSL alert, three hosts blocked): TC-143 added, TC-106 and TC-127 extended; 553 passed</w:t>
+            </w:r>
+          </w:p>
+        </w:tc>
+      </w:tr>
     </w:tbl>
     <w:p>
       <w:pPr>
@@ -2158,7 +2274,6 @@
         <w:pStyle w:val="FrontSubheading"/>
       </w:pPr>
       <w:r>
-        <w:lastRenderedPageBreak/>
         <w:t>Review and approval</w:t>
       </w:r>
     </w:p>
@@ -2547,7 +2662,7 @@
     <w:sdt>
       <w:sdtPr>
         <w:alias w:val="Contents"/>
-        <w:id w:val="918982480"/>
+        <w:id w:val="-930804378"/>
       </w:sdtPr>
       <w:sdtEndPr/>
       <w:sdtContent>
@@ -2576,7 +2691,7 @@
           <w:r>
             <w:fldChar w:fldCharType="separate"/>
           </w:r>
-          <w:hyperlink w:anchor="_Toc243654254" w:history="1">
+          <w:hyperlink w:anchor="_Toc243656585" w:history="1">
             <w:r>
               <w:rPr>
                 <w:rStyle w:val="Hyperlink"/>
@@ -2600,7 +2715,7 @@
               <w:rPr>
                 <w:noProof/>
               </w:rPr>
-              <w:instrText xml:space="preserve"> PAGEREF _Toc243654254 \h </w:instrText>
+              <w:instrText xml:space="preserve"> PAGEREF _Toc243656585 \h </w:instrText>
             </w:r>
             <w:r>
               <w:rPr>
@@ -2643,7 +2758,7 @@
               <w14:ligatures w14:val="standardContextual"/>
             </w:rPr>
           </w:pPr>
-          <w:hyperlink w:anchor="_Toc243654255" w:history="1">
+          <w:hyperlink w:anchor="_Toc243656586" w:history="1">
             <w:r>
               <w:rPr>
                 <w:rStyle w:val="Hyperlink"/>
@@ -2667,7 +2782,7 @@
               <w:rPr>
                 <w:noProof/>
               </w:rPr>
-              <w:instrText xml:space="preserve"> PAGEREF _Toc243654255 \h </w:instrText>
+              <w:instrText xml:space="preserve"> PAGEREF _Toc243656586 \h </w:instrText>
             </w:r>
             <w:r>
               <w:rPr>
@@ -2710,7 +2825,7 @@
               <w14:ligatures w14:val="standardContextual"/>
             </w:rPr>
           </w:pPr>
-          <w:hyperlink w:anchor="_Toc243654256" w:history="1">
+          <w:hyperlink w:anchor="_Toc243656587" w:history="1">
             <w:r>
               <w:rPr>
                 <w:rStyle w:val="Hyperlink"/>
@@ -2734,7 +2849,7 @@
               <w:rPr>
                 <w:noProof/>
               </w:rPr>
-              <w:instrText xml:space="preserve"> PAGEREF _Toc243654256 \h </w:instrText>
+              <w:instrText xml:space="preserve"> PAGEREF _Toc243656587 \h </w:instrText>
             </w:r>
             <w:r>
               <w:rPr>
@@ -2777,7 +2892,7 @@
               <w14:ligatures w14:val="standardContextual"/>
             </w:rPr>
           </w:pPr>
-          <w:hyperlink w:anchor="_Toc243654257" w:history="1">
+          <w:hyperlink w:anchor="_Toc243656588" w:history="1">
             <w:r>
               <w:rPr>
                 <w:rStyle w:val="Hyperlink"/>
@@ -2801,7 +2916,7 @@
               <w:rPr>
                 <w:noProof/>
               </w:rPr>
-              <w:instrText xml:space="preserve"> PAGEREF _Toc243654257 \h </w:instrText>
+              <w:instrText xml:space="preserve"> PAGEREF _Toc243656588 \h </w:instrText>
             </w:r>
             <w:r>
               <w:rPr>
@@ -2844,7 +2959,7 @@
               <w14:ligatures w14:val="standardContextual"/>
             </w:rPr>
           </w:pPr>
-          <w:hyperlink w:anchor="_Toc243654258" w:history="1">
+          <w:hyperlink w:anchor="_Toc243656589" w:history="1">
             <w:r>
               <w:rPr>
                 <w:rStyle w:val="Hyperlink"/>
@@ -2868,7 +2983,7 @@
               <w:rPr>
                 <w:noProof/>
               </w:rPr>
-              <w:instrText xml:space="preserve"> PAGEREF _Toc243654258 \h </w:instrText>
+              <w:instrText xml:space="preserve"> PAGEREF _Toc243656589 \h </w:instrText>
             </w:r>
             <w:r>
               <w:rPr>
@@ -2911,7 +3026,7 @@
               <w14:ligatures w14:val="standardContextual"/>
             </w:rPr>
           </w:pPr>
-          <w:hyperlink w:anchor="_Toc243654259" w:history="1">
+          <w:hyperlink w:anchor="_Toc243656590" w:history="1">
             <w:r>
               <w:rPr>
                 <w:rStyle w:val="Hyperlink"/>
@@ -2935,7 +3050,7 @@
               <w:rPr>
                 <w:noProof/>
               </w:rPr>
-              <w:instrText xml:space="preserve"> PAGEREF _Toc243654259 \h </w:instrText>
+              <w:instrText xml:space="preserve"> PAGEREF _Toc243656590 \h </w:instrText>
             </w:r>
             <w:r>
               <w:rPr>
@@ -2978,7 +3093,7 @@
               <w14:ligatures w14:val="standardContextual"/>
             </w:rPr>
           </w:pPr>
-          <w:hyperlink w:anchor="_Toc243654260" w:history="1">
+          <w:hyperlink w:anchor="_Toc243656591" w:history="1">
             <w:r>
               <w:rPr>
                 <w:rStyle w:val="Hyperlink"/>
@@ -3002,7 +3117,7 @@
               <w:rPr>
                 <w:noProof/>
               </w:rPr>
-              <w:instrText xml:space="preserve"> PAGEREF _Toc243654260 \h </w:instrText>
+              <w:instrText xml:space="preserve"> PAGEREF _Toc243656591 \h </w:instrText>
             </w:r>
             <w:r>
               <w:rPr>
@@ -3045,7 +3160,7 @@
               <w14:ligatures w14:val="standardContextual"/>
             </w:rPr>
           </w:pPr>
-          <w:hyperlink w:anchor="_Toc243654261" w:history="1">
+          <w:hyperlink w:anchor="_Toc243656592" w:history="1">
             <w:r>
               <w:rPr>
                 <w:rStyle w:val="Hyperlink"/>
@@ -3069,7 +3184,7 @@
               <w:rPr>
                 <w:noProof/>
               </w:rPr>
-              <w:instrText xml:space="preserve"> PAGEREF _Toc243654261 \h </w:instrText>
+              <w:instrText xml:space="preserve"> PAGEREF _Toc243656592 \h </w:instrText>
             </w:r>
             <w:r>
               <w:rPr>
@@ -3112,7 +3227,7 @@
               <w14:ligatures w14:val="standardContextual"/>
             </w:rPr>
           </w:pPr>
-          <w:hyperlink w:anchor="_Toc243654262" w:history="1">
+          <w:hyperlink w:anchor="_Toc243656593" w:history="1">
             <w:r>
               <w:rPr>
                 <w:rStyle w:val="Hyperlink"/>
@@ -3136,7 +3251,7 @@
               <w:rPr>
                 <w:noProof/>
               </w:rPr>
-              <w:instrText xml:space="preserve"> PAGEREF _Toc243654262 \h </w:instrText>
+              <w:instrText xml:space="preserve"> PAGEREF _Toc243656593 \h </w:instrText>
             </w:r>
             <w:r>
               <w:rPr>
@@ -3179,7 +3294,7 @@
               <w14:ligatures w14:val="standardContextual"/>
             </w:rPr>
           </w:pPr>
-          <w:hyperlink w:anchor="_Toc243654263" w:history="1">
+          <w:hyperlink w:anchor="_Toc243656594" w:history="1">
             <w:r>
               <w:rPr>
                 <w:rStyle w:val="Hyperlink"/>
@@ -3203,7 +3318,7 @@
               <w:rPr>
                 <w:noProof/>
               </w:rPr>
-              <w:instrText xml:space="preserve"> PAGEREF _Toc243654263 \h </w:instrText>
+              <w:instrText xml:space="preserve"> PAGEREF _Toc243656594 \h </w:instrText>
             </w:r>
             <w:r>
               <w:rPr>
@@ -3246,7 +3361,7 @@
               <w14:ligatures w14:val="standardContextual"/>
             </w:rPr>
           </w:pPr>
-          <w:hyperlink w:anchor="_Toc243654264" w:history="1">
+          <w:hyperlink w:anchor="_Toc243656595" w:history="1">
             <w:r>
               <w:rPr>
                 <w:rStyle w:val="Hyperlink"/>
@@ -3270,7 +3385,7 @@
               <w:rPr>
                 <w:noProof/>
               </w:rPr>
-              <w:instrText xml:space="preserve"> PAGEREF _Toc243654264 \h </w:instrText>
+              <w:instrText xml:space="preserve"> PAGEREF _Toc243656595 \h </w:instrText>
             </w:r>
             <w:r>
               <w:rPr>
@@ -3313,7 +3428,7 @@
               <w14:ligatures w14:val="standardContextual"/>
             </w:rPr>
           </w:pPr>
-          <w:hyperlink w:anchor="_Toc243654265" w:history="1">
+          <w:hyperlink w:anchor="_Toc243656596" w:history="1">
             <w:r>
               <w:rPr>
                 <w:rStyle w:val="Hyperlink"/>
@@ -3337,7 +3452,7 @@
               <w:rPr>
                 <w:noProof/>
               </w:rPr>
-              <w:instrText xml:space="preserve"> PAGEREF _Toc243654265 \h </w:instrText>
+              <w:instrText xml:space="preserve"> PAGEREF _Toc243656596 \h </w:instrText>
             </w:r>
             <w:r>
               <w:rPr>
@@ -3380,7 +3495,7 @@
               <w14:ligatures w14:val="standardContextual"/>
             </w:rPr>
           </w:pPr>
-          <w:hyperlink w:anchor="_Toc243654266" w:history="1">
+          <w:hyperlink w:anchor="_Toc243656597" w:history="1">
             <w:r>
               <w:rPr>
                 <w:rStyle w:val="Hyperlink"/>
@@ -3404,7 +3519,7 @@
               <w:rPr>
                 <w:noProof/>
               </w:rPr>
-              <w:instrText xml:space="preserve"> PAGEREF _Toc243654266 \h </w:instrText>
+              <w:instrText xml:space="preserve"> PAGEREF _Toc243656597 \h </w:instrText>
             </w:r>
             <w:r>
               <w:rPr>
@@ -3447,7 +3562,7 @@
               <w14:ligatures w14:val="standardContextual"/>
             </w:rPr>
           </w:pPr>
-          <w:hyperlink w:anchor="_Toc243654267" w:history="1">
+          <w:hyperlink w:anchor="_Toc243656598" w:history="1">
             <w:r>
               <w:rPr>
                 <w:rStyle w:val="Hyperlink"/>
@@ -3471,7 +3586,7 @@
               <w:rPr>
                 <w:noProof/>
               </w:rPr>
-              <w:instrText xml:space="preserve"> PAGEREF _Toc243654267 \h </w:instrText>
+              <w:instrText xml:space="preserve"> PAGEREF _Toc243656598 \h </w:instrText>
             </w:r>
             <w:r>
               <w:rPr>
@@ -3514,7 +3629,7 @@
               <w14:ligatures w14:val="standardContextual"/>
             </w:rPr>
           </w:pPr>
-          <w:hyperlink w:anchor="_Toc243654268" w:history="1">
+          <w:hyperlink w:anchor="_Toc243656599" w:history="1">
             <w:r>
               <w:rPr>
                 <w:rStyle w:val="Hyperlink"/>
@@ -3538,7 +3653,7 @@
               <w:rPr>
                 <w:noProof/>
               </w:rPr>
-              <w:instrText xml:space="preserve"> PAGEREF _Toc243654268 \h </w:instrText>
+              <w:instrText xml:space="preserve"> PAGEREF _Toc243656599 \h </w:instrText>
             </w:r>
             <w:r>
               <w:rPr>
@@ -3581,7 +3696,7 @@
               <w14:ligatures w14:val="standardContextual"/>
             </w:rPr>
           </w:pPr>
-          <w:hyperlink w:anchor="_Toc243654269" w:history="1">
+          <w:hyperlink w:anchor="_Toc243656600" w:history="1">
             <w:r>
               <w:rPr>
                 <w:rStyle w:val="Hyperlink"/>
@@ -3605,7 +3720,7 @@
               <w:rPr>
                 <w:noProof/>
               </w:rPr>
-              <w:instrText xml:space="preserve"> PAGEREF _Toc243654269 \h </w:instrText>
+              <w:instrText xml:space="preserve"> PAGEREF _Toc243656600 \h </w:instrText>
             </w:r>
             <w:r>
               <w:rPr>
@@ -3648,7 +3763,7 @@
               <w14:ligatures w14:val="standardContextual"/>
             </w:rPr>
           </w:pPr>
-          <w:hyperlink w:anchor="_Toc243654270" w:history="1">
+          <w:hyperlink w:anchor="_Toc243656601" w:history="1">
             <w:r>
               <w:rPr>
                 <w:rStyle w:val="Hyperlink"/>
@@ -3672,7 +3787,7 @@
               <w:rPr>
                 <w:noProof/>
               </w:rPr>
-              <w:instrText xml:space="preserve"> PAGEREF _Toc243654270 \h </w:instrText>
+              <w:instrText xml:space="preserve"> PAGEREF _Toc243656601 \h </w:instrText>
             </w:r>
             <w:r>
               <w:rPr>
@@ -3689,7 +3804,7 @@
               <w:rPr>
                 <w:noProof/>
               </w:rPr>
-              <w:t>19</w:t>
+              <w:t>20</w:t>
             </w:r>
             <w:r>
               <w:rPr>
@@ -3715,7 +3830,7 @@
               <w14:ligatures w14:val="standardContextual"/>
             </w:rPr>
           </w:pPr>
-          <w:hyperlink w:anchor="_Toc243654271" w:history="1">
+          <w:hyperlink w:anchor="_Toc243656602" w:history="1">
             <w:r>
               <w:rPr>
                 <w:rStyle w:val="Hyperlink"/>
@@ -3739,7 +3854,7 @@
               <w:rPr>
                 <w:noProof/>
               </w:rPr>
-              <w:instrText xml:space="preserve"> PAGEREF _Toc243654271 \h </w:instrText>
+              <w:instrText xml:space="preserve"> PAGEREF _Toc243656602 \h </w:instrText>
             </w:r>
             <w:r>
               <w:rPr>
@@ -3756,7 +3871,7 @@
               <w:rPr>
                 <w:noProof/>
               </w:rPr>
-              <w:t>21</w:t>
+              <w:t>22</w:t>
             </w:r>
             <w:r>
               <w:rPr>
@@ -3782,7 +3897,7 @@
               <w14:ligatures w14:val="standardContextual"/>
             </w:rPr>
           </w:pPr>
-          <w:hyperlink w:anchor="_Toc243654272" w:history="1">
+          <w:hyperlink w:anchor="_Toc243656603" w:history="1">
             <w:r>
               <w:rPr>
                 <w:rStyle w:val="Hyperlink"/>
@@ -3806,7 +3921,7 @@
               <w:rPr>
                 <w:noProof/>
               </w:rPr>
-              <w:instrText xml:space="preserve"> PAGEREF _Toc243654272 \h </w:instrText>
+              <w:instrText xml:space="preserve"> PAGEREF _Toc243656603 \h </w:instrText>
             </w:r>
             <w:r>
               <w:rPr>
@@ -3823,7 +3938,7 @@
               <w:rPr>
                 <w:noProof/>
               </w:rPr>
-              <w:t>23</w:t>
+              <w:t>24</w:t>
             </w:r>
             <w:r>
               <w:rPr>
@@ -3849,7 +3964,7 @@
               <w14:ligatures w14:val="standardContextual"/>
             </w:rPr>
           </w:pPr>
-          <w:hyperlink w:anchor="_Toc243654273" w:history="1">
+          <w:hyperlink w:anchor="_Toc243656604" w:history="1">
             <w:r>
               <w:rPr>
                 <w:rStyle w:val="Hyperlink"/>
@@ -3873,7 +3988,7 @@
               <w:rPr>
                 <w:noProof/>
               </w:rPr>
-              <w:instrText xml:space="preserve"> PAGEREF _Toc243654273 \h </w:instrText>
+              <w:instrText xml:space="preserve"> PAGEREF _Toc243656604 \h </w:instrText>
             </w:r>
             <w:r>
               <w:rPr>
@@ -3890,7 +4005,7 @@
               <w:rPr>
                 <w:noProof/>
               </w:rPr>
-              <w:t>24</w:t>
+              <w:t>25</w:t>
             </w:r>
             <w:r>
               <w:rPr>
@@ -3916,7 +4031,7 @@
               <w14:ligatures w14:val="standardContextual"/>
             </w:rPr>
           </w:pPr>
-          <w:hyperlink w:anchor="_Toc243654274" w:history="1">
+          <w:hyperlink w:anchor="_Toc243656605" w:history="1">
             <w:r>
               <w:rPr>
                 <w:rStyle w:val="Hyperlink"/>
@@ -3940,7 +4055,7 @@
               <w:rPr>
                 <w:noProof/>
               </w:rPr>
-              <w:instrText xml:space="preserve"> PAGEREF _Toc243654274 \h </w:instrText>
+              <w:instrText xml:space="preserve"> PAGEREF _Toc243656605 \h </w:instrText>
             </w:r>
             <w:r>
               <w:rPr>
@@ -3957,7 +4072,7 @@
               <w:rPr>
                 <w:noProof/>
               </w:rPr>
-              <w:t>25</w:t>
+              <w:t>26</w:t>
             </w:r>
             <w:r>
               <w:rPr>
@@ -3983,7 +4098,7 @@
               <w14:ligatures w14:val="standardContextual"/>
             </w:rPr>
           </w:pPr>
-          <w:hyperlink w:anchor="_Toc243654275" w:history="1">
+          <w:hyperlink w:anchor="_Toc243656606" w:history="1">
             <w:r>
               <w:rPr>
                 <w:rStyle w:val="Hyperlink"/>
@@ -4007,7 +4122,7 @@
               <w:rPr>
                 <w:noProof/>
               </w:rPr>
-              <w:instrText xml:space="preserve"> PAGEREF _Toc243654275 \h </w:instrText>
+              <w:instrText xml:space="preserve"> PAGEREF _Toc243656606 \h </w:instrText>
             </w:r>
             <w:r>
               <w:rPr>
@@ -4024,7 +4139,7 @@
               <w:rPr>
                 <w:noProof/>
               </w:rPr>
-              <w:t>26</w:t>
+              <w:t>27</w:t>
             </w:r>
             <w:r>
               <w:rPr>
@@ -4050,7 +4165,7 @@
               <w14:ligatures w14:val="standardContextual"/>
             </w:rPr>
           </w:pPr>
-          <w:hyperlink w:anchor="_Toc243654276" w:history="1">
+          <w:hyperlink w:anchor="_Toc243656607" w:history="1">
             <w:r>
               <w:rPr>
                 <w:rStyle w:val="Hyperlink"/>
@@ -4074,7 +4189,7 @@
               <w:rPr>
                 <w:noProof/>
               </w:rPr>
-              <w:instrText xml:space="preserve"> PAGEREF _Toc243654276 \h </w:instrText>
+              <w:instrText xml:space="preserve"> PAGEREF _Toc243656607 \h </w:instrText>
             </w:r>
             <w:r>
               <w:rPr>
@@ -4091,7 +4206,7 @@
               <w:rPr>
                 <w:noProof/>
               </w:rPr>
-              <w:t>27</w:t>
+              <w:t>28</w:t>
             </w:r>
             <w:r>
               <w:rPr>
@@ -4120,7 +4235,7 @@
     <w:sdt>
       <w:sdtPr>
         <w:alias w:val="Tables"/>
-        <w:id w:val="1280531396"/>
+        <w:id w:val="1564607646"/>
       </w:sdtPr>
       <w:sdtEndPr/>
       <w:sdtContent>
@@ -4149,7 +4264,7 @@
           <w:r>
             <w:fldChar w:fldCharType="separate"/>
           </w:r>
-          <w:hyperlink w:anchor="_Toc243654277" w:history="1">
+          <w:hyperlink w:anchor="_Toc243656608" w:history="1">
             <w:r>
               <w:rPr>
                 <w:rStyle w:val="Hyperlink"/>
@@ -4173,7 +4288,7 @@
               <w:rPr>
                 <w:noProof/>
               </w:rPr>
-              <w:instrText xml:space="preserve"> PAGEREF _Toc243654277 \h </w:instrText>
+              <w:instrText xml:space="preserve"> PAGEREF _Toc243656608 \h </w:instrText>
             </w:r>
             <w:r>
               <w:rPr>
@@ -4216,7 +4331,7 @@
               <w14:ligatures w14:val="standardContextual"/>
             </w:rPr>
           </w:pPr>
-          <w:hyperlink w:anchor="_Toc243654278" w:history="1">
+          <w:hyperlink w:anchor="_Toc243656609" w:history="1">
             <w:r>
               <w:rPr>
                 <w:rStyle w:val="Hyperlink"/>
@@ -4240,7 +4355,7 @@
               <w:rPr>
                 <w:noProof/>
               </w:rPr>
-              <w:instrText xml:space="preserve"> PAGEREF _Toc243654278 \h </w:instrText>
+              <w:instrText xml:space="preserve"> PAGEREF _Toc243656609 \h </w:instrText>
             </w:r>
             <w:r>
               <w:rPr>
@@ -4283,7 +4398,7 @@
               <w14:ligatures w14:val="standardContextual"/>
             </w:rPr>
           </w:pPr>
-          <w:hyperlink w:anchor="_Toc243654279" w:history="1">
+          <w:hyperlink w:anchor="_Toc243656610" w:history="1">
             <w:r>
               <w:rPr>
                 <w:rStyle w:val="Hyperlink"/>
@@ -4307,7 +4422,7 @@
               <w:rPr>
                 <w:noProof/>
               </w:rPr>
-              <w:instrText xml:space="preserve"> PAGEREF _Toc243654279 \h </w:instrText>
+              <w:instrText xml:space="preserve"> PAGEREF _Toc243656610 \h </w:instrText>
             </w:r>
             <w:r>
               <w:rPr>
@@ -4350,7 +4465,7 @@
               <w14:ligatures w14:val="standardContextual"/>
             </w:rPr>
           </w:pPr>
-          <w:hyperlink w:anchor="_Toc243654280" w:history="1">
+          <w:hyperlink w:anchor="_Toc243656611" w:history="1">
             <w:r>
               <w:rPr>
                 <w:rStyle w:val="Hyperlink"/>
@@ -4374,7 +4489,7 @@
               <w:rPr>
                 <w:noProof/>
               </w:rPr>
-              <w:instrText xml:space="preserve"> PAGEREF _Toc243654280 \h </w:instrText>
+              <w:instrText xml:space="preserve"> PAGEREF _Toc243656611 \h </w:instrText>
             </w:r>
             <w:r>
               <w:rPr>
@@ -4417,7 +4532,7 @@
               <w14:ligatures w14:val="standardContextual"/>
             </w:rPr>
           </w:pPr>
-          <w:hyperlink w:anchor="_Toc243654281" w:history="1">
+          <w:hyperlink w:anchor="_Toc243656612" w:history="1">
             <w:r>
               <w:rPr>
                 <w:rStyle w:val="Hyperlink"/>
@@ -4441,7 +4556,7 @@
               <w:rPr>
                 <w:noProof/>
               </w:rPr>
-              <w:instrText xml:space="preserve"> PAGEREF _Toc243654281 \h </w:instrText>
+              <w:instrText xml:space="preserve"> PAGEREF _Toc243656612 \h </w:instrText>
             </w:r>
             <w:r>
               <w:rPr>
@@ -4484,7 +4599,7 @@
               <w14:ligatures w14:val="standardContextual"/>
             </w:rPr>
           </w:pPr>
-          <w:hyperlink w:anchor="_Toc243654282" w:history="1">
+          <w:hyperlink w:anchor="_Toc243656613" w:history="1">
             <w:r>
               <w:rPr>
                 <w:rStyle w:val="Hyperlink"/>
@@ -4508,7 +4623,7 @@
               <w:rPr>
                 <w:noProof/>
               </w:rPr>
-              <w:instrText xml:space="preserve"> PAGEREF _Toc243654282 \h </w:instrText>
+              <w:instrText xml:space="preserve"> PAGEREF _Toc243656613 \h </w:instrText>
             </w:r>
             <w:r>
               <w:rPr>
@@ -4551,7 +4666,7 @@
               <w14:ligatures w14:val="standardContextual"/>
             </w:rPr>
           </w:pPr>
-          <w:hyperlink w:anchor="_Toc243654283" w:history="1">
+          <w:hyperlink w:anchor="_Toc243656614" w:history="1">
             <w:r>
               <w:rPr>
                 <w:rStyle w:val="Hyperlink"/>
@@ -4575,7 +4690,7 @@
               <w:rPr>
                 <w:noProof/>
               </w:rPr>
-              <w:instrText xml:space="preserve"> PAGEREF _Toc243654283 \h </w:instrText>
+              <w:instrText xml:space="preserve"> PAGEREF _Toc243656614 \h </w:instrText>
             </w:r>
             <w:r>
               <w:rPr>
@@ -4592,7 +4707,7 @@
               <w:rPr>
                 <w:noProof/>
               </w:rPr>
-              <w:t>19</w:t>
+              <w:t>20</w:t>
             </w:r>
             <w:r>
               <w:rPr>
@@ -4618,7 +4733,7 @@
               <w14:ligatures w14:val="standardContextual"/>
             </w:rPr>
           </w:pPr>
-          <w:hyperlink w:anchor="_Toc243654284" w:history="1">
+          <w:hyperlink w:anchor="_Toc243656615" w:history="1">
             <w:r>
               <w:rPr>
                 <w:rStyle w:val="Hyperlink"/>
@@ -4642,7 +4757,7 @@
               <w:rPr>
                 <w:noProof/>
               </w:rPr>
-              <w:instrText xml:space="preserve"> PAGEREF _Toc243654284 \h </w:instrText>
+              <w:instrText xml:space="preserve"> PAGEREF _Toc243656615 \h </w:instrText>
             </w:r>
             <w:r>
               <w:rPr>
@@ -4659,7 +4774,7 @@
               <w:rPr>
                 <w:noProof/>
               </w:rPr>
-              <w:t>21</w:t>
+              <w:t>22</w:t>
             </w:r>
             <w:r>
               <w:rPr>
@@ -4685,7 +4800,7 @@
               <w14:ligatures w14:val="standardContextual"/>
             </w:rPr>
           </w:pPr>
-          <w:hyperlink w:anchor="_Toc243654285" w:history="1">
+          <w:hyperlink w:anchor="_Toc243656616" w:history="1">
             <w:r>
               <w:rPr>
                 <w:rStyle w:val="Hyperlink"/>
@@ -4709,7 +4824,7 @@
               <w:rPr>
                 <w:noProof/>
               </w:rPr>
-              <w:instrText xml:space="preserve"> PAGEREF _Toc243654285 \h </w:instrText>
+              <w:instrText xml:space="preserve"> PAGEREF _Toc243656616 \h </w:instrText>
             </w:r>
             <w:r>
               <w:rPr>
@@ -4726,7 +4841,7 @@
               <w:rPr>
                 <w:noProof/>
               </w:rPr>
-              <w:t>21</w:t>
+              <w:t>22</w:t>
             </w:r>
             <w:r>
               <w:rPr>
@@ -4752,7 +4867,7 @@
               <w14:ligatures w14:val="standardContextual"/>
             </w:rPr>
           </w:pPr>
-          <w:hyperlink w:anchor="_Toc243654286" w:history="1">
+          <w:hyperlink w:anchor="_Toc243656617" w:history="1">
             <w:r>
               <w:rPr>
                 <w:rStyle w:val="Hyperlink"/>
@@ -4776,7 +4891,7 @@
               <w:rPr>
                 <w:noProof/>
               </w:rPr>
-              <w:instrText xml:space="preserve"> PAGEREF _Toc243654286 \h </w:instrText>
+              <w:instrText xml:space="preserve"> PAGEREF _Toc243656617 \h </w:instrText>
             </w:r>
             <w:r>
               <w:rPr>
@@ -4793,7 +4908,7 @@
               <w:rPr>
                 <w:noProof/>
               </w:rPr>
-              <w:t>22</w:t>
+              <w:t>23</w:t>
             </w:r>
             <w:r>
               <w:rPr>
@@ -4819,7 +4934,7 @@
               <w14:ligatures w14:val="standardContextual"/>
             </w:rPr>
           </w:pPr>
-          <w:hyperlink w:anchor="_Toc243654287" w:history="1">
+          <w:hyperlink w:anchor="_Toc243656618" w:history="1">
             <w:r>
               <w:rPr>
                 <w:rStyle w:val="Hyperlink"/>
@@ -4843,7 +4958,7 @@
               <w:rPr>
                 <w:noProof/>
               </w:rPr>
-              <w:instrText xml:space="preserve"> PAGEREF _Toc243654287 \h </w:instrText>
+              <w:instrText xml:space="preserve"> PAGEREF _Toc243656618 \h </w:instrText>
             </w:r>
             <w:r>
               <w:rPr>
@@ -4860,7 +4975,7 @@
               <w:rPr>
                 <w:noProof/>
               </w:rPr>
-              <w:t>23</w:t>
+              <w:t>24</w:t>
             </w:r>
             <w:r>
               <w:rPr>
@@ -4886,7 +5001,7 @@
               <w14:ligatures w14:val="standardContextual"/>
             </w:rPr>
           </w:pPr>
-          <w:hyperlink w:anchor="_Toc243654288" w:history="1">
+          <w:hyperlink w:anchor="_Toc243656619" w:history="1">
             <w:r>
               <w:rPr>
                 <w:rStyle w:val="Hyperlink"/>
@@ -4910,7 +5025,7 @@
               <w:rPr>
                 <w:noProof/>
               </w:rPr>
-              <w:instrText xml:space="preserve"> PAGEREF _Toc243654288 \h </w:instrText>
+              <w:instrText xml:space="preserve"> PAGEREF _Toc243656619 \h </w:instrText>
             </w:r>
             <w:r>
               <w:rPr>
@@ -4927,7 +5042,7 @@
               <w:rPr>
                 <w:noProof/>
               </w:rPr>
-              <w:t>24</w:t>
+              <w:t>25</w:t>
             </w:r>
             <w:r>
               <w:rPr>
@@ -4953,7 +5068,7 @@
               <w14:ligatures w14:val="standardContextual"/>
             </w:rPr>
           </w:pPr>
-          <w:hyperlink w:anchor="_Toc243654289" w:history="1">
+          <w:hyperlink w:anchor="_Toc243656620" w:history="1">
             <w:r>
               <w:rPr>
                 <w:rStyle w:val="Hyperlink"/>
@@ -4977,7 +5092,7 @@
               <w:rPr>
                 <w:noProof/>
               </w:rPr>
-              <w:instrText xml:space="preserve"> PAGEREF _Toc243654289 \h </w:instrText>
+              <w:instrText xml:space="preserve"> PAGEREF _Toc243656620 \h </w:instrText>
             </w:r>
             <w:r>
               <w:rPr>
@@ -4994,7 +5109,7 @@
               <w:rPr>
                 <w:noProof/>
               </w:rPr>
-              <w:t>25</w:t>
+              <w:t>26</w:t>
             </w:r>
             <w:r>
               <w:rPr>
@@ -5020,7 +5135,7 @@
               <w14:ligatures w14:val="standardContextual"/>
             </w:rPr>
           </w:pPr>
-          <w:hyperlink w:anchor="_Toc243654290" w:history="1">
+          <w:hyperlink w:anchor="_Toc243656621" w:history="1">
             <w:r>
               <w:rPr>
                 <w:rStyle w:val="Hyperlink"/>
@@ -5044,7 +5159,7 @@
               <w:rPr>
                 <w:noProof/>
               </w:rPr>
-              <w:instrText xml:space="preserve"> PAGEREF _Toc243654290 \h </w:instrText>
+              <w:instrText xml:space="preserve"> PAGEREF _Toc243656621 \h </w:instrText>
             </w:r>
             <w:r>
               <w:rPr>
@@ -5061,7 +5176,7 @@
               <w:rPr>
                 <w:noProof/>
               </w:rPr>
-              <w:t>26</w:t>
+              <w:t>27</w:t>
             </w:r>
             <w:r>
               <w:rPr>
@@ -5087,7 +5202,7 @@
               <w14:ligatures w14:val="standardContextual"/>
             </w:rPr>
           </w:pPr>
-          <w:hyperlink w:anchor="_Toc243654291" w:history="1">
+          <w:hyperlink w:anchor="_Toc243656622" w:history="1">
             <w:r>
               <w:rPr>
                 <w:rStyle w:val="Hyperlink"/>
@@ -5111,7 +5226,7 @@
               <w:rPr>
                 <w:noProof/>
               </w:rPr>
-              <w:instrText xml:space="preserve"> PAGEREF _Toc243654291 \h </w:instrText>
+              <w:instrText xml:space="preserve"> PAGEREF _Toc243656622 \h </w:instrText>
             </w:r>
             <w:r>
               <w:rPr>
@@ -5128,7 +5243,7 @@
               <w:rPr>
                 <w:noProof/>
               </w:rPr>
-              <w:t>27</w:t>
+              <w:t>28</w:t>
             </w:r>
             <w:r>
               <w:rPr>
@@ -5152,7 +5267,7 @@
         <w:keepLines/>
         <w:pageBreakBefore/>
       </w:pPr>
-      <w:bookmarkStart w:id="0" w:name="_Toc243654254"/>
+      <w:bookmarkStart w:id="0" w:name="_Toc243656585"/>
       <w:r>
         <w:lastRenderedPageBreak/>
         <w:t>1 Introduction</w:t>
@@ -5165,7 +5280,7 @@
         <w:keepNext/>
         <w:keepLines/>
       </w:pPr>
-      <w:bookmarkStart w:id="1" w:name="_Toc243654255"/>
+      <w:bookmarkStart w:id="1" w:name="_Toc243656586"/>
       <w:r>
         <w:t>1.1 Purpose</w:t>
       </w:r>
@@ -5176,7 +5291,10 @@
         <w:spacing w:after="120"/>
       </w:pPr>
       <w:r>
-        <w:t>This document states how ZedPath is tested, what is tested, on what, and with what result. It follows the structure of IEEE 829 and ISO/IEC/IEEE 29119-3 (test plan and test summary content), scaled to a three-week buildathon product. It also gives the matrix from requirement to test case that ZP-DOC-00 requires of this document.</w:t>
+        <w:t xml:space="preserve">This document states how ZedPath is tested, what is tested, on what, and with what result. It follows the structure of IEEE 829 and ISO/IEC/IEEE 29119-3 (test plan and test summary content), scaled to a </w:t>
+      </w:r>
+      <w:r>
+        <w:t>three-week buildathon product. It also gives the matrix from requirement to test case that ZP-DOC-00 requires of this document.</w:t>
       </w:r>
     </w:p>
     <w:p>
@@ -5185,7 +5303,7 @@
         <w:keepNext/>
         <w:keepLines/>
       </w:pPr>
-      <w:bookmarkStart w:id="2" w:name="_Toc243654256"/>
+      <w:bookmarkStart w:id="2" w:name="_Toc243656587"/>
       <w:r>
         <w:t>1.2 Scope</w:t>
       </w:r>
@@ -5196,10 +5314,10 @@
         <w:spacing w:after="120"/>
       </w:pPr>
       <w:r>
-        <w:t xml:space="preserve">All software of Releases R1 and R2 as live on 11 October 2026, and as built on 15 October 2026 (VR2 and CR-007 to </w:t>
+        <w:t xml:space="preserve">All software of Releases R1 and R2 as live on 11 October 2026, and as built on 15 October 2026 (VR2 and CR-007 to CR-010): the React single-page app, the Hono API in one Cloudflare Worker, the D1 database and its migrations 0001 to 0012, the group-room Durable Object, Ask ZedPath, </w:t>
       </w:r>
       <w:r>
-        <w:t>CR-010): the React single-page app, the Hono API in one Cloudflare Worker, the D1 database and its migrations 0001 to 0012, the group-room Durable Object, Ask ZedPath, and the project's safety tooling (deploy guard and leak scanner). Out of scope: features not yet built (results-photo reading, curator review queue, Gazette job, share card, teacher view) and third-party services themselves (Gemini, Cloudflare platform), which are tested only through ZedPath's handling of their answers.</w:t>
+        <w:t>and the project's safety tooling (deploy guard and leak scanner). Out of scope: features not yet built (results-photo reading, curator review queue, Gazette job, share card, teacher view) and third-party services themselves (Gemini, Cloudflare platform), which are tested only through ZedPath's handling of their answers.</w:t>
       </w:r>
     </w:p>
     <w:p>
@@ -5208,7 +5326,7 @@
         <w:keepNext/>
         <w:keepLines/>
       </w:pPr>
-      <w:bookmarkStart w:id="3" w:name="_Toc243654257"/>
+      <w:bookmarkStart w:id="3" w:name="_Toc243656588"/>
       <w:r>
         <w:t>1.3 Intended audience</w:t>
       </w:r>
@@ -5228,7 +5346,7 @@
         <w:keepNext/>
         <w:keepLines/>
       </w:pPr>
-      <w:bookmarkStart w:id="4" w:name="_Toc243654258"/>
+      <w:bookmarkStart w:id="4" w:name="_Toc243656589"/>
       <w:r>
         <w:t>1.4 Relationship to other documents</w:t>
       </w:r>
@@ -5239,7 +5357,7 @@
         <w:pStyle w:val="Caption"/>
         <w:keepNext/>
       </w:pPr>
-      <w:bookmarkStart w:id="5" w:name="_Toc243654277"/>
+      <w:bookmarkStart w:id="5" w:name="_Toc243656608"/>
       <w:r>
         <w:t xml:space="preserve">Table </w:t>
       </w:r>
@@ -5757,7 +5875,7 @@
         <w:keepLines/>
         <w:pageBreakBefore/>
       </w:pPr>
-      <w:bookmarkStart w:id="6" w:name="_Toc243654259"/>
+      <w:bookmarkStart w:id="6" w:name="_Toc243656590"/>
       <w:r>
         <w:lastRenderedPageBreak/>
         <w:t>2 Test strategy</w:t>
@@ -5770,7 +5888,7 @@
         <w:keepNext/>
         <w:keepLines/>
       </w:pPr>
-      <w:bookmarkStart w:id="7" w:name="_Toc243654260"/>
+      <w:bookmarkStart w:id="7" w:name="_Toc243656591"/>
       <w:r>
         <w:t>2.1 Test levels</w:t>
       </w:r>
@@ -5781,7 +5899,7 @@
         <w:pStyle w:val="Caption"/>
         <w:keepNext/>
       </w:pPr>
-      <w:bookmarkStart w:id="8" w:name="_Toc243654278"/>
+      <w:bookmarkStart w:id="8" w:name="_Toc243656609"/>
       <w:r>
         <w:t xml:space="preserve">Table </w:t>
       </w:r>
@@ -7023,7 +7141,7 @@
         <w:keepNext/>
         <w:keepLines/>
       </w:pPr>
-      <w:bookmarkStart w:id="9" w:name="_Toc243654261"/>
+      <w:bookmarkStart w:id="9" w:name="_Toc243656592"/>
       <w:r>
         <w:t>2.2 Test types</w:t>
       </w:r>
@@ -7034,7 +7152,7 @@
         <w:pStyle w:val="Caption"/>
         <w:keepNext/>
       </w:pPr>
-      <w:bookmarkStart w:id="10" w:name="_Toc243654279"/>
+      <w:bookmarkStart w:id="10" w:name="_Toc243656610"/>
       <w:r>
         <w:t xml:space="preserve">Table </w:t>
       </w:r>
@@ -7822,7 +7940,7 @@
         <w:keepNext/>
         <w:keepLines/>
       </w:pPr>
-      <w:bookmarkStart w:id="11" w:name="_Toc243654262"/>
+      <w:bookmarkStart w:id="11" w:name="_Toc243656593"/>
       <w:r>
         <w:t>2.3 Approach</w:t>
       </w:r>
@@ -7845,7 +7963,10 @@
         <w:t>shared/</w:t>
       </w:r>
       <w:r>
-        <w:t xml:space="preserve"> (NFR-060), so they are tested without a server. Server rules are tested through the real HTTP routes on the real schema, never by calling internals. Each bug found by hand gets a test before or with its fix. Any change to a default value comes with a test that pins the default.</w:t>
+        <w:t xml:space="preserve"> (NFR-060), so they are tested without a server. Server rules are tested through the real HTTP routes on the real schema, never by calling internals. Each bug </w:t>
+      </w:r>
+      <w:r>
+        <w:t>found by hand gets a test before or with its fix. Any change to a default value comes with a test that pins the default.</w:t>
       </w:r>
     </w:p>
     <w:p>
@@ -7855,7 +7976,7 @@
         <w:keepLines/>
         <w:pageBreakBefore/>
       </w:pPr>
-      <w:bookmarkStart w:id="12" w:name="_Toc243654263"/>
+      <w:bookmarkStart w:id="12" w:name="_Toc243656594"/>
       <w:r>
         <w:lastRenderedPageBreak/>
         <w:t>3 Test environment</w:t>
@@ -7867,7 +7988,7 @@
         <w:pStyle w:val="Caption"/>
         <w:keepNext/>
       </w:pPr>
-      <w:bookmarkStart w:id="13" w:name="_Toc243654280"/>
+      <w:bookmarkStart w:id="13" w:name="_Toc243656611"/>
       <w:r>
         <w:t xml:space="preserve">Table </w:t>
       </w:r>
@@ -8530,10 +8651,13 @@
         <w:keepLines/>
         <w:pageBreakBefore/>
       </w:pPr>
-      <w:bookmarkStart w:id="14" w:name="_Toc243654264"/>
+      <w:bookmarkStart w:id="14" w:name="_Toc243656595"/>
       <w:r>
         <w:lastRenderedPageBreak/>
-        <w:t>4 Entry and exit criteria</w:t>
+        <w:t>4 </w:t>
+      </w:r>
+      <w:r>
+        <w:t>Entry and exit criteria</w:t>
       </w:r>
       <w:bookmarkEnd w:id="14"/>
     </w:p>
@@ -8543,7 +8667,7 @@
         <w:keepNext/>
         <w:keepLines/>
       </w:pPr>
-      <w:bookmarkStart w:id="15" w:name="_Toc243654265"/>
+      <w:bookmarkStart w:id="15" w:name="_Toc243656596"/>
       <w:r>
         <w:t>4.1 Entry criteria</w:t>
       </w:r>
@@ -8563,7 +8687,7 @@
         <w:keepNext/>
         <w:keepLines/>
       </w:pPr>
-      <w:bookmarkStart w:id="16" w:name="_Toc243654266"/>
+      <w:bookmarkStart w:id="16" w:name="_Toc243656597"/>
       <w:r>
         <w:t>4.2 Exit criteria (Definition of Done)</w:t>
       </w:r>
@@ -8771,12 +8895,9 @@
         <w:keepNext/>
         <w:keepLines/>
       </w:pPr>
-      <w:bookmarkStart w:id="17" w:name="_Toc243654267"/>
+      <w:bookmarkStart w:id="17" w:name="_Toc243656598"/>
       <w:r>
-        <w:t>4.3 </w:t>
-      </w:r>
-      <w:r>
-        <w:t>Suspension and resumption</w:t>
+        <w:t>4.3 Suspension and resumption</w:t>
       </w:r>
       <w:bookmarkEnd w:id="17"/>
     </w:p>
@@ -8785,7 +8906,10 @@
         <w:spacing w:after="120"/>
       </w:pPr>
       <w:r>
-        <w:t>Testing stops when the test channel itself fails (for example, a local server serving an old build); the channel is fixed first, then testing resumes. After one failed fix, the next step is instrumentation, not a second patch.</w:t>
+        <w:t xml:space="preserve">Testing stops when the test channel itself fails (for example, a local server serving an old build); the </w:t>
+      </w:r>
+      <w:r>
+        <w:t>channel is fixed first, then testing resumes. After one failed fix, the next step is instrumentation, not a second patch.</w:t>
       </w:r>
     </w:p>
     <w:p>
@@ -8795,7 +8919,7 @@
         <w:keepLines/>
         <w:pageBreakBefore/>
       </w:pPr>
-      <w:bookmarkStart w:id="18" w:name="_Toc243654268"/>
+      <w:bookmarkStart w:id="18" w:name="_Toc243656599"/>
       <w:r>
         <w:lastRenderedPageBreak/>
         <w:t>5 Test items and features</w:t>
@@ -8807,7 +8931,7 @@
         <w:pStyle w:val="Caption"/>
         <w:keepNext/>
       </w:pPr>
-      <w:bookmarkStart w:id="19" w:name="_Toc243654281"/>
+      <w:bookmarkStart w:id="19" w:name="_Toc243656612"/>
       <w:r>
         <w:t xml:space="preserve">Table </w:t>
       </w:r>
@@ -11664,7 +11788,7 @@
         <w:keepLines/>
         <w:pageBreakBefore/>
       </w:pPr>
-      <w:bookmarkStart w:id="20" w:name="_Toc243654269"/>
+      <w:bookmarkStart w:id="20" w:name="_Toc243656600"/>
       <w:r>
         <w:lastRenderedPageBreak/>
         <w:t>6 Test case catalogue</w:t>
@@ -11696,7 +11820,7 @@
         <w:pStyle w:val="Caption"/>
         <w:keepNext/>
       </w:pPr>
-      <w:bookmarkStart w:id="21" w:name="_Toc243654282"/>
+      <w:bookmarkStart w:id="21" w:name="_Toc243656613"/>
       <w:r>
         <w:t xml:space="preserve">Table </w:t>
       </w:r>
@@ -11741,11 +11865,11 @@
         <w:tblLook w:val="04A0" w:firstRow="1" w:lastRow="0" w:firstColumn="1" w:lastColumn="0" w:noHBand="0" w:noVBand="1"/>
       </w:tblPr>
       <w:tblGrid>
-        <w:gridCol w:w="741"/>
-        <w:gridCol w:w="1266"/>
-        <w:gridCol w:w="3103"/>
-        <w:gridCol w:w="2264"/>
-        <w:gridCol w:w="2264"/>
+        <w:gridCol w:w="740"/>
+        <w:gridCol w:w="1370"/>
+        <w:gridCol w:w="3098"/>
+        <w:gridCol w:w="2215"/>
+        <w:gridCol w:w="2215"/>
       </w:tblGrid>
       <w:tr>
         <w:tblPrEx>
@@ -11760,7 +11884,7 @@
         </w:trPr>
         <w:tc>
           <w:tcPr>
-            <w:tcW w:w="741" w:type="dxa"/>
+            <w:tcW w:w="740" w:type="dxa"/>
             <w:tcBorders>
               <w:top w:val="single" w:sz="4" w:space="0" w:color="C9D3D0"/>
               <w:left w:val="single" w:sz="4" w:space="0" w:color="C9D3D0"/>
@@ -11794,7 +11918,7 @@
         </w:tc>
         <w:tc>
           <w:tcPr>
-            <w:tcW w:w="1266" w:type="dxa"/>
+            <w:tcW w:w="1370" w:type="dxa"/>
             <w:tcBorders>
               <w:top w:val="single" w:sz="4" w:space="0" w:color="C9D3D0"/>
               <w:left w:val="single" w:sz="4" w:space="0" w:color="C9D3D0"/>
@@ -11828,7 +11952,7 @@
         </w:tc>
         <w:tc>
           <w:tcPr>
-            <w:tcW w:w="3103" w:type="dxa"/>
+            <w:tcW w:w="3098" w:type="dxa"/>
             <w:tcBorders>
               <w:top w:val="single" w:sz="4" w:space="0" w:color="C9D3D0"/>
               <w:left w:val="single" w:sz="4" w:space="0" w:color="C9D3D0"/>
@@ -11862,7 +11986,7 @@
         </w:tc>
         <w:tc>
           <w:tcPr>
-            <w:tcW w:w="2264" w:type="dxa"/>
+            <w:tcW w:w="2215" w:type="dxa"/>
             <w:tcBorders>
               <w:top w:val="single" w:sz="4" w:space="0" w:color="C9D3D0"/>
               <w:left w:val="single" w:sz="4" w:space="0" w:color="C9D3D0"/>
@@ -11896,7 +12020,7 @@
         </w:tc>
         <w:tc>
           <w:tcPr>
-            <w:tcW w:w="2264" w:type="dxa"/>
+            <w:tcW w:w="2215" w:type="dxa"/>
             <w:tcBorders>
               <w:top w:val="single" w:sz="4" w:space="0" w:color="C9D3D0"/>
               <w:left w:val="single" w:sz="4" w:space="0" w:color="C9D3D0"/>
@@ -11941,7 +12065,7 @@
         </w:trPr>
         <w:tc>
           <w:tcPr>
-            <w:tcW w:w="741" w:type="dxa"/>
+            <w:tcW w:w="740" w:type="dxa"/>
             <w:tcBorders>
               <w:top w:val="single" w:sz="4" w:space="0" w:color="C9D3D0"/>
               <w:left w:val="single" w:sz="4" w:space="0" w:color="C9D3D0"/>
@@ -11971,7 +12095,7 @@
         </w:tc>
         <w:tc>
           <w:tcPr>
-            <w:tcW w:w="1266" w:type="dxa"/>
+            <w:tcW w:w="1370" w:type="dxa"/>
             <w:tcBorders>
               <w:top w:val="single" w:sz="4" w:space="0" w:color="C9D3D0"/>
               <w:left w:val="single" w:sz="4" w:space="0" w:color="C9D3D0"/>
@@ -12001,7 +12125,7 @@
         </w:tc>
         <w:tc>
           <w:tcPr>
-            <w:tcW w:w="3103" w:type="dxa"/>
+            <w:tcW w:w="3098" w:type="dxa"/>
             <w:tcBorders>
               <w:top w:val="single" w:sz="4" w:space="0" w:color="C9D3D0"/>
               <w:left w:val="single" w:sz="4" w:space="0" w:color="C9D3D0"/>
@@ -12040,7 +12164,7 @@
         </w:tc>
         <w:tc>
           <w:tcPr>
-            <w:tcW w:w="2264" w:type="dxa"/>
+            <w:tcW w:w="2215" w:type="dxa"/>
             <w:tcBorders>
               <w:top w:val="single" w:sz="4" w:space="0" w:color="C9D3D0"/>
               <w:left w:val="single" w:sz="4" w:space="0" w:color="C9D3D0"/>
@@ -12070,7 +12194,7 @@
         </w:tc>
         <w:tc>
           <w:tcPr>
-            <w:tcW w:w="2264" w:type="dxa"/>
+            <w:tcW w:w="2215" w:type="dxa"/>
             <w:tcBorders>
               <w:top w:val="single" w:sz="4" w:space="0" w:color="C9D3D0"/>
               <w:left w:val="single" w:sz="4" w:space="0" w:color="C9D3D0"/>
@@ -12111,7 +12235,7 @@
         </w:trPr>
         <w:tc>
           <w:tcPr>
-            <w:tcW w:w="741" w:type="dxa"/>
+            <w:tcW w:w="740" w:type="dxa"/>
             <w:tcBorders>
               <w:top w:val="single" w:sz="4" w:space="0" w:color="C9D3D0"/>
               <w:left w:val="single" w:sz="4" w:space="0" w:color="C9D3D0"/>
@@ -12142,7 +12266,7 @@
         </w:tc>
         <w:tc>
           <w:tcPr>
-            <w:tcW w:w="1266" w:type="dxa"/>
+            <w:tcW w:w="1370" w:type="dxa"/>
             <w:tcBorders>
               <w:top w:val="single" w:sz="4" w:space="0" w:color="C9D3D0"/>
               <w:left w:val="single" w:sz="4" w:space="0" w:color="C9D3D0"/>
@@ -12173,7 +12297,7 @@
         </w:tc>
         <w:tc>
           <w:tcPr>
-            <w:tcW w:w="3103" w:type="dxa"/>
+            <w:tcW w:w="3098" w:type="dxa"/>
             <w:tcBorders>
               <w:top w:val="single" w:sz="4" w:space="0" w:color="C9D3D0"/>
               <w:left w:val="single" w:sz="4" w:space="0" w:color="C9D3D0"/>
@@ -12213,7 +12337,7 @@
         </w:tc>
         <w:tc>
           <w:tcPr>
-            <w:tcW w:w="2264" w:type="dxa"/>
+            <w:tcW w:w="2215" w:type="dxa"/>
             <w:tcBorders>
               <w:top w:val="single" w:sz="4" w:space="0" w:color="C9D3D0"/>
               <w:left w:val="single" w:sz="4" w:space="0" w:color="C9D3D0"/>
@@ -12244,7 +12368,7 @@
         </w:tc>
         <w:tc>
           <w:tcPr>
-            <w:tcW w:w="2264" w:type="dxa"/>
+            <w:tcW w:w="2215" w:type="dxa"/>
             <w:tcBorders>
               <w:top w:val="single" w:sz="4" w:space="0" w:color="C9D3D0"/>
               <w:left w:val="single" w:sz="4" w:space="0" w:color="C9D3D0"/>
@@ -12286,7 +12410,7 @@
         </w:trPr>
         <w:tc>
           <w:tcPr>
-            <w:tcW w:w="741" w:type="dxa"/>
+            <w:tcW w:w="740" w:type="dxa"/>
             <w:tcBorders>
               <w:top w:val="single" w:sz="4" w:space="0" w:color="C9D3D0"/>
               <w:left w:val="single" w:sz="4" w:space="0" w:color="C9D3D0"/>
@@ -12316,7 +12440,7 @@
         </w:tc>
         <w:tc>
           <w:tcPr>
-            <w:tcW w:w="1266" w:type="dxa"/>
+            <w:tcW w:w="1370" w:type="dxa"/>
             <w:tcBorders>
               <w:top w:val="single" w:sz="4" w:space="0" w:color="C9D3D0"/>
               <w:left w:val="single" w:sz="4" w:space="0" w:color="C9D3D0"/>
@@ -12346,7 +12470,7 @@
         </w:tc>
         <w:tc>
           <w:tcPr>
-            <w:tcW w:w="3103" w:type="dxa"/>
+            <w:tcW w:w="3098" w:type="dxa"/>
             <w:tcBorders>
               <w:top w:val="single" w:sz="4" w:space="0" w:color="C9D3D0"/>
               <w:left w:val="single" w:sz="4" w:space="0" w:color="C9D3D0"/>
@@ -12385,7 +12509,7 @@
         </w:tc>
         <w:tc>
           <w:tcPr>
-            <w:tcW w:w="2264" w:type="dxa"/>
+            <w:tcW w:w="2215" w:type="dxa"/>
             <w:tcBorders>
               <w:top w:val="single" w:sz="4" w:space="0" w:color="C9D3D0"/>
               <w:left w:val="single" w:sz="4" w:space="0" w:color="C9D3D0"/>
@@ -12424,7 +12548,7 @@
         </w:tc>
         <w:tc>
           <w:tcPr>
-            <w:tcW w:w="2264" w:type="dxa"/>
+            <w:tcW w:w="2215" w:type="dxa"/>
             <w:tcBorders>
               <w:top w:val="single" w:sz="4" w:space="0" w:color="C9D3D0"/>
               <w:left w:val="single" w:sz="4" w:space="0" w:color="C9D3D0"/>
@@ -12465,7 +12589,7 @@
         </w:trPr>
         <w:tc>
           <w:tcPr>
-            <w:tcW w:w="741" w:type="dxa"/>
+            <w:tcW w:w="740" w:type="dxa"/>
             <w:tcBorders>
               <w:top w:val="single" w:sz="4" w:space="0" w:color="C9D3D0"/>
               <w:left w:val="single" w:sz="4" w:space="0" w:color="C9D3D0"/>
@@ -12496,7 +12620,7 @@
         </w:tc>
         <w:tc>
           <w:tcPr>
-            <w:tcW w:w="1266" w:type="dxa"/>
+            <w:tcW w:w="1370" w:type="dxa"/>
             <w:tcBorders>
               <w:top w:val="single" w:sz="4" w:space="0" w:color="C9D3D0"/>
               <w:left w:val="single" w:sz="4" w:space="0" w:color="C9D3D0"/>
@@ -12527,7 +12651,7 @@
         </w:tc>
         <w:tc>
           <w:tcPr>
-            <w:tcW w:w="3103" w:type="dxa"/>
+            <w:tcW w:w="3098" w:type="dxa"/>
             <w:tcBorders>
               <w:top w:val="single" w:sz="4" w:space="0" w:color="C9D3D0"/>
               <w:left w:val="single" w:sz="4" w:space="0" w:color="C9D3D0"/>
@@ -12567,7 +12691,7 @@
         </w:tc>
         <w:tc>
           <w:tcPr>
-            <w:tcW w:w="2264" w:type="dxa"/>
+            <w:tcW w:w="2215" w:type="dxa"/>
             <w:tcBorders>
               <w:top w:val="single" w:sz="4" w:space="0" w:color="C9D3D0"/>
               <w:left w:val="single" w:sz="4" w:space="0" w:color="C9D3D0"/>
@@ -12598,7 +12722,7 @@
         </w:tc>
         <w:tc>
           <w:tcPr>
-            <w:tcW w:w="2264" w:type="dxa"/>
+            <w:tcW w:w="2215" w:type="dxa"/>
             <w:tcBorders>
               <w:top w:val="single" w:sz="4" w:space="0" w:color="C9D3D0"/>
               <w:left w:val="single" w:sz="4" w:space="0" w:color="C9D3D0"/>
@@ -12640,7 +12764,7 @@
         </w:trPr>
         <w:tc>
           <w:tcPr>
-            <w:tcW w:w="741" w:type="dxa"/>
+            <w:tcW w:w="740" w:type="dxa"/>
             <w:tcBorders>
               <w:top w:val="single" w:sz="4" w:space="0" w:color="C9D3D0"/>
               <w:left w:val="single" w:sz="4" w:space="0" w:color="C9D3D0"/>
@@ -12670,7 +12794,7 @@
         </w:tc>
         <w:tc>
           <w:tcPr>
-            <w:tcW w:w="1266" w:type="dxa"/>
+            <w:tcW w:w="1370" w:type="dxa"/>
             <w:tcBorders>
               <w:top w:val="single" w:sz="4" w:space="0" w:color="C9D3D0"/>
               <w:left w:val="single" w:sz="4" w:space="0" w:color="C9D3D0"/>
@@ -12700,7 +12824,7 @@
         </w:tc>
         <w:tc>
           <w:tcPr>
-            <w:tcW w:w="3103" w:type="dxa"/>
+            <w:tcW w:w="3098" w:type="dxa"/>
             <w:tcBorders>
               <w:top w:val="single" w:sz="4" w:space="0" w:color="C9D3D0"/>
               <w:left w:val="single" w:sz="4" w:space="0" w:color="C9D3D0"/>
@@ -12739,7 +12863,7 @@
         </w:tc>
         <w:tc>
           <w:tcPr>
-            <w:tcW w:w="2264" w:type="dxa"/>
+            <w:tcW w:w="2215" w:type="dxa"/>
             <w:tcBorders>
               <w:top w:val="single" w:sz="4" w:space="0" w:color="C9D3D0"/>
               <w:left w:val="single" w:sz="4" w:space="0" w:color="C9D3D0"/>
@@ -12769,7 +12893,7 @@
         </w:tc>
         <w:tc>
           <w:tcPr>
-            <w:tcW w:w="2264" w:type="dxa"/>
+            <w:tcW w:w="2215" w:type="dxa"/>
             <w:tcBorders>
               <w:top w:val="single" w:sz="4" w:space="0" w:color="C9D3D0"/>
               <w:left w:val="single" w:sz="4" w:space="0" w:color="C9D3D0"/>
@@ -12810,7 +12934,7 @@
         </w:trPr>
         <w:tc>
           <w:tcPr>
-            <w:tcW w:w="741" w:type="dxa"/>
+            <w:tcW w:w="740" w:type="dxa"/>
             <w:tcBorders>
               <w:top w:val="single" w:sz="4" w:space="0" w:color="C9D3D0"/>
               <w:left w:val="single" w:sz="4" w:space="0" w:color="C9D3D0"/>
@@ -12841,7 +12965,7 @@
         </w:tc>
         <w:tc>
           <w:tcPr>
-            <w:tcW w:w="1266" w:type="dxa"/>
+            <w:tcW w:w="1370" w:type="dxa"/>
             <w:tcBorders>
               <w:top w:val="single" w:sz="4" w:space="0" w:color="C9D3D0"/>
               <w:left w:val="single" w:sz="4" w:space="0" w:color="C9D3D0"/>
@@ -12872,7 +12996,7 @@
         </w:tc>
         <w:tc>
           <w:tcPr>
-            <w:tcW w:w="3103" w:type="dxa"/>
+            <w:tcW w:w="3098" w:type="dxa"/>
             <w:tcBorders>
               <w:top w:val="single" w:sz="4" w:space="0" w:color="C9D3D0"/>
               <w:left w:val="single" w:sz="4" w:space="0" w:color="C9D3D0"/>
@@ -12906,13 +13030,13 @@
                 <w:sz w:val="19"/>
                 <w:szCs w:val="19"/>
               </w:rPr>
-              <w:t xml:space="preserve"> (16)</w:t>
-            </w:r>
-          </w:p>
-        </w:tc>
-        <w:tc>
-          <w:tcPr>
-            <w:tcW w:w="2264" w:type="dxa"/>
+              <w:t xml:space="preserve"> (17)</w:t>
+            </w:r>
+          </w:p>
+        </w:tc>
+        <w:tc>
+          <w:tcPr>
+            <w:tcW w:w="2215" w:type="dxa"/>
             <w:tcBorders>
               <w:top w:val="single" w:sz="4" w:space="0" w:color="C9D3D0"/>
               <w:left w:val="single" w:sz="4" w:space="0" w:color="C9D3D0"/>
@@ -12943,7 +13067,7 @@
         </w:tc>
         <w:tc>
           <w:tcPr>
-            <w:tcW w:w="2264" w:type="dxa"/>
+            <w:tcW w:w="2215" w:type="dxa"/>
             <w:tcBorders>
               <w:top w:val="single" w:sz="4" w:space="0" w:color="C9D3D0"/>
               <w:left w:val="single" w:sz="4" w:space="0" w:color="C9D3D0"/>
@@ -12985,7 +13109,7 @@
         </w:trPr>
         <w:tc>
           <w:tcPr>
-            <w:tcW w:w="741" w:type="dxa"/>
+            <w:tcW w:w="740" w:type="dxa"/>
             <w:tcBorders>
               <w:top w:val="single" w:sz="4" w:space="0" w:color="C9D3D0"/>
               <w:left w:val="single" w:sz="4" w:space="0" w:color="C9D3D0"/>
@@ -13015,7 +13139,7 @@
         </w:tc>
         <w:tc>
           <w:tcPr>
-            <w:tcW w:w="1266" w:type="dxa"/>
+            <w:tcW w:w="1370" w:type="dxa"/>
             <w:tcBorders>
               <w:top w:val="single" w:sz="4" w:space="0" w:color="C9D3D0"/>
               <w:left w:val="single" w:sz="4" w:space="0" w:color="C9D3D0"/>
@@ -13045,7 +13169,7 @@
         </w:tc>
         <w:tc>
           <w:tcPr>
-            <w:tcW w:w="3103" w:type="dxa"/>
+            <w:tcW w:w="3098" w:type="dxa"/>
             <w:tcBorders>
               <w:top w:val="single" w:sz="4" w:space="0" w:color="C9D3D0"/>
               <w:left w:val="single" w:sz="4" w:space="0" w:color="C9D3D0"/>
@@ -13084,7 +13208,7 @@
         </w:tc>
         <w:tc>
           <w:tcPr>
-            <w:tcW w:w="2264" w:type="dxa"/>
+            <w:tcW w:w="2215" w:type="dxa"/>
             <w:tcBorders>
               <w:top w:val="single" w:sz="4" w:space="0" w:color="C9D3D0"/>
               <w:left w:val="single" w:sz="4" w:space="0" w:color="C9D3D0"/>
@@ -13114,7 +13238,7 @@
         </w:tc>
         <w:tc>
           <w:tcPr>
-            <w:tcW w:w="2264" w:type="dxa"/>
+            <w:tcW w:w="2215" w:type="dxa"/>
             <w:tcBorders>
               <w:top w:val="single" w:sz="4" w:space="0" w:color="C9D3D0"/>
               <w:left w:val="single" w:sz="4" w:space="0" w:color="C9D3D0"/>
@@ -13155,7 +13279,7 @@
         </w:trPr>
         <w:tc>
           <w:tcPr>
-            <w:tcW w:w="741" w:type="dxa"/>
+            <w:tcW w:w="740" w:type="dxa"/>
             <w:tcBorders>
               <w:top w:val="single" w:sz="4" w:space="0" w:color="C9D3D0"/>
               <w:left w:val="single" w:sz="4" w:space="0" w:color="C9D3D0"/>
@@ -13187,7 +13311,7 @@
         </w:tc>
         <w:tc>
           <w:tcPr>
-            <w:tcW w:w="1266" w:type="dxa"/>
+            <w:tcW w:w="1370" w:type="dxa"/>
             <w:tcBorders>
               <w:top w:val="single" w:sz="4" w:space="0" w:color="C9D3D0"/>
               <w:left w:val="single" w:sz="4" w:space="0" w:color="C9D3D0"/>
@@ -13218,7 +13342,7 @@
         </w:tc>
         <w:tc>
           <w:tcPr>
-            <w:tcW w:w="3103" w:type="dxa"/>
+            <w:tcW w:w="3098" w:type="dxa"/>
             <w:tcBorders>
               <w:top w:val="single" w:sz="4" w:space="0" w:color="C9D3D0"/>
               <w:left w:val="single" w:sz="4" w:space="0" w:color="C9D3D0"/>
@@ -13258,7 +13382,7 @@
         </w:tc>
         <w:tc>
           <w:tcPr>
-            <w:tcW w:w="2264" w:type="dxa"/>
+            <w:tcW w:w="2215" w:type="dxa"/>
             <w:tcBorders>
               <w:top w:val="single" w:sz="4" w:space="0" w:color="C9D3D0"/>
               <w:left w:val="single" w:sz="4" w:space="0" w:color="C9D3D0"/>
@@ -13289,7 +13413,7 @@
         </w:tc>
         <w:tc>
           <w:tcPr>
-            <w:tcW w:w="2264" w:type="dxa"/>
+            <w:tcW w:w="2215" w:type="dxa"/>
             <w:tcBorders>
               <w:top w:val="single" w:sz="4" w:space="0" w:color="C9D3D0"/>
               <w:left w:val="single" w:sz="4" w:space="0" w:color="C9D3D0"/>
@@ -13331,7 +13455,7 @@
         </w:trPr>
         <w:tc>
           <w:tcPr>
-            <w:tcW w:w="741" w:type="dxa"/>
+            <w:tcW w:w="740" w:type="dxa"/>
             <w:tcBorders>
               <w:top w:val="single" w:sz="4" w:space="0" w:color="C9D3D0"/>
               <w:left w:val="single" w:sz="4" w:space="0" w:color="C9D3D0"/>
@@ -13361,7 +13485,7 @@
         </w:tc>
         <w:tc>
           <w:tcPr>
-            <w:tcW w:w="1266" w:type="dxa"/>
+            <w:tcW w:w="1370" w:type="dxa"/>
             <w:tcBorders>
               <w:top w:val="single" w:sz="4" w:space="0" w:color="C9D3D0"/>
               <w:left w:val="single" w:sz="4" w:space="0" w:color="C9D3D0"/>
@@ -13391,7 +13515,7 @@
         </w:tc>
         <w:tc>
           <w:tcPr>
-            <w:tcW w:w="3103" w:type="dxa"/>
+            <w:tcW w:w="3098" w:type="dxa"/>
             <w:tcBorders>
               <w:top w:val="single" w:sz="4" w:space="0" w:color="C9D3D0"/>
               <w:left w:val="single" w:sz="4" w:space="0" w:color="C9D3D0"/>
@@ -13430,7 +13554,7 @@
         </w:tc>
         <w:tc>
           <w:tcPr>
-            <w:tcW w:w="2264" w:type="dxa"/>
+            <w:tcW w:w="2215" w:type="dxa"/>
             <w:tcBorders>
               <w:top w:val="single" w:sz="4" w:space="0" w:color="C9D3D0"/>
               <w:left w:val="single" w:sz="4" w:space="0" w:color="C9D3D0"/>
@@ -13460,7 +13584,7 @@
         </w:tc>
         <w:tc>
           <w:tcPr>
-            <w:tcW w:w="2264" w:type="dxa"/>
+            <w:tcW w:w="2215" w:type="dxa"/>
             <w:tcBorders>
               <w:top w:val="single" w:sz="4" w:space="0" w:color="C9D3D0"/>
               <w:left w:val="single" w:sz="4" w:space="0" w:color="C9D3D0"/>
@@ -13501,7 +13625,7 @@
         </w:trPr>
         <w:tc>
           <w:tcPr>
-            <w:tcW w:w="741" w:type="dxa"/>
+            <w:tcW w:w="740" w:type="dxa"/>
             <w:tcBorders>
               <w:top w:val="single" w:sz="4" w:space="0" w:color="C9D3D0"/>
               <w:left w:val="single" w:sz="4" w:space="0" w:color="C9D3D0"/>
@@ -13532,7 +13656,7 @@
         </w:tc>
         <w:tc>
           <w:tcPr>
-            <w:tcW w:w="1266" w:type="dxa"/>
+            <w:tcW w:w="1370" w:type="dxa"/>
             <w:tcBorders>
               <w:top w:val="single" w:sz="4" w:space="0" w:color="C9D3D0"/>
               <w:left w:val="single" w:sz="4" w:space="0" w:color="C9D3D0"/>
@@ -13563,7 +13687,7 @@
         </w:tc>
         <w:tc>
           <w:tcPr>
-            <w:tcW w:w="3103" w:type="dxa"/>
+            <w:tcW w:w="3098" w:type="dxa"/>
             <w:tcBorders>
               <w:top w:val="single" w:sz="4" w:space="0" w:color="C9D3D0"/>
               <w:left w:val="single" w:sz="4" w:space="0" w:color="C9D3D0"/>
@@ -13603,7 +13727,7 @@
         </w:tc>
         <w:tc>
           <w:tcPr>
-            <w:tcW w:w="2264" w:type="dxa"/>
+            <w:tcW w:w="2215" w:type="dxa"/>
             <w:tcBorders>
               <w:top w:val="single" w:sz="4" w:space="0" w:color="C9D3D0"/>
               <w:left w:val="single" w:sz="4" w:space="0" w:color="C9D3D0"/>
@@ -13634,7 +13758,7 @@
         </w:tc>
         <w:tc>
           <w:tcPr>
-            <w:tcW w:w="2264" w:type="dxa"/>
+            <w:tcW w:w="2215" w:type="dxa"/>
             <w:tcBorders>
               <w:top w:val="single" w:sz="4" w:space="0" w:color="C9D3D0"/>
               <w:left w:val="single" w:sz="4" w:space="0" w:color="C9D3D0"/>
@@ -13676,7 +13800,7 @@
         </w:trPr>
         <w:tc>
           <w:tcPr>
-            <w:tcW w:w="741" w:type="dxa"/>
+            <w:tcW w:w="740" w:type="dxa"/>
             <w:tcBorders>
               <w:top w:val="single" w:sz="4" w:space="0" w:color="C9D3D0"/>
               <w:left w:val="single" w:sz="4" w:space="0" w:color="C9D3D0"/>
@@ -13706,7 +13830,7 @@
         </w:tc>
         <w:tc>
           <w:tcPr>
-            <w:tcW w:w="1266" w:type="dxa"/>
+            <w:tcW w:w="1370" w:type="dxa"/>
             <w:tcBorders>
               <w:top w:val="single" w:sz="4" w:space="0" w:color="C9D3D0"/>
               <w:left w:val="single" w:sz="4" w:space="0" w:color="C9D3D0"/>
@@ -13736,7 +13860,7 @@
         </w:tc>
         <w:tc>
           <w:tcPr>
-            <w:tcW w:w="3103" w:type="dxa"/>
+            <w:tcW w:w="3098" w:type="dxa"/>
             <w:tcBorders>
               <w:top w:val="single" w:sz="4" w:space="0" w:color="C9D3D0"/>
               <w:left w:val="single" w:sz="4" w:space="0" w:color="C9D3D0"/>
@@ -13775,7 +13899,7 @@
         </w:tc>
         <w:tc>
           <w:tcPr>
-            <w:tcW w:w="2264" w:type="dxa"/>
+            <w:tcW w:w="2215" w:type="dxa"/>
             <w:tcBorders>
               <w:top w:val="single" w:sz="4" w:space="0" w:color="C9D3D0"/>
               <w:left w:val="single" w:sz="4" w:space="0" w:color="C9D3D0"/>
@@ -13805,7 +13929,7 @@
         </w:tc>
         <w:tc>
           <w:tcPr>
-            <w:tcW w:w="2264" w:type="dxa"/>
+            <w:tcW w:w="2215" w:type="dxa"/>
             <w:tcBorders>
               <w:top w:val="single" w:sz="4" w:space="0" w:color="C9D3D0"/>
               <w:left w:val="single" w:sz="4" w:space="0" w:color="C9D3D0"/>
@@ -13846,7 +13970,7 @@
         </w:trPr>
         <w:tc>
           <w:tcPr>
-            <w:tcW w:w="741" w:type="dxa"/>
+            <w:tcW w:w="740" w:type="dxa"/>
             <w:tcBorders>
               <w:top w:val="single" w:sz="4" w:space="0" w:color="C9D3D0"/>
               <w:left w:val="single" w:sz="4" w:space="0" w:color="C9D3D0"/>
@@ -13877,7 +14001,7 @@
         </w:tc>
         <w:tc>
           <w:tcPr>
-            <w:tcW w:w="1266" w:type="dxa"/>
+            <w:tcW w:w="1370" w:type="dxa"/>
             <w:tcBorders>
               <w:top w:val="single" w:sz="4" w:space="0" w:color="C9D3D0"/>
               <w:left w:val="single" w:sz="4" w:space="0" w:color="C9D3D0"/>
@@ -13908,7 +14032,7 @@
         </w:tc>
         <w:tc>
           <w:tcPr>
-            <w:tcW w:w="3103" w:type="dxa"/>
+            <w:tcW w:w="3098" w:type="dxa"/>
             <w:tcBorders>
               <w:top w:val="single" w:sz="4" w:space="0" w:color="C9D3D0"/>
               <w:left w:val="single" w:sz="4" w:space="0" w:color="C9D3D0"/>
@@ -13948,7 +14072,7 @@
         </w:tc>
         <w:tc>
           <w:tcPr>
-            <w:tcW w:w="2264" w:type="dxa"/>
+            <w:tcW w:w="2215" w:type="dxa"/>
             <w:tcBorders>
               <w:top w:val="single" w:sz="4" w:space="0" w:color="C9D3D0"/>
               <w:left w:val="single" w:sz="4" w:space="0" w:color="C9D3D0"/>
@@ -13995,7 +14119,7 @@
         </w:tc>
         <w:tc>
           <w:tcPr>
-            <w:tcW w:w="2264" w:type="dxa"/>
+            <w:tcW w:w="2215" w:type="dxa"/>
             <w:tcBorders>
               <w:top w:val="single" w:sz="4" w:space="0" w:color="C9D3D0"/>
               <w:left w:val="single" w:sz="4" w:space="0" w:color="C9D3D0"/>
@@ -14037,7 +14161,7 @@
         </w:trPr>
         <w:tc>
           <w:tcPr>
-            <w:tcW w:w="741" w:type="dxa"/>
+            <w:tcW w:w="740" w:type="dxa"/>
             <w:tcBorders>
               <w:top w:val="single" w:sz="4" w:space="0" w:color="C9D3D0"/>
               <w:left w:val="single" w:sz="4" w:space="0" w:color="C9D3D0"/>
@@ -14067,7 +14191,7 @@
         </w:tc>
         <w:tc>
           <w:tcPr>
-            <w:tcW w:w="1266" w:type="dxa"/>
+            <w:tcW w:w="1370" w:type="dxa"/>
             <w:tcBorders>
               <w:top w:val="single" w:sz="4" w:space="0" w:color="C9D3D0"/>
               <w:left w:val="single" w:sz="4" w:space="0" w:color="C9D3D0"/>
@@ -14097,7 +14221,7 @@
         </w:tc>
         <w:tc>
           <w:tcPr>
-            <w:tcW w:w="3103" w:type="dxa"/>
+            <w:tcW w:w="3098" w:type="dxa"/>
             <w:tcBorders>
               <w:top w:val="single" w:sz="4" w:space="0" w:color="C9D3D0"/>
               <w:left w:val="single" w:sz="4" w:space="0" w:color="C9D3D0"/>
@@ -14136,7 +14260,7 @@
         </w:tc>
         <w:tc>
           <w:tcPr>
-            <w:tcW w:w="2264" w:type="dxa"/>
+            <w:tcW w:w="2215" w:type="dxa"/>
             <w:tcBorders>
               <w:top w:val="single" w:sz="4" w:space="0" w:color="C9D3D0"/>
               <w:left w:val="single" w:sz="4" w:space="0" w:color="C9D3D0"/>
@@ -14166,7 +14290,7 @@
         </w:tc>
         <w:tc>
           <w:tcPr>
-            <w:tcW w:w="2264" w:type="dxa"/>
+            <w:tcW w:w="2215" w:type="dxa"/>
             <w:tcBorders>
               <w:top w:val="single" w:sz="4" w:space="0" w:color="C9D3D0"/>
               <w:left w:val="single" w:sz="4" w:space="0" w:color="C9D3D0"/>
@@ -14207,7 +14331,7 @@
         </w:trPr>
         <w:tc>
           <w:tcPr>
-            <w:tcW w:w="741" w:type="dxa"/>
+            <w:tcW w:w="740" w:type="dxa"/>
             <w:tcBorders>
               <w:top w:val="single" w:sz="4" w:space="0" w:color="C9D3D0"/>
               <w:left w:val="single" w:sz="4" w:space="0" w:color="C9D3D0"/>
@@ -14238,7 +14362,7 @@
         </w:tc>
         <w:tc>
           <w:tcPr>
-            <w:tcW w:w="1266" w:type="dxa"/>
+            <w:tcW w:w="1370" w:type="dxa"/>
             <w:tcBorders>
               <w:top w:val="single" w:sz="4" w:space="0" w:color="C9D3D0"/>
               <w:left w:val="single" w:sz="4" w:space="0" w:color="C9D3D0"/>
@@ -14269,7 +14393,7 @@
         </w:tc>
         <w:tc>
           <w:tcPr>
-            <w:tcW w:w="3103" w:type="dxa"/>
+            <w:tcW w:w="3098" w:type="dxa"/>
             <w:tcBorders>
               <w:top w:val="single" w:sz="4" w:space="0" w:color="C9D3D0"/>
               <w:left w:val="single" w:sz="4" w:space="0" w:color="C9D3D0"/>
@@ -14309,7 +14433,7 @@
         </w:tc>
         <w:tc>
           <w:tcPr>
-            <w:tcW w:w="2264" w:type="dxa"/>
+            <w:tcW w:w="2215" w:type="dxa"/>
             <w:tcBorders>
               <w:top w:val="single" w:sz="4" w:space="0" w:color="C9D3D0"/>
               <w:left w:val="single" w:sz="4" w:space="0" w:color="C9D3D0"/>
@@ -14340,7 +14464,7 @@
         </w:tc>
         <w:tc>
           <w:tcPr>
-            <w:tcW w:w="2264" w:type="dxa"/>
+            <w:tcW w:w="2215" w:type="dxa"/>
             <w:tcBorders>
               <w:top w:val="single" w:sz="4" w:space="0" w:color="C9D3D0"/>
               <w:left w:val="single" w:sz="4" w:space="0" w:color="C9D3D0"/>
@@ -14382,7 +14506,7 @@
         </w:trPr>
         <w:tc>
           <w:tcPr>
-            <w:tcW w:w="741" w:type="dxa"/>
+            <w:tcW w:w="740" w:type="dxa"/>
             <w:tcBorders>
               <w:top w:val="single" w:sz="4" w:space="0" w:color="C9D3D0"/>
               <w:left w:val="single" w:sz="4" w:space="0" w:color="C9D3D0"/>
@@ -14413,7 +14537,7 @@
         </w:tc>
         <w:tc>
           <w:tcPr>
-            <w:tcW w:w="1266" w:type="dxa"/>
+            <w:tcW w:w="1370" w:type="dxa"/>
             <w:tcBorders>
               <w:top w:val="single" w:sz="4" w:space="0" w:color="C9D3D0"/>
               <w:left w:val="single" w:sz="4" w:space="0" w:color="C9D3D0"/>
@@ -14443,7 +14567,7 @@
         </w:tc>
         <w:tc>
           <w:tcPr>
-            <w:tcW w:w="3103" w:type="dxa"/>
+            <w:tcW w:w="3098" w:type="dxa"/>
             <w:tcBorders>
               <w:top w:val="single" w:sz="4" w:space="0" w:color="C9D3D0"/>
               <w:left w:val="single" w:sz="4" w:space="0" w:color="C9D3D0"/>
@@ -14482,7 +14606,7 @@
         </w:tc>
         <w:tc>
           <w:tcPr>
-            <w:tcW w:w="2264" w:type="dxa"/>
+            <w:tcW w:w="2215" w:type="dxa"/>
             <w:tcBorders>
               <w:top w:val="single" w:sz="4" w:space="0" w:color="C9D3D0"/>
               <w:left w:val="single" w:sz="4" w:space="0" w:color="C9D3D0"/>
@@ -14512,7 +14636,7 @@
         </w:tc>
         <w:tc>
           <w:tcPr>
-            <w:tcW w:w="2264" w:type="dxa"/>
+            <w:tcW w:w="2215" w:type="dxa"/>
             <w:tcBorders>
               <w:top w:val="single" w:sz="4" w:space="0" w:color="C9D3D0"/>
               <w:left w:val="single" w:sz="4" w:space="0" w:color="C9D3D0"/>
@@ -14553,7 +14677,7 @@
         </w:trPr>
         <w:tc>
           <w:tcPr>
-            <w:tcW w:w="741" w:type="dxa"/>
+            <w:tcW w:w="740" w:type="dxa"/>
             <w:tcBorders>
               <w:top w:val="single" w:sz="4" w:space="0" w:color="C9D3D0"/>
               <w:left w:val="single" w:sz="4" w:space="0" w:color="C9D3D0"/>
@@ -14584,7 +14708,7 @@
         </w:tc>
         <w:tc>
           <w:tcPr>
-            <w:tcW w:w="1266" w:type="dxa"/>
+            <w:tcW w:w="1370" w:type="dxa"/>
             <w:tcBorders>
               <w:top w:val="single" w:sz="4" w:space="0" w:color="C9D3D0"/>
               <w:left w:val="single" w:sz="4" w:space="0" w:color="C9D3D0"/>
@@ -14615,7 +14739,7 @@
         </w:tc>
         <w:tc>
           <w:tcPr>
-            <w:tcW w:w="3103" w:type="dxa"/>
+            <w:tcW w:w="3098" w:type="dxa"/>
             <w:tcBorders>
               <w:top w:val="single" w:sz="4" w:space="0" w:color="C9D3D0"/>
               <w:left w:val="single" w:sz="4" w:space="0" w:color="C9D3D0"/>
@@ -14655,7 +14779,7 @@
         </w:tc>
         <w:tc>
           <w:tcPr>
-            <w:tcW w:w="2264" w:type="dxa"/>
+            <w:tcW w:w="2215" w:type="dxa"/>
             <w:tcBorders>
               <w:top w:val="single" w:sz="4" w:space="0" w:color="C9D3D0"/>
               <w:left w:val="single" w:sz="4" w:space="0" w:color="C9D3D0"/>
@@ -14686,7 +14810,7 @@
         </w:tc>
         <w:tc>
           <w:tcPr>
-            <w:tcW w:w="2264" w:type="dxa"/>
+            <w:tcW w:w="2215" w:type="dxa"/>
             <w:tcBorders>
               <w:top w:val="single" w:sz="4" w:space="0" w:color="C9D3D0"/>
               <w:left w:val="single" w:sz="4" w:space="0" w:color="C9D3D0"/>
@@ -14728,7 +14852,7 @@
         </w:trPr>
         <w:tc>
           <w:tcPr>
-            <w:tcW w:w="741" w:type="dxa"/>
+            <w:tcW w:w="740" w:type="dxa"/>
             <w:tcBorders>
               <w:top w:val="single" w:sz="4" w:space="0" w:color="C9D3D0"/>
               <w:left w:val="single" w:sz="4" w:space="0" w:color="C9D3D0"/>
@@ -14758,7 +14882,7 @@
         </w:tc>
         <w:tc>
           <w:tcPr>
-            <w:tcW w:w="1266" w:type="dxa"/>
+            <w:tcW w:w="1370" w:type="dxa"/>
             <w:tcBorders>
               <w:top w:val="single" w:sz="4" w:space="0" w:color="C9D3D0"/>
               <w:left w:val="single" w:sz="4" w:space="0" w:color="C9D3D0"/>
@@ -14788,7 +14912,7 @@
         </w:tc>
         <w:tc>
           <w:tcPr>
-            <w:tcW w:w="3103" w:type="dxa"/>
+            <w:tcW w:w="3098" w:type="dxa"/>
             <w:tcBorders>
               <w:top w:val="single" w:sz="4" w:space="0" w:color="C9D3D0"/>
               <w:left w:val="single" w:sz="4" w:space="0" w:color="C9D3D0"/>
@@ -14827,7 +14951,7 @@
         </w:tc>
         <w:tc>
           <w:tcPr>
-            <w:tcW w:w="2264" w:type="dxa"/>
+            <w:tcW w:w="2215" w:type="dxa"/>
             <w:tcBorders>
               <w:top w:val="single" w:sz="4" w:space="0" w:color="C9D3D0"/>
               <w:left w:val="single" w:sz="4" w:space="0" w:color="C9D3D0"/>
@@ -14857,7 +14981,7 @@
         </w:tc>
         <w:tc>
           <w:tcPr>
-            <w:tcW w:w="2264" w:type="dxa"/>
+            <w:tcW w:w="2215" w:type="dxa"/>
             <w:tcBorders>
               <w:top w:val="single" w:sz="4" w:space="0" w:color="C9D3D0"/>
               <w:left w:val="single" w:sz="4" w:space="0" w:color="C9D3D0"/>
@@ -14898,7 +15022,7 @@
         </w:trPr>
         <w:tc>
           <w:tcPr>
-            <w:tcW w:w="741" w:type="dxa"/>
+            <w:tcW w:w="740" w:type="dxa"/>
             <w:tcBorders>
               <w:top w:val="single" w:sz="4" w:space="0" w:color="C9D3D0"/>
               <w:left w:val="single" w:sz="4" w:space="0" w:color="C9D3D0"/>
@@ -14929,7 +15053,7 @@
         </w:tc>
         <w:tc>
           <w:tcPr>
-            <w:tcW w:w="1266" w:type="dxa"/>
+            <w:tcW w:w="1370" w:type="dxa"/>
             <w:tcBorders>
               <w:top w:val="single" w:sz="4" w:space="0" w:color="C9D3D0"/>
               <w:left w:val="single" w:sz="4" w:space="0" w:color="C9D3D0"/>
@@ -14960,7 +15084,7 @@
         </w:tc>
         <w:tc>
           <w:tcPr>
-            <w:tcW w:w="3103" w:type="dxa"/>
+            <w:tcW w:w="3098" w:type="dxa"/>
             <w:tcBorders>
               <w:top w:val="single" w:sz="4" w:space="0" w:color="C9D3D0"/>
               <w:left w:val="single" w:sz="4" w:space="0" w:color="C9D3D0"/>
@@ -15000,7 +15124,7 @@
         </w:tc>
         <w:tc>
           <w:tcPr>
-            <w:tcW w:w="2264" w:type="dxa"/>
+            <w:tcW w:w="2215" w:type="dxa"/>
             <w:tcBorders>
               <w:top w:val="single" w:sz="4" w:space="0" w:color="C9D3D0"/>
               <w:left w:val="single" w:sz="4" w:space="0" w:color="C9D3D0"/>
@@ -15063,7 +15187,7 @@
         </w:tc>
         <w:tc>
           <w:tcPr>
-            <w:tcW w:w="2264" w:type="dxa"/>
+            <w:tcW w:w="2215" w:type="dxa"/>
             <w:tcBorders>
               <w:top w:val="single" w:sz="4" w:space="0" w:color="C9D3D0"/>
               <w:left w:val="single" w:sz="4" w:space="0" w:color="C9D3D0"/>
@@ -15105,7 +15229,7 @@
         </w:trPr>
         <w:tc>
           <w:tcPr>
-            <w:tcW w:w="741" w:type="dxa"/>
+            <w:tcW w:w="740" w:type="dxa"/>
             <w:tcBorders>
               <w:top w:val="single" w:sz="4" w:space="0" w:color="C9D3D0"/>
               <w:left w:val="single" w:sz="4" w:space="0" w:color="C9D3D0"/>
@@ -15135,7 +15259,7 @@
         </w:tc>
         <w:tc>
           <w:tcPr>
-            <w:tcW w:w="1266" w:type="dxa"/>
+            <w:tcW w:w="1370" w:type="dxa"/>
             <w:tcBorders>
               <w:top w:val="single" w:sz="4" w:space="0" w:color="C9D3D0"/>
               <w:left w:val="single" w:sz="4" w:space="0" w:color="C9D3D0"/>
@@ -15165,7 +15289,7 @@
         </w:tc>
         <w:tc>
           <w:tcPr>
-            <w:tcW w:w="3103" w:type="dxa"/>
+            <w:tcW w:w="3098" w:type="dxa"/>
             <w:tcBorders>
               <w:top w:val="single" w:sz="4" w:space="0" w:color="C9D3D0"/>
               <w:left w:val="single" w:sz="4" w:space="0" w:color="C9D3D0"/>
@@ -15204,7 +15328,7 @@
         </w:tc>
         <w:tc>
           <w:tcPr>
-            <w:tcW w:w="2264" w:type="dxa"/>
+            <w:tcW w:w="2215" w:type="dxa"/>
             <w:tcBorders>
               <w:top w:val="single" w:sz="4" w:space="0" w:color="C9D3D0"/>
               <w:left w:val="single" w:sz="4" w:space="0" w:color="C9D3D0"/>
@@ -15234,7 +15358,7 @@
         </w:tc>
         <w:tc>
           <w:tcPr>
-            <w:tcW w:w="2264" w:type="dxa"/>
+            <w:tcW w:w="2215" w:type="dxa"/>
             <w:tcBorders>
               <w:top w:val="single" w:sz="4" w:space="0" w:color="C9D3D0"/>
               <w:left w:val="single" w:sz="4" w:space="0" w:color="C9D3D0"/>
@@ -15275,7 +15399,7 @@
         </w:trPr>
         <w:tc>
           <w:tcPr>
-            <w:tcW w:w="741" w:type="dxa"/>
+            <w:tcW w:w="740" w:type="dxa"/>
             <w:tcBorders>
               <w:top w:val="single" w:sz="4" w:space="0" w:color="C9D3D0"/>
               <w:left w:val="single" w:sz="4" w:space="0" w:color="C9D3D0"/>
@@ -15306,7 +15430,7 @@
         </w:tc>
         <w:tc>
           <w:tcPr>
-            <w:tcW w:w="1266" w:type="dxa"/>
+            <w:tcW w:w="1370" w:type="dxa"/>
             <w:tcBorders>
               <w:top w:val="single" w:sz="4" w:space="0" w:color="C9D3D0"/>
               <w:left w:val="single" w:sz="4" w:space="0" w:color="C9D3D0"/>
@@ -15337,7 +15461,7 @@
         </w:tc>
         <w:tc>
           <w:tcPr>
-            <w:tcW w:w="3103" w:type="dxa"/>
+            <w:tcW w:w="3098" w:type="dxa"/>
             <w:tcBorders>
               <w:top w:val="single" w:sz="4" w:space="0" w:color="C9D3D0"/>
               <w:left w:val="single" w:sz="4" w:space="0" w:color="C9D3D0"/>
@@ -15377,7 +15501,7 @@
         </w:tc>
         <w:tc>
           <w:tcPr>
-            <w:tcW w:w="2264" w:type="dxa"/>
+            <w:tcW w:w="2215" w:type="dxa"/>
             <w:tcBorders>
               <w:top w:val="single" w:sz="4" w:space="0" w:color="C9D3D0"/>
               <w:left w:val="single" w:sz="4" w:space="0" w:color="C9D3D0"/>
@@ -15408,7 +15532,7 @@
         </w:tc>
         <w:tc>
           <w:tcPr>
-            <w:tcW w:w="2264" w:type="dxa"/>
+            <w:tcW w:w="2215" w:type="dxa"/>
             <w:tcBorders>
               <w:top w:val="single" w:sz="4" w:space="0" w:color="C9D3D0"/>
               <w:left w:val="single" w:sz="4" w:space="0" w:color="C9D3D0"/>
@@ -15450,7 +15574,7 @@
         </w:trPr>
         <w:tc>
           <w:tcPr>
-            <w:tcW w:w="741" w:type="dxa"/>
+            <w:tcW w:w="740" w:type="dxa"/>
             <w:tcBorders>
               <w:top w:val="single" w:sz="4" w:space="0" w:color="C9D3D0"/>
               <w:left w:val="single" w:sz="4" w:space="0" w:color="C9D3D0"/>
@@ -15480,7 +15604,7 @@
         </w:tc>
         <w:tc>
           <w:tcPr>
-            <w:tcW w:w="1266" w:type="dxa"/>
+            <w:tcW w:w="1370" w:type="dxa"/>
             <w:tcBorders>
               <w:top w:val="single" w:sz="4" w:space="0" w:color="C9D3D0"/>
               <w:left w:val="single" w:sz="4" w:space="0" w:color="C9D3D0"/>
@@ -15510,7 +15634,7 @@
         </w:tc>
         <w:tc>
           <w:tcPr>
-            <w:tcW w:w="3103" w:type="dxa"/>
+            <w:tcW w:w="3098" w:type="dxa"/>
             <w:tcBorders>
               <w:top w:val="single" w:sz="4" w:space="0" w:color="C9D3D0"/>
               <w:left w:val="single" w:sz="4" w:space="0" w:color="C9D3D0"/>
@@ -15549,7 +15673,7 @@
         </w:tc>
         <w:tc>
           <w:tcPr>
-            <w:tcW w:w="2264" w:type="dxa"/>
+            <w:tcW w:w="2215" w:type="dxa"/>
             <w:tcBorders>
               <w:top w:val="single" w:sz="4" w:space="0" w:color="C9D3D0"/>
               <w:left w:val="single" w:sz="4" w:space="0" w:color="C9D3D0"/>
@@ -15579,7 +15703,7 @@
         </w:tc>
         <w:tc>
           <w:tcPr>
-            <w:tcW w:w="2264" w:type="dxa"/>
+            <w:tcW w:w="2215" w:type="dxa"/>
             <w:tcBorders>
               <w:top w:val="single" w:sz="4" w:space="0" w:color="C9D3D0"/>
               <w:left w:val="single" w:sz="4" w:space="0" w:color="C9D3D0"/>
@@ -15620,7 +15744,7 @@
         </w:trPr>
         <w:tc>
           <w:tcPr>
-            <w:tcW w:w="741" w:type="dxa"/>
+            <w:tcW w:w="740" w:type="dxa"/>
             <w:tcBorders>
               <w:top w:val="single" w:sz="4" w:space="0" w:color="C9D3D0"/>
               <w:left w:val="single" w:sz="4" w:space="0" w:color="C9D3D0"/>
@@ -15651,7 +15775,7 @@
         </w:tc>
         <w:tc>
           <w:tcPr>
-            <w:tcW w:w="1266" w:type="dxa"/>
+            <w:tcW w:w="1370" w:type="dxa"/>
             <w:tcBorders>
               <w:top w:val="single" w:sz="4" w:space="0" w:color="C9D3D0"/>
               <w:left w:val="single" w:sz="4" w:space="0" w:color="C9D3D0"/>
@@ -15682,7 +15806,7 @@
         </w:tc>
         <w:tc>
           <w:tcPr>
-            <w:tcW w:w="3103" w:type="dxa"/>
+            <w:tcW w:w="3098" w:type="dxa"/>
             <w:tcBorders>
               <w:top w:val="single" w:sz="4" w:space="0" w:color="C9D3D0"/>
               <w:left w:val="single" w:sz="4" w:space="0" w:color="C9D3D0"/>
@@ -15713,7 +15837,7 @@
         </w:tc>
         <w:tc>
           <w:tcPr>
-            <w:tcW w:w="2264" w:type="dxa"/>
+            <w:tcW w:w="2215" w:type="dxa"/>
             <w:tcBorders>
               <w:top w:val="single" w:sz="4" w:space="0" w:color="C9D3D0"/>
               <w:left w:val="single" w:sz="4" w:space="0" w:color="C9D3D0"/>
@@ -15744,7 +15868,7 @@
         </w:tc>
         <w:tc>
           <w:tcPr>
-            <w:tcW w:w="2264" w:type="dxa"/>
+            <w:tcW w:w="2215" w:type="dxa"/>
             <w:tcBorders>
               <w:top w:val="single" w:sz="4" w:space="0" w:color="C9D3D0"/>
               <w:left w:val="single" w:sz="4" w:space="0" w:color="C9D3D0"/>
@@ -15786,7 +15910,7 @@
         </w:trPr>
         <w:tc>
           <w:tcPr>
-            <w:tcW w:w="741" w:type="dxa"/>
+            <w:tcW w:w="740" w:type="dxa"/>
             <w:tcBorders>
               <w:top w:val="single" w:sz="4" w:space="0" w:color="C9D3D0"/>
               <w:left w:val="single" w:sz="4" w:space="0" w:color="C9D3D0"/>
@@ -15816,7 +15940,7 @@
         </w:tc>
         <w:tc>
           <w:tcPr>
-            <w:tcW w:w="1266" w:type="dxa"/>
+            <w:tcW w:w="1370" w:type="dxa"/>
             <w:tcBorders>
               <w:top w:val="single" w:sz="4" w:space="0" w:color="C9D3D0"/>
               <w:left w:val="single" w:sz="4" w:space="0" w:color="C9D3D0"/>
@@ -15846,7 +15970,7 @@
         </w:tc>
         <w:tc>
           <w:tcPr>
-            <w:tcW w:w="3103" w:type="dxa"/>
+            <w:tcW w:w="3098" w:type="dxa"/>
             <w:tcBorders>
               <w:top w:val="single" w:sz="4" w:space="0" w:color="C9D3D0"/>
               <w:left w:val="single" w:sz="4" w:space="0" w:color="C9D3D0"/>
@@ -15876,7 +16000,7 @@
         </w:tc>
         <w:tc>
           <w:tcPr>
-            <w:tcW w:w="2264" w:type="dxa"/>
+            <w:tcW w:w="2215" w:type="dxa"/>
             <w:tcBorders>
               <w:top w:val="single" w:sz="4" w:space="0" w:color="C9D3D0"/>
               <w:left w:val="single" w:sz="4" w:space="0" w:color="C9D3D0"/>
@@ -15906,7 +16030,7 @@
         </w:tc>
         <w:tc>
           <w:tcPr>
-            <w:tcW w:w="2264" w:type="dxa"/>
+            <w:tcW w:w="2215" w:type="dxa"/>
             <w:tcBorders>
               <w:top w:val="single" w:sz="4" w:space="0" w:color="C9D3D0"/>
               <w:left w:val="single" w:sz="4" w:space="0" w:color="C9D3D0"/>
@@ -15947,7 +16071,7 @@
         </w:trPr>
         <w:tc>
           <w:tcPr>
-            <w:tcW w:w="741" w:type="dxa"/>
+            <w:tcW w:w="740" w:type="dxa"/>
             <w:tcBorders>
               <w:top w:val="single" w:sz="4" w:space="0" w:color="C9D3D0"/>
               <w:left w:val="single" w:sz="4" w:space="0" w:color="C9D3D0"/>
@@ -15978,7 +16102,7 @@
         </w:tc>
         <w:tc>
           <w:tcPr>
-            <w:tcW w:w="1266" w:type="dxa"/>
+            <w:tcW w:w="1370" w:type="dxa"/>
             <w:tcBorders>
               <w:top w:val="single" w:sz="4" w:space="0" w:color="C9D3D0"/>
               <w:left w:val="single" w:sz="4" w:space="0" w:color="C9D3D0"/>
@@ -16009,7 +16133,7 @@
         </w:tc>
         <w:tc>
           <w:tcPr>
-            <w:tcW w:w="3103" w:type="dxa"/>
+            <w:tcW w:w="3098" w:type="dxa"/>
             <w:tcBorders>
               <w:top w:val="single" w:sz="4" w:space="0" w:color="C9D3D0"/>
               <w:left w:val="single" w:sz="4" w:space="0" w:color="C9D3D0"/>
@@ -16049,7 +16173,7 @@
         </w:tc>
         <w:tc>
           <w:tcPr>
-            <w:tcW w:w="2264" w:type="dxa"/>
+            <w:tcW w:w="2215" w:type="dxa"/>
             <w:tcBorders>
               <w:top w:val="single" w:sz="4" w:space="0" w:color="C9D3D0"/>
               <w:left w:val="single" w:sz="4" w:space="0" w:color="C9D3D0"/>
@@ -16080,7 +16204,7 @@
         </w:tc>
         <w:tc>
           <w:tcPr>
-            <w:tcW w:w="2264" w:type="dxa"/>
+            <w:tcW w:w="2215" w:type="dxa"/>
             <w:tcBorders>
               <w:top w:val="single" w:sz="4" w:space="0" w:color="C9D3D0"/>
               <w:left w:val="single" w:sz="4" w:space="0" w:color="C9D3D0"/>
@@ -16122,7 +16246,7 @@
         </w:trPr>
         <w:tc>
           <w:tcPr>
-            <w:tcW w:w="741" w:type="dxa"/>
+            <w:tcW w:w="740" w:type="dxa"/>
             <w:tcBorders>
               <w:top w:val="single" w:sz="4" w:space="0" w:color="C9D3D0"/>
               <w:left w:val="single" w:sz="4" w:space="0" w:color="C9D3D0"/>
@@ -16152,7 +16276,7 @@
         </w:tc>
         <w:tc>
           <w:tcPr>
-            <w:tcW w:w="1266" w:type="dxa"/>
+            <w:tcW w:w="1370" w:type="dxa"/>
             <w:tcBorders>
               <w:top w:val="single" w:sz="4" w:space="0" w:color="C9D3D0"/>
               <w:left w:val="single" w:sz="4" w:space="0" w:color="C9D3D0"/>
@@ -16182,7 +16306,7 @@
         </w:tc>
         <w:tc>
           <w:tcPr>
-            <w:tcW w:w="3103" w:type="dxa"/>
+            <w:tcW w:w="3098" w:type="dxa"/>
             <w:tcBorders>
               <w:top w:val="single" w:sz="4" w:space="0" w:color="C9D3D0"/>
               <w:left w:val="single" w:sz="4" w:space="0" w:color="C9D3D0"/>
@@ -16221,7 +16345,7 @@
         </w:tc>
         <w:tc>
           <w:tcPr>
-            <w:tcW w:w="2264" w:type="dxa"/>
+            <w:tcW w:w="2215" w:type="dxa"/>
             <w:tcBorders>
               <w:top w:val="single" w:sz="4" w:space="0" w:color="C9D3D0"/>
               <w:left w:val="single" w:sz="4" w:space="0" w:color="C9D3D0"/>
@@ -16267,7 +16391,7 @@
         </w:tc>
         <w:tc>
           <w:tcPr>
-            <w:tcW w:w="2264" w:type="dxa"/>
+            <w:tcW w:w="2215" w:type="dxa"/>
             <w:tcBorders>
               <w:top w:val="single" w:sz="4" w:space="0" w:color="C9D3D0"/>
               <w:left w:val="single" w:sz="4" w:space="0" w:color="C9D3D0"/>
@@ -16308,7 +16432,7 @@
         </w:trPr>
         <w:tc>
           <w:tcPr>
-            <w:tcW w:w="741" w:type="dxa"/>
+            <w:tcW w:w="740" w:type="dxa"/>
             <w:tcBorders>
               <w:top w:val="single" w:sz="4" w:space="0" w:color="C9D3D0"/>
               <w:left w:val="single" w:sz="4" w:space="0" w:color="C9D3D0"/>
@@ -16340,7 +16464,7 @@
         </w:tc>
         <w:tc>
           <w:tcPr>
-            <w:tcW w:w="1266" w:type="dxa"/>
+            <w:tcW w:w="1370" w:type="dxa"/>
             <w:tcBorders>
               <w:top w:val="single" w:sz="4" w:space="0" w:color="C9D3D0"/>
               <w:left w:val="single" w:sz="4" w:space="0" w:color="C9D3D0"/>
@@ -16371,7 +16495,7 @@
         </w:tc>
         <w:tc>
           <w:tcPr>
-            <w:tcW w:w="3103" w:type="dxa"/>
+            <w:tcW w:w="3098" w:type="dxa"/>
             <w:tcBorders>
               <w:top w:val="single" w:sz="4" w:space="0" w:color="C9D3D0"/>
               <w:left w:val="single" w:sz="4" w:space="0" w:color="C9D3D0"/>
@@ -16411,7 +16535,7 @@
         </w:tc>
         <w:tc>
           <w:tcPr>
-            <w:tcW w:w="2264" w:type="dxa"/>
+            <w:tcW w:w="2215" w:type="dxa"/>
             <w:tcBorders>
               <w:top w:val="single" w:sz="4" w:space="0" w:color="C9D3D0"/>
               <w:left w:val="single" w:sz="4" w:space="0" w:color="C9D3D0"/>
@@ -16442,7 +16566,7 @@
         </w:tc>
         <w:tc>
           <w:tcPr>
-            <w:tcW w:w="2264" w:type="dxa"/>
+            <w:tcW w:w="2215" w:type="dxa"/>
             <w:tcBorders>
               <w:top w:val="single" w:sz="4" w:space="0" w:color="C9D3D0"/>
               <w:left w:val="single" w:sz="4" w:space="0" w:color="C9D3D0"/>
@@ -16484,7 +16608,7 @@
         </w:trPr>
         <w:tc>
           <w:tcPr>
-            <w:tcW w:w="741" w:type="dxa"/>
+            <w:tcW w:w="740" w:type="dxa"/>
             <w:tcBorders>
               <w:top w:val="single" w:sz="4" w:space="0" w:color="C9D3D0"/>
               <w:left w:val="single" w:sz="4" w:space="0" w:color="C9D3D0"/>
@@ -16514,7 +16638,7 @@
         </w:tc>
         <w:tc>
           <w:tcPr>
-            <w:tcW w:w="1266" w:type="dxa"/>
+            <w:tcW w:w="1370" w:type="dxa"/>
             <w:tcBorders>
               <w:top w:val="single" w:sz="4" w:space="0" w:color="C9D3D0"/>
               <w:left w:val="single" w:sz="4" w:space="0" w:color="C9D3D0"/>
@@ -16544,7 +16668,7 @@
         </w:tc>
         <w:tc>
           <w:tcPr>
-            <w:tcW w:w="3103" w:type="dxa"/>
+            <w:tcW w:w="3098" w:type="dxa"/>
             <w:tcBorders>
               <w:top w:val="single" w:sz="4" w:space="0" w:color="C9D3D0"/>
               <w:left w:val="single" w:sz="4" w:space="0" w:color="C9D3D0"/>
@@ -16577,13 +16701,13 @@
                 <w:sz w:val="19"/>
                 <w:szCs w:val="19"/>
               </w:rPr>
-              <w:t xml:space="preserve"> (46)</w:t>
-            </w:r>
-          </w:p>
-        </w:tc>
-        <w:tc>
-          <w:tcPr>
-            <w:tcW w:w="2264" w:type="dxa"/>
+              <w:t xml:space="preserve"> (47)</w:t>
+            </w:r>
+          </w:p>
+        </w:tc>
+        <w:tc>
+          <w:tcPr>
+            <w:tcW w:w="2215" w:type="dxa"/>
             <w:tcBorders>
               <w:top w:val="single" w:sz="4" w:space="0" w:color="C9D3D0"/>
               <w:left w:val="single" w:sz="4" w:space="0" w:color="C9D3D0"/>
@@ -16613,7 +16737,7 @@
         </w:tc>
         <w:tc>
           <w:tcPr>
-            <w:tcW w:w="2264" w:type="dxa"/>
+            <w:tcW w:w="2215" w:type="dxa"/>
             <w:tcBorders>
               <w:top w:val="single" w:sz="4" w:space="0" w:color="C9D3D0"/>
               <w:left w:val="single" w:sz="4" w:space="0" w:color="C9D3D0"/>
@@ -16654,7 +16778,7 @@
         </w:trPr>
         <w:tc>
           <w:tcPr>
-            <w:tcW w:w="741" w:type="dxa"/>
+            <w:tcW w:w="740" w:type="dxa"/>
             <w:tcBorders>
               <w:top w:val="single" w:sz="4" w:space="0" w:color="C9D3D0"/>
               <w:left w:val="single" w:sz="4" w:space="0" w:color="C9D3D0"/>
@@ -16685,7 +16809,7 @@
         </w:tc>
         <w:tc>
           <w:tcPr>
-            <w:tcW w:w="1266" w:type="dxa"/>
+            <w:tcW w:w="1370" w:type="dxa"/>
             <w:tcBorders>
               <w:top w:val="single" w:sz="4" w:space="0" w:color="C9D3D0"/>
               <w:left w:val="single" w:sz="4" w:space="0" w:color="C9D3D0"/>
@@ -16716,7 +16840,7 @@
         </w:tc>
         <w:tc>
           <w:tcPr>
-            <w:tcW w:w="3103" w:type="dxa"/>
+            <w:tcW w:w="3098" w:type="dxa"/>
             <w:tcBorders>
               <w:top w:val="single" w:sz="4" w:space="0" w:color="C9D3D0"/>
               <w:left w:val="single" w:sz="4" w:space="0" w:color="C9D3D0"/>
@@ -16756,7 +16880,7 @@
         </w:tc>
         <w:tc>
           <w:tcPr>
-            <w:tcW w:w="2264" w:type="dxa"/>
+            <w:tcW w:w="2215" w:type="dxa"/>
             <w:tcBorders>
               <w:top w:val="single" w:sz="4" w:space="0" w:color="C9D3D0"/>
               <w:left w:val="single" w:sz="4" w:space="0" w:color="C9D3D0"/>
@@ -16803,7 +16927,7 @@
         </w:tc>
         <w:tc>
           <w:tcPr>
-            <w:tcW w:w="2264" w:type="dxa"/>
+            <w:tcW w:w="2215" w:type="dxa"/>
             <w:tcBorders>
               <w:top w:val="single" w:sz="4" w:space="0" w:color="C9D3D0"/>
               <w:left w:val="single" w:sz="4" w:space="0" w:color="C9D3D0"/>
@@ -16845,7 +16969,7 @@
         </w:trPr>
         <w:tc>
           <w:tcPr>
-            <w:tcW w:w="741" w:type="dxa"/>
+            <w:tcW w:w="740" w:type="dxa"/>
             <w:tcBorders>
               <w:top w:val="single" w:sz="4" w:space="0" w:color="C9D3D0"/>
               <w:left w:val="single" w:sz="4" w:space="0" w:color="C9D3D0"/>
@@ -16875,7 +16999,7 @@
         </w:tc>
         <w:tc>
           <w:tcPr>
-            <w:tcW w:w="1266" w:type="dxa"/>
+            <w:tcW w:w="1370" w:type="dxa"/>
             <w:tcBorders>
               <w:top w:val="single" w:sz="4" w:space="0" w:color="C9D3D0"/>
               <w:left w:val="single" w:sz="4" w:space="0" w:color="C9D3D0"/>
@@ -16905,7 +17029,7 @@
         </w:tc>
         <w:tc>
           <w:tcPr>
-            <w:tcW w:w="3103" w:type="dxa"/>
+            <w:tcW w:w="3098" w:type="dxa"/>
             <w:tcBorders>
               <w:top w:val="single" w:sz="4" w:space="0" w:color="C9D3D0"/>
               <w:left w:val="single" w:sz="4" w:space="0" w:color="C9D3D0"/>
@@ -16944,7 +17068,7 @@
         </w:tc>
         <w:tc>
           <w:tcPr>
-            <w:tcW w:w="2264" w:type="dxa"/>
+            <w:tcW w:w="2215" w:type="dxa"/>
             <w:tcBorders>
               <w:top w:val="single" w:sz="4" w:space="0" w:color="C9D3D0"/>
               <w:left w:val="single" w:sz="4" w:space="0" w:color="C9D3D0"/>
@@ -16990,7 +17114,7 @@
         </w:tc>
         <w:tc>
           <w:tcPr>
-            <w:tcW w:w="2264" w:type="dxa"/>
+            <w:tcW w:w="2215" w:type="dxa"/>
             <w:tcBorders>
               <w:top w:val="single" w:sz="4" w:space="0" w:color="C9D3D0"/>
               <w:left w:val="single" w:sz="4" w:space="0" w:color="C9D3D0"/>
@@ -17031,7 +17155,7 @@
         </w:trPr>
         <w:tc>
           <w:tcPr>
-            <w:tcW w:w="741" w:type="dxa"/>
+            <w:tcW w:w="740" w:type="dxa"/>
             <w:tcBorders>
               <w:top w:val="single" w:sz="4" w:space="0" w:color="C9D3D0"/>
               <w:left w:val="single" w:sz="4" w:space="0" w:color="C9D3D0"/>
@@ -17062,7 +17186,7 @@
         </w:tc>
         <w:tc>
           <w:tcPr>
-            <w:tcW w:w="1266" w:type="dxa"/>
+            <w:tcW w:w="1370" w:type="dxa"/>
             <w:tcBorders>
               <w:top w:val="single" w:sz="4" w:space="0" w:color="C9D3D0"/>
               <w:left w:val="single" w:sz="4" w:space="0" w:color="C9D3D0"/>
@@ -17093,7 +17217,7 @@
         </w:tc>
         <w:tc>
           <w:tcPr>
-            <w:tcW w:w="3103" w:type="dxa"/>
+            <w:tcW w:w="3098" w:type="dxa"/>
             <w:tcBorders>
               <w:top w:val="single" w:sz="4" w:space="0" w:color="C9D3D0"/>
               <w:left w:val="single" w:sz="4" w:space="0" w:color="C9D3D0"/>
@@ -17133,7 +17257,7 @@
         </w:tc>
         <w:tc>
           <w:tcPr>
-            <w:tcW w:w="2264" w:type="dxa"/>
+            <w:tcW w:w="2215" w:type="dxa"/>
             <w:tcBorders>
               <w:top w:val="single" w:sz="4" w:space="0" w:color="C9D3D0"/>
               <w:left w:val="single" w:sz="4" w:space="0" w:color="C9D3D0"/>
@@ -17164,7 +17288,7 @@
         </w:tc>
         <w:tc>
           <w:tcPr>
-            <w:tcW w:w="2264" w:type="dxa"/>
+            <w:tcW w:w="2215" w:type="dxa"/>
             <w:tcBorders>
               <w:top w:val="single" w:sz="4" w:space="0" w:color="C9D3D0"/>
               <w:left w:val="single" w:sz="4" w:space="0" w:color="C9D3D0"/>
@@ -17206,7 +17330,7 @@
         </w:trPr>
         <w:tc>
           <w:tcPr>
-            <w:tcW w:w="741" w:type="dxa"/>
+            <w:tcW w:w="740" w:type="dxa"/>
             <w:tcBorders>
               <w:top w:val="single" w:sz="4" w:space="0" w:color="C9D3D0"/>
               <w:left w:val="single" w:sz="4" w:space="0" w:color="C9D3D0"/>
@@ -17236,7 +17360,7 @@
         </w:tc>
         <w:tc>
           <w:tcPr>
-            <w:tcW w:w="1266" w:type="dxa"/>
+            <w:tcW w:w="1370" w:type="dxa"/>
             <w:tcBorders>
               <w:top w:val="single" w:sz="4" w:space="0" w:color="C9D3D0"/>
               <w:left w:val="single" w:sz="4" w:space="0" w:color="C9D3D0"/>
@@ -17266,7 +17390,7 @@
         </w:tc>
         <w:tc>
           <w:tcPr>
-            <w:tcW w:w="3103" w:type="dxa"/>
+            <w:tcW w:w="3098" w:type="dxa"/>
             <w:tcBorders>
               <w:top w:val="single" w:sz="4" w:space="0" w:color="C9D3D0"/>
               <w:left w:val="single" w:sz="4" w:space="0" w:color="C9D3D0"/>
@@ -17321,7 +17445,7 @@
         </w:tc>
         <w:tc>
           <w:tcPr>
-            <w:tcW w:w="2264" w:type="dxa"/>
+            <w:tcW w:w="2215" w:type="dxa"/>
             <w:tcBorders>
               <w:top w:val="single" w:sz="4" w:space="0" w:color="C9D3D0"/>
               <w:left w:val="single" w:sz="4" w:space="0" w:color="C9D3D0"/>
@@ -17351,7 +17475,7 @@
         </w:tc>
         <w:tc>
           <w:tcPr>
-            <w:tcW w:w="2264" w:type="dxa"/>
+            <w:tcW w:w="2215" w:type="dxa"/>
             <w:tcBorders>
               <w:top w:val="single" w:sz="4" w:space="0" w:color="C9D3D0"/>
               <w:left w:val="single" w:sz="4" w:space="0" w:color="C9D3D0"/>
@@ -17392,7 +17516,7 @@
         </w:trPr>
         <w:tc>
           <w:tcPr>
-            <w:tcW w:w="741" w:type="dxa"/>
+            <w:tcW w:w="740" w:type="dxa"/>
             <w:tcBorders>
               <w:top w:val="single" w:sz="4" w:space="0" w:color="C9D3D0"/>
               <w:left w:val="single" w:sz="4" w:space="0" w:color="C9D3D0"/>
@@ -17423,7 +17547,7 @@
         </w:tc>
         <w:tc>
           <w:tcPr>
-            <w:tcW w:w="1266" w:type="dxa"/>
+            <w:tcW w:w="1370" w:type="dxa"/>
             <w:tcBorders>
               <w:top w:val="single" w:sz="4" w:space="0" w:color="C9D3D0"/>
               <w:left w:val="single" w:sz="4" w:space="0" w:color="C9D3D0"/>
@@ -17454,7 +17578,7 @@
         </w:tc>
         <w:tc>
           <w:tcPr>
-            <w:tcW w:w="3103" w:type="dxa"/>
+            <w:tcW w:w="3098" w:type="dxa"/>
             <w:tcBorders>
               <w:top w:val="single" w:sz="4" w:space="0" w:color="C9D3D0"/>
               <w:left w:val="single" w:sz="4" w:space="0" w:color="C9D3D0"/>
@@ -17494,7 +17618,7 @@
         </w:tc>
         <w:tc>
           <w:tcPr>
-            <w:tcW w:w="2264" w:type="dxa"/>
+            <w:tcW w:w="2215" w:type="dxa"/>
             <w:tcBorders>
               <w:top w:val="single" w:sz="4" w:space="0" w:color="C9D3D0"/>
               <w:left w:val="single" w:sz="4" w:space="0" w:color="C9D3D0"/>
@@ -17525,7 +17649,7 @@
         </w:tc>
         <w:tc>
           <w:tcPr>
-            <w:tcW w:w="2264" w:type="dxa"/>
+            <w:tcW w:w="2215" w:type="dxa"/>
             <w:tcBorders>
               <w:top w:val="single" w:sz="4" w:space="0" w:color="C9D3D0"/>
               <w:left w:val="single" w:sz="4" w:space="0" w:color="C9D3D0"/>
@@ -17567,7 +17691,7 @@
         </w:trPr>
         <w:tc>
           <w:tcPr>
-            <w:tcW w:w="741" w:type="dxa"/>
+            <w:tcW w:w="740" w:type="dxa"/>
             <w:tcBorders>
               <w:top w:val="single" w:sz="4" w:space="0" w:color="C9D3D0"/>
               <w:left w:val="single" w:sz="4" w:space="0" w:color="C9D3D0"/>
@@ -17598,7 +17722,7 @@
         </w:tc>
         <w:tc>
           <w:tcPr>
-            <w:tcW w:w="1266" w:type="dxa"/>
+            <w:tcW w:w="1370" w:type="dxa"/>
             <w:tcBorders>
               <w:top w:val="single" w:sz="4" w:space="0" w:color="C9D3D0"/>
               <w:left w:val="single" w:sz="4" w:space="0" w:color="C9D3D0"/>
@@ -17628,7 +17752,7 @@
         </w:tc>
         <w:tc>
           <w:tcPr>
-            <w:tcW w:w="3103" w:type="dxa"/>
+            <w:tcW w:w="3098" w:type="dxa"/>
             <w:tcBorders>
               <w:top w:val="single" w:sz="4" w:space="0" w:color="C9D3D0"/>
               <w:left w:val="single" w:sz="4" w:space="0" w:color="C9D3D0"/>
@@ -17667,7 +17791,7 @@
         </w:tc>
         <w:tc>
           <w:tcPr>
-            <w:tcW w:w="2264" w:type="dxa"/>
+            <w:tcW w:w="2215" w:type="dxa"/>
             <w:tcBorders>
               <w:top w:val="single" w:sz="4" w:space="0" w:color="C9D3D0"/>
               <w:left w:val="single" w:sz="4" w:space="0" w:color="C9D3D0"/>
@@ -17697,7 +17821,7 @@
         </w:tc>
         <w:tc>
           <w:tcPr>
-            <w:tcW w:w="2264" w:type="dxa"/>
+            <w:tcW w:w="2215" w:type="dxa"/>
             <w:tcBorders>
               <w:top w:val="single" w:sz="4" w:space="0" w:color="C9D3D0"/>
               <w:left w:val="single" w:sz="4" w:space="0" w:color="C9D3D0"/>
@@ -17738,7 +17862,7 @@
         </w:trPr>
         <w:tc>
           <w:tcPr>
-            <w:tcW w:w="741" w:type="dxa"/>
+            <w:tcW w:w="740" w:type="dxa"/>
             <w:tcBorders>
               <w:top w:val="single" w:sz="4" w:space="0" w:color="C9D3D0"/>
               <w:left w:val="single" w:sz="4" w:space="0" w:color="C9D3D0"/>
@@ -17769,7 +17893,7 @@
         </w:tc>
         <w:tc>
           <w:tcPr>
-            <w:tcW w:w="1266" w:type="dxa"/>
+            <w:tcW w:w="1370" w:type="dxa"/>
             <w:tcBorders>
               <w:top w:val="single" w:sz="4" w:space="0" w:color="C9D3D0"/>
               <w:left w:val="single" w:sz="4" w:space="0" w:color="C9D3D0"/>
@@ -17800,7 +17924,7 @@
         </w:tc>
         <w:tc>
           <w:tcPr>
-            <w:tcW w:w="3103" w:type="dxa"/>
+            <w:tcW w:w="3098" w:type="dxa"/>
             <w:tcBorders>
               <w:top w:val="single" w:sz="4" w:space="0" w:color="C9D3D0"/>
               <w:left w:val="single" w:sz="4" w:space="0" w:color="C9D3D0"/>
@@ -17840,7 +17964,7 @@
         </w:tc>
         <w:tc>
           <w:tcPr>
-            <w:tcW w:w="2264" w:type="dxa"/>
+            <w:tcW w:w="2215" w:type="dxa"/>
             <w:tcBorders>
               <w:top w:val="single" w:sz="4" w:space="0" w:color="C9D3D0"/>
               <w:left w:val="single" w:sz="4" w:space="0" w:color="C9D3D0"/>
@@ -17871,7 +17995,7 @@
         </w:tc>
         <w:tc>
           <w:tcPr>
-            <w:tcW w:w="2264" w:type="dxa"/>
+            <w:tcW w:w="2215" w:type="dxa"/>
             <w:tcBorders>
               <w:top w:val="single" w:sz="4" w:space="0" w:color="C9D3D0"/>
               <w:left w:val="single" w:sz="4" w:space="0" w:color="C9D3D0"/>
@@ -17913,7 +18037,7 @@
         </w:trPr>
         <w:tc>
           <w:tcPr>
-            <w:tcW w:w="741" w:type="dxa"/>
+            <w:tcW w:w="740" w:type="dxa"/>
             <w:tcBorders>
               <w:top w:val="single" w:sz="4" w:space="0" w:color="C9D3D0"/>
               <w:left w:val="single" w:sz="4" w:space="0" w:color="C9D3D0"/>
@@ -17943,7 +18067,7 @@
         </w:tc>
         <w:tc>
           <w:tcPr>
-            <w:tcW w:w="1266" w:type="dxa"/>
+            <w:tcW w:w="1370" w:type="dxa"/>
             <w:tcBorders>
               <w:top w:val="single" w:sz="4" w:space="0" w:color="C9D3D0"/>
               <w:left w:val="single" w:sz="4" w:space="0" w:color="C9D3D0"/>
@@ -17973,7 +18097,7 @@
         </w:tc>
         <w:tc>
           <w:tcPr>
-            <w:tcW w:w="3103" w:type="dxa"/>
+            <w:tcW w:w="3098" w:type="dxa"/>
             <w:tcBorders>
               <w:top w:val="single" w:sz="4" w:space="0" w:color="C9D3D0"/>
               <w:left w:val="single" w:sz="4" w:space="0" w:color="C9D3D0"/>
@@ -18012,7 +18136,7 @@
         </w:tc>
         <w:tc>
           <w:tcPr>
-            <w:tcW w:w="2264" w:type="dxa"/>
+            <w:tcW w:w="2215" w:type="dxa"/>
             <w:tcBorders>
               <w:top w:val="single" w:sz="4" w:space="0" w:color="C9D3D0"/>
               <w:left w:val="single" w:sz="4" w:space="0" w:color="C9D3D0"/>
@@ -18042,7 +18166,7 @@
         </w:tc>
         <w:tc>
           <w:tcPr>
-            <w:tcW w:w="2264" w:type="dxa"/>
+            <w:tcW w:w="2215" w:type="dxa"/>
             <w:tcBorders>
               <w:top w:val="single" w:sz="4" w:space="0" w:color="C9D3D0"/>
               <w:left w:val="single" w:sz="4" w:space="0" w:color="C9D3D0"/>
@@ -18083,7 +18207,7 @@
         </w:trPr>
         <w:tc>
           <w:tcPr>
-            <w:tcW w:w="741" w:type="dxa"/>
+            <w:tcW w:w="740" w:type="dxa"/>
             <w:tcBorders>
               <w:top w:val="single" w:sz="4" w:space="0" w:color="C9D3D0"/>
               <w:left w:val="single" w:sz="4" w:space="0" w:color="C9D3D0"/>
@@ -18114,7 +18238,7 @@
         </w:tc>
         <w:tc>
           <w:tcPr>
-            <w:tcW w:w="1266" w:type="dxa"/>
+            <w:tcW w:w="1370" w:type="dxa"/>
             <w:tcBorders>
               <w:top w:val="single" w:sz="4" w:space="0" w:color="C9D3D0"/>
               <w:left w:val="single" w:sz="4" w:space="0" w:color="C9D3D0"/>
@@ -18145,7 +18269,7 @@
         </w:tc>
         <w:tc>
           <w:tcPr>
-            <w:tcW w:w="3103" w:type="dxa"/>
+            <w:tcW w:w="3098" w:type="dxa"/>
             <w:tcBorders>
               <w:top w:val="single" w:sz="4" w:space="0" w:color="C9D3D0"/>
               <w:left w:val="single" w:sz="4" w:space="0" w:color="C9D3D0"/>
@@ -18185,7 +18309,7 @@
         </w:tc>
         <w:tc>
           <w:tcPr>
-            <w:tcW w:w="2264" w:type="dxa"/>
+            <w:tcW w:w="2215" w:type="dxa"/>
             <w:tcBorders>
               <w:top w:val="single" w:sz="4" w:space="0" w:color="C9D3D0"/>
               <w:left w:val="single" w:sz="4" w:space="0" w:color="C9D3D0"/>
@@ -18216,7 +18340,7 @@
         </w:tc>
         <w:tc>
           <w:tcPr>
-            <w:tcW w:w="2264" w:type="dxa"/>
+            <w:tcW w:w="2215" w:type="dxa"/>
             <w:tcBorders>
               <w:top w:val="single" w:sz="4" w:space="0" w:color="C9D3D0"/>
               <w:left w:val="single" w:sz="4" w:space="0" w:color="C9D3D0"/>
@@ -18258,7 +18382,7 @@
         </w:trPr>
         <w:tc>
           <w:tcPr>
-            <w:tcW w:w="741" w:type="dxa"/>
+            <w:tcW w:w="740" w:type="dxa"/>
             <w:tcBorders>
               <w:top w:val="single" w:sz="4" w:space="0" w:color="C9D3D0"/>
               <w:left w:val="single" w:sz="4" w:space="0" w:color="C9D3D0"/>
@@ -18289,7 +18413,7 @@
         </w:tc>
         <w:tc>
           <w:tcPr>
-            <w:tcW w:w="1266" w:type="dxa"/>
+            <w:tcW w:w="1370" w:type="dxa"/>
             <w:tcBorders>
               <w:top w:val="single" w:sz="4" w:space="0" w:color="C9D3D0"/>
               <w:left w:val="single" w:sz="4" w:space="0" w:color="C9D3D0"/>
@@ -18319,7 +18443,7 @@
         </w:tc>
         <w:tc>
           <w:tcPr>
-            <w:tcW w:w="3103" w:type="dxa"/>
+            <w:tcW w:w="3098" w:type="dxa"/>
             <w:tcBorders>
               <w:top w:val="single" w:sz="4" w:space="0" w:color="C9D3D0"/>
               <w:left w:val="single" w:sz="4" w:space="0" w:color="C9D3D0"/>
@@ -18358,7 +18482,7 @@
         </w:tc>
         <w:tc>
           <w:tcPr>
-            <w:tcW w:w="2264" w:type="dxa"/>
+            <w:tcW w:w="2215" w:type="dxa"/>
             <w:tcBorders>
               <w:top w:val="single" w:sz="4" w:space="0" w:color="C9D3D0"/>
               <w:left w:val="single" w:sz="4" w:space="0" w:color="C9D3D0"/>
@@ -18388,7 +18512,7 @@
         </w:tc>
         <w:tc>
           <w:tcPr>
-            <w:tcW w:w="2264" w:type="dxa"/>
+            <w:tcW w:w="2215" w:type="dxa"/>
             <w:tcBorders>
               <w:top w:val="single" w:sz="4" w:space="0" w:color="C9D3D0"/>
               <w:left w:val="single" w:sz="4" w:space="0" w:color="C9D3D0"/>
@@ -18429,7 +18553,7 @@
         </w:trPr>
         <w:tc>
           <w:tcPr>
-            <w:tcW w:w="741" w:type="dxa"/>
+            <w:tcW w:w="740" w:type="dxa"/>
             <w:tcBorders>
               <w:top w:val="single" w:sz="4" w:space="0" w:color="C9D3D0"/>
               <w:left w:val="single" w:sz="4" w:space="0" w:color="C9D3D0"/>
@@ -18460,7 +18584,7 @@
         </w:tc>
         <w:tc>
           <w:tcPr>
-            <w:tcW w:w="1266" w:type="dxa"/>
+            <w:tcW w:w="1370" w:type="dxa"/>
             <w:tcBorders>
               <w:top w:val="single" w:sz="4" w:space="0" w:color="C9D3D0"/>
               <w:left w:val="single" w:sz="4" w:space="0" w:color="C9D3D0"/>
@@ -18491,7 +18615,7 @@
         </w:tc>
         <w:tc>
           <w:tcPr>
-            <w:tcW w:w="3103" w:type="dxa"/>
+            <w:tcW w:w="3098" w:type="dxa"/>
             <w:tcBorders>
               <w:top w:val="single" w:sz="4" w:space="0" w:color="C9D3D0"/>
               <w:left w:val="single" w:sz="4" w:space="0" w:color="C9D3D0"/>
@@ -18531,7 +18655,7 @@
         </w:tc>
         <w:tc>
           <w:tcPr>
-            <w:tcW w:w="2264" w:type="dxa"/>
+            <w:tcW w:w="2215" w:type="dxa"/>
             <w:tcBorders>
               <w:top w:val="single" w:sz="4" w:space="0" w:color="C9D3D0"/>
               <w:left w:val="single" w:sz="4" w:space="0" w:color="C9D3D0"/>
@@ -18562,7 +18686,7 @@
         </w:tc>
         <w:tc>
           <w:tcPr>
-            <w:tcW w:w="2264" w:type="dxa"/>
+            <w:tcW w:w="2215" w:type="dxa"/>
             <w:tcBorders>
               <w:top w:val="single" w:sz="4" w:space="0" w:color="C9D3D0"/>
               <w:left w:val="single" w:sz="4" w:space="0" w:color="C9D3D0"/>
@@ -18604,7 +18728,7 @@
         </w:trPr>
         <w:tc>
           <w:tcPr>
-            <w:tcW w:w="741" w:type="dxa"/>
+            <w:tcW w:w="740" w:type="dxa"/>
             <w:tcBorders>
               <w:top w:val="single" w:sz="4" w:space="0" w:color="C9D3D0"/>
               <w:left w:val="single" w:sz="4" w:space="0" w:color="C9D3D0"/>
@@ -18634,7 +18758,7 @@
         </w:tc>
         <w:tc>
           <w:tcPr>
-            <w:tcW w:w="1266" w:type="dxa"/>
+            <w:tcW w:w="1370" w:type="dxa"/>
             <w:tcBorders>
               <w:top w:val="single" w:sz="4" w:space="0" w:color="C9D3D0"/>
               <w:left w:val="single" w:sz="4" w:space="0" w:color="C9D3D0"/>
@@ -18664,7 +18788,7 @@
         </w:tc>
         <w:tc>
           <w:tcPr>
-            <w:tcW w:w="3103" w:type="dxa"/>
+            <w:tcW w:w="3098" w:type="dxa"/>
             <w:tcBorders>
               <w:top w:val="single" w:sz="4" w:space="0" w:color="C9D3D0"/>
               <w:left w:val="single" w:sz="4" w:space="0" w:color="C9D3D0"/>
@@ -18703,7 +18827,7 @@
         </w:tc>
         <w:tc>
           <w:tcPr>
-            <w:tcW w:w="2264" w:type="dxa"/>
+            <w:tcW w:w="2215" w:type="dxa"/>
             <w:tcBorders>
               <w:top w:val="single" w:sz="4" w:space="0" w:color="C9D3D0"/>
               <w:left w:val="single" w:sz="4" w:space="0" w:color="C9D3D0"/>
@@ -18733,7 +18857,7 @@
         </w:tc>
         <w:tc>
           <w:tcPr>
-            <w:tcW w:w="2264" w:type="dxa"/>
+            <w:tcW w:w="2215" w:type="dxa"/>
             <w:tcBorders>
               <w:top w:val="single" w:sz="4" w:space="0" w:color="C9D3D0"/>
               <w:left w:val="single" w:sz="4" w:space="0" w:color="C9D3D0"/>
@@ -18774,7 +18898,7 @@
         </w:trPr>
         <w:tc>
           <w:tcPr>
-            <w:tcW w:w="741" w:type="dxa"/>
+            <w:tcW w:w="740" w:type="dxa"/>
             <w:tcBorders>
               <w:top w:val="single" w:sz="4" w:space="0" w:color="C9D3D0"/>
               <w:left w:val="single" w:sz="4" w:space="0" w:color="C9D3D0"/>
@@ -18805,7 +18929,7 @@
         </w:tc>
         <w:tc>
           <w:tcPr>
-            <w:tcW w:w="1266" w:type="dxa"/>
+            <w:tcW w:w="1370" w:type="dxa"/>
             <w:tcBorders>
               <w:top w:val="single" w:sz="4" w:space="0" w:color="C9D3D0"/>
               <w:left w:val="single" w:sz="4" w:space="0" w:color="C9D3D0"/>
@@ -18836,7 +18960,7 @@
         </w:tc>
         <w:tc>
           <w:tcPr>
-            <w:tcW w:w="3103" w:type="dxa"/>
+            <w:tcW w:w="3098" w:type="dxa"/>
             <w:tcBorders>
               <w:top w:val="single" w:sz="4" w:space="0" w:color="C9D3D0"/>
               <w:left w:val="single" w:sz="4" w:space="0" w:color="C9D3D0"/>
@@ -18876,7 +19000,7 @@
         </w:tc>
         <w:tc>
           <w:tcPr>
-            <w:tcW w:w="2264" w:type="dxa"/>
+            <w:tcW w:w="2215" w:type="dxa"/>
             <w:tcBorders>
               <w:top w:val="single" w:sz="4" w:space="0" w:color="C9D3D0"/>
               <w:left w:val="single" w:sz="4" w:space="0" w:color="C9D3D0"/>
@@ -18907,7 +19031,7 @@
         </w:tc>
         <w:tc>
           <w:tcPr>
-            <w:tcW w:w="2264" w:type="dxa"/>
+            <w:tcW w:w="2215" w:type="dxa"/>
             <w:tcBorders>
               <w:top w:val="single" w:sz="4" w:space="0" w:color="C9D3D0"/>
               <w:left w:val="single" w:sz="4" w:space="0" w:color="C9D3D0"/>
@@ -18949,7 +19073,7 @@
         </w:trPr>
         <w:tc>
           <w:tcPr>
-            <w:tcW w:w="741" w:type="dxa"/>
+            <w:tcW w:w="740" w:type="dxa"/>
             <w:tcBorders>
               <w:top w:val="single" w:sz="4" w:space="0" w:color="C9D3D0"/>
               <w:left w:val="single" w:sz="4" w:space="0" w:color="C9D3D0"/>
@@ -18979,7 +19103,7 @@
         </w:tc>
         <w:tc>
           <w:tcPr>
-            <w:tcW w:w="1266" w:type="dxa"/>
+            <w:tcW w:w="1370" w:type="dxa"/>
             <w:tcBorders>
               <w:top w:val="single" w:sz="4" w:space="0" w:color="C9D3D0"/>
               <w:left w:val="single" w:sz="4" w:space="0" w:color="C9D3D0"/>
@@ -19009,7 +19133,7 @@
         </w:tc>
         <w:tc>
           <w:tcPr>
-            <w:tcW w:w="3103" w:type="dxa"/>
+            <w:tcW w:w="3098" w:type="dxa"/>
             <w:tcBorders>
               <w:top w:val="single" w:sz="4" w:space="0" w:color="C9D3D0"/>
               <w:left w:val="single" w:sz="4" w:space="0" w:color="C9D3D0"/>
@@ -19048,7 +19172,7 @@
         </w:tc>
         <w:tc>
           <w:tcPr>
-            <w:tcW w:w="2264" w:type="dxa"/>
+            <w:tcW w:w="2215" w:type="dxa"/>
             <w:tcBorders>
               <w:top w:val="single" w:sz="4" w:space="0" w:color="C9D3D0"/>
               <w:left w:val="single" w:sz="4" w:space="0" w:color="C9D3D0"/>
@@ -19078,7 +19202,7 @@
         </w:tc>
         <w:tc>
           <w:tcPr>
-            <w:tcW w:w="2264" w:type="dxa"/>
+            <w:tcW w:w="2215" w:type="dxa"/>
             <w:tcBorders>
               <w:top w:val="single" w:sz="4" w:space="0" w:color="C9D3D0"/>
               <w:left w:val="single" w:sz="4" w:space="0" w:color="C9D3D0"/>
@@ -19119,7 +19243,7 @@
         </w:trPr>
         <w:tc>
           <w:tcPr>
-            <w:tcW w:w="741" w:type="dxa"/>
+            <w:tcW w:w="740" w:type="dxa"/>
             <w:tcBorders>
               <w:top w:val="single" w:sz="4" w:space="0" w:color="C9D3D0"/>
               <w:left w:val="single" w:sz="4" w:space="0" w:color="C9D3D0"/>
@@ -19150,7 +19274,7 @@
         </w:tc>
         <w:tc>
           <w:tcPr>
-            <w:tcW w:w="1266" w:type="dxa"/>
+            <w:tcW w:w="1370" w:type="dxa"/>
             <w:tcBorders>
               <w:top w:val="single" w:sz="4" w:space="0" w:color="C9D3D0"/>
               <w:left w:val="single" w:sz="4" w:space="0" w:color="C9D3D0"/>
@@ -19181,7 +19305,7 @@
         </w:tc>
         <w:tc>
           <w:tcPr>
-            <w:tcW w:w="3103" w:type="dxa"/>
+            <w:tcW w:w="3098" w:type="dxa"/>
             <w:tcBorders>
               <w:top w:val="single" w:sz="4" w:space="0" w:color="C9D3D0"/>
               <w:left w:val="single" w:sz="4" w:space="0" w:color="C9D3D0"/>
@@ -19221,7 +19345,7 @@
         </w:tc>
         <w:tc>
           <w:tcPr>
-            <w:tcW w:w="2264" w:type="dxa"/>
+            <w:tcW w:w="2215" w:type="dxa"/>
             <w:tcBorders>
               <w:top w:val="single" w:sz="4" w:space="0" w:color="C9D3D0"/>
               <w:left w:val="single" w:sz="4" w:space="0" w:color="C9D3D0"/>
@@ -19252,7 +19376,7 @@
         </w:tc>
         <w:tc>
           <w:tcPr>
-            <w:tcW w:w="2264" w:type="dxa"/>
+            <w:tcW w:w="2215" w:type="dxa"/>
             <w:tcBorders>
               <w:top w:val="single" w:sz="4" w:space="0" w:color="C9D3D0"/>
               <w:left w:val="single" w:sz="4" w:space="0" w:color="C9D3D0"/>
@@ -19279,6 +19403,170 @@
               </w:rPr>
               <w:t>FR-313 to FR-316</w:t>
             </w:r>
+          </w:p>
+        </w:tc>
+      </w:tr>
+      <w:tr>
+        <w:tblPrEx>
+          <w:tblCellMar>
+            <w:top w:w="0" w:type="dxa"/>
+            <w:bottom w:w="0" w:type="dxa"/>
+          </w:tblCellMar>
+        </w:tblPrEx>
+        <w:trPr>
+          <w:cantSplit/>
+        </w:trPr>
+        <w:tc>
+          <w:tcPr>
+            <w:tcW w:w="740" w:type="dxa"/>
+            <w:tcBorders>
+              <w:top w:val="single" w:sz="4" w:space="0" w:color="C9D3D0"/>
+              <w:left w:val="single" w:sz="4" w:space="0" w:color="C9D3D0"/>
+              <w:bottom w:val="single" w:sz="4" w:space="0" w:color="C9D3D0"/>
+              <w:right w:val="single" w:sz="4" w:space="0" w:color="C9D3D0"/>
+            </w:tcBorders>
+            <w:tcMar>
+              <w:top w:w="50" w:type="dxa"/>
+              <w:left w:w="100" w:type="dxa"/>
+              <w:bottom w:w="50" w:type="dxa"/>
+              <w:right w:w="100" w:type="dxa"/>
+            </w:tcMar>
+            <w:vAlign w:val="center"/>
+          </w:tcPr>
+          <w:p>
+            <w:pPr>
+              <w:spacing w:line="252" w:lineRule="auto"/>
+            </w:pPr>
+            <w:r>
+              <w:rPr>
+                <w:sz w:val="19"/>
+                <w:szCs w:val="19"/>
+              </w:rPr>
+              <w:lastRenderedPageBreak/>
+              <w:t>TC-143</w:t>
+            </w:r>
+          </w:p>
+        </w:tc>
+        <w:tc>
+          <w:tcPr>
+            <w:tcW w:w="1370" w:type="dxa"/>
+            <w:tcBorders>
+              <w:top w:val="single" w:sz="4" w:space="0" w:color="C9D3D0"/>
+              <w:left w:val="single" w:sz="4" w:space="0" w:color="C9D3D0"/>
+              <w:bottom w:val="single" w:sz="4" w:space="0" w:color="C9D3D0"/>
+              <w:right w:val="single" w:sz="4" w:space="0" w:color="C9D3D0"/>
+            </w:tcBorders>
+            <w:tcMar>
+              <w:top w:w="50" w:type="dxa"/>
+              <w:left w:w="100" w:type="dxa"/>
+              <w:bottom w:w="50" w:type="dxa"/>
+              <w:right w:w="100" w:type="dxa"/>
+            </w:tcMar>
+            <w:vAlign w:val="center"/>
+          </w:tcPr>
+          <w:p>
+            <w:pPr>
+              <w:spacing w:line="252" w:lineRule="auto"/>
+            </w:pPr>
+            <w:r>
+              <w:rPr>
+                <w:sz w:val="19"/>
+                <w:szCs w:val="19"/>
+              </w:rPr>
+              <w:t>Other paths: cost and checked date</w:t>
+            </w:r>
+          </w:p>
+        </w:tc>
+        <w:tc>
+          <w:tcPr>
+            <w:tcW w:w="3098" w:type="dxa"/>
+            <w:tcBorders>
+              <w:top w:val="single" w:sz="4" w:space="0" w:color="C9D3D0"/>
+              <w:left w:val="single" w:sz="4" w:space="0" w:color="C9D3D0"/>
+              <w:bottom w:val="single" w:sz="4" w:space="0" w:color="C9D3D0"/>
+              <w:right w:val="single" w:sz="4" w:space="0" w:color="C9D3D0"/>
+            </w:tcBorders>
+            <w:tcMar>
+              <w:top w:w="50" w:type="dxa"/>
+              <w:left w:w="100" w:type="dxa"/>
+              <w:bottom w:w="50" w:type="dxa"/>
+              <w:right w:w="100" w:type="dxa"/>
+            </w:tcMar>
+            <w:vAlign w:val="center"/>
+          </w:tcPr>
+          <w:p>
+            <w:pPr>
+              <w:spacing w:line="252" w:lineRule="auto"/>
+            </w:pPr>
+            <w:r>
+              <w:rPr>
+                <w:rFonts w:ascii="Consolas" w:eastAsia="Consolas" w:hAnsi="Consolas" w:cs="Consolas"/>
+                <w:sz w:val="17"/>
+                <w:szCs w:val="17"/>
+                <w:shd w:val="clear" w:color="auto" w:fill="F2F4F3"/>
+              </w:rPr>
+              <w:t>worker/routes-free.test.ts</w:t>
+            </w:r>
+            <w:r>
+              <w:rPr>
+                <w:sz w:val="19"/>
+                <w:szCs w:val="19"/>
+              </w:rPr>
+              <w:t xml:space="preserve"> (2)</w:t>
+            </w:r>
+          </w:p>
+        </w:tc>
+        <w:tc>
+          <w:tcPr>
+            <w:tcW w:w="2215" w:type="dxa"/>
+            <w:tcBorders>
+              <w:top w:val="single" w:sz="4" w:space="0" w:color="C9D3D0"/>
+              <w:left w:val="single" w:sz="4" w:space="0" w:color="C9D3D0"/>
+              <w:bottom w:val="single" w:sz="4" w:space="0" w:color="C9D3D0"/>
+              <w:right w:val="single" w:sz="4" w:space="0" w:color="C9D3D0"/>
+            </w:tcBorders>
+            <w:tcMar>
+              <w:top w:w="50" w:type="dxa"/>
+              <w:left w:w="100" w:type="dxa"/>
+              <w:bottom w:w="50" w:type="dxa"/>
+              <w:right w:w="100" w:type="dxa"/>
+            </w:tcMar>
+            <w:vAlign w:val="center"/>
+          </w:tcPr>
+          <w:p>
+            <w:pPr>
+              <w:spacing w:line="252" w:lineRule="auto"/>
+            </w:pPr>
+            <w:r>
+              <w:rPr>
+                <w:sz w:val="19"/>
+                <w:szCs w:val="19"/>
+              </w:rPr>
+              <w:t>A zero cost is "Free", never "Rs 0"; every route keeps its ISO checked-on date, shown in place of a fixed date</w:t>
+            </w:r>
+          </w:p>
+        </w:tc>
+        <w:tc>
+          <w:tcPr>
+            <w:tcW w:w="2215" w:type="dxa"/>
+            <w:tcBorders>
+              <w:top w:val="single" w:sz="4" w:space="0" w:color="C9D3D0"/>
+              <w:left w:val="single" w:sz="4" w:space="0" w:color="C9D3D0"/>
+              <w:bottom w:val="single" w:sz="4" w:space="0" w:color="C9D3D0"/>
+              <w:right w:val="single" w:sz="4" w:space="0" w:color="C9D3D0"/>
+            </w:tcBorders>
+            <w:tcMar>
+              <w:top w:w="50" w:type="dxa"/>
+              <w:left w:w="100" w:type="dxa"/>
+              <w:bottom w:w="50" w:type="dxa"/>
+              <w:right w:w="100" w:type="dxa"/>
+            </w:tcMar>
+            <w:vAlign w:val="center"/>
+          </w:tcPr>
+          <w:p>
+            <w:pPr>
+              <w:spacing w:line="252" w:lineRule="auto"/>
+            </w:pPr>
           </w:p>
         </w:tc>
       </w:tr>
@@ -19295,7 +19583,7 @@
         <w:keepLines/>
         <w:pageBreakBefore/>
       </w:pPr>
-      <w:bookmarkStart w:id="22" w:name="_Toc243654270"/>
+      <w:bookmarkStart w:id="22" w:name="_Toc243656601"/>
       <w:r>
         <w:lastRenderedPageBreak/>
         <w:t>7 Security tests</w:t>
@@ -19307,7 +19595,7 @@
         <w:pStyle w:val="Caption"/>
         <w:keepNext/>
       </w:pPr>
-      <w:bookmarkStart w:id="23" w:name="_Toc243654283"/>
+      <w:bookmarkStart w:id="23" w:name="_Toc243656614"/>
       <w:r>
         <w:t xml:space="preserve">Table </w:t>
       </w:r>
@@ -21840,10 +22128,7 @@
         <w:t>Security audit run-1 (15 October 2026).</w:t>
       </w:r>
       <w:r>
-        <w:t xml:space="preserve"> The Cloudflare security-audit skill (37 agents, report kept outside the public repository) produced 0 confirmed findings, 17 leads needing validation and 1 rejected lead. Every lead except lead 9 (accepted risk: the log-in limit stays per username because school laboratories share an address; a Turnstile </w:t>
-      </w:r>
-      <w:r>
-        <w:t>human check is planned) was fixed on 15 October 2026. The method, each lead, its fix and its test are listed in the ZP-DOC-08 Test Summary Report.</w:t>
+        <w:t xml:space="preserve"> The Cloudflare security-audit skill (37 agents, report kept outside the public repository) produced 0 confirmed findings, 17 leads needing validation and 1 rejected lead. Every lead except lead 9 (accepted risk: the log-in limit stays per username because school laboratories share an address; a Turnstile human check is planned) was fixed on 15 October 2026. The method, each lead, its fix and its test are listed in the ZP-DOC-08 Test Summary Report.</w:t>
       </w:r>
     </w:p>
     <w:p>
@@ -21853,7 +22138,7 @@
         <w:keepLines/>
         <w:pageBreakBefore/>
       </w:pPr>
-      <w:bookmarkStart w:id="24" w:name="_Toc243654271"/>
+      <w:bookmarkStart w:id="24" w:name="_Toc243656602"/>
       <w:r>
         <w:lastRenderedPageBreak/>
         <w:t>8 Results summary</w:t>
@@ -21885,7 +22170,7 @@
         <w:pStyle w:val="Caption"/>
         <w:keepNext/>
       </w:pPr>
-      <w:bookmarkStart w:id="25" w:name="_Toc243654284"/>
+      <w:bookmarkStart w:id="25" w:name="_Toc243656615"/>
       <w:r>
         <w:t xml:space="preserve">Table </w:t>
       </w:r>
@@ -22672,10 +22957,10 @@
         <w:spacing w:after="120"/>
       </w:pPr>
       <w:r>
-        <w:t xml:space="preserve">Automated test count over the build: 79 (5 October), 126, 152, 164, 179, 185 (11 October), 515 with 6 expected-fail and 21 opt-in (12 to 15 October, after the test campaign and CR-007 to CR-009), 532 with 0 expected-fail and 21 opt-in </w:t>
+        <w:t xml:space="preserve">Automated test count over the build: 79 (5 October), 126, 152, 164, 179, 185 (11 October), 515 with 6 expected-fail </w:t>
       </w:r>
       <w:r>
-        <w:t>(15 October, after the hardening of CR-010), 536 (21 October, after VR3 and the desktop side menu, TC-139), 539 (23 October, after VR4, TC-140), 543 (23 October, after CR-011, TC-141), 547 (23 October, after CR-012, TC-142), 549 (23 October, CR-012 revised to guides).</w:t>
+        <w:t>and 21 opt-in (12 to 15 October, after the test campaign and CR-007 to CR-009), 532 with 0 expected-fail and 21 opt-in (15 October, after the hardening of CR-010), 536 (21 October, after VR3 and the desktop side menu, TC-139), 539 (23 October, after VR4, TC-140), 543 (23 October, after CR-011, TC-141), 547 (23 October, after CR-012, TC-142), 549 (23 October, CR-012 revised to guides), 553 (23 October, other paths refreshed, TC-143).</w:t>
       </w:r>
     </w:p>
     <w:p>
@@ -22683,7 +22968,7 @@
         <w:pStyle w:val="Caption"/>
         <w:keepNext/>
       </w:pPr>
-      <w:bookmarkStart w:id="26" w:name="_Toc243654285"/>
+      <w:bookmarkStart w:id="26" w:name="_Toc243656616"/>
       <w:r>
         <w:t xml:space="preserve">Table </w:t>
       </w:r>
@@ -23198,7 +23483,7 @@
         <w:pStyle w:val="Caption"/>
         <w:keepNext/>
       </w:pPr>
-      <w:bookmarkStart w:id="27" w:name="_Toc243654286"/>
+      <w:bookmarkStart w:id="27" w:name="_Toc243656617"/>
       <w:r>
         <w:lastRenderedPageBreak/>
         <w:t xml:space="preserve">Table </w:t>
@@ -23773,7 +24058,7 @@
         <w:keepLines/>
         <w:pageBreakBefore/>
       </w:pPr>
-      <w:bookmarkStart w:id="28" w:name="_Toc243654272"/>
+      <w:bookmarkStart w:id="28" w:name="_Toc243656603"/>
       <w:r>
         <w:lastRenderedPageBreak/>
         <w:t>9 Defects found and fixed</w:t>
@@ -23785,7 +24070,7 @@
         <w:pStyle w:val="Caption"/>
         <w:keepNext/>
       </w:pPr>
-      <w:bookmarkStart w:id="29" w:name="_Toc243654287"/>
+      <w:bookmarkStart w:id="29" w:name="_Toc243656618"/>
       <w:r>
         <w:t xml:space="preserve">Table </w:t>
       </w:r>
@@ -24930,7 +25215,10 @@
         <w:spacing w:after="120"/>
       </w:pPr>
       <w:r>
-        <w:t>The product owner's screen-recorded reviews produced change requests CR-001 to CR-006; each was designed in ZP-DOC-05 first and arrived with its own tests.</w:t>
+        <w:t xml:space="preserve">The product owner's screen-recorded reviews produced change requests CR-001 to CR-006; each was designed in </w:t>
+      </w:r>
+      <w:r>
+        <w:t>ZP-DOC-05 first and arrived with its own tests.</w:t>
       </w:r>
     </w:p>
     <w:p>
@@ -24940,7 +25228,7 @@
         <w:keepLines/>
         <w:pageBreakBefore/>
       </w:pPr>
-      <w:bookmarkStart w:id="30" w:name="_Toc243654273"/>
+      <w:bookmarkStart w:id="30" w:name="_Toc243656604"/>
       <w:r>
         <w:lastRenderedPageBreak/>
         <w:t>10 Known gaps and risks</w:t>
@@ -24952,7 +25240,7 @@
         <w:pStyle w:val="Caption"/>
         <w:keepNext/>
       </w:pPr>
-      <w:bookmarkStart w:id="31" w:name="_Toc243654288"/>
+      <w:bookmarkStart w:id="31" w:name="_Toc243656619"/>
       <w:r>
         <w:t xml:space="preserve">Table </w:t>
       </w:r>
@@ -26217,7 +26505,7 @@
         <w:keepLines/>
         <w:pageBreakBefore/>
       </w:pPr>
-      <w:bookmarkStart w:id="32" w:name="_Toc243654274"/>
+      <w:bookmarkStart w:id="32" w:name="_Toc243656605"/>
       <w:r>
         <w:lastRenderedPageBreak/>
         <w:t>11 Traceability</w:t>
@@ -26237,7 +26525,7 @@
         <w:pStyle w:val="Caption"/>
         <w:keepNext/>
       </w:pPr>
-      <w:bookmarkStart w:id="33" w:name="_Toc243654289"/>
+      <w:bookmarkStart w:id="33" w:name="_Toc243656620"/>
       <w:r>
         <w:t xml:space="preserve">Table </w:t>
       </w:r>
@@ -28106,7 +28394,7 @@
         <w:keepLines/>
         <w:pageBreakBefore/>
       </w:pPr>
-      <w:bookmarkStart w:id="34" w:name="_Toc243654275"/>
+      <w:bookmarkStart w:id="34" w:name="_Toc243656606"/>
       <w:r>
         <w:lastRenderedPageBreak/>
         <w:t>Appendix A: Glossary</w:t>
@@ -28118,7 +28406,7 @@
         <w:pStyle w:val="Caption"/>
         <w:keepNext/>
       </w:pPr>
-      <w:bookmarkStart w:id="35" w:name="_Toc243654290"/>
+      <w:bookmarkStart w:id="35" w:name="_Toc243656621"/>
       <w:r>
         <w:t xml:space="preserve">Table </w:t>
       </w:r>
@@ -29139,7 +29427,7 @@
         <w:keepLines/>
         <w:pageBreakBefore/>
       </w:pPr>
-      <w:bookmarkStart w:id="36" w:name="_Toc243654276"/>
+      <w:bookmarkStart w:id="36" w:name="_Toc243656607"/>
       <w:r>
         <w:lastRenderedPageBreak/>
         <w:t>Appendix B: References</w:t>
@@ -29151,7 +29439,7 @@
         <w:pStyle w:val="Caption"/>
         <w:keepNext/>
       </w:pPr>
-      <w:bookmarkStart w:id="37" w:name="_Toc243654291"/>
+      <w:bookmarkStart w:id="37" w:name="_Toc243656622"/>
       <w:r>
         <w:t xml:space="preserve">Table </w:t>
       </w:r>
@@ -30068,10 +30356,10 @@
 <file path=word/numbering.xml><?xml version="1.0" encoding="utf-8"?>
 <w:numbering xmlns:wpc="http://schemas.microsoft.com/office/word/2010/wordprocessingCanvas" xmlns:cx="http://schemas.microsoft.com/office/drawing/2014/chartex" xmlns:cx1="http://schemas.microsoft.com/office/drawing/2015/9/8/chartex" xmlns:cx2="http://schemas.microsoft.com/office/drawing/2015/10/21/chartex" xmlns:cx3="http://schemas.microsoft.com/office/drawing/2016/5/9/chartex" xmlns:cx4="http://schemas.microsoft.com/office/drawing/2016/5/10/chartex" xmlns:cx5="http://schemas.microsoft.com/office/drawing/2016/5/11/chartex" xmlns:cx6="http://schemas.microsoft.com/office/drawing/2016/5/12/chartex" xmlns:cx7="http://schemas.microsoft.com/office/drawing/2016/5/13/chartex" xmlns:cx8="http://schemas.microsoft.com/office/drawing/2016/5/14/chartex" xmlns:mc="http://schemas.openxmlformats.org/markup-compatibility/2006" xmlns:aink="http://schemas.microsoft.com/office/drawing/2016/ink" xmlns:am3d="http://schemas.microsoft.com/office/drawing/2017/model3d" xmlns:o="urn:schemas-microsoft-com:office:office" xmlns:oel="http://schemas.microsoft.com/office/2019/extlst" xmlns:r="http://schemas.openxmlformats.org/officeDocument/2006/relationships" xmlns:m="http://schemas.openxmlformats.org/officeDocument/2006/math" xmlns:v="urn:schemas-microsoft-com:vml" xmlns:wp14="http://schemas.microsoft.com/office/word/2010/wordprocessingDrawing" xmlns:wp="http://schemas.openxmlformats.org/drawingml/2006/wordprocessingDrawing" xmlns:w10="urn:schemas-microsoft-com:office:word" xmlns:w="http://schemas.openxmlformats.org/wordprocessingml/2006/main" xmlns:w14="http://schemas.microsoft.com/office/word/2010/wordml" xmlns:w15="http://schemas.microsoft.com/office/word/2012/wordml" xmlns:w16cex="http://schemas.microsoft.com/office/word/2018/wordml/cex" xmlns:w16cid="http://schemas.microsoft.com/office/word/2016/wordml/cid" xmlns:w16="http://schemas.microsoft.com/office/word/2018/wordml" xmlns:w16du="http://schemas.microsoft.com/office/word/2023/wordml/word16du" xmlns:w16sdtdh="http://schemas.microsoft.com/office/word/2020/wordml/sdtdatahash" xmlns:w16sdtfl="http://schemas.microsoft.com/office/word/2024/wordml/sdtformatlock" xmlns:w16se="http://schemas.microsoft.com/office/word/2015/wordml/symex" xmlns:wpg="http://schemas.microsoft.com/office/word/2010/wordprocessingGroup" xmlns:wpi="http://schemas.microsoft.com/office/word/2010/wordprocessingInk" xmlns:wne="http://schemas.microsoft.com/office/word/2006/wordml" xmlns:wps="http://schemas.microsoft.com/office/word/2010/wordprocessingShape" mc:Ignorable="w14 w15 w16se w16cid w16 w16cex w16sdtdh w16sdtfl w16du wp14">
   <w:abstractNum w:abstractNumId="0" w15:restartNumberingAfterBreak="0">
-    <w:nsid w:val="26147B31"/>
+    <w:nsid w:val="0D9C50F4"/>
     <w:multiLevelType w:val="hybridMultilevel"/>
-    <w:tmpl w:val="8DA0C326"/>
-    <w:lvl w:ilvl="0" w:tplc="27EC0EF4" w:tentative="1">
+    <w:tmpl w:val="1898CEA0"/>
+    <w:lvl w:ilvl="0" w:tplc="6C6CFCA0" w:tentative="1">
       <w:start w:val="1"/>
       <w:numFmt w:val="bullet"/>
       <w:lvlText w:val="●"/>
@@ -30080,7 +30368,7 @@
         <w:ind w:left="720" w:hanging="360"/>
       </w:pPr>
     </w:lvl>
-    <w:lvl w:ilvl="1" w:tplc="0B46C47C" w:tentative="1">
+    <w:lvl w:ilvl="1" w:tplc="2112F60E" w:tentative="1">
       <w:start w:val="1"/>
       <w:numFmt w:val="bullet"/>
       <w:lvlText w:val="○"/>
@@ -30089,7 +30377,7 @@
         <w:ind w:left="1440" w:hanging="360"/>
       </w:pPr>
     </w:lvl>
-    <w:lvl w:ilvl="2" w:tplc="76809646" w:tentative="1">
+    <w:lvl w:ilvl="2" w:tplc="1478AD2E" w:tentative="1">
       <w:start w:val="1"/>
       <w:numFmt w:val="bullet"/>
       <w:lvlText w:val="■"/>
@@ -30098,7 +30386,7 @@
         <w:ind w:left="2160" w:hanging="360"/>
       </w:pPr>
     </w:lvl>
-    <w:lvl w:ilvl="3" w:tplc="70D4FA0E" w:tentative="1">
+    <w:lvl w:ilvl="3" w:tplc="46C8FAEE" w:tentative="1">
       <w:start w:val="1"/>
       <w:numFmt w:val="bullet"/>
       <w:lvlText w:val="●"/>
@@ -30107,7 +30395,7 @@
         <w:ind w:left="2880" w:hanging="360"/>
       </w:pPr>
     </w:lvl>
-    <w:lvl w:ilvl="4" w:tplc="A372E08E" w:tentative="1">
+    <w:lvl w:ilvl="4" w:tplc="2966B416" w:tentative="1">
       <w:start w:val="1"/>
       <w:numFmt w:val="bullet"/>
       <w:lvlText w:val="○"/>
@@ -30116,7 +30404,7 @@
         <w:ind w:left="3600" w:hanging="360"/>
       </w:pPr>
     </w:lvl>
-    <w:lvl w:ilvl="5" w:tplc="58AAD158" w:tentative="1">
+    <w:lvl w:ilvl="5" w:tplc="5EEACBFC" w:tentative="1">
       <w:start w:val="1"/>
       <w:numFmt w:val="bullet"/>
       <w:lvlText w:val="■"/>
@@ -30125,7 +30413,7 @@
         <w:ind w:left="4320" w:hanging="360"/>
       </w:pPr>
     </w:lvl>
-    <w:lvl w:ilvl="6" w:tplc="991AFD6E" w:tentative="1">
+    <w:lvl w:ilvl="6" w:tplc="3250B486" w:tentative="1">
       <w:start w:val="1"/>
       <w:numFmt w:val="bullet"/>
       <w:lvlText w:val="●"/>
@@ -30134,7 +30422,7 @@
         <w:ind w:left="5040" w:hanging="360"/>
       </w:pPr>
     </w:lvl>
-    <w:lvl w:ilvl="7" w:tplc="1C6CD8E6" w:tentative="1">
+    <w:lvl w:ilvl="7" w:tplc="02FCBE4E" w:tentative="1">
       <w:start w:val="1"/>
       <w:numFmt w:val="bullet"/>
       <w:lvlText w:val="●"/>
@@ -30143,7 +30431,7 @@
         <w:ind w:left="5760" w:hanging="360"/>
       </w:pPr>
     </w:lvl>
-    <w:lvl w:ilvl="8" w:tplc="8D08D56C" w:tentative="1">
+    <w:lvl w:ilvl="8" w:tplc="706E92DA" w:tentative="1">
       <w:start w:val="1"/>
       <w:numFmt w:val="bullet"/>
       <w:lvlText w:val="●"/>
@@ -30154,10 +30442,72 @@
     </w:lvl>
   </w:abstractNum>
   <w:abstractNum w:abstractNumId="1" w15:restartNumberingAfterBreak="0">
-    <w:nsid w:val="45AB7BF1"/>
+    <w:nsid w:val="1ED625AD"/>
     <w:multiLevelType w:val="hybridMultilevel"/>
-    <w:tmpl w:val="2968F4EA"/>
-    <w:lvl w:ilvl="0" w:tplc="7A42D96C" w:tentative="1">
+    <w:tmpl w:val="1D4E9974"/>
+    <w:lvl w:ilvl="0" w:tplc="819A954E">
+      <w:start w:val="1"/>
+      <w:numFmt w:val="decimal"/>
+      <w:lvlText w:val="%1."/>
+      <w:lvlJc w:val="left"/>
+      <w:pPr>
+        <w:ind w:left="720" w:hanging="360"/>
+      </w:pPr>
+    </w:lvl>
+    <w:lvl w:ilvl="1" w:tplc="5AAE2CAA" w:tentative="1">
+      <w:start w:val="1"/>
+      <w:numFmt w:val="lowerLetter"/>
+      <w:lvlText w:val="%2."/>
+      <w:lvlJc w:val="left"/>
+      <w:pPr>
+        <w:ind w:left="1080" w:hanging="360"/>
+      </w:pPr>
+    </w:lvl>
+    <w:lvl w:ilvl="2" w:tplc="FA4CD41C" w:tentative="1">
+      <w:start w:val="1"/>
+      <w:numFmt w:val="lowerRoman"/>
+      <w:lvlText w:val="%3."/>
+      <w:lvlJc w:val="left"/>
+      <w:pPr>
+        <w:ind w:left="1440" w:hanging="360"/>
+      </w:pPr>
+    </w:lvl>
+    <w:lvl w:ilvl="3" w:tplc="BAA0FBBE">
+      <w:numFmt w:val="decimal"/>
+      <w:lvlText w:val=""/>
+      <w:lvlJc w:val="left"/>
+    </w:lvl>
+    <w:lvl w:ilvl="4" w:tplc="692066AA">
+      <w:numFmt w:val="decimal"/>
+      <w:lvlText w:val=""/>
+      <w:lvlJc w:val="left"/>
+    </w:lvl>
+    <w:lvl w:ilvl="5" w:tplc="E5741050">
+      <w:numFmt w:val="decimal"/>
+      <w:lvlText w:val=""/>
+      <w:lvlJc w:val="left"/>
+    </w:lvl>
+    <w:lvl w:ilvl="6" w:tplc="5350A190">
+      <w:numFmt w:val="decimal"/>
+      <w:lvlText w:val=""/>
+      <w:lvlJc w:val="left"/>
+    </w:lvl>
+    <w:lvl w:ilvl="7" w:tplc="95B8185E">
+      <w:numFmt w:val="decimal"/>
+      <w:lvlText w:val=""/>
+      <w:lvlJc w:val="left"/>
+    </w:lvl>
+    <w:lvl w:ilvl="8" w:tplc="3774DDCA">
+      <w:numFmt w:val="decimal"/>
+      <w:lvlText w:val=""/>
+      <w:lvlJc w:val="left"/>
+    </w:lvl>
+  </w:abstractNum>
+  <w:abstractNum w:abstractNumId="2" w15:restartNumberingAfterBreak="0">
+    <w:nsid w:val="69E13278"/>
+    <w:multiLevelType w:val="hybridMultilevel"/>
+    <w:tmpl w:val="BF8E61FC"/>
+    <w:lvl w:ilvl="0" w:tplc="85045A46" w:tentative="1">
       <w:start w:val="1"/>
       <w:numFmt w:val="bullet"/>
       <w:lvlText w:val="•"/>
@@ -30166,7 +30516,7 @@
         <w:ind w:left="720" w:hanging="280"/>
       </w:pPr>
     </w:lvl>
-    <w:lvl w:ilvl="1" w:tplc="A32AEFEA" w:tentative="1">
+    <w:lvl w:ilvl="1" w:tplc="BA54A5B8" w:tentative="1">
       <w:start w:val="1"/>
       <w:numFmt w:val="bullet"/>
       <w:lvlText w:val="–"/>
@@ -30175,7 +30525,7 @@
         <w:ind w:left="1080" w:hanging="280"/>
       </w:pPr>
     </w:lvl>
-    <w:lvl w:ilvl="2" w:tplc="6D3ADB7C" w:tentative="1">
+    <w:lvl w:ilvl="2" w:tplc="0B4808D4" w:tentative="1">
       <w:start w:val="1"/>
       <w:numFmt w:val="bullet"/>
       <w:lvlText w:val="▪"/>
@@ -30184,107 +30534,45 @@
         <w:ind w:left="1440" w:hanging="280"/>
       </w:pPr>
     </w:lvl>
-    <w:lvl w:ilvl="3" w:tplc="BF6AE720">
+    <w:lvl w:ilvl="3" w:tplc="21481010">
       <w:numFmt w:val="decimal"/>
       <w:lvlText w:val=""/>
       <w:lvlJc w:val="left"/>
     </w:lvl>
-    <w:lvl w:ilvl="4" w:tplc="37065430">
+    <w:lvl w:ilvl="4" w:tplc="B468AD68">
       <w:numFmt w:val="decimal"/>
       <w:lvlText w:val=""/>
       <w:lvlJc w:val="left"/>
     </w:lvl>
-    <w:lvl w:ilvl="5" w:tplc="1DA0C2F0">
+    <w:lvl w:ilvl="5" w:tplc="1A266FA0">
       <w:numFmt w:val="decimal"/>
       <w:lvlText w:val=""/>
       <w:lvlJc w:val="left"/>
     </w:lvl>
-    <w:lvl w:ilvl="6" w:tplc="008A0636">
+    <w:lvl w:ilvl="6" w:tplc="CAEA114E">
       <w:numFmt w:val="decimal"/>
       <w:lvlText w:val=""/>
       <w:lvlJc w:val="left"/>
     </w:lvl>
-    <w:lvl w:ilvl="7" w:tplc="C4D25E44">
+    <w:lvl w:ilvl="7" w:tplc="295E75E8">
       <w:numFmt w:val="decimal"/>
       <w:lvlText w:val=""/>
       <w:lvlJc w:val="left"/>
     </w:lvl>
-    <w:lvl w:ilvl="8" w:tplc="A920AB5A">
+    <w:lvl w:ilvl="8" w:tplc="B10A7492">
       <w:numFmt w:val="decimal"/>
       <w:lvlText w:val=""/>
       <w:lvlJc w:val="left"/>
     </w:lvl>
   </w:abstractNum>
-  <w:abstractNum w:abstractNumId="2" w15:restartNumberingAfterBreak="0">
-    <w:nsid w:val="6AD11CE1"/>
-    <w:multiLevelType w:val="hybridMultilevel"/>
-    <w:tmpl w:val="44BC73B2"/>
-    <w:lvl w:ilvl="0" w:tplc="DB866284">
-      <w:start w:val="1"/>
-      <w:numFmt w:val="decimal"/>
-      <w:lvlText w:val="%1."/>
-      <w:lvlJc w:val="left"/>
-      <w:pPr>
-        <w:ind w:left="720" w:hanging="360"/>
-      </w:pPr>
-    </w:lvl>
-    <w:lvl w:ilvl="1" w:tplc="DED662E0" w:tentative="1">
-      <w:start w:val="1"/>
-      <w:numFmt w:val="lowerLetter"/>
-      <w:lvlText w:val="%2."/>
-      <w:lvlJc w:val="left"/>
-      <w:pPr>
-        <w:ind w:left="1080" w:hanging="360"/>
-      </w:pPr>
-    </w:lvl>
-    <w:lvl w:ilvl="2" w:tplc="84F65682" w:tentative="1">
-      <w:start w:val="1"/>
-      <w:numFmt w:val="lowerRoman"/>
-      <w:lvlText w:val="%3."/>
-      <w:lvlJc w:val="left"/>
-      <w:pPr>
-        <w:ind w:left="1440" w:hanging="360"/>
-      </w:pPr>
-    </w:lvl>
-    <w:lvl w:ilvl="3" w:tplc="319ECB80">
-      <w:numFmt w:val="decimal"/>
-      <w:lvlText w:val=""/>
-      <w:lvlJc w:val="left"/>
-    </w:lvl>
-    <w:lvl w:ilvl="4" w:tplc="7E842FAC">
-      <w:numFmt w:val="decimal"/>
-      <w:lvlText w:val=""/>
-      <w:lvlJc w:val="left"/>
-    </w:lvl>
-    <w:lvl w:ilvl="5" w:tplc="4BC4EB34">
-      <w:numFmt w:val="decimal"/>
-      <w:lvlText w:val=""/>
-      <w:lvlJc w:val="left"/>
-    </w:lvl>
-    <w:lvl w:ilvl="6" w:tplc="D3807E74">
-      <w:numFmt w:val="decimal"/>
-      <w:lvlText w:val=""/>
-      <w:lvlJc w:val="left"/>
-    </w:lvl>
-    <w:lvl w:ilvl="7" w:tplc="9312C7DE">
-      <w:numFmt w:val="decimal"/>
-      <w:lvlText w:val=""/>
-      <w:lvlJc w:val="left"/>
-    </w:lvl>
-    <w:lvl w:ilvl="8" w:tplc="2D8A71DE">
-      <w:numFmt w:val="decimal"/>
-      <w:lvlText w:val=""/>
-      <w:lvlJc w:val="left"/>
-    </w:lvl>
-  </w:abstractNum>
-  <w:num w:numId="1" w16cid:durableId="1289776459">
+  <w:num w:numId="1" w16cid:durableId="1575626722">
     <w:abstractNumId w:val="0"/>
     <w:lvlOverride w:ilvl="0">
       <w:startOverride w:val="1"/>
     </w:lvlOverride>
   </w:num>
-  <w:num w:numId="2" w16cid:durableId="817453944">
-    <w:abstractNumId w:val="2"/>
+  <w:num w:numId="2" w16cid:durableId="1483236105">
+    <w:abstractNumId w:val="1"/>
     <w:lvlOverride w:ilvl="0">
       <w:startOverride w:val="1"/>
     </w:lvlOverride>
@@ -30988,7 +31276,7 @@
     <w:autoRedefine/>
     <w:uiPriority w:val="39"/>
     <w:unhideWhenUsed/>
-    <w:rsid w:val="00A637C0"/>
+    <w:rsid w:val="0013547D"/>
     <w:pPr>
       <w:spacing w:after="100"/>
     </w:pPr>
@@ -31000,7 +31288,7 @@
     <w:autoRedefine/>
     <w:uiPriority w:val="39"/>
     <w:unhideWhenUsed/>
-    <w:rsid w:val="00A637C0"/>
+    <w:rsid w:val="0013547D"/>
     <w:pPr>
       <w:spacing w:after="100"/>
       <w:ind w:left="210"/>
@@ -31012,7 +31300,7 @@
     <w:next w:val="Normal"/>
     <w:uiPriority w:val="99"/>
     <w:unhideWhenUsed/>
-    <w:rsid w:val="00A637C0"/>
+    <w:rsid w:val="0013547D"/>
   </w:style>
 </w:styles>
 </file>

</xml_diff>

<commit_message>
Fix: an unknown cost is never "Free"; CMA and BIT kept (Praveen: "why are all prof bodies free", "U have reduced the stuff we had")
- Number(null) is 0 in JavaScript, so every route without a published cost showed "Free" (19 routes, all
  professional bodies). "Free" now needs a published cost of 0 (SLIATE, DTET). Only a maximum, or a free
  place for some (NAITA), shows "Up to Rs ..." - never "Rs 0".
- R029 CMA and the R026 BIT facts are back as checked on 5 Oct 2026. Their sites returned unsafe content
  today, so they are not linked: sourceUrl may be null, pinned in DAT-030 (KNOWN.sourceNotLinked).
- routes-free tests 3; 554 passed; ZP-DOC-08, ROUTES_REPORT, README updated.

Co-Authored-By: Claude Opus 5.5 (1M context) <noreply@anthropic.com>
</commit_message>
<xml_diff>
--- a/docs/08-test-plan/ZP-DOC-08_Test-Plan.docx
+++ b/docs/08-test-plan/ZP-DOC-08_Test-Plan.docx
@@ -2263,6 +2263,123 @@
           </w:p>
         </w:tc>
       </w:tr>
+      <w:tr>
+        <w:tblPrEx>
+          <w:tblCellMar>
+            <w:top w:w="0" w:type="dxa"/>
+            <w:bottom w:w="0" w:type="dxa"/>
+          </w:tblCellMar>
+        </w:tblPrEx>
+        <w:trPr>
+          <w:cantSplit/>
+          <w:trHeight w:val="420"/>
+        </w:trPr>
+        <w:tc>
+          <w:tcPr>
+            <w:tcW w:w="964" w:type="dxa"/>
+            <w:tcBorders>
+              <w:top w:val="single" w:sz="4" w:space="0" w:color="C9D3D0"/>
+              <w:left w:val="single" w:sz="4" w:space="0" w:color="C9D3D0"/>
+              <w:bottom w:val="single" w:sz="4" w:space="0" w:color="C9D3D0"/>
+              <w:right w:val="single" w:sz="4" w:space="0" w:color="C9D3D0"/>
+            </w:tcBorders>
+            <w:tcMar>
+              <w:top w:w="50" w:type="dxa"/>
+              <w:left w:w="100" w:type="dxa"/>
+              <w:bottom w:w="50" w:type="dxa"/>
+              <w:right w:w="100" w:type="dxa"/>
+            </w:tcMar>
+          </w:tcPr>
+          <w:p>
+            <w:r>
+              <w:rPr>
+                <w:sz w:val="19"/>
+                <w:szCs w:val="19"/>
+              </w:rPr>
+              <w:lastRenderedPageBreak/>
+              <w:t>0.9</w:t>
+            </w:r>
+          </w:p>
+        </w:tc>
+        <w:tc>
+          <w:tcPr>
+            <w:tcW w:w="1542" w:type="dxa"/>
+            <w:tcBorders>
+              <w:top w:val="single" w:sz="4" w:space="0" w:color="C9D3D0"/>
+              <w:left w:val="single" w:sz="4" w:space="0" w:color="C9D3D0"/>
+              <w:bottom w:val="single" w:sz="4" w:space="0" w:color="C9D3D0"/>
+              <w:right w:val="single" w:sz="4" w:space="0" w:color="C9D3D0"/>
+            </w:tcBorders>
+            <w:tcMar>
+              <w:top w:w="50" w:type="dxa"/>
+              <w:left w:w="100" w:type="dxa"/>
+              <w:bottom w:w="50" w:type="dxa"/>
+              <w:right w:w="100" w:type="dxa"/>
+            </w:tcMar>
+          </w:tcPr>
+          <w:p>
+            <w:r>
+              <w:rPr>
+                <w:sz w:val="19"/>
+                <w:szCs w:val="19"/>
+              </w:rPr>
+              <w:t>23 Oct 2026</w:t>
+            </w:r>
+          </w:p>
+        </w:tc>
+        <w:tc>
+          <w:tcPr>
+            <w:tcW w:w="1928" w:type="dxa"/>
+            <w:tcBorders>
+              <w:top w:val="single" w:sz="4" w:space="0" w:color="C9D3D0"/>
+              <w:left w:val="single" w:sz="4" w:space="0" w:color="C9D3D0"/>
+              <w:bottom w:val="single" w:sz="4" w:space="0" w:color="C9D3D0"/>
+              <w:right w:val="single" w:sz="4" w:space="0" w:color="C9D3D0"/>
+            </w:tcBorders>
+            <w:tcMar>
+              <w:top w:w="50" w:type="dxa"/>
+              <w:left w:w="100" w:type="dxa"/>
+              <w:bottom w:w="50" w:type="dxa"/>
+              <w:right w:w="100" w:type="dxa"/>
+            </w:tcMar>
+          </w:tcPr>
+          <w:p>
+            <w:r>
+              <w:rPr>
+                <w:sz w:val="19"/>
+                <w:szCs w:val="19"/>
+              </w:rPr>
+              <w:t>Team Kestrel</w:t>
+            </w:r>
+          </w:p>
+        </w:tc>
+        <w:tc>
+          <w:tcPr>
+            <w:tcW w:w="5204" w:type="dxa"/>
+            <w:tcBorders>
+              <w:top w:val="single" w:sz="4" w:space="0" w:color="C9D3D0"/>
+              <w:left w:val="single" w:sz="4" w:space="0" w:color="C9D3D0"/>
+              <w:bottom w:val="single" w:sz="4" w:space="0" w:color="C9D3D0"/>
+              <w:right w:val="single" w:sz="4" w:space="0" w:color="C9D3D0"/>
+            </w:tcBorders>
+            <w:tcMar>
+              <w:top w:w="50" w:type="dxa"/>
+              <w:left w:w="100" w:type="dxa"/>
+              <w:bottom w:w="50" w:type="dxa"/>
+              <w:right w:w="100" w:type="dxa"/>
+            </w:tcMar>
+          </w:tcPr>
+          <w:p>
+            <w:r>
+              <w:rPr>
+                <w:sz w:val="19"/>
+                <w:szCs w:val="19"/>
+              </w:rPr>
+              <w:t>Unknown cost never shown as "Free"; "Up to Rs ..."; CMA and BIT kept without links: TC-143 extended; 554 passed</w:t>
+            </w:r>
+          </w:p>
+        </w:tc>
+      </w:tr>
     </w:tbl>
     <w:p>
       <w:pPr>
@@ -2662,7 +2779,7 @@
     <w:sdt>
       <w:sdtPr>
         <w:alias w:val="Contents"/>
-        <w:id w:val="-930804378"/>
+        <w:id w:val="1357389623"/>
       </w:sdtPr>
       <w:sdtEndPr/>
       <w:sdtContent>
@@ -2691,7 +2808,7 @@
           <w:r>
             <w:fldChar w:fldCharType="separate"/>
           </w:r>
-          <w:hyperlink w:anchor="_Toc243656585" w:history="1">
+          <w:hyperlink w:anchor="_Toc243658713" w:history="1">
             <w:r>
               <w:rPr>
                 <w:rStyle w:val="Hyperlink"/>
@@ -2715,7 +2832,7 @@
               <w:rPr>
                 <w:noProof/>
               </w:rPr>
-              <w:instrText xml:space="preserve"> PAGEREF _Toc243656585 \h </w:instrText>
+              <w:instrText xml:space="preserve"> PAGEREF _Toc243658713 \h </w:instrText>
             </w:r>
             <w:r>
               <w:rPr>
@@ -2758,7 +2875,7 @@
               <w14:ligatures w14:val="standardContextual"/>
             </w:rPr>
           </w:pPr>
-          <w:hyperlink w:anchor="_Toc243656586" w:history="1">
+          <w:hyperlink w:anchor="_Toc243658714" w:history="1">
             <w:r>
               <w:rPr>
                 <w:rStyle w:val="Hyperlink"/>
@@ -2782,7 +2899,7 @@
               <w:rPr>
                 <w:noProof/>
               </w:rPr>
-              <w:instrText xml:space="preserve"> PAGEREF _Toc243656586 \h </w:instrText>
+              <w:instrText xml:space="preserve"> PAGEREF _Toc243658714 \h </w:instrText>
             </w:r>
             <w:r>
               <w:rPr>
@@ -2825,7 +2942,7 @@
               <w14:ligatures w14:val="standardContextual"/>
             </w:rPr>
           </w:pPr>
-          <w:hyperlink w:anchor="_Toc243656587" w:history="1">
+          <w:hyperlink w:anchor="_Toc243658715" w:history="1">
             <w:r>
               <w:rPr>
                 <w:rStyle w:val="Hyperlink"/>
@@ -2849,7 +2966,7 @@
               <w:rPr>
                 <w:noProof/>
               </w:rPr>
-              <w:instrText xml:space="preserve"> PAGEREF _Toc243656587 \h </w:instrText>
+              <w:instrText xml:space="preserve"> PAGEREF _Toc243658715 \h </w:instrText>
             </w:r>
             <w:r>
               <w:rPr>
@@ -2892,7 +3009,7 @@
               <w14:ligatures w14:val="standardContextual"/>
             </w:rPr>
           </w:pPr>
-          <w:hyperlink w:anchor="_Toc243656588" w:history="1">
+          <w:hyperlink w:anchor="_Toc243658716" w:history="1">
             <w:r>
               <w:rPr>
                 <w:rStyle w:val="Hyperlink"/>
@@ -2916,7 +3033,7 @@
               <w:rPr>
                 <w:noProof/>
               </w:rPr>
-              <w:instrText xml:space="preserve"> PAGEREF _Toc243656588 \h </w:instrText>
+              <w:instrText xml:space="preserve"> PAGEREF _Toc243658716 \h </w:instrText>
             </w:r>
             <w:r>
               <w:rPr>
@@ -2959,7 +3076,7 @@
               <w14:ligatures w14:val="standardContextual"/>
             </w:rPr>
           </w:pPr>
-          <w:hyperlink w:anchor="_Toc243656589" w:history="1">
+          <w:hyperlink w:anchor="_Toc243658717" w:history="1">
             <w:r>
               <w:rPr>
                 <w:rStyle w:val="Hyperlink"/>
@@ -2983,7 +3100,7 @@
               <w:rPr>
                 <w:noProof/>
               </w:rPr>
-              <w:instrText xml:space="preserve"> PAGEREF _Toc243656589 \h </w:instrText>
+              <w:instrText xml:space="preserve"> PAGEREF _Toc243658717 \h </w:instrText>
             </w:r>
             <w:r>
               <w:rPr>
@@ -3026,7 +3143,7 @@
               <w14:ligatures w14:val="standardContextual"/>
             </w:rPr>
           </w:pPr>
-          <w:hyperlink w:anchor="_Toc243656590" w:history="1">
+          <w:hyperlink w:anchor="_Toc243658718" w:history="1">
             <w:r>
               <w:rPr>
                 <w:rStyle w:val="Hyperlink"/>
@@ -3050,7 +3167,7 @@
               <w:rPr>
                 <w:noProof/>
               </w:rPr>
-              <w:instrText xml:space="preserve"> PAGEREF _Toc243656590 \h </w:instrText>
+              <w:instrText xml:space="preserve"> PAGEREF _Toc243658718 \h </w:instrText>
             </w:r>
             <w:r>
               <w:rPr>
@@ -3093,7 +3210,7 @@
               <w14:ligatures w14:val="standardContextual"/>
             </w:rPr>
           </w:pPr>
-          <w:hyperlink w:anchor="_Toc243656591" w:history="1">
+          <w:hyperlink w:anchor="_Toc243658719" w:history="1">
             <w:r>
               <w:rPr>
                 <w:rStyle w:val="Hyperlink"/>
@@ -3117,7 +3234,7 @@
               <w:rPr>
                 <w:noProof/>
               </w:rPr>
-              <w:instrText xml:space="preserve"> PAGEREF _Toc243656591 \h </w:instrText>
+              <w:instrText xml:space="preserve"> PAGEREF _Toc243658719 \h </w:instrText>
             </w:r>
             <w:r>
               <w:rPr>
@@ -3160,7 +3277,7 @@
               <w14:ligatures w14:val="standardContextual"/>
             </w:rPr>
           </w:pPr>
-          <w:hyperlink w:anchor="_Toc243656592" w:history="1">
+          <w:hyperlink w:anchor="_Toc243658720" w:history="1">
             <w:r>
               <w:rPr>
                 <w:rStyle w:val="Hyperlink"/>
@@ -3184,7 +3301,7 @@
               <w:rPr>
                 <w:noProof/>
               </w:rPr>
-              <w:instrText xml:space="preserve"> PAGEREF _Toc243656592 \h </w:instrText>
+              <w:instrText xml:space="preserve"> PAGEREF _Toc243658720 \h </w:instrText>
             </w:r>
             <w:r>
               <w:rPr>
@@ -3227,7 +3344,7 @@
               <w14:ligatures w14:val="standardContextual"/>
             </w:rPr>
           </w:pPr>
-          <w:hyperlink w:anchor="_Toc243656593" w:history="1">
+          <w:hyperlink w:anchor="_Toc243658721" w:history="1">
             <w:r>
               <w:rPr>
                 <w:rStyle w:val="Hyperlink"/>
@@ -3251,7 +3368,7 @@
               <w:rPr>
                 <w:noProof/>
               </w:rPr>
-              <w:instrText xml:space="preserve"> PAGEREF _Toc243656593 \h </w:instrText>
+              <w:instrText xml:space="preserve"> PAGEREF _Toc243658721 \h </w:instrText>
             </w:r>
             <w:r>
               <w:rPr>
@@ -3294,7 +3411,7 @@
               <w14:ligatures w14:val="standardContextual"/>
             </w:rPr>
           </w:pPr>
-          <w:hyperlink w:anchor="_Toc243656594" w:history="1">
+          <w:hyperlink w:anchor="_Toc243658722" w:history="1">
             <w:r>
               <w:rPr>
                 <w:rStyle w:val="Hyperlink"/>
@@ -3318,7 +3435,7 @@
               <w:rPr>
                 <w:noProof/>
               </w:rPr>
-              <w:instrText xml:space="preserve"> PAGEREF _Toc243656594 \h </w:instrText>
+              <w:instrText xml:space="preserve"> PAGEREF _Toc243658722 \h </w:instrText>
             </w:r>
             <w:r>
               <w:rPr>
@@ -3361,7 +3478,7 @@
               <w14:ligatures w14:val="standardContextual"/>
             </w:rPr>
           </w:pPr>
-          <w:hyperlink w:anchor="_Toc243656595" w:history="1">
+          <w:hyperlink w:anchor="_Toc243658723" w:history="1">
             <w:r>
               <w:rPr>
                 <w:rStyle w:val="Hyperlink"/>
@@ -3385,7 +3502,7 @@
               <w:rPr>
                 <w:noProof/>
               </w:rPr>
-              <w:instrText xml:space="preserve"> PAGEREF _Toc243656595 \h </w:instrText>
+              <w:instrText xml:space="preserve"> PAGEREF _Toc243658723 \h </w:instrText>
             </w:r>
             <w:r>
               <w:rPr>
@@ -3428,7 +3545,7 @@
               <w14:ligatures w14:val="standardContextual"/>
             </w:rPr>
           </w:pPr>
-          <w:hyperlink w:anchor="_Toc243656596" w:history="1">
+          <w:hyperlink w:anchor="_Toc243658724" w:history="1">
             <w:r>
               <w:rPr>
                 <w:rStyle w:val="Hyperlink"/>
@@ -3452,7 +3569,7 @@
               <w:rPr>
                 <w:noProof/>
               </w:rPr>
-              <w:instrText xml:space="preserve"> PAGEREF _Toc243656596 \h </w:instrText>
+              <w:instrText xml:space="preserve"> PAGEREF _Toc243658724 \h </w:instrText>
             </w:r>
             <w:r>
               <w:rPr>
@@ -3495,7 +3612,7 @@
               <w14:ligatures w14:val="standardContextual"/>
             </w:rPr>
           </w:pPr>
-          <w:hyperlink w:anchor="_Toc243656597" w:history="1">
+          <w:hyperlink w:anchor="_Toc243658725" w:history="1">
             <w:r>
               <w:rPr>
                 <w:rStyle w:val="Hyperlink"/>
@@ -3519,7 +3636,7 @@
               <w:rPr>
                 <w:noProof/>
               </w:rPr>
-              <w:instrText xml:space="preserve"> PAGEREF _Toc243656597 \h </w:instrText>
+              <w:instrText xml:space="preserve"> PAGEREF _Toc243658725 \h </w:instrText>
             </w:r>
             <w:r>
               <w:rPr>
@@ -3562,7 +3679,7 @@
               <w14:ligatures w14:val="standardContextual"/>
             </w:rPr>
           </w:pPr>
-          <w:hyperlink w:anchor="_Toc243656598" w:history="1">
+          <w:hyperlink w:anchor="_Toc243658726" w:history="1">
             <w:r>
               <w:rPr>
                 <w:rStyle w:val="Hyperlink"/>
@@ -3586,7 +3703,7 @@
               <w:rPr>
                 <w:noProof/>
               </w:rPr>
-              <w:instrText xml:space="preserve"> PAGEREF _Toc243656598 \h </w:instrText>
+              <w:instrText xml:space="preserve"> PAGEREF _Toc243658726 \h </w:instrText>
             </w:r>
             <w:r>
               <w:rPr>
@@ -3629,7 +3746,7 @@
               <w14:ligatures w14:val="standardContextual"/>
             </w:rPr>
           </w:pPr>
-          <w:hyperlink w:anchor="_Toc243656599" w:history="1">
+          <w:hyperlink w:anchor="_Toc243658727" w:history="1">
             <w:r>
               <w:rPr>
                 <w:rStyle w:val="Hyperlink"/>
@@ -3653,7 +3770,7 @@
               <w:rPr>
                 <w:noProof/>
               </w:rPr>
-              <w:instrText xml:space="preserve"> PAGEREF _Toc243656599 \h </w:instrText>
+              <w:instrText xml:space="preserve"> PAGEREF _Toc243658727 \h </w:instrText>
             </w:r>
             <w:r>
               <w:rPr>
@@ -3696,7 +3813,7 @@
               <w14:ligatures w14:val="standardContextual"/>
             </w:rPr>
           </w:pPr>
-          <w:hyperlink w:anchor="_Toc243656600" w:history="1">
+          <w:hyperlink w:anchor="_Toc243658728" w:history="1">
             <w:r>
               <w:rPr>
                 <w:rStyle w:val="Hyperlink"/>
@@ -3720,7 +3837,7 @@
               <w:rPr>
                 <w:noProof/>
               </w:rPr>
-              <w:instrText xml:space="preserve"> PAGEREF _Toc243656600 \h </w:instrText>
+              <w:instrText xml:space="preserve"> PAGEREF _Toc243658728 \h </w:instrText>
             </w:r>
             <w:r>
               <w:rPr>
@@ -3763,7 +3880,7 @@
               <w14:ligatures w14:val="standardContextual"/>
             </w:rPr>
           </w:pPr>
-          <w:hyperlink w:anchor="_Toc243656601" w:history="1">
+          <w:hyperlink w:anchor="_Toc243658729" w:history="1">
             <w:r>
               <w:rPr>
                 <w:rStyle w:val="Hyperlink"/>
@@ -3787,7 +3904,7 @@
               <w:rPr>
                 <w:noProof/>
               </w:rPr>
-              <w:instrText xml:space="preserve"> PAGEREF _Toc243656601 \h </w:instrText>
+              <w:instrText xml:space="preserve"> PAGEREF _Toc243658729 \h </w:instrText>
             </w:r>
             <w:r>
               <w:rPr>
@@ -3830,7 +3947,7 @@
               <w14:ligatures w14:val="standardContextual"/>
             </w:rPr>
           </w:pPr>
-          <w:hyperlink w:anchor="_Toc243656602" w:history="1">
+          <w:hyperlink w:anchor="_Toc243658730" w:history="1">
             <w:r>
               <w:rPr>
                 <w:rStyle w:val="Hyperlink"/>
@@ -3854,7 +3971,7 @@
               <w:rPr>
                 <w:noProof/>
               </w:rPr>
-              <w:instrText xml:space="preserve"> PAGEREF _Toc243656602 \h </w:instrText>
+              <w:instrText xml:space="preserve"> PAGEREF _Toc243658730 \h </w:instrText>
             </w:r>
             <w:r>
               <w:rPr>
@@ -3897,7 +4014,7 @@
               <w14:ligatures w14:val="standardContextual"/>
             </w:rPr>
           </w:pPr>
-          <w:hyperlink w:anchor="_Toc243656603" w:history="1">
+          <w:hyperlink w:anchor="_Toc243658731" w:history="1">
             <w:r>
               <w:rPr>
                 <w:rStyle w:val="Hyperlink"/>
@@ -3921,7 +4038,7 @@
               <w:rPr>
                 <w:noProof/>
               </w:rPr>
-              <w:instrText xml:space="preserve"> PAGEREF _Toc243656603 \h </w:instrText>
+              <w:instrText xml:space="preserve"> PAGEREF _Toc243658731 \h </w:instrText>
             </w:r>
             <w:r>
               <w:rPr>
@@ -3964,7 +4081,7 @@
               <w14:ligatures w14:val="standardContextual"/>
             </w:rPr>
           </w:pPr>
-          <w:hyperlink w:anchor="_Toc243656604" w:history="1">
+          <w:hyperlink w:anchor="_Toc243658732" w:history="1">
             <w:r>
               <w:rPr>
                 <w:rStyle w:val="Hyperlink"/>
@@ -3988,7 +4105,7 @@
               <w:rPr>
                 <w:noProof/>
               </w:rPr>
-              <w:instrText xml:space="preserve"> PAGEREF _Toc243656604 \h </w:instrText>
+              <w:instrText xml:space="preserve"> PAGEREF _Toc243658732 \h </w:instrText>
             </w:r>
             <w:r>
               <w:rPr>
@@ -4031,7 +4148,7 @@
               <w14:ligatures w14:val="standardContextual"/>
             </w:rPr>
           </w:pPr>
-          <w:hyperlink w:anchor="_Toc243656605" w:history="1">
+          <w:hyperlink w:anchor="_Toc243658733" w:history="1">
             <w:r>
               <w:rPr>
                 <w:rStyle w:val="Hyperlink"/>
@@ -4055,7 +4172,7 @@
               <w:rPr>
                 <w:noProof/>
               </w:rPr>
-              <w:instrText xml:space="preserve"> PAGEREF _Toc243656605 \h </w:instrText>
+              <w:instrText xml:space="preserve"> PAGEREF _Toc243658733 \h </w:instrText>
             </w:r>
             <w:r>
               <w:rPr>
@@ -4098,7 +4215,7 @@
               <w14:ligatures w14:val="standardContextual"/>
             </w:rPr>
           </w:pPr>
-          <w:hyperlink w:anchor="_Toc243656606" w:history="1">
+          <w:hyperlink w:anchor="_Toc243658734" w:history="1">
             <w:r>
               <w:rPr>
                 <w:rStyle w:val="Hyperlink"/>
@@ -4122,7 +4239,7 @@
               <w:rPr>
                 <w:noProof/>
               </w:rPr>
-              <w:instrText xml:space="preserve"> PAGEREF _Toc243656606 \h </w:instrText>
+              <w:instrText xml:space="preserve"> PAGEREF _Toc243658734 \h </w:instrText>
             </w:r>
             <w:r>
               <w:rPr>
@@ -4165,7 +4282,7 @@
               <w14:ligatures w14:val="standardContextual"/>
             </w:rPr>
           </w:pPr>
-          <w:hyperlink w:anchor="_Toc243656607" w:history="1">
+          <w:hyperlink w:anchor="_Toc243658735" w:history="1">
             <w:r>
               <w:rPr>
                 <w:rStyle w:val="Hyperlink"/>
@@ -4189,7 +4306,7 @@
               <w:rPr>
                 <w:noProof/>
               </w:rPr>
-              <w:instrText xml:space="preserve"> PAGEREF _Toc243656607 \h </w:instrText>
+              <w:instrText xml:space="preserve"> PAGEREF _Toc243658735 \h </w:instrText>
             </w:r>
             <w:r>
               <w:rPr>
@@ -4235,7 +4352,7 @@
     <w:sdt>
       <w:sdtPr>
         <w:alias w:val="Tables"/>
-        <w:id w:val="1564607646"/>
+        <w:id w:val="-1007593650"/>
       </w:sdtPr>
       <w:sdtEndPr/>
       <w:sdtContent>
@@ -4264,7 +4381,7 @@
           <w:r>
             <w:fldChar w:fldCharType="separate"/>
           </w:r>
-          <w:hyperlink w:anchor="_Toc243656608" w:history="1">
+          <w:hyperlink w:anchor="_Toc243658736" w:history="1">
             <w:r>
               <w:rPr>
                 <w:rStyle w:val="Hyperlink"/>
@@ -4288,7 +4405,7 @@
               <w:rPr>
                 <w:noProof/>
               </w:rPr>
-              <w:instrText xml:space="preserve"> PAGEREF _Toc243656608 \h </w:instrText>
+              <w:instrText xml:space="preserve"> PAGEREF _Toc243658736 \h </w:instrText>
             </w:r>
             <w:r>
               <w:rPr>
@@ -4331,7 +4448,7 @@
               <w14:ligatures w14:val="standardContextual"/>
             </w:rPr>
           </w:pPr>
-          <w:hyperlink w:anchor="_Toc243656609" w:history="1">
+          <w:hyperlink w:anchor="_Toc243658737" w:history="1">
             <w:r>
               <w:rPr>
                 <w:rStyle w:val="Hyperlink"/>
@@ -4355,7 +4472,7 @@
               <w:rPr>
                 <w:noProof/>
               </w:rPr>
-              <w:instrText xml:space="preserve"> PAGEREF _Toc243656609 \h </w:instrText>
+              <w:instrText xml:space="preserve"> PAGEREF _Toc243658737 \h </w:instrText>
             </w:r>
             <w:r>
               <w:rPr>
@@ -4398,7 +4515,7 @@
               <w14:ligatures w14:val="standardContextual"/>
             </w:rPr>
           </w:pPr>
-          <w:hyperlink w:anchor="_Toc243656610" w:history="1">
+          <w:hyperlink w:anchor="_Toc243658738" w:history="1">
             <w:r>
               <w:rPr>
                 <w:rStyle w:val="Hyperlink"/>
@@ -4422,7 +4539,7 @@
               <w:rPr>
                 <w:noProof/>
               </w:rPr>
-              <w:instrText xml:space="preserve"> PAGEREF _Toc243656610 \h </w:instrText>
+              <w:instrText xml:space="preserve"> PAGEREF _Toc243658738 \h </w:instrText>
             </w:r>
             <w:r>
               <w:rPr>
@@ -4465,7 +4582,7 @@
               <w14:ligatures w14:val="standardContextual"/>
             </w:rPr>
           </w:pPr>
-          <w:hyperlink w:anchor="_Toc243656611" w:history="1">
+          <w:hyperlink w:anchor="_Toc243658739" w:history="1">
             <w:r>
               <w:rPr>
                 <w:rStyle w:val="Hyperlink"/>
@@ -4489,7 +4606,7 @@
               <w:rPr>
                 <w:noProof/>
               </w:rPr>
-              <w:instrText xml:space="preserve"> PAGEREF _Toc243656611 \h </w:instrText>
+              <w:instrText xml:space="preserve"> PAGEREF _Toc243658739 \h </w:instrText>
             </w:r>
             <w:r>
               <w:rPr>
@@ -4532,7 +4649,7 @@
               <w14:ligatures w14:val="standardContextual"/>
             </w:rPr>
           </w:pPr>
-          <w:hyperlink w:anchor="_Toc243656612" w:history="1">
+          <w:hyperlink w:anchor="_Toc243658740" w:history="1">
             <w:r>
               <w:rPr>
                 <w:rStyle w:val="Hyperlink"/>
@@ -4556,7 +4673,7 @@
               <w:rPr>
                 <w:noProof/>
               </w:rPr>
-              <w:instrText xml:space="preserve"> PAGEREF _Toc243656612 \h </w:instrText>
+              <w:instrText xml:space="preserve"> PAGEREF _Toc243658740 \h </w:instrText>
             </w:r>
             <w:r>
               <w:rPr>
@@ -4599,7 +4716,7 @@
               <w14:ligatures w14:val="standardContextual"/>
             </w:rPr>
           </w:pPr>
-          <w:hyperlink w:anchor="_Toc243656613" w:history="1">
+          <w:hyperlink w:anchor="_Toc243658741" w:history="1">
             <w:r>
               <w:rPr>
                 <w:rStyle w:val="Hyperlink"/>
@@ -4623,7 +4740,7 @@
               <w:rPr>
                 <w:noProof/>
               </w:rPr>
-              <w:instrText xml:space="preserve"> PAGEREF _Toc243656613 \h </w:instrText>
+              <w:instrText xml:space="preserve"> PAGEREF _Toc243658741 \h </w:instrText>
             </w:r>
             <w:r>
               <w:rPr>
@@ -4666,7 +4783,7 @@
               <w14:ligatures w14:val="standardContextual"/>
             </w:rPr>
           </w:pPr>
-          <w:hyperlink w:anchor="_Toc243656614" w:history="1">
+          <w:hyperlink w:anchor="_Toc243658742" w:history="1">
             <w:r>
               <w:rPr>
                 <w:rStyle w:val="Hyperlink"/>
@@ -4690,7 +4807,7 @@
               <w:rPr>
                 <w:noProof/>
               </w:rPr>
-              <w:instrText xml:space="preserve"> PAGEREF _Toc243656614 \h </w:instrText>
+              <w:instrText xml:space="preserve"> PAGEREF _Toc243658742 \h </w:instrText>
             </w:r>
             <w:r>
               <w:rPr>
@@ -4733,7 +4850,7 @@
               <w14:ligatures w14:val="standardContextual"/>
             </w:rPr>
           </w:pPr>
-          <w:hyperlink w:anchor="_Toc243656615" w:history="1">
+          <w:hyperlink w:anchor="_Toc243658743" w:history="1">
             <w:r>
               <w:rPr>
                 <w:rStyle w:val="Hyperlink"/>
@@ -4757,7 +4874,7 @@
               <w:rPr>
                 <w:noProof/>
               </w:rPr>
-              <w:instrText xml:space="preserve"> PAGEREF _Toc243656615 \h </w:instrText>
+              <w:instrText xml:space="preserve"> PAGEREF _Toc243658743 \h </w:instrText>
             </w:r>
             <w:r>
               <w:rPr>
@@ -4800,7 +4917,7 @@
               <w14:ligatures w14:val="standardContextual"/>
             </w:rPr>
           </w:pPr>
-          <w:hyperlink w:anchor="_Toc243656616" w:history="1">
+          <w:hyperlink w:anchor="_Toc243658744" w:history="1">
             <w:r>
               <w:rPr>
                 <w:rStyle w:val="Hyperlink"/>
@@ -4824,7 +4941,7 @@
               <w:rPr>
                 <w:noProof/>
               </w:rPr>
-              <w:instrText xml:space="preserve"> PAGEREF _Toc243656616 \h </w:instrText>
+              <w:instrText xml:space="preserve"> PAGEREF _Toc243658744 \h </w:instrText>
             </w:r>
             <w:r>
               <w:rPr>
@@ -4867,7 +4984,7 @@
               <w14:ligatures w14:val="standardContextual"/>
             </w:rPr>
           </w:pPr>
-          <w:hyperlink w:anchor="_Toc243656617" w:history="1">
+          <w:hyperlink w:anchor="_Toc243658745" w:history="1">
             <w:r>
               <w:rPr>
                 <w:rStyle w:val="Hyperlink"/>
@@ -4891,7 +5008,7 @@
               <w:rPr>
                 <w:noProof/>
               </w:rPr>
-              <w:instrText xml:space="preserve"> PAGEREF _Toc243656617 \h </w:instrText>
+              <w:instrText xml:space="preserve"> PAGEREF _Toc243658745 \h </w:instrText>
             </w:r>
             <w:r>
               <w:rPr>
@@ -4934,7 +5051,7 @@
               <w14:ligatures w14:val="standardContextual"/>
             </w:rPr>
           </w:pPr>
-          <w:hyperlink w:anchor="_Toc243656618" w:history="1">
+          <w:hyperlink w:anchor="_Toc243658746" w:history="1">
             <w:r>
               <w:rPr>
                 <w:rStyle w:val="Hyperlink"/>
@@ -4958,7 +5075,7 @@
               <w:rPr>
                 <w:noProof/>
               </w:rPr>
-              <w:instrText xml:space="preserve"> PAGEREF _Toc243656618 \h </w:instrText>
+              <w:instrText xml:space="preserve"> PAGEREF _Toc243658746 \h </w:instrText>
             </w:r>
             <w:r>
               <w:rPr>
@@ -5001,7 +5118,7 @@
               <w14:ligatures w14:val="standardContextual"/>
             </w:rPr>
           </w:pPr>
-          <w:hyperlink w:anchor="_Toc243656619" w:history="1">
+          <w:hyperlink w:anchor="_Toc243658747" w:history="1">
             <w:r>
               <w:rPr>
                 <w:rStyle w:val="Hyperlink"/>
@@ -5025,7 +5142,7 @@
               <w:rPr>
                 <w:noProof/>
               </w:rPr>
-              <w:instrText xml:space="preserve"> PAGEREF _Toc243656619 \h </w:instrText>
+              <w:instrText xml:space="preserve"> PAGEREF _Toc243658747 \h </w:instrText>
             </w:r>
             <w:r>
               <w:rPr>
@@ -5068,7 +5185,7 @@
               <w14:ligatures w14:val="standardContextual"/>
             </w:rPr>
           </w:pPr>
-          <w:hyperlink w:anchor="_Toc243656620" w:history="1">
+          <w:hyperlink w:anchor="_Toc243658748" w:history="1">
             <w:r>
               <w:rPr>
                 <w:rStyle w:val="Hyperlink"/>
@@ -5092,7 +5209,7 @@
               <w:rPr>
                 <w:noProof/>
               </w:rPr>
-              <w:instrText xml:space="preserve"> PAGEREF _Toc243656620 \h </w:instrText>
+              <w:instrText xml:space="preserve"> PAGEREF _Toc243658748 \h </w:instrText>
             </w:r>
             <w:r>
               <w:rPr>
@@ -5135,7 +5252,7 @@
               <w14:ligatures w14:val="standardContextual"/>
             </w:rPr>
           </w:pPr>
-          <w:hyperlink w:anchor="_Toc243656621" w:history="1">
+          <w:hyperlink w:anchor="_Toc243658749" w:history="1">
             <w:r>
               <w:rPr>
                 <w:rStyle w:val="Hyperlink"/>
@@ -5159,7 +5276,7 @@
               <w:rPr>
                 <w:noProof/>
               </w:rPr>
-              <w:instrText xml:space="preserve"> PAGEREF _Toc243656621 \h </w:instrText>
+              <w:instrText xml:space="preserve"> PAGEREF _Toc243658749 \h </w:instrText>
             </w:r>
             <w:r>
               <w:rPr>
@@ -5202,7 +5319,7 @@
               <w14:ligatures w14:val="standardContextual"/>
             </w:rPr>
           </w:pPr>
-          <w:hyperlink w:anchor="_Toc243656622" w:history="1">
+          <w:hyperlink w:anchor="_Toc243658750" w:history="1">
             <w:r>
               <w:rPr>
                 <w:rStyle w:val="Hyperlink"/>
@@ -5226,7 +5343,7 @@
               <w:rPr>
                 <w:noProof/>
               </w:rPr>
-              <w:instrText xml:space="preserve"> PAGEREF _Toc243656622 \h </w:instrText>
+              <w:instrText xml:space="preserve"> PAGEREF _Toc243658750 \h </w:instrText>
             </w:r>
             <w:r>
               <w:rPr>
@@ -5267,7 +5384,7 @@
         <w:keepLines/>
         <w:pageBreakBefore/>
       </w:pPr>
-      <w:bookmarkStart w:id="0" w:name="_Toc243656585"/>
+      <w:bookmarkStart w:id="0" w:name="_Toc243658713"/>
       <w:r>
         <w:lastRenderedPageBreak/>
         <w:t>1 Introduction</w:t>
@@ -5280,7 +5397,7 @@
         <w:keepNext/>
         <w:keepLines/>
       </w:pPr>
-      <w:bookmarkStart w:id="1" w:name="_Toc243656586"/>
+      <w:bookmarkStart w:id="1" w:name="_Toc243658714"/>
       <w:r>
         <w:t>1.1 Purpose</w:t>
       </w:r>
@@ -5291,10 +5408,10 @@
         <w:spacing w:after="120"/>
       </w:pPr>
       <w:r>
-        <w:t xml:space="preserve">This document states how ZedPath is tested, what is tested, on what, and with what result. It follows the structure of IEEE 829 and ISO/IEC/IEEE 29119-3 (test plan and test summary content), scaled to a </w:t>
+        <w:t xml:space="preserve">This document states how ZedPath is tested, what is tested, on what, and with what result. It follows the </w:t>
       </w:r>
       <w:r>
-        <w:t>three-week buildathon product. It also gives the matrix from requirement to test case that ZP-DOC-00 requires of this document.</w:t>
+        <w:t>structure of IEEE 829 and ISO/IEC/IEEE 29119-3 (test plan and test summary content), scaled to a three-week buildathon product. It also gives the matrix from requirement to test case that ZP-DOC-00 requires of this document.</w:t>
       </w:r>
     </w:p>
     <w:p>
@@ -5303,7 +5420,7 @@
         <w:keepNext/>
         <w:keepLines/>
       </w:pPr>
-      <w:bookmarkStart w:id="2" w:name="_Toc243656587"/>
+      <w:bookmarkStart w:id="2" w:name="_Toc243658715"/>
       <w:r>
         <w:t>1.2 Scope</w:t>
       </w:r>
@@ -5314,10 +5431,10 @@
         <w:spacing w:after="120"/>
       </w:pPr>
       <w:r>
-        <w:t xml:space="preserve">All software of Releases R1 and R2 as live on 11 October 2026, and as built on 15 October 2026 (VR2 and CR-007 to CR-010): the React single-page app, the Hono API in one Cloudflare Worker, the D1 database and its migrations 0001 to 0012, the group-room Durable Object, Ask ZedPath, </w:t>
+        <w:t xml:space="preserve">All software of Releases R1 and R2 as live on 11 October 2026, and as built on 15 October 2026 (VR2 and CR-007 to </w:t>
       </w:r>
       <w:r>
-        <w:t>and the project's safety tooling (deploy guard and leak scanner). Out of scope: features not yet built (results-photo reading, curator review queue, Gazette job, share card, teacher view) and third-party services themselves (Gemini, Cloudflare platform), which are tested only through ZedPath's handling of their answers.</w:t>
+        <w:t>CR-010): the React single-page app, the Hono API in one Cloudflare Worker, the D1 database and its migrations 0001 to 0012, the group-room Durable Object, Ask ZedPath, and the project's safety tooling (deploy guard and leak scanner). Out of scope: features not yet built (results-photo reading, curator review queue, Gazette job, share card, teacher view) and third-party services themselves (Gemini, Cloudflare platform), which are tested only through ZedPath's handling of their answers.</w:t>
       </w:r>
     </w:p>
     <w:p>
@@ -5326,7 +5443,7 @@
         <w:keepNext/>
         <w:keepLines/>
       </w:pPr>
-      <w:bookmarkStart w:id="3" w:name="_Toc243656588"/>
+      <w:bookmarkStart w:id="3" w:name="_Toc243658716"/>
       <w:r>
         <w:t>1.3 Intended audience</w:t>
       </w:r>
@@ -5346,7 +5463,7 @@
         <w:keepNext/>
         <w:keepLines/>
       </w:pPr>
-      <w:bookmarkStart w:id="4" w:name="_Toc243656589"/>
+      <w:bookmarkStart w:id="4" w:name="_Toc243658717"/>
       <w:r>
         <w:t>1.4 Relationship to other documents</w:t>
       </w:r>
@@ -5357,7 +5474,7 @@
         <w:pStyle w:val="Caption"/>
         <w:keepNext/>
       </w:pPr>
-      <w:bookmarkStart w:id="5" w:name="_Toc243656608"/>
+      <w:bookmarkStart w:id="5" w:name="_Toc243658736"/>
       <w:r>
         <w:t xml:space="preserve">Table </w:t>
       </w:r>
@@ -5875,7 +5992,7 @@
         <w:keepLines/>
         <w:pageBreakBefore/>
       </w:pPr>
-      <w:bookmarkStart w:id="6" w:name="_Toc243656590"/>
+      <w:bookmarkStart w:id="6" w:name="_Toc243658718"/>
       <w:r>
         <w:lastRenderedPageBreak/>
         <w:t>2 Test strategy</w:t>
@@ -5888,7 +6005,7 @@
         <w:keepNext/>
         <w:keepLines/>
       </w:pPr>
-      <w:bookmarkStart w:id="7" w:name="_Toc243656591"/>
+      <w:bookmarkStart w:id="7" w:name="_Toc243658719"/>
       <w:r>
         <w:t>2.1 Test levels</w:t>
       </w:r>
@@ -5899,7 +6016,7 @@
         <w:pStyle w:val="Caption"/>
         <w:keepNext/>
       </w:pPr>
-      <w:bookmarkStart w:id="8" w:name="_Toc243656609"/>
+      <w:bookmarkStart w:id="8" w:name="_Toc243658737"/>
       <w:r>
         <w:t xml:space="preserve">Table </w:t>
       </w:r>
@@ -7141,7 +7258,7 @@
         <w:keepNext/>
         <w:keepLines/>
       </w:pPr>
-      <w:bookmarkStart w:id="9" w:name="_Toc243656592"/>
+      <w:bookmarkStart w:id="9" w:name="_Toc243658720"/>
       <w:r>
         <w:t>2.2 Test types</w:t>
       </w:r>
@@ -7152,7 +7269,7 @@
         <w:pStyle w:val="Caption"/>
         <w:keepNext/>
       </w:pPr>
-      <w:bookmarkStart w:id="10" w:name="_Toc243656610"/>
+      <w:bookmarkStart w:id="10" w:name="_Toc243658738"/>
       <w:r>
         <w:t xml:space="preserve">Table </w:t>
       </w:r>
@@ -7940,7 +8057,7 @@
         <w:keepNext/>
         <w:keepLines/>
       </w:pPr>
-      <w:bookmarkStart w:id="11" w:name="_Toc243656593"/>
+      <w:bookmarkStart w:id="11" w:name="_Toc243658721"/>
       <w:r>
         <w:t>2.3 Approach</w:t>
       </w:r>
@@ -7963,10 +8080,7 @@
         <w:t>shared/</w:t>
       </w:r>
       <w:r>
-        <w:t xml:space="preserve"> (NFR-060), so they are tested without a server. Server rules are tested through the real HTTP routes on the real schema, never by calling internals. Each bug </w:t>
-      </w:r>
-      <w:r>
-        <w:t>found by hand gets a test before or with its fix. Any change to a default value comes with a test that pins the default.</w:t>
+        <w:t xml:space="preserve"> (NFR-060), so they are tested without a server. Server rules are tested through the real HTTP routes on the real schema, never by calling internals. Each bug found by hand gets a test before or with its fix. Any change to a default value comes with a test that pins the default.</w:t>
       </w:r>
     </w:p>
     <w:p>
@@ -7976,7 +8090,7 @@
         <w:keepLines/>
         <w:pageBreakBefore/>
       </w:pPr>
-      <w:bookmarkStart w:id="12" w:name="_Toc243656594"/>
+      <w:bookmarkStart w:id="12" w:name="_Toc243658722"/>
       <w:r>
         <w:lastRenderedPageBreak/>
         <w:t>3 Test environment</w:t>
@@ -7988,7 +8102,7 @@
         <w:pStyle w:val="Caption"/>
         <w:keepNext/>
       </w:pPr>
-      <w:bookmarkStart w:id="13" w:name="_Toc243656611"/>
+      <w:bookmarkStart w:id="13" w:name="_Toc243658739"/>
       <w:r>
         <w:t xml:space="preserve">Table </w:t>
       </w:r>
@@ -8651,13 +8765,10 @@
         <w:keepLines/>
         <w:pageBreakBefore/>
       </w:pPr>
-      <w:bookmarkStart w:id="14" w:name="_Toc243656595"/>
+      <w:bookmarkStart w:id="14" w:name="_Toc243658723"/>
       <w:r>
         <w:lastRenderedPageBreak/>
-        <w:t>4 </w:t>
-      </w:r>
-      <w:r>
-        <w:t>Entry and exit criteria</w:t>
+        <w:t>4 Entry and exit criteria</w:t>
       </w:r>
       <w:bookmarkEnd w:id="14"/>
     </w:p>
@@ -8667,7 +8778,7 @@
         <w:keepNext/>
         <w:keepLines/>
       </w:pPr>
-      <w:bookmarkStart w:id="15" w:name="_Toc243656596"/>
+      <w:bookmarkStart w:id="15" w:name="_Toc243658724"/>
       <w:r>
         <w:t>4.1 Entry criteria</w:t>
       </w:r>
@@ -8687,7 +8798,7 @@
         <w:keepNext/>
         <w:keepLines/>
       </w:pPr>
-      <w:bookmarkStart w:id="16" w:name="_Toc243656597"/>
+      <w:bookmarkStart w:id="16" w:name="_Toc243658725"/>
       <w:r>
         <w:t>4.2 Exit criteria (Definition of Done)</w:t>
       </w:r>
@@ -8895,9 +9006,12 @@
         <w:keepNext/>
         <w:keepLines/>
       </w:pPr>
-      <w:bookmarkStart w:id="17" w:name="_Toc243656598"/>
+      <w:bookmarkStart w:id="17" w:name="_Toc243658726"/>
       <w:r>
-        <w:t>4.3 Suspension and resumption</w:t>
+        <w:t>4.3 </w:t>
+      </w:r>
+      <w:r>
+        <w:t>Suspension and resumption</w:t>
       </w:r>
       <w:bookmarkEnd w:id="17"/>
     </w:p>
@@ -8906,10 +9020,7 @@
         <w:spacing w:after="120"/>
       </w:pPr>
       <w:r>
-        <w:t xml:space="preserve">Testing stops when the test channel itself fails (for example, a local server serving an old build); the </w:t>
-      </w:r>
-      <w:r>
-        <w:t>channel is fixed first, then testing resumes. After one failed fix, the next step is instrumentation, not a second patch.</w:t>
+        <w:t>Testing stops when the test channel itself fails (for example, a local server serving an old build); the channel is fixed first, then testing resumes. After one failed fix, the next step is instrumentation, not a second patch.</w:t>
       </w:r>
     </w:p>
     <w:p>
@@ -8919,7 +9030,7 @@
         <w:keepLines/>
         <w:pageBreakBefore/>
       </w:pPr>
-      <w:bookmarkStart w:id="18" w:name="_Toc243656599"/>
+      <w:bookmarkStart w:id="18" w:name="_Toc243658727"/>
       <w:r>
         <w:lastRenderedPageBreak/>
         <w:t>5 Test items and features</w:t>
@@ -8931,7 +9042,7 @@
         <w:pStyle w:val="Caption"/>
         <w:keepNext/>
       </w:pPr>
-      <w:bookmarkStart w:id="19" w:name="_Toc243656612"/>
+      <w:bookmarkStart w:id="19" w:name="_Toc243658740"/>
       <w:r>
         <w:t xml:space="preserve">Table </w:t>
       </w:r>
@@ -11788,7 +11899,7 @@
         <w:keepLines/>
         <w:pageBreakBefore/>
       </w:pPr>
-      <w:bookmarkStart w:id="20" w:name="_Toc243656600"/>
+      <w:bookmarkStart w:id="20" w:name="_Toc243658728"/>
       <w:r>
         <w:lastRenderedPageBreak/>
         <w:t>6 Test case catalogue</w:t>
@@ -11820,7 +11931,7 @@
         <w:pStyle w:val="Caption"/>
         <w:keepNext/>
       </w:pPr>
-      <w:bookmarkStart w:id="21" w:name="_Toc243656613"/>
+      <w:bookmarkStart w:id="21" w:name="_Toc243658741"/>
       <w:r>
         <w:t xml:space="preserve">Table </w:t>
       </w:r>
@@ -19512,7 +19623,7 @@
                 <w:sz w:val="19"/>
                 <w:szCs w:val="19"/>
               </w:rPr>
-              <w:t xml:space="preserve"> (2)</w:t>
+              <w:t xml:space="preserve"> (3)</w:t>
             </w:r>
           </w:p>
         </w:tc>
@@ -19542,7 +19653,7 @@
                 <w:sz w:val="19"/>
                 <w:szCs w:val="19"/>
               </w:rPr>
-              <w:t>A zero cost is "Free", never "Rs 0"; every route keeps its ISO checked-on date, shown in place of a fixed date</w:t>
+              <w:t>A published zero cost is "Free", never "Rs 0"; an unknown cost is never "Free"; only a maximum or a free place shows "Up to Rs ..."; every route keeps its ISO checked-on date, shown in place of a fixed date</w:t>
             </w:r>
           </w:p>
         </w:tc>
@@ -19583,7 +19694,7 @@
         <w:keepLines/>
         <w:pageBreakBefore/>
       </w:pPr>
-      <w:bookmarkStart w:id="22" w:name="_Toc243656601"/>
+      <w:bookmarkStart w:id="22" w:name="_Toc243658729"/>
       <w:r>
         <w:lastRenderedPageBreak/>
         <w:t>7 Security tests</w:t>
@@ -19595,7 +19706,7 @@
         <w:pStyle w:val="Caption"/>
         <w:keepNext/>
       </w:pPr>
-      <w:bookmarkStart w:id="23" w:name="_Toc243656614"/>
+      <w:bookmarkStart w:id="23" w:name="_Toc243658742"/>
       <w:r>
         <w:t xml:space="preserve">Table </w:t>
       </w:r>
@@ -22138,7 +22249,7 @@
         <w:keepLines/>
         <w:pageBreakBefore/>
       </w:pPr>
-      <w:bookmarkStart w:id="24" w:name="_Toc243656602"/>
+      <w:bookmarkStart w:id="24" w:name="_Toc243658730"/>
       <w:r>
         <w:lastRenderedPageBreak/>
         <w:t>8 Results summary</w:t>
@@ -22170,7 +22281,7 @@
         <w:pStyle w:val="Caption"/>
         <w:keepNext/>
       </w:pPr>
-      <w:bookmarkStart w:id="25" w:name="_Toc243656615"/>
+      <w:bookmarkStart w:id="25" w:name="_Toc243658743"/>
       <w:r>
         <w:t xml:space="preserve">Table </w:t>
       </w:r>
@@ -22960,7 +23071,7 @@
         <w:t xml:space="preserve">Automated test count over the build: 79 (5 October), 126, 152, 164, 179, 185 (11 October), 515 with 6 expected-fail </w:t>
       </w:r>
       <w:r>
-        <w:t>and 21 opt-in (12 to 15 October, after the test campaign and CR-007 to CR-009), 532 with 0 expected-fail and 21 opt-in (15 October, after the hardening of CR-010), 536 (21 October, after VR3 and the desktop side menu, TC-139), 539 (23 October, after VR4, TC-140), 543 (23 October, after CR-011, TC-141), 547 (23 October, after CR-012, TC-142), 549 (23 October, CR-012 revised to guides), 553 (23 October, other paths refreshed, TC-143).</w:t>
+        <w:t>and 21 opt-in (12 to 15 October, after the test campaign and CR-007 to CR-009), 532 with 0 expected-fail and 21 opt-in (15 October, after the hardening of CR-010), 536 (21 October, after VR3 and the desktop side menu, TC-139), 539 (23 October, after VR4, TC-140), 543 (23 October, after CR-011, TC-141), 547 (23 October, after CR-012, TC-142), 549 (23 October, CR-012 revised to guides), 553 (23 October, other paths refreshed, TC-143), 554 (23 October, unknown cost never "Free").</w:t>
       </w:r>
     </w:p>
     <w:p>
@@ -22968,7 +23079,7 @@
         <w:pStyle w:val="Caption"/>
         <w:keepNext/>
       </w:pPr>
-      <w:bookmarkStart w:id="26" w:name="_Toc243656616"/>
+      <w:bookmarkStart w:id="26" w:name="_Toc243658744"/>
       <w:r>
         <w:t xml:space="preserve">Table </w:t>
       </w:r>
@@ -23483,7 +23594,7 @@
         <w:pStyle w:val="Caption"/>
         <w:keepNext/>
       </w:pPr>
-      <w:bookmarkStart w:id="27" w:name="_Toc243656617"/>
+      <w:bookmarkStart w:id="27" w:name="_Toc243658745"/>
       <w:r>
         <w:lastRenderedPageBreak/>
         <w:t xml:space="preserve">Table </w:t>
@@ -24058,7 +24169,7 @@
         <w:keepLines/>
         <w:pageBreakBefore/>
       </w:pPr>
-      <w:bookmarkStart w:id="28" w:name="_Toc243656603"/>
+      <w:bookmarkStart w:id="28" w:name="_Toc243658731"/>
       <w:r>
         <w:lastRenderedPageBreak/>
         <w:t>9 Defects found and fixed</w:t>
@@ -24070,7 +24181,7 @@
         <w:pStyle w:val="Caption"/>
         <w:keepNext/>
       </w:pPr>
-      <w:bookmarkStart w:id="29" w:name="_Toc243656618"/>
+      <w:bookmarkStart w:id="29" w:name="_Toc243658746"/>
       <w:r>
         <w:t xml:space="preserve">Table </w:t>
       </w:r>
@@ -25228,7 +25339,7 @@
         <w:keepLines/>
         <w:pageBreakBefore/>
       </w:pPr>
-      <w:bookmarkStart w:id="30" w:name="_Toc243656604"/>
+      <w:bookmarkStart w:id="30" w:name="_Toc243658732"/>
       <w:r>
         <w:lastRenderedPageBreak/>
         <w:t>10 Known gaps and risks</w:t>
@@ -25240,7 +25351,7 @@
         <w:pStyle w:val="Caption"/>
         <w:keepNext/>
       </w:pPr>
-      <w:bookmarkStart w:id="31" w:name="_Toc243656619"/>
+      <w:bookmarkStart w:id="31" w:name="_Toc243658747"/>
       <w:r>
         <w:t xml:space="preserve">Table </w:t>
       </w:r>
@@ -26505,7 +26616,7 @@
         <w:keepLines/>
         <w:pageBreakBefore/>
       </w:pPr>
-      <w:bookmarkStart w:id="32" w:name="_Toc243656605"/>
+      <w:bookmarkStart w:id="32" w:name="_Toc243658733"/>
       <w:r>
         <w:lastRenderedPageBreak/>
         <w:t>11 Traceability</w:t>
@@ -26525,7 +26636,7 @@
         <w:pStyle w:val="Caption"/>
         <w:keepNext/>
       </w:pPr>
-      <w:bookmarkStart w:id="33" w:name="_Toc243656620"/>
+      <w:bookmarkStart w:id="33" w:name="_Toc243658748"/>
       <w:r>
         <w:t xml:space="preserve">Table </w:t>
       </w:r>
@@ -28394,7 +28505,7 @@
         <w:keepLines/>
         <w:pageBreakBefore/>
       </w:pPr>
-      <w:bookmarkStart w:id="34" w:name="_Toc243656606"/>
+      <w:bookmarkStart w:id="34" w:name="_Toc243658734"/>
       <w:r>
         <w:lastRenderedPageBreak/>
         <w:t>Appendix A: Glossary</w:t>
@@ -28406,7 +28517,7 @@
         <w:pStyle w:val="Caption"/>
         <w:keepNext/>
       </w:pPr>
-      <w:bookmarkStart w:id="35" w:name="_Toc243656621"/>
+      <w:bookmarkStart w:id="35" w:name="_Toc243658749"/>
       <w:r>
         <w:t xml:space="preserve">Table </w:t>
       </w:r>
@@ -29427,7 +29538,7 @@
         <w:keepLines/>
         <w:pageBreakBefore/>
       </w:pPr>
-      <w:bookmarkStart w:id="36" w:name="_Toc243656607"/>
+      <w:bookmarkStart w:id="36" w:name="_Toc243658735"/>
       <w:r>
         <w:lastRenderedPageBreak/>
         <w:t>Appendix B: References</w:t>
@@ -29439,7 +29550,7 @@
         <w:pStyle w:val="Caption"/>
         <w:keepNext/>
       </w:pPr>
-      <w:bookmarkStart w:id="37" w:name="_Toc243656622"/>
+      <w:bookmarkStart w:id="37" w:name="_Toc243658750"/>
       <w:r>
         <w:t xml:space="preserve">Table </w:t>
       </w:r>
@@ -30356,10 +30467,10 @@
 <file path=word/numbering.xml><?xml version="1.0" encoding="utf-8"?>
 <w:numbering xmlns:wpc="http://schemas.microsoft.com/office/word/2010/wordprocessingCanvas" xmlns:cx="http://schemas.microsoft.com/office/drawing/2014/chartex" xmlns:cx1="http://schemas.microsoft.com/office/drawing/2015/9/8/chartex" xmlns:cx2="http://schemas.microsoft.com/office/drawing/2015/10/21/chartex" xmlns:cx3="http://schemas.microsoft.com/office/drawing/2016/5/9/chartex" xmlns:cx4="http://schemas.microsoft.com/office/drawing/2016/5/10/chartex" xmlns:cx5="http://schemas.microsoft.com/office/drawing/2016/5/11/chartex" xmlns:cx6="http://schemas.microsoft.com/office/drawing/2016/5/12/chartex" xmlns:cx7="http://schemas.microsoft.com/office/drawing/2016/5/13/chartex" xmlns:cx8="http://schemas.microsoft.com/office/drawing/2016/5/14/chartex" xmlns:mc="http://schemas.openxmlformats.org/markup-compatibility/2006" xmlns:aink="http://schemas.microsoft.com/office/drawing/2016/ink" xmlns:am3d="http://schemas.microsoft.com/office/drawing/2017/model3d" xmlns:o="urn:schemas-microsoft-com:office:office" xmlns:oel="http://schemas.microsoft.com/office/2019/extlst" xmlns:r="http://schemas.openxmlformats.org/officeDocument/2006/relationships" xmlns:m="http://schemas.openxmlformats.org/officeDocument/2006/math" xmlns:v="urn:schemas-microsoft-com:vml" xmlns:wp14="http://schemas.microsoft.com/office/word/2010/wordprocessingDrawing" xmlns:wp="http://schemas.openxmlformats.org/drawingml/2006/wordprocessingDrawing" xmlns:w10="urn:schemas-microsoft-com:office:word" xmlns:w="http://schemas.openxmlformats.org/wordprocessingml/2006/main" xmlns:w14="http://schemas.microsoft.com/office/word/2010/wordml" xmlns:w15="http://schemas.microsoft.com/office/word/2012/wordml" xmlns:w16cex="http://schemas.microsoft.com/office/word/2018/wordml/cex" xmlns:w16cid="http://schemas.microsoft.com/office/word/2016/wordml/cid" xmlns:w16="http://schemas.microsoft.com/office/word/2018/wordml" xmlns:w16du="http://schemas.microsoft.com/office/word/2023/wordml/word16du" xmlns:w16sdtdh="http://schemas.microsoft.com/office/word/2020/wordml/sdtdatahash" xmlns:w16sdtfl="http://schemas.microsoft.com/office/word/2024/wordml/sdtformatlock" xmlns:w16se="http://schemas.microsoft.com/office/word/2015/wordml/symex" xmlns:wpg="http://schemas.microsoft.com/office/word/2010/wordprocessingGroup" xmlns:wpi="http://schemas.microsoft.com/office/word/2010/wordprocessingInk" xmlns:wne="http://schemas.microsoft.com/office/word/2006/wordml" xmlns:wps="http://schemas.microsoft.com/office/word/2010/wordprocessingShape" mc:Ignorable="w14 w15 w16se w16cid w16 w16cex w16sdtdh w16sdtfl w16du wp14">
   <w:abstractNum w:abstractNumId="0" w15:restartNumberingAfterBreak="0">
-    <w:nsid w:val="0D9C50F4"/>
+    <w:nsid w:val="547B2C68"/>
     <w:multiLevelType w:val="hybridMultilevel"/>
-    <w:tmpl w:val="1898CEA0"/>
-    <w:lvl w:ilvl="0" w:tplc="6C6CFCA0" w:tentative="1">
+    <w:tmpl w:val="43C2CB0E"/>
+    <w:lvl w:ilvl="0" w:tplc="5BE01F74" w:tentative="1">
       <w:start w:val="1"/>
       <w:numFmt w:val="bullet"/>
       <w:lvlText w:val="●"/>
@@ -30368,7 +30479,7 @@
         <w:ind w:left="720" w:hanging="360"/>
       </w:pPr>
     </w:lvl>
-    <w:lvl w:ilvl="1" w:tplc="2112F60E" w:tentative="1">
+    <w:lvl w:ilvl="1" w:tplc="05584214" w:tentative="1">
       <w:start w:val="1"/>
       <w:numFmt w:val="bullet"/>
       <w:lvlText w:val="○"/>
@@ -30377,7 +30488,7 @@
         <w:ind w:left="1440" w:hanging="360"/>
       </w:pPr>
     </w:lvl>
-    <w:lvl w:ilvl="2" w:tplc="1478AD2E" w:tentative="1">
+    <w:lvl w:ilvl="2" w:tplc="5D8298D2" w:tentative="1">
       <w:start w:val="1"/>
       <w:numFmt w:val="bullet"/>
       <w:lvlText w:val="■"/>
@@ -30386,7 +30497,7 @@
         <w:ind w:left="2160" w:hanging="360"/>
       </w:pPr>
     </w:lvl>
-    <w:lvl w:ilvl="3" w:tplc="46C8FAEE" w:tentative="1">
+    <w:lvl w:ilvl="3" w:tplc="19486486" w:tentative="1">
       <w:start w:val="1"/>
       <w:numFmt w:val="bullet"/>
       <w:lvlText w:val="●"/>
@@ -30395,7 +30506,7 @@
         <w:ind w:left="2880" w:hanging="360"/>
       </w:pPr>
     </w:lvl>
-    <w:lvl w:ilvl="4" w:tplc="2966B416" w:tentative="1">
+    <w:lvl w:ilvl="4" w:tplc="E75E7CCA" w:tentative="1">
       <w:start w:val="1"/>
       <w:numFmt w:val="bullet"/>
       <w:lvlText w:val="○"/>
@@ -30404,7 +30515,7 @@
         <w:ind w:left="3600" w:hanging="360"/>
       </w:pPr>
     </w:lvl>
-    <w:lvl w:ilvl="5" w:tplc="5EEACBFC" w:tentative="1">
+    <w:lvl w:ilvl="5" w:tplc="C6D80732" w:tentative="1">
       <w:start w:val="1"/>
       <w:numFmt w:val="bullet"/>
       <w:lvlText w:val="■"/>
@@ -30413,7 +30524,7 @@
         <w:ind w:left="4320" w:hanging="360"/>
       </w:pPr>
     </w:lvl>
-    <w:lvl w:ilvl="6" w:tplc="3250B486" w:tentative="1">
+    <w:lvl w:ilvl="6" w:tplc="56D8091C" w:tentative="1">
       <w:start w:val="1"/>
       <w:numFmt w:val="bullet"/>
       <w:lvlText w:val="●"/>
@@ -30422,7 +30533,7 @@
         <w:ind w:left="5040" w:hanging="360"/>
       </w:pPr>
     </w:lvl>
-    <w:lvl w:ilvl="7" w:tplc="02FCBE4E" w:tentative="1">
+    <w:lvl w:ilvl="7" w:tplc="D9ECCD56" w:tentative="1">
       <w:start w:val="1"/>
       <w:numFmt w:val="bullet"/>
       <w:lvlText w:val="●"/>
@@ -30431,7 +30542,7 @@
         <w:ind w:left="5760" w:hanging="360"/>
       </w:pPr>
     </w:lvl>
-    <w:lvl w:ilvl="8" w:tplc="706E92DA" w:tentative="1">
+    <w:lvl w:ilvl="8" w:tplc="F5348CE6" w:tentative="1">
       <w:start w:val="1"/>
       <w:numFmt w:val="bullet"/>
       <w:lvlText w:val="●"/>
@@ -30442,10 +30553,72 @@
     </w:lvl>
   </w:abstractNum>
   <w:abstractNum w:abstractNumId="1" w15:restartNumberingAfterBreak="0">
-    <w:nsid w:val="1ED625AD"/>
+    <w:nsid w:val="5EAF3097"/>
     <w:multiLevelType w:val="hybridMultilevel"/>
-    <w:tmpl w:val="1D4E9974"/>
-    <w:lvl w:ilvl="0" w:tplc="819A954E">
+    <w:tmpl w:val="A01CFA46"/>
+    <w:lvl w:ilvl="0" w:tplc="1A2EAD0C" w:tentative="1">
+      <w:start w:val="1"/>
+      <w:numFmt w:val="bullet"/>
+      <w:lvlText w:val="•"/>
+      <w:lvlJc w:val="left"/>
+      <w:pPr>
+        <w:ind w:left="720" w:hanging="280"/>
+      </w:pPr>
+    </w:lvl>
+    <w:lvl w:ilvl="1" w:tplc="44F49074" w:tentative="1">
+      <w:start w:val="1"/>
+      <w:numFmt w:val="bullet"/>
+      <w:lvlText w:val="–"/>
+      <w:lvlJc w:val="left"/>
+      <w:pPr>
+        <w:ind w:left="1080" w:hanging="280"/>
+      </w:pPr>
+    </w:lvl>
+    <w:lvl w:ilvl="2" w:tplc="3F4A4BE2" w:tentative="1">
+      <w:start w:val="1"/>
+      <w:numFmt w:val="bullet"/>
+      <w:lvlText w:val="▪"/>
+      <w:lvlJc w:val="left"/>
+      <w:pPr>
+        <w:ind w:left="1440" w:hanging="280"/>
+      </w:pPr>
+    </w:lvl>
+    <w:lvl w:ilvl="3" w:tplc="9224D866">
+      <w:numFmt w:val="decimal"/>
+      <w:lvlText w:val=""/>
+      <w:lvlJc w:val="left"/>
+    </w:lvl>
+    <w:lvl w:ilvl="4" w:tplc="67B8906A">
+      <w:numFmt w:val="decimal"/>
+      <w:lvlText w:val=""/>
+      <w:lvlJc w:val="left"/>
+    </w:lvl>
+    <w:lvl w:ilvl="5" w:tplc="A37661A6">
+      <w:numFmt w:val="decimal"/>
+      <w:lvlText w:val=""/>
+      <w:lvlJc w:val="left"/>
+    </w:lvl>
+    <w:lvl w:ilvl="6" w:tplc="B31CE6C4">
+      <w:numFmt w:val="decimal"/>
+      <w:lvlText w:val=""/>
+      <w:lvlJc w:val="left"/>
+    </w:lvl>
+    <w:lvl w:ilvl="7" w:tplc="8B6AF18C">
+      <w:numFmt w:val="decimal"/>
+      <w:lvlText w:val=""/>
+      <w:lvlJc w:val="left"/>
+    </w:lvl>
+    <w:lvl w:ilvl="8" w:tplc="38D4881C">
+      <w:numFmt w:val="decimal"/>
+      <w:lvlText w:val=""/>
+      <w:lvlJc w:val="left"/>
+    </w:lvl>
+  </w:abstractNum>
+  <w:abstractNum w:abstractNumId="2" w15:restartNumberingAfterBreak="0">
+    <w:nsid w:val="7D475A7B"/>
+    <w:multiLevelType w:val="hybridMultilevel"/>
+    <w:tmpl w:val="CCA0A228"/>
+    <w:lvl w:ilvl="0" w:tplc="74BA70CE">
       <w:start w:val="1"/>
       <w:numFmt w:val="decimal"/>
       <w:lvlText w:val="%1."/>
@@ -30454,7 +30627,7 @@
         <w:ind w:left="720" w:hanging="360"/>
       </w:pPr>
     </w:lvl>
-    <w:lvl w:ilvl="1" w:tplc="5AAE2CAA" w:tentative="1">
+    <w:lvl w:ilvl="1" w:tplc="03867380" w:tentative="1">
       <w:start w:val="1"/>
       <w:numFmt w:val="lowerLetter"/>
       <w:lvlText w:val="%2."/>
@@ -30463,7 +30636,7 @@
         <w:ind w:left="1080" w:hanging="360"/>
       </w:pPr>
     </w:lvl>
-    <w:lvl w:ilvl="2" w:tplc="FA4CD41C" w:tentative="1">
+    <w:lvl w:ilvl="2" w:tplc="6658B5F8" w:tentative="1">
       <w:start w:val="1"/>
       <w:numFmt w:val="lowerRoman"/>
       <w:lvlText w:val="%3."/>
@@ -30472,107 +30645,45 @@
         <w:ind w:left="1440" w:hanging="360"/>
       </w:pPr>
     </w:lvl>
-    <w:lvl w:ilvl="3" w:tplc="BAA0FBBE">
+    <w:lvl w:ilvl="3" w:tplc="57C6D288">
       <w:numFmt w:val="decimal"/>
       <w:lvlText w:val=""/>
       <w:lvlJc w:val="left"/>
     </w:lvl>
-    <w:lvl w:ilvl="4" w:tplc="692066AA">
+    <w:lvl w:ilvl="4" w:tplc="2F1487AA">
       <w:numFmt w:val="decimal"/>
       <w:lvlText w:val=""/>
       <w:lvlJc w:val="left"/>
     </w:lvl>
-    <w:lvl w:ilvl="5" w:tplc="E5741050">
+    <w:lvl w:ilvl="5" w:tplc="ED36D72E">
       <w:numFmt w:val="decimal"/>
       <w:lvlText w:val=""/>
       <w:lvlJc w:val="left"/>
     </w:lvl>
-    <w:lvl w:ilvl="6" w:tplc="5350A190">
+    <w:lvl w:ilvl="6" w:tplc="B5C82BBC">
       <w:numFmt w:val="decimal"/>
       <w:lvlText w:val=""/>
       <w:lvlJc w:val="left"/>
     </w:lvl>
-    <w:lvl w:ilvl="7" w:tplc="95B8185E">
+    <w:lvl w:ilvl="7" w:tplc="37EA758A">
       <w:numFmt w:val="decimal"/>
       <w:lvlText w:val=""/>
       <w:lvlJc w:val="left"/>
     </w:lvl>
-    <w:lvl w:ilvl="8" w:tplc="3774DDCA">
+    <w:lvl w:ilvl="8" w:tplc="A5542C62">
       <w:numFmt w:val="decimal"/>
       <w:lvlText w:val=""/>
       <w:lvlJc w:val="left"/>
     </w:lvl>
   </w:abstractNum>
-  <w:abstractNum w:abstractNumId="2" w15:restartNumberingAfterBreak="0">
-    <w:nsid w:val="69E13278"/>
-    <w:multiLevelType w:val="hybridMultilevel"/>
-    <w:tmpl w:val="BF8E61FC"/>
-    <w:lvl w:ilvl="0" w:tplc="85045A46" w:tentative="1">
-      <w:start w:val="1"/>
-      <w:numFmt w:val="bullet"/>
-      <w:lvlText w:val="•"/>
-      <w:lvlJc w:val="left"/>
-      <w:pPr>
-        <w:ind w:left="720" w:hanging="280"/>
-      </w:pPr>
-    </w:lvl>
-    <w:lvl w:ilvl="1" w:tplc="BA54A5B8" w:tentative="1">
-      <w:start w:val="1"/>
-      <w:numFmt w:val="bullet"/>
-      <w:lvlText w:val="–"/>
-      <w:lvlJc w:val="left"/>
-      <w:pPr>
-        <w:ind w:left="1080" w:hanging="280"/>
-      </w:pPr>
-    </w:lvl>
-    <w:lvl w:ilvl="2" w:tplc="0B4808D4" w:tentative="1">
-      <w:start w:val="1"/>
-      <w:numFmt w:val="bullet"/>
-      <w:lvlText w:val="▪"/>
-      <w:lvlJc w:val="left"/>
-      <w:pPr>
-        <w:ind w:left="1440" w:hanging="280"/>
-      </w:pPr>
-    </w:lvl>
-    <w:lvl w:ilvl="3" w:tplc="21481010">
-      <w:numFmt w:val="decimal"/>
-      <w:lvlText w:val=""/>
-      <w:lvlJc w:val="left"/>
-    </w:lvl>
-    <w:lvl w:ilvl="4" w:tplc="B468AD68">
-      <w:numFmt w:val="decimal"/>
-      <w:lvlText w:val=""/>
-      <w:lvlJc w:val="left"/>
-    </w:lvl>
-    <w:lvl w:ilvl="5" w:tplc="1A266FA0">
-      <w:numFmt w:val="decimal"/>
-      <w:lvlText w:val=""/>
-      <w:lvlJc w:val="left"/>
-    </w:lvl>
-    <w:lvl w:ilvl="6" w:tplc="CAEA114E">
-      <w:numFmt w:val="decimal"/>
-      <w:lvlText w:val=""/>
-      <w:lvlJc w:val="left"/>
-    </w:lvl>
-    <w:lvl w:ilvl="7" w:tplc="295E75E8">
-      <w:numFmt w:val="decimal"/>
-      <w:lvlText w:val=""/>
-      <w:lvlJc w:val="left"/>
-    </w:lvl>
-    <w:lvl w:ilvl="8" w:tplc="B10A7492">
-      <w:numFmt w:val="decimal"/>
-      <w:lvlText w:val=""/>
-      <w:lvlJc w:val="left"/>
-    </w:lvl>
-  </w:abstractNum>
-  <w:num w:numId="1" w16cid:durableId="1575626722">
+  <w:num w:numId="1" w16cid:durableId="1156530546">
     <w:abstractNumId w:val="0"/>
     <w:lvlOverride w:ilvl="0">
       <w:startOverride w:val="1"/>
     </w:lvlOverride>
   </w:num>
-  <w:num w:numId="2" w16cid:durableId="1483236105">
-    <w:abstractNumId w:val="1"/>
+  <w:num w:numId="2" w16cid:durableId="1063522223">
+    <w:abstractNumId w:val="2"/>
     <w:lvlOverride w:ilvl="0">
       <w:startOverride w:val="1"/>
     </w:lvlOverride>
@@ -31276,7 +31387,7 @@
     <w:autoRedefine/>
     <w:uiPriority w:val="39"/>
     <w:unhideWhenUsed/>
-    <w:rsid w:val="0013547D"/>
+    <w:rsid w:val="00E230CC"/>
     <w:pPr>
       <w:spacing w:after="100"/>
     </w:pPr>
@@ -31288,7 +31399,7 @@
     <w:autoRedefine/>
     <w:uiPriority w:val="39"/>
     <w:unhideWhenUsed/>
-    <w:rsid w:val="0013547D"/>
+    <w:rsid w:val="00E230CC"/>
     <w:pPr>
       <w:spacing w:after="100"/>
       <w:ind w:left="210"/>
@@ -31300,7 +31411,7 @@
     <w:next w:val="Normal"/>
     <w:uiPriority w:val="99"/>
     <w:unhideWhenUsed/>
-    <w:rsid w:val="0013547D"/>
+    <w:rsid w:val="00E230CC"/>
   </w:style>
 </w:styles>
 </file>

</xml_diff>

<commit_message>
Career-mode test: imports adjusted for its new place next to the Worker tests; ZP-DOC-08 path updated
Co-Authored-By: Claude Opus 5.5 (1M context) <noreply@anthropic.com>
</commit_message>
<xml_diff>
--- a/docs/08-test-plan/ZP-DOC-08_Test-Plan.docx
+++ b/docs/08-test-plan/ZP-DOC-08_Test-Plan.docx
@@ -3243,7 +3243,7 @@
     <w:sdt>
       <w:sdtPr>
         <w:alias w:val="Contents"/>
-        <w:id w:val="1338039116"/>
+        <w:id w:val="-1346783939"/>
       </w:sdtPr>
       <w:sdtEndPr/>
       <w:sdtContent>
@@ -3272,7 +3272,7 @@
           <w:r>
             <w:fldChar w:fldCharType="separate"/>
           </w:r>
-          <w:hyperlink w:anchor="_Toc243668332" w:history="1">
+          <w:hyperlink w:anchor="_Toc243669434" w:history="1">
             <w:r>
               <w:rPr>
                 <w:rStyle w:val="Hyperlink"/>
@@ -3296,7 +3296,7 @@
               <w:rPr>
                 <w:noProof/>
               </w:rPr>
-              <w:instrText xml:space="preserve"> PAGEREF _Toc243668332 \h </w:instrText>
+              <w:instrText xml:space="preserve"> PAGEREF _Toc243669434 \h </w:instrText>
             </w:r>
             <w:r>
               <w:rPr>
@@ -3339,7 +3339,7 @@
               <w14:ligatures w14:val="standardContextual"/>
             </w:rPr>
           </w:pPr>
-          <w:hyperlink w:anchor="_Toc243668333" w:history="1">
+          <w:hyperlink w:anchor="_Toc243669435" w:history="1">
             <w:r>
               <w:rPr>
                 <w:rStyle w:val="Hyperlink"/>
@@ -3363,7 +3363,7 @@
               <w:rPr>
                 <w:noProof/>
               </w:rPr>
-              <w:instrText xml:space="preserve"> PAGEREF _Toc243668333 \h </w:instrText>
+              <w:instrText xml:space="preserve"> PAGEREF _Toc243669435 \h </w:instrText>
             </w:r>
             <w:r>
               <w:rPr>
@@ -3406,7 +3406,7 @@
               <w14:ligatures w14:val="standardContextual"/>
             </w:rPr>
           </w:pPr>
-          <w:hyperlink w:anchor="_Toc243668334" w:history="1">
+          <w:hyperlink w:anchor="_Toc243669436" w:history="1">
             <w:r>
               <w:rPr>
                 <w:rStyle w:val="Hyperlink"/>
@@ -3430,7 +3430,7 @@
               <w:rPr>
                 <w:noProof/>
               </w:rPr>
-              <w:instrText xml:space="preserve"> PAGEREF _Toc243668334 \h </w:instrText>
+              <w:instrText xml:space="preserve"> PAGEREF _Toc243669436 \h </w:instrText>
             </w:r>
             <w:r>
               <w:rPr>
@@ -3473,7 +3473,7 @@
               <w14:ligatures w14:val="standardContextual"/>
             </w:rPr>
           </w:pPr>
-          <w:hyperlink w:anchor="_Toc243668335" w:history="1">
+          <w:hyperlink w:anchor="_Toc243669437" w:history="1">
             <w:r>
               <w:rPr>
                 <w:rStyle w:val="Hyperlink"/>
@@ -3497,7 +3497,7 @@
               <w:rPr>
                 <w:noProof/>
               </w:rPr>
-              <w:instrText xml:space="preserve"> PAGEREF _Toc243668335 \h </w:instrText>
+              <w:instrText xml:space="preserve"> PAGEREF _Toc243669437 \h </w:instrText>
             </w:r>
             <w:r>
               <w:rPr>
@@ -3540,7 +3540,7 @@
               <w14:ligatures w14:val="standardContextual"/>
             </w:rPr>
           </w:pPr>
-          <w:hyperlink w:anchor="_Toc243668336" w:history="1">
+          <w:hyperlink w:anchor="_Toc243669438" w:history="1">
             <w:r>
               <w:rPr>
                 <w:rStyle w:val="Hyperlink"/>
@@ -3564,7 +3564,7 @@
               <w:rPr>
                 <w:noProof/>
               </w:rPr>
-              <w:instrText xml:space="preserve"> PAGEREF _Toc243668336 \h </w:instrText>
+              <w:instrText xml:space="preserve"> PAGEREF _Toc243669438 \h </w:instrText>
             </w:r>
             <w:r>
               <w:rPr>
@@ -3607,7 +3607,7 @@
               <w14:ligatures w14:val="standardContextual"/>
             </w:rPr>
           </w:pPr>
-          <w:hyperlink w:anchor="_Toc243668337" w:history="1">
+          <w:hyperlink w:anchor="_Toc243669439" w:history="1">
             <w:r>
               <w:rPr>
                 <w:rStyle w:val="Hyperlink"/>
@@ -3631,7 +3631,7 @@
               <w:rPr>
                 <w:noProof/>
               </w:rPr>
-              <w:instrText xml:space="preserve"> PAGEREF _Toc243668337 \h </w:instrText>
+              <w:instrText xml:space="preserve"> PAGEREF _Toc243669439 \h </w:instrText>
             </w:r>
             <w:r>
               <w:rPr>
@@ -3674,7 +3674,7 @@
               <w14:ligatures w14:val="standardContextual"/>
             </w:rPr>
           </w:pPr>
-          <w:hyperlink w:anchor="_Toc243668338" w:history="1">
+          <w:hyperlink w:anchor="_Toc243669440" w:history="1">
             <w:r>
               <w:rPr>
                 <w:rStyle w:val="Hyperlink"/>
@@ -3698,7 +3698,7 @@
               <w:rPr>
                 <w:noProof/>
               </w:rPr>
-              <w:instrText xml:space="preserve"> PAGEREF _Toc243668338 \h </w:instrText>
+              <w:instrText xml:space="preserve"> PAGEREF _Toc243669440 \h </w:instrText>
             </w:r>
             <w:r>
               <w:rPr>
@@ -3741,7 +3741,7 @@
               <w14:ligatures w14:val="standardContextual"/>
             </w:rPr>
           </w:pPr>
-          <w:hyperlink w:anchor="_Toc243668339" w:history="1">
+          <w:hyperlink w:anchor="_Toc243669441" w:history="1">
             <w:r>
               <w:rPr>
                 <w:rStyle w:val="Hyperlink"/>
@@ -3765,7 +3765,7 @@
               <w:rPr>
                 <w:noProof/>
               </w:rPr>
-              <w:instrText xml:space="preserve"> PAGEREF _Toc243668339 \h </w:instrText>
+              <w:instrText xml:space="preserve"> PAGEREF _Toc243669441 \h </w:instrText>
             </w:r>
             <w:r>
               <w:rPr>
@@ -3808,7 +3808,7 @@
               <w14:ligatures w14:val="standardContextual"/>
             </w:rPr>
           </w:pPr>
-          <w:hyperlink w:anchor="_Toc243668340" w:history="1">
+          <w:hyperlink w:anchor="_Toc243669442" w:history="1">
             <w:r>
               <w:rPr>
                 <w:rStyle w:val="Hyperlink"/>
@@ -3832,7 +3832,7 @@
               <w:rPr>
                 <w:noProof/>
               </w:rPr>
-              <w:instrText xml:space="preserve"> PAGEREF _Toc243668340 \h </w:instrText>
+              <w:instrText xml:space="preserve"> PAGEREF _Toc243669442 \h </w:instrText>
             </w:r>
             <w:r>
               <w:rPr>
@@ -3875,7 +3875,7 @@
               <w14:ligatures w14:val="standardContextual"/>
             </w:rPr>
           </w:pPr>
-          <w:hyperlink w:anchor="_Toc243668341" w:history="1">
+          <w:hyperlink w:anchor="_Toc243669443" w:history="1">
             <w:r>
               <w:rPr>
                 <w:rStyle w:val="Hyperlink"/>
@@ -3899,7 +3899,7 @@
               <w:rPr>
                 <w:noProof/>
               </w:rPr>
-              <w:instrText xml:space="preserve"> PAGEREF _Toc243668341 \h </w:instrText>
+              <w:instrText xml:space="preserve"> PAGEREF _Toc243669443 \h </w:instrText>
             </w:r>
             <w:r>
               <w:rPr>
@@ -3942,7 +3942,7 @@
               <w14:ligatures w14:val="standardContextual"/>
             </w:rPr>
           </w:pPr>
-          <w:hyperlink w:anchor="_Toc243668342" w:history="1">
+          <w:hyperlink w:anchor="_Toc243669444" w:history="1">
             <w:r>
               <w:rPr>
                 <w:rStyle w:val="Hyperlink"/>
@@ -3966,7 +3966,7 @@
               <w:rPr>
                 <w:noProof/>
               </w:rPr>
-              <w:instrText xml:space="preserve"> PAGEREF _Toc243668342 \h </w:instrText>
+              <w:instrText xml:space="preserve"> PAGEREF _Toc243669444 \h </w:instrText>
             </w:r>
             <w:r>
               <w:rPr>
@@ -4009,7 +4009,7 @@
               <w14:ligatures w14:val="standardContextual"/>
             </w:rPr>
           </w:pPr>
-          <w:hyperlink w:anchor="_Toc243668343" w:history="1">
+          <w:hyperlink w:anchor="_Toc243669445" w:history="1">
             <w:r>
               <w:rPr>
                 <w:rStyle w:val="Hyperlink"/>
@@ -4033,7 +4033,7 @@
               <w:rPr>
                 <w:noProof/>
               </w:rPr>
-              <w:instrText xml:space="preserve"> PAGEREF _Toc243668343 \h </w:instrText>
+              <w:instrText xml:space="preserve"> PAGEREF _Toc243669445 \h </w:instrText>
             </w:r>
             <w:r>
               <w:rPr>
@@ -4076,7 +4076,7 @@
               <w14:ligatures w14:val="standardContextual"/>
             </w:rPr>
           </w:pPr>
-          <w:hyperlink w:anchor="_Toc243668344" w:history="1">
+          <w:hyperlink w:anchor="_Toc243669446" w:history="1">
             <w:r>
               <w:rPr>
                 <w:rStyle w:val="Hyperlink"/>
@@ -4100,7 +4100,7 @@
               <w:rPr>
                 <w:noProof/>
               </w:rPr>
-              <w:instrText xml:space="preserve"> PAGEREF _Toc243668344 \h </w:instrText>
+              <w:instrText xml:space="preserve"> PAGEREF _Toc243669446 \h </w:instrText>
             </w:r>
             <w:r>
               <w:rPr>
@@ -4143,7 +4143,7 @@
               <w14:ligatures w14:val="standardContextual"/>
             </w:rPr>
           </w:pPr>
-          <w:hyperlink w:anchor="_Toc243668345" w:history="1">
+          <w:hyperlink w:anchor="_Toc243669447" w:history="1">
             <w:r>
               <w:rPr>
                 <w:rStyle w:val="Hyperlink"/>
@@ -4167,7 +4167,7 @@
               <w:rPr>
                 <w:noProof/>
               </w:rPr>
-              <w:instrText xml:space="preserve"> PAGEREF _Toc243668345 \h </w:instrText>
+              <w:instrText xml:space="preserve"> PAGEREF _Toc243669447 \h </w:instrText>
             </w:r>
             <w:r>
               <w:rPr>
@@ -4210,7 +4210,7 @@
               <w14:ligatures w14:val="standardContextual"/>
             </w:rPr>
           </w:pPr>
-          <w:hyperlink w:anchor="_Toc243668346" w:history="1">
+          <w:hyperlink w:anchor="_Toc243669448" w:history="1">
             <w:r>
               <w:rPr>
                 <w:rStyle w:val="Hyperlink"/>
@@ -4234,7 +4234,7 @@
               <w:rPr>
                 <w:noProof/>
               </w:rPr>
-              <w:instrText xml:space="preserve"> PAGEREF _Toc243668346 \h </w:instrText>
+              <w:instrText xml:space="preserve"> PAGEREF _Toc243669448 \h </w:instrText>
             </w:r>
             <w:r>
               <w:rPr>
@@ -4277,7 +4277,7 @@
               <w14:ligatures w14:val="standardContextual"/>
             </w:rPr>
           </w:pPr>
-          <w:hyperlink w:anchor="_Toc243668347" w:history="1">
+          <w:hyperlink w:anchor="_Toc243669449" w:history="1">
             <w:r>
               <w:rPr>
                 <w:rStyle w:val="Hyperlink"/>
@@ -4301,7 +4301,7 @@
               <w:rPr>
                 <w:noProof/>
               </w:rPr>
-              <w:instrText xml:space="preserve"> PAGEREF _Toc243668347 \h </w:instrText>
+              <w:instrText xml:space="preserve"> PAGEREF _Toc243669449 \h </w:instrText>
             </w:r>
             <w:r>
               <w:rPr>
@@ -4344,7 +4344,7 @@
               <w14:ligatures w14:val="standardContextual"/>
             </w:rPr>
           </w:pPr>
-          <w:hyperlink w:anchor="_Toc243668348" w:history="1">
+          <w:hyperlink w:anchor="_Toc243669450" w:history="1">
             <w:r>
               <w:rPr>
                 <w:rStyle w:val="Hyperlink"/>
@@ -4368,7 +4368,7 @@
               <w:rPr>
                 <w:noProof/>
               </w:rPr>
-              <w:instrText xml:space="preserve"> PAGEREF _Toc243668348 \h </w:instrText>
+              <w:instrText xml:space="preserve"> PAGEREF _Toc243669450 \h </w:instrText>
             </w:r>
             <w:r>
               <w:rPr>
@@ -4411,7 +4411,7 @@
               <w14:ligatures w14:val="standardContextual"/>
             </w:rPr>
           </w:pPr>
-          <w:hyperlink w:anchor="_Toc243668349" w:history="1">
+          <w:hyperlink w:anchor="_Toc243669451" w:history="1">
             <w:r>
               <w:rPr>
                 <w:rStyle w:val="Hyperlink"/>
@@ -4435,7 +4435,7 @@
               <w:rPr>
                 <w:noProof/>
               </w:rPr>
-              <w:instrText xml:space="preserve"> PAGEREF _Toc243668349 \h </w:instrText>
+              <w:instrText xml:space="preserve"> PAGEREF _Toc243669451 \h </w:instrText>
             </w:r>
             <w:r>
               <w:rPr>
@@ -4478,7 +4478,7 @@
               <w14:ligatures w14:val="standardContextual"/>
             </w:rPr>
           </w:pPr>
-          <w:hyperlink w:anchor="_Toc243668350" w:history="1">
+          <w:hyperlink w:anchor="_Toc243669452" w:history="1">
             <w:r>
               <w:rPr>
                 <w:rStyle w:val="Hyperlink"/>
@@ -4502,7 +4502,7 @@
               <w:rPr>
                 <w:noProof/>
               </w:rPr>
-              <w:instrText xml:space="preserve"> PAGEREF _Toc243668350 \h </w:instrText>
+              <w:instrText xml:space="preserve"> PAGEREF _Toc243669452 \h </w:instrText>
             </w:r>
             <w:r>
               <w:rPr>
@@ -4545,7 +4545,7 @@
               <w14:ligatures w14:val="standardContextual"/>
             </w:rPr>
           </w:pPr>
-          <w:hyperlink w:anchor="_Toc243668351" w:history="1">
+          <w:hyperlink w:anchor="_Toc243669453" w:history="1">
             <w:r>
               <w:rPr>
                 <w:rStyle w:val="Hyperlink"/>
@@ -4569,7 +4569,7 @@
               <w:rPr>
                 <w:noProof/>
               </w:rPr>
-              <w:instrText xml:space="preserve"> PAGEREF _Toc243668351 \h </w:instrText>
+              <w:instrText xml:space="preserve"> PAGEREF _Toc243669453 \h </w:instrText>
             </w:r>
             <w:r>
               <w:rPr>
@@ -4612,7 +4612,7 @@
               <w14:ligatures w14:val="standardContextual"/>
             </w:rPr>
           </w:pPr>
-          <w:hyperlink w:anchor="_Toc243668352" w:history="1">
+          <w:hyperlink w:anchor="_Toc243669454" w:history="1">
             <w:r>
               <w:rPr>
                 <w:rStyle w:val="Hyperlink"/>
@@ -4636,7 +4636,7 @@
               <w:rPr>
                 <w:noProof/>
               </w:rPr>
-              <w:instrText xml:space="preserve"> PAGEREF _Toc243668352 \h </w:instrText>
+              <w:instrText xml:space="preserve"> PAGEREF _Toc243669454 \h </w:instrText>
             </w:r>
             <w:r>
               <w:rPr>
@@ -4679,7 +4679,7 @@
               <w14:ligatures w14:val="standardContextual"/>
             </w:rPr>
           </w:pPr>
-          <w:hyperlink w:anchor="_Toc243668353" w:history="1">
+          <w:hyperlink w:anchor="_Toc243669455" w:history="1">
             <w:r>
               <w:rPr>
                 <w:rStyle w:val="Hyperlink"/>
@@ -4703,7 +4703,7 @@
               <w:rPr>
                 <w:noProof/>
               </w:rPr>
-              <w:instrText xml:space="preserve"> PAGEREF _Toc243668353 \h </w:instrText>
+              <w:instrText xml:space="preserve"> PAGEREF _Toc243669455 \h </w:instrText>
             </w:r>
             <w:r>
               <w:rPr>
@@ -4746,7 +4746,7 @@
               <w14:ligatures w14:val="standardContextual"/>
             </w:rPr>
           </w:pPr>
-          <w:hyperlink w:anchor="_Toc243668354" w:history="1">
+          <w:hyperlink w:anchor="_Toc243669456" w:history="1">
             <w:r>
               <w:rPr>
                 <w:rStyle w:val="Hyperlink"/>
@@ -4770,7 +4770,7 @@
               <w:rPr>
                 <w:noProof/>
               </w:rPr>
-              <w:instrText xml:space="preserve"> PAGEREF _Toc243668354 \h </w:instrText>
+              <w:instrText xml:space="preserve"> PAGEREF _Toc243669456 \h </w:instrText>
             </w:r>
             <w:r>
               <w:rPr>
@@ -4816,7 +4816,7 @@
     <w:sdt>
       <w:sdtPr>
         <w:alias w:val="Tables"/>
-        <w:id w:val="1808122942"/>
+        <w:id w:val="1364630050"/>
       </w:sdtPr>
       <w:sdtEndPr/>
       <w:sdtContent>
@@ -4845,7 +4845,7 @@
           <w:r>
             <w:fldChar w:fldCharType="separate"/>
           </w:r>
-          <w:hyperlink w:anchor="_Toc243668355" w:history="1">
+          <w:hyperlink w:anchor="_Toc243669457" w:history="1">
             <w:r>
               <w:rPr>
                 <w:rStyle w:val="Hyperlink"/>
@@ -4869,7 +4869,7 @@
               <w:rPr>
                 <w:noProof/>
               </w:rPr>
-              <w:instrText xml:space="preserve"> PAGEREF _Toc243668355 \h </w:instrText>
+              <w:instrText xml:space="preserve"> PAGEREF _Toc243669457 \h </w:instrText>
             </w:r>
             <w:r>
               <w:rPr>
@@ -4912,7 +4912,7 @@
               <w14:ligatures w14:val="standardContextual"/>
             </w:rPr>
           </w:pPr>
-          <w:hyperlink w:anchor="_Toc243668356" w:history="1">
+          <w:hyperlink w:anchor="_Toc243669458" w:history="1">
             <w:r>
               <w:rPr>
                 <w:rStyle w:val="Hyperlink"/>
@@ -4936,7 +4936,7 @@
               <w:rPr>
                 <w:noProof/>
               </w:rPr>
-              <w:instrText xml:space="preserve"> PAGEREF _Toc243668356 \h </w:instrText>
+              <w:instrText xml:space="preserve"> PAGEREF _Toc243669458 \h </w:instrText>
             </w:r>
             <w:r>
               <w:rPr>
@@ -4979,7 +4979,7 @@
               <w14:ligatures w14:val="standardContextual"/>
             </w:rPr>
           </w:pPr>
-          <w:hyperlink w:anchor="_Toc243668357" w:history="1">
+          <w:hyperlink w:anchor="_Toc243669459" w:history="1">
             <w:r>
               <w:rPr>
                 <w:rStyle w:val="Hyperlink"/>
@@ -5003,7 +5003,7 @@
               <w:rPr>
                 <w:noProof/>
               </w:rPr>
-              <w:instrText xml:space="preserve"> PAGEREF _Toc243668357 \h </w:instrText>
+              <w:instrText xml:space="preserve"> PAGEREF _Toc243669459 \h </w:instrText>
             </w:r>
             <w:r>
               <w:rPr>
@@ -5046,7 +5046,7 @@
               <w14:ligatures w14:val="standardContextual"/>
             </w:rPr>
           </w:pPr>
-          <w:hyperlink w:anchor="_Toc243668358" w:history="1">
+          <w:hyperlink w:anchor="_Toc243669460" w:history="1">
             <w:r>
               <w:rPr>
                 <w:rStyle w:val="Hyperlink"/>
@@ -5070,7 +5070,7 @@
               <w:rPr>
                 <w:noProof/>
               </w:rPr>
-              <w:instrText xml:space="preserve"> PAGEREF _Toc243668358 \h </w:instrText>
+              <w:instrText xml:space="preserve"> PAGEREF _Toc243669460 \h </w:instrText>
             </w:r>
             <w:r>
               <w:rPr>
@@ -5113,7 +5113,7 @@
               <w14:ligatures w14:val="standardContextual"/>
             </w:rPr>
           </w:pPr>
-          <w:hyperlink w:anchor="_Toc243668359" w:history="1">
+          <w:hyperlink w:anchor="_Toc243669461" w:history="1">
             <w:r>
               <w:rPr>
                 <w:rStyle w:val="Hyperlink"/>
@@ -5137,7 +5137,7 @@
               <w:rPr>
                 <w:noProof/>
               </w:rPr>
-              <w:instrText xml:space="preserve"> PAGEREF _Toc243668359 \h </w:instrText>
+              <w:instrText xml:space="preserve"> PAGEREF _Toc243669461 \h </w:instrText>
             </w:r>
             <w:r>
               <w:rPr>
@@ -5180,7 +5180,7 @@
               <w14:ligatures w14:val="standardContextual"/>
             </w:rPr>
           </w:pPr>
-          <w:hyperlink w:anchor="_Toc243668360" w:history="1">
+          <w:hyperlink w:anchor="_Toc243669462" w:history="1">
             <w:r>
               <w:rPr>
                 <w:rStyle w:val="Hyperlink"/>
@@ -5204,7 +5204,7 @@
               <w:rPr>
                 <w:noProof/>
               </w:rPr>
-              <w:instrText xml:space="preserve"> PAGEREF _Toc243668360 \h </w:instrText>
+              <w:instrText xml:space="preserve"> PAGEREF _Toc243669462 \h </w:instrText>
             </w:r>
             <w:r>
               <w:rPr>
@@ -5247,7 +5247,7 @@
               <w14:ligatures w14:val="standardContextual"/>
             </w:rPr>
           </w:pPr>
-          <w:hyperlink w:anchor="_Toc243668361" w:history="1">
+          <w:hyperlink w:anchor="_Toc243669463" w:history="1">
             <w:r>
               <w:rPr>
                 <w:rStyle w:val="Hyperlink"/>
@@ -5271,7 +5271,7 @@
               <w:rPr>
                 <w:noProof/>
               </w:rPr>
-              <w:instrText xml:space="preserve"> PAGEREF _Toc243668361 \h </w:instrText>
+              <w:instrText xml:space="preserve"> PAGEREF _Toc243669463 \h </w:instrText>
             </w:r>
             <w:r>
               <w:rPr>
@@ -5314,7 +5314,7 @@
               <w14:ligatures w14:val="standardContextual"/>
             </w:rPr>
           </w:pPr>
-          <w:hyperlink w:anchor="_Toc243668362" w:history="1">
+          <w:hyperlink w:anchor="_Toc243669464" w:history="1">
             <w:r>
               <w:rPr>
                 <w:rStyle w:val="Hyperlink"/>
@@ -5338,7 +5338,7 @@
               <w:rPr>
                 <w:noProof/>
               </w:rPr>
-              <w:instrText xml:space="preserve"> PAGEREF _Toc243668362 \h </w:instrText>
+              <w:instrText xml:space="preserve"> PAGEREF _Toc243669464 \h </w:instrText>
             </w:r>
             <w:r>
               <w:rPr>
@@ -5381,7 +5381,7 @@
               <w14:ligatures w14:val="standardContextual"/>
             </w:rPr>
           </w:pPr>
-          <w:hyperlink w:anchor="_Toc243668363" w:history="1">
+          <w:hyperlink w:anchor="_Toc243669465" w:history="1">
             <w:r>
               <w:rPr>
                 <w:rStyle w:val="Hyperlink"/>
@@ -5405,7 +5405,7 @@
               <w:rPr>
                 <w:noProof/>
               </w:rPr>
-              <w:instrText xml:space="preserve"> PAGEREF _Toc243668363 \h </w:instrText>
+              <w:instrText xml:space="preserve"> PAGEREF _Toc243669465 \h </w:instrText>
             </w:r>
             <w:r>
               <w:rPr>
@@ -5448,7 +5448,7 @@
               <w14:ligatures w14:val="standardContextual"/>
             </w:rPr>
           </w:pPr>
-          <w:hyperlink w:anchor="_Toc243668364" w:history="1">
+          <w:hyperlink w:anchor="_Toc243669466" w:history="1">
             <w:r>
               <w:rPr>
                 <w:rStyle w:val="Hyperlink"/>
@@ -5472,7 +5472,7 @@
               <w:rPr>
                 <w:noProof/>
               </w:rPr>
-              <w:instrText xml:space="preserve"> PAGEREF _Toc243668364 \h </w:instrText>
+              <w:instrText xml:space="preserve"> PAGEREF _Toc243669466 \h </w:instrText>
             </w:r>
             <w:r>
               <w:rPr>
@@ -5515,7 +5515,7 @@
               <w14:ligatures w14:val="standardContextual"/>
             </w:rPr>
           </w:pPr>
-          <w:hyperlink w:anchor="_Toc243668365" w:history="1">
+          <w:hyperlink w:anchor="_Toc243669467" w:history="1">
             <w:r>
               <w:rPr>
                 <w:rStyle w:val="Hyperlink"/>
@@ -5539,7 +5539,7 @@
               <w:rPr>
                 <w:noProof/>
               </w:rPr>
-              <w:instrText xml:space="preserve"> PAGEREF _Toc243668365 \h </w:instrText>
+              <w:instrText xml:space="preserve"> PAGEREF _Toc243669467 \h </w:instrText>
             </w:r>
             <w:r>
               <w:rPr>
@@ -5582,7 +5582,7 @@
               <w14:ligatures w14:val="standardContextual"/>
             </w:rPr>
           </w:pPr>
-          <w:hyperlink w:anchor="_Toc243668366" w:history="1">
+          <w:hyperlink w:anchor="_Toc243669468" w:history="1">
             <w:r>
               <w:rPr>
                 <w:rStyle w:val="Hyperlink"/>
@@ -5606,7 +5606,7 @@
               <w:rPr>
                 <w:noProof/>
               </w:rPr>
-              <w:instrText xml:space="preserve"> PAGEREF _Toc243668366 \h </w:instrText>
+              <w:instrText xml:space="preserve"> PAGEREF _Toc243669468 \h </w:instrText>
             </w:r>
             <w:r>
               <w:rPr>
@@ -5649,7 +5649,7 @@
               <w14:ligatures w14:val="standardContextual"/>
             </w:rPr>
           </w:pPr>
-          <w:hyperlink w:anchor="_Toc243668367" w:history="1">
+          <w:hyperlink w:anchor="_Toc243669469" w:history="1">
             <w:r>
               <w:rPr>
                 <w:rStyle w:val="Hyperlink"/>
@@ -5673,7 +5673,7 @@
               <w:rPr>
                 <w:noProof/>
               </w:rPr>
-              <w:instrText xml:space="preserve"> PAGEREF _Toc243668367 \h </w:instrText>
+              <w:instrText xml:space="preserve"> PAGEREF _Toc243669469 \h </w:instrText>
             </w:r>
             <w:r>
               <w:rPr>
@@ -5716,7 +5716,7 @@
               <w14:ligatures w14:val="standardContextual"/>
             </w:rPr>
           </w:pPr>
-          <w:hyperlink w:anchor="_Toc243668368" w:history="1">
+          <w:hyperlink w:anchor="_Toc243669470" w:history="1">
             <w:r>
               <w:rPr>
                 <w:rStyle w:val="Hyperlink"/>
@@ -5740,7 +5740,7 @@
               <w:rPr>
                 <w:noProof/>
               </w:rPr>
-              <w:instrText xml:space="preserve"> PAGEREF _Toc243668368 \h </w:instrText>
+              <w:instrText xml:space="preserve"> PAGEREF _Toc243669470 \h </w:instrText>
             </w:r>
             <w:r>
               <w:rPr>
@@ -5783,7 +5783,7 @@
               <w14:ligatures w14:val="standardContextual"/>
             </w:rPr>
           </w:pPr>
-          <w:hyperlink w:anchor="_Toc243668369" w:history="1">
+          <w:hyperlink w:anchor="_Toc243669471" w:history="1">
             <w:r>
               <w:rPr>
                 <w:rStyle w:val="Hyperlink"/>
@@ -5807,7 +5807,7 @@
               <w:rPr>
                 <w:noProof/>
               </w:rPr>
-              <w:instrText xml:space="preserve"> PAGEREF _Toc243668369 \h </w:instrText>
+              <w:instrText xml:space="preserve"> PAGEREF _Toc243669471 \h </w:instrText>
             </w:r>
             <w:r>
               <w:rPr>
@@ -5848,7 +5848,7 @@
         <w:keepLines/>
         <w:pageBreakBefore/>
       </w:pPr>
-      <w:bookmarkStart w:id="0" w:name="_Toc243668332"/>
+      <w:bookmarkStart w:id="0" w:name="_Toc243669434"/>
       <w:r>
         <w:lastRenderedPageBreak/>
         <w:t>1 Introduction</w:t>
@@ -5861,7 +5861,7 @@
         <w:keepNext/>
         <w:keepLines/>
       </w:pPr>
-      <w:bookmarkStart w:id="1" w:name="_Toc243668333"/>
+      <w:bookmarkStart w:id="1" w:name="_Toc243669435"/>
       <w:r>
         <w:t>1.1 Purpose</w:t>
       </w:r>
@@ -5884,7 +5884,7 @@
         <w:keepNext/>
         <w:keepLines/>
       </w:pPr>
-      <w:bookmarkStart w:id="2" w:name="_Toc243668334"/>
+      <w:bookmarkStart w:id="2" w:name="_Toc243669436"/>
       <w:r>
         <w:t>1.2 Scope</w:t>
       </w:r>
@@ -5907,7 +5907,7 @@
         <w:keepNext/>
         <w:keepLines/>
       </w:pPr>
-      <w:bookmarkStart w:id="3" w:name="_Toc243668335"/>
+      <w:bookmarkStart w:id="3" w:name="_Toc243669437"/>
       <w:r>
         <w:t>1.3 Intended audience</w:t>
       </w:r>
@@ -5927,7 +5927,7 @@
         <w:keepNext/>
         <w:keepLines/>
       </w:pPr>
-      <w:bookmarkStart w:id="4" w:name="_Toc243668336"/>
+      <w:bookmarkStart w:id="4" w:name="_Toc243669438"/>
       <w:r>
         <w:t>1.4 Relationship to other documents</w:t>
       </w:r>
@@ -5938,7 +5938,7 @@
         <w:pStyle w:val="Caption"/>
         <w:keepNext/>
       </w:pPr>
-      <w:bookmarkStart w:id="5" w:name="_Toc243668355"/>
+      <w:bookmarkStart w:id="5" w:name="_Toc243669457"/>
       <w:r>
         <w:t xml:space="preserve">Table </w:t>
       </w:r>
@@ -6456,7 +6456,7 @@
         <w:keepLines/>
         <w:pageBreakBefore/>
       </w:pPr>
-      <w:bookmarkStart w:id="6" w:name="_Toc243668337"/>
+      <w:bookmarkStart w:id="6" w:name="_Toc243669439"/>
       <w:r>
         <w:lastRenderedPageBreak/>
         <w:t>2 Test strategy</w:t>
@@ -6469,7 +6469,7 @@
         <w:keepNext/>
         <w:keepLines/>
       </w:pPr>
-      <w:bookmarkStart w:id="7" w:name="_Toc243668338"/>
+      <w:bookmarkStart w:id="7" w:name="_Toc243669440"/>
       <w:r>
         <w:t>2.1 Test levels</w:t>
       </w:r>
@@ -6480,7 +6480,7 @@
         <w:pStyle w:val="Caption"/>
         <w:keepNext/>
       </w:pPr>
-      <w:bookmarkStart w:id="8" w:name="_Toc243668356"/>
+      <w:bookmarkStart w:id="8" w:name="_Toc243669458"/>
       <w:r>
         <w:t xml:space="preserve">Table </w:t>
       </w:r>
@@ -7722,7 +7722,7 @@
         <w:keepNext/>
         <w:keepLines/>
       </w:pPr>
-      <w:bookmarkStart w:id="9" w:name="_Toc243668339"/>
+      <w:bookmarkStart w:id="9" w:name="_Toc243669441"/>
       <w:r>
         <w:t>2.2 Test types</w:t>
       </w:r>
@@ -7733,7 +7733,7 @@
         <w:pStyle w:val="Caption"/>
         <w:keepNext/>
       </w:pPr>
-      <w:bookmarkStart w:id="10" w:name="_Toc243668357"/>
+      <w:bookmarkStart w:id="10" w:name="_Toc243669459"/>
       <w:r>
         <w:t xml:space="preserve">Table </w:t>
       </w:r>
@@ -8521,7 +8521,7 @@
         <w:keepNext/>
         <w:keepLines/>
       </w:pPr>
-      <w:bookmarkStart w:id="11" w:name="_Toc243668340"/>
+      <w:bookmarkStart w:id="11" w:name="_Toc243669442"/>
       <w:r>
         <w:t>2.3 Approach</w:t>
       </w:r>
@@ -8557,7 +8557,7 @@
         <w:keepLines/>
         <w:pageBreakBefore/>
       </w:pPr>
-      <w:bookmarkStart w:id="12" w:name="_Toc243668341"/>
+      <w:bookmarkStart w:id="12" w:name="_Toc243669443"/>
       <w:r>
         <w:lastRenderedPageBreak/>
         <w:t>3 Test environment</w:t>
@@ -8569,7 +8569,7 @@
         <w:pStyle w:val="Caption"/>
         <w:keepNext/>
       </w:pPr>
-      <w:bookmarkStart w:id="13" w:name="_Toc243668358"/>
+      <w:bookmarkStart w:id="13" w:name="_Toc243669460"/>
       <w:r>
         <w:t xml:space="preserve">Table </w:t>
       </w:r>
@@ -9232,7 +9232,7 @@
         <w:keepLines/>
         <w:pageBreakBefore/>
       </w:pPr>
-      <w:bookmarkStart w:id="14" w:name="_Toc243668342"/>
+      <w:bookmarkStart w:id="14" w:name="_Toc243669444"/>
       <w:r>
         <w:lastRenderedPageBreak/>
         <w:t>4 </w:t>
@@ -9248,7 +9248,7 @@
         <w:keepNext/>
         <w:keepLines/>
       </w:pPr>
-      <w:bookmarkStart w:id="15" w:name="_Toc243668343"/>
+      <w:bookmarkStart w:id="15" w:name="_Toc243669445"/>
       <w:r>
         <w:t>4.1 Entry criteria</w:t>
       </w:r>
@@ -9268,7 +9268,7 @@
         <w:keepNext/>
         <w:keepLines/>
       </w:pPr>
-      <w:bookmarkStart w:id="16" w:name="_Toc243668344"/>
+      <w:bookmarkStart w:id="16" w:name="_Toc243669446"/>
       <w:r>
         <w:t>4.2 Exit criteria (Definition of Done)</w:t>
       </w:r>
@@ -9476,7 +9476,7 @@
         <w:keepNext/>
         <w:keepLines/>
       </w:pPr>
-      <w:bookmarkStart w:id="17" w:name="_Toc243668345"/>
+      <w:bookmarkStart w:id="17" w:name="_Toc243669447"/>
       <w:r>
         <w:t>4.3 Suspension and resumption</w:t>
       </w:r>
@@ -9500,7 +9500,7 @@
         <w:keepLines/>
         <w:pageBreakBefore/>
       </w:pPr>
-      <w:bookmarkStart w:id="18" w:name="_Toc243668346"/>
+      <w:bookmarkStart w:id="18" w:name="_Toc243669448"/>
       <w:r>
         <w:lastRenderedPageBreak/>
         <w:t>5 Test items and features</w:t>
@@ -9512,7 +9512,7 @@
         <w:pStyle w:val="Caption"/>
         <w:keepNext/>
       </w:pPr>
-      <w:bookmarkStart w:id="19" w:name="_Toc243668359"/>
+      <w:bookmarkStart w:id="19" w:name="_Toc243669461"/>
       <w:r>
         <w:t xml:space="preserve">Table </w:t>
       </w:r>
@@ -12369,7 +12369,7 @@
         <w:keepLines/>
         <w:pageBreakBefore/>
       </w:pPr>
-      <w:bookmarkStart w:id="20" w:name="_Toc243668347"/>
+      <w:bookmarkStart w:id="20" w:name="_Toc243669449"/>
       <w:r>
         <w:lastRenderedPageBreak/>
         <w:t>6 Test case catalogue</w:t>
@@ -12401,7 +12401,7 @@
         <w:pStyle w:val="Caption"/>
         <w:keepNext/>
       </w:pPr>
-      <w:bookmarkStart w:id="21" w:name="_Toc243668360"/>
+      <w:bookmarkStart w:id="21" w:name="_Toc243669462"/>
       <w:r>
         <w:t xml:space="preserve">Table </w:t>
       </w:r>
@@ -20749,7 +20749,7 @@
                 <w:szCs w:val="17"/>
                 <w:shd w:val="clear" w:color="auto" w:fill="F2F4F3"/>
               </w:rPr>
-              <w:t>shared/careers.test.ts</w:t>
+              <w:t>worker/careers.test.ts</w:t>
             </w:r>
             <w:r>
               <w:rPr>
@@ -20827,7 +20827,7 @@
         <w:keepLines/>
         <w:pageBreakBefore/>
       </w:pPr>
-      <w:bookmarkStart w:id="22" w:name="_Toc243668348"/>
+      <w:bookmarkStart w:id="22" w:name="_Toc243669450"/>
       <w:r>
         <w:lastRenderedPageBreak/>
         <w:t>7 Security tests</w:t>
@@ -20839,7 +20839,7 @@
         <w:pStyle w:val="Caption"/>
         <w:keepNext/>
       </w:pPr>
-      <w:bookmarkStart w:id="23" w:name="_Toc243668361"/>
+      <w:bookmarkStart w:id="23" w:name="_Toc243669463"/>
       <w:r>
         <w:t xml:space="preserve">Table </w:t>
       </w:r>
@@ -23385,7 +23385,7 @@
         <w:keepLines/>
         <w:pageBreakBefore/>
       </w:pPr>
-      <w:bookmarkStart w:id="24" w:name="_Toc243668349"/>
+      <w:bookmarkStart w:id="24" w:name="_Toc243669451"/>
       <w:r>
         <w:lastRenderedPageBreak/>
         <w:t>8 Results summary</w:t>
@@ -23417,7 +23417,7 @@
         <w:pStyle w:val="Caption"/>
         <w:keepNext/>
       </w:pPr>
-      <w:bookmarkStart w:id="25" w:name="_Toc243668362"/>
+      <w:bookmarkStart w:id="25" w:name="_Toc243669464"/>
       <w:r>
         <w:t xml:space="preserve">Table </w:t>
       </w:r>
@@ -24218,7 +24218,7 @@
         <w:pStyle w:val="Caption"/>
         <w:keepNext/>
       </w:pPr>
-      <w:bookmarkStart w:id="26" w:name="_Toc243668363"/>
+      <w:bookmarkStart w:id="26" w:name="_Toc243669465"/>
       <w:r>
         <w:t xml:space="preserve">Table </w:t>
       </w:r>
@@ -24733,7 +24733,7 @@
         <w:pStyle w:val="Caption"/>
         <w:keepNext/>
       </w:pPr>
-      <w:bookmarkStart w:id="27" w:name="_Toc243668364"/>
+      <w:bookmarkStart w:id="27" w:name="_Toc243669466"/>
       <w:r>
         <w:t xml:space="preserve">Table </w:t>
       </w:r>
@@ -25307,7 +25307,7 @@
         <w:keepLines/>
         <w:pageBreakBefore/>
       </w:pPr>
-      <w:bookmarkStart w:id="28" w:name="_Toc243668350"/>
+      <w:bookmarkStart w:id="28" w:name="_Toc243669452"/>
       <w:r>
         <w:lastRenderedPageBreak/>
         <w:t>9 Defects found and fixed</w:t>
@@ -25319,7 +25319,7 @@
         <w:pStyle w:val="Caption"/>
         <w:keepNext/>
       </w:pPr>
-      <w:bookmarkStart w:id="29" w:name="_Toc243668365"/>
+      <w:bookmarkStart w:id="29" w:name="_Toc243669467"/>
       <w:r>
         <w:t xml:space="preserve">Table </w:t>
       </w:r>
@@ -26477,7 +26477,7 @@
         <w:keepLines/>
         <w:pageBreakBefore/>
       </w:pPr>
-      <w:bookmarkStart w:id="30" w:name="_Toc243668351"/>
+      <w:bookmarkStart w:id="30" w:name="_Toc243669453"/>
       <w:r>
         <w:lastRenderedPageBreak/>
         <w:t>10 Known gaps and risks</w:t>
@@ -26489,7 +26489,7 @@
         <w:pStyle w:val="Caption"/>
         <w:keepNext/>
       </w:pPr>
-      <w:bookmarkStart w:id="31" w:name="_Toc243668366"/>
+      <w:bookmarkStart w:id="31" w:name="_Toc243669468"/>
       <w:r>
         <w:t xml:space="preserve">Table </w:t>
       </w:r>
@@ -27754,7 +27754,7 @@
         <w:keepLines/>
         <w:pageBreakBefore/>
       </w:pPr>
-      <w:bookmarkStart w:id="32" w:name="_Toc243668352"/>
+      <w:bookmarkStart w:id="32" w:name="_Toc243669454"/>
       <w:r>
         <w:lastRenderedPageBreak/>
         <w:t>11 Traceability</w:t>
@@ -27774,7 +27774,7 @@
         <w:pStyle w:val="Caption"/>
         <w:keepNext/>
       </w:pPr>
-      <w:bookmarkStart w:id="33" w:name="_Toc243668367"/>
+      <w:bookmarkStart w:id="33" w:name="_Toc243669469"/>
       <w:r>
         <w:t xml:space="preserve">Table </w:t>
       </w:r>
@@ -29643,7 +29643,7 @@
         <w:keepLines/>
         <w:pageBreakBefore/>
       </w:pPr>
-      <w:bookmarkStart w:id="34" w:name="_Toc243668353"/>
+      <w:bookmarkStart w:id="34" w:name="_Toc243669455"/>
       <w:r>
         <w:lastRenderedPageBreak/>
         <w:t>Appendix A: Glossary</w:t>
@@ -29655,7 +29655,7 @@
         <w:pStyle w:val="Caption"/>
         <w:keepNext/>
       </w:pPr>
-      <w:bookmarkStart w:id="35" w:name="_Toc243668368"/>
+      <w:bookmarkStart w:id="35" w:name="_Toc243669470"/>
       <w:r>
         <w:t xml:space="preserve">Table </w:t>
       </w:r>
@@ -30676,7 +30676,7 @@
         <w:keepLines/>
         <w:pageBreakBefore/>
       </w:pPr>
-      <w:bookmarkStart w:id="36" w:name="_Toc243668354"/>
+      <w:bookmarkStart w:id="36" w:name="_Toc243669456"/>
       <w:r>
         <w:lastRenderedPageBreak/>
         <w:t>Appendix B: References</w:t>
@@ -30688,7 +30688,7 @@
         <w:pStyle w:val="Caption"/>
         <w:keepNext/>
       </w:pPr>
-      <w:bookmarkStart w:id="37" w:name="_Toc243668369"/>
+      <w:bookmarkStart w:id="37" w:name="_Toc243669471"/>
       <w:r>
         <w:t xml:space="preserve">Table </w:t>
       </w:r>
@@ -31605,10 +31605,72 @@
 <file path=word/numbering.xml><?xml version="1.0" encoding="utf-8"?>
 <w:numbering xmlns:wpc="http://schemas.microsoft.com/office/word/2010/wordprocessingCanvas" xmlns:cx="http://schemas.microsoft.com/office/drawing/2014/chartex" xmlns:cx1="http://schemas.microsoft.com/office/drawing/2015/9/8/chartex" xmlns:cx2="http://schemas.microsoft.com/office/drawing/2015/10/21/chartex" xmlns:cx3="http://schemas.microsoft.com/office/drawing/2016/5/9/chartex" xmlns:cx4="http://schemas.microsoft.com/office/drawing/2016/5/10/chartex" xmlns:cx5="http://schemas.microsoft.com/office/drawing/2016/5/11/chartex" xmlns:cx6="http://schemas.microsoft.com/office/drawing/2016/5/12/chartex" xmlns:cx7="http://schemas.microsoft.com/office/drawing/2016/5/13/chartex" xmlns:cx8="http://schemas.microsoft.com/office/drawing/2016/5/14/chartex" xmlns:mc="http://schemas.openxmlformats.org/markup-compatibility/2006" xmlns:aink="http://schemas.microsoft.com/office/drawing/2016/ink" xmlns:am3d="http://schemas.microsoft.com/office/drawing/2017/model3d" xmlns:o="urn:schemas-microsoft-com:office:office" xmlns:oel="http://schemas.microsoft.com/office/2019/extlst" xmlns:r="http://schemas.openxmlformats.org/officeDocument/2006/relationships" xmlns:m="http://schemas.openxmlformats.org/officeDocument/2006/math" xmlns:v="urn:schemas-microsoft-com:vml" xmlns:wp14="http://schemas.microsoft.com/office/word/2010/wordprocessingDrawing" xmlns:wp="http://schemas.openxmlformats.org/drawingml/2006/wordprocessingDrawing" xmlns:w10="urn:schemas-microsoft-com:office:word" xmlns:w="http://schemas.openxmlformats.org/wordprocessingml/2006/main" xmlns:w14="http://schemas.microsoft.com/office/word/2010/wordml" xmlns:w15="http://schemas.microsoft.com/office/word/2012/wordml" xmlns:w16cex="http://schemas.microsoft.com/office/word/2018/wordml/cex" xmlns:w16cid="http://schemas.microsoft.com/office/word/2016/wordml/cid" xmlns:w16="http://schemas.microsoft.com/office/word/2018/wordml" xmlns:w16du="http://schemas.microsoft.com/office/word/2023/wordml/word16du" xmlns:w16sdtdh="http://schemas.microsoft.com/office/word/2020/wordml/sdtdatahash" xmlns:w16sdtfl="http://schemas.microsoft.com/office/word/2024/wordml/sdtformatlock" xmlns:w16se="http://schemas.microsoft.com/office/word/2015/wordml/symex" xmlns:wpg="http://schemas.microsoft.com/office/word/2010/wordprocessingGroup" xmlns:wpi="http://schemas.microsoft.com/office/word/2010/wordprocessingInk" xmlns:wne="http://schemas.microsoft.com/office/word/2006/wordml" xmlns:wps="http://schemas.microsoft.com/office/word/2010/wordprocessingShape" mc:Ignorable="w14 w15 w16se w16cid w16 w16cex w16sdtdh w16sdtfl w16du wp14">
   <w:abstractNum w:abstractNumId="0" w15:restartNumberingAfterBreak="0">
-    <w:nsid w:val="16B26E3B"/>
+    <w:nsid w:val="17F662DE"/>
     <w:multiLevelType w:val="hybridMultilevel"/>
-    <w:tmpl w:val="2EB06260"/>
-    <w:lvl w:ilvl="0" w:tplc="52E8261C" w:tentative="1">
+    <w:tmpl w:val="76F4D226"/>
+    <w:lvl w:ilvl="0" w:tplc="9FB424FA">
+      <w:start w:val="1"/>
+      <w:numFmt w:val="decimal"/>
+      <w:lvlText w:val="%1."/>
+      <w:lvlJc w:val="left"/>
+      <w:pPr>
+        <w:ind w:left="720" w:hanging="360"/>
+      </w:pPr>
+    </w:lvl>
+    <w:lvl w:ilvl="1" w:tplc="0AE081D4" w:tentative="1">
+      <w:start w:val="1"/>
+      <w:numFmt w:val="lowerLetter"/>
+      <w:lvlText w:val="%2."/>
+      <w:lvlJc w:val="left"/>
+      <w:pPr>
+        <w:ind w:left="1080" w:hanging="360"/>
+      </w:pPr>
+    </w:lvl>
+    <w:lvl w:ilvl="2" w:tplc="31BED5D2" w:tentative="1">
+      <w:start w:val="1"/>
+      <w:numFmt w:val="lowerRoman"/>
+      <w:lvlText w:val="%3."/>
+      <w:lvlJc w:val="left"/>
+      <w:pPr>
+        <w:ind w:left="1440" w:hanging="360"/>
+      </w:pPr>
+    </w:lvl>
+    <w:lvl w:ilvl="3" w:tplc="63EA7C30">
+      <w:numFmt w:val="decimal"/>
+      <w:lvlText w:val=""/>
+      <w:lvlJc w:val="left"/>
+    </w:lvl>
+    <w:lvl w:ilvl="4" w:tplc="9D94B28C">
+      <w:numFmt w:val="decimal"/>
+      <w:lvlText w:val=""/>
+      <w:lvlJc w:val="left"/>
+    </w:lvl>
+    <w:lvl w:ilvl="5" w:tplc="2E8C004C">
+      <w:numFmt w:val="decimal"/>
+      <w:lvlText w:val=""/>
+      <w:lvlJc w:val="left"/>
+    </w:lvl>
+    <w:lvl w:ilvl="6" w:tplc="E5F690C6">
+      <w:numFmt w:val="decimal"/>
+      <w:lvlText w:val=""/>
+      <w:lvlJc w:val="left"/>
+    </w:lvl>
+    <w:lvl w:ilvl="7" w:tplc="964C5A44">
+      <w:numFmt w:val="decimal"/>
+      <w:lvlText w:val=""/>
+      <w:lvlJc w:val="left"/>
+    </w:lvl>
+    <w:lvl w:ilvl="8" w:tplc="3AB218EC">
+      <w:numFmt w:val="decimal"/>
+      <w:lvlText w:val=""/>
+      <w:lvlJc w:val="left"/>
+    </w:lvl>
+  </w:abstractNum>
+  <w:abstractNum w:abstractNumId="1" w15:restartNumberingAfterBreak="0">
+    <w:nsid w:val="51EF01E0"/>
+    <w:multiLevelType w:val="hybridMultilevel"/>
+    <w:tmpl w:val="718216C0"/>
+    <w:lvl w:ilvl="0" w:tplc="49300A50" w:tentative="1">
       <w:start w:val="1"/>
       <w:numFmt w:val="bullet"/>
       <w:lvlText w:val="●"/>
@@ -31617,7 +31679,7 @@
         <w:ind w:left="720" w:hanging="360"/>
       </w:pPr>
     </w:lvl>
-    <w:lvl w:ilvl="1" w:tplc="7B0C1848" w:tentative="1">
+    <w:lvl w:ilvl="1" w:tplc="1EDC2BF2" w:tentative="1">
       <w:start w:val="1"/>
       <w:numFmt w:val="bullet"/>
       <w:lvlText w:val="○"/>
@@ -31626,7 +31688,7 @@
         <w:ind w:left="1440" w:hanging="360"/>
       </w:pPr>
     </w:lvl>
-    <w:lvl w:ilvl="2" w:tplc="F0E04554" w:tentative="1">
+    <w:lvl w:ilvl="2" w:tplc="669011A0" w:tentative="1">
       <w:start w:val="1"/>
       <w:numFmt w:val="bullet"/>
       <w:lvlText w:val="■"/>
@@ -31635,7 +31697,7 @@
         <w:ind w:left="2160" w:hanging="360"/>
       </w:pPr>
     </w:lvl>
-    <w:lvl w:ilvl="3" w:tplc="1334F0C2" w:tentative="1">
+    <w:lvl w:ilvl="3" w:tplc="649E6622" w:tentative="1">
       <w:start w:val="1"/>
       <w:numFmt w:val="bullet"/>
       <w:lvlText w:val="●"/>
@@ -31644,7 +31706,7 @@
         <w:ind w:left="2880" w:hanging="360"/>
       </w:pPr>
     </w:lvl>
-    <w:lvl w:ilvl="4" w:tplc="F0884BA8" w:tentative="1">
+    <w:lvl w:ilvl="4" w:tplc="848421AA" w:tentative="1">
       <w:start w:val="1"/>
       <w:numFmt w:val="bullet"/>
       <w:lvlText w:val="○"/>
@@ -31653,7 +31715,7 @@
         <w:ind w:left="3600" w:hanging="360"/>
       </w:pPr>
     </w:lvl>
-    <w:lvl w:ilvl="5" w:tplc="FED25972" w:tentative="1">
+    <w:lvl w:ilvl="5" w:tplc="B76E8F9A" w:tentative="1">
       <w:start w:val="1"/>
       <w:numFmt w:val="bullet"/>
       <w:lvlText w:val="■"/>
@@ -31662,7 +31724,7 @@
         <w:ind w:left="4320" w:hanging="360"/>
       </w:pPr>
     </w:lvl>
-    <w:lvl w:ilvl="6" w:tplc="D0EEB598" w:tentative="1">
+    <w:lvl w:ilvl="6" w:tplc="A67C7060" w:tentative="1">
       <w:start w:val="1"/>
       <w:numFmt w:val="bullet"/>
       <w:lvlText w:val="●"/>
@@ -31671,7 +31733,7 @@
         <w:ind w:left="5040" w:hanging="360"/>
       </w:pPr>
     </w:lvl>
-    <w:lvl w:ilvl="7" w:tplc="102CC496" w:tentative="1">
+    <w:lvl w:ilvl="7" w:tplc="785E5242" w:tentative="1">
       <w:start w:val="1"/>
       <w:numFmt w:val="bullet"/>
       <w:lvlText w:val="●"/>
@@ -31680,7 +31742,7 @@
         <w:ind w:left="5760" w:hanging="360"/>
       </w:pPr>
     </w:lvl>
-    <w:lvl w:ilvl="8" w:tplc="44028E04" w:tentative="1">
+    <w:lvl w:ilvl="8" w:tplc="30D6DFD0" w:tentative="1">
       <w:start w:val="1"/>
       <w:numFmt w:val="bullet"/>
       <w:lvlText w:val="●"/>
@@ -31690,11 +31752,11 @@
       </w:pPr>
     </w:lvl>
   </w:abstractNum>
-  <w:abstractNum w:abstractNumId="1" w15:restartNumberingAfterBreak="0">
-    <w:nsid w:val="32331445"/>
+  <w:abstractNum w:abstractNumId="2" w15:restartNumberingAfterBreak="0">
+    <w:nsid w:val="5D4317B7"/>
     <w:multiLevelType w:val="hybridMultilevel"/>
-    <w:tmpl w:val="7AB88520"/>
-    <w:lvl w:ilvl="0" w:tplc="BA96B782" w:tentative="1">
+    <w:tmpl w:val="1868CB7E"/>
+    <w:lvl w:ilvl="0" w:tplc="339E81C8" w:tentative="1">
       <w:start w:val="1"/>
       <w:numFmt w:val="bullet"/>
       <w:lvlText w:val="•"/>
@@ -31703,7 +31765,7 @@
         <w:ind w:left="720" w:hanging="280"/>
       </w:pPr>
     </w:lvl>
-    <w:lvl w:ilvl="1" w:tplc="9D8EFD44" w:tentative="1">
+    <w:lvl w:ilvl="1" w:tplc="3F702D4A" w:tentative="1">
       <w:start w:val="1"/>
       <w:numFmt w:val="bullet"/>
       <w:lvlText w:val="–"/>
@@ -31712,7 +31774,7 @@
         <w:ind w:left="1080" w:hanging="280"/>
       </w:pPr>
     </w:lvl>
-    <w:lvl w:ilvl="2" w:tplc="D3C49B3A" w:tentative="1">
+    <w:lvl w:ilvl="2" w:tplc="F8DCB78A" w:tentative="1">
       <w:start w:val="1"/>
       <w:numFmt w:val="bullet"/>
       <w:lvlText w:val="▪"/>
@@ -31721,107 +31783,45 @@
         <w:ind w:left="1440" w:hanging="280"/>
       </w:pPr>
     </w:lvl>
-    <w:lvl w:ilvl="3" w:tplc="87EABFE0">
+    <w:lvl w:ilvl="3" w:tplc="B1C458CC">
       <w:numFmt w:val="decimal"/>
       <w:lvlText w:val=""/>
       <w:lvlJc w:val="left"/>
     </w:lvl>
-    <w:lvl w:ilvl="4" w:tplc="84F881AE">
+    <w:lvl w:ilvl="4" w:tplc="E9143266">
       <w:numFmt w:val="decimal"/>
       <w:lvlText w:val=""/>
       <w:lvlJc w:val="left"/>
     </w:lvl>
-    <w:lvl w:ilvl="5" w:tplc="870AF5D4">
+    <w:lvl w:ilvl="5" w:tplc="DEEEE772">
       <w:numFmt w:val="decimal"/>
       <w:lvlText w:val=""/>
       <w:lvlJc w:val="left"/>
     </w:lvl>
-    <w:lvl w:ilvl="6" w:tplc="6ED68444">
+    <w:lvl w:ilvl="6" w:tplc="7C24FBE2">
       <w:numFmt w:val="decimal"/>
       <w:lvlText w:val=""/>
       <w:lvlJc w:val="left"/>
     </w:lvl>
-    <w:lvl w:ilvl="7" w:tplc="9EF49C96">
+    <w:lvl w:ilvl="7" w:tplc="C0D071E6">
       <w:numFmt w:val="decimal"/>
       <w:lvlText w:val=""/>
       <w:lvlJc w:val="left"/>
     </w:lvl>
-    <w:lvl w:ilvl="8" w:tplc="C548EA28">
+    <w:lvl w:ilvl="8" w:tplc="2496D862">
       <w:numFmt w:val="decimal"/>
       <w:lvlText w:val=""/>
       <w:lvlJc w:val="left"/>
     </w:lvl>
   </w:abstractNum>
-  <w:abstractNum w:abstractNumId="2" w15:restartNumberingAfterBreak="0">
-    <w:nsid w:val="3E1568C2"/>
-    <w:multiLevelType w:val="hybridMultilevel"/>
-    <w:tmpl w:val="58B6B978"/>
-    <w:lvl w:ilvl="0" w:tplc="D898BE70">
-      <w:start w:val="1"/>
-      <w:numFmt w:val="decimal"/>
-      <w:lvlText w:val="%1."/>
-      <w:lvlJc w:val="left"/>
-      <w:pPr>
-        <w:ind w:left="720" w:hanging="360"/>
-      </w:pPr>
-    </w:lvl>
-    <w:lvl w:ilvl="1" w:tplc="4C4EE54E" w:tentative="1">
-      <w:start w:val="1"/>
-      <w:numFmt w:val="lowerLetter"/>
-      <w:lvlText w:val="%2."/>
-      <w:lvlJc w:val="left"/>
-      <w:pPr>
-        <w:ind w:left="1080" w:hanging="360"/>
-      </w:pPr>
-    </w:lvl>
-    <w:lvl w:ilvl="2" w:tplc="944CA73A" w:tentative="1">
-      <w:start w:val="1"/>
-      <w:numFmt w:val="lowerRoman"/>
-      <w:lvlText w:val="%3."/>
-      <w:lvlJc w:val="left"/>
-      <w:pPr>
-        <w:ind w:left="1440" w:hanging="360"/>
-      </w:pPr>
-    </w:lvl>
-    <w:lvl w:ilvl="3" w:tplc="D38A1382">
-      <w:numFmt w:val="decimal"/>
-      <w:lvlText w:val=""/>
-      <w:lvlJc w:val="left"/>
-    </w:lvl>
-    <w:lvl w:ilvl="4" w:tplc="E6888A90">
-      <w:numFmt w:val="decimal"/>
-      <w:lvlText w:val=""/>
-      <w:lvlJc w:val="left"/>
-    </w:lvl>
-    <w:lvl w:ilvl="5" w:tplc="26108238">
-      <w:numFmt w:val="decimal"/>
-      <w:lvlText w:val=""/>
-      <w:lvlJc w:val="left"/>
-    </w:lvl>
-    <w:lvl w:ilvl="6" w:tplc="303E31F0">
-      <w:numFmt w:val="decimal"/>
-      <w:lvlText w:val=""/>
-      <w:lvlJc w:val="left"/>
-    </w:lvl>
-    <w:lvl w:ilvl="7" w:tplc="2FE25DC6">
-      <w:numFmt w:val="decimal"/>
-      <w:lvlText w:val=""/>
-      <w:lvlJc w:val="left"/>
-    </w:lvl>
-    <w:lvl w:ilvl="8" w:tplc="E8F6CFDE">
-      <w:numFmt w:val="decimal"/>
-      <w:lvlText w:val=""/>
-      <w:lvlJc w:val="left"/>
-    </w:lvl>
-  </w:abstractNum>
-  <w:num w:numId="1" w16cid:durableId="1142312085">
-    <w:abstractNumId w:val="0"/>
+  <w:num w:numId="1" w16cid:durableId="1481195605">
+    <w:abstractNumId w:val="1"/>
     <w:lvlOverride w:ilvl="0">
       <w:startOverride w:val="1"/>
     </w:lvlOverride>
   </w:num>
-  <w:num w:numId="2" w16cid:durableId="1046687615">
-    <w:abstractNumId w:val="2"/>
+  <w:num w:numId="2" w16cid:durableId="1385449366">
+    <w:abstractNumId w:val="0"/>
     <w:lvlOverride w:ilvl="0">
       <w:startOverride w:val="1"/>
     </w:lvlOverride>
@@ -32525,7 +32525,7 @@
     <w:autoRedefine/>
     <w:uiPriority w:val="39"/>
     <w:unhideWhenUsed/>
-    <w:rsid w:val="00962B1E"/>
+    <w:rsid w:val="00D32E5D"/>
     <w:pPr>
       <w:spacing w:after="100"/>
     </w:pPr>
@@ -32537,7 +32537,7 @@
     <w:autoRedefine/>
     <w:uiPriority w:val="39"/>
     <w:unhideWhenUsed/>
-    <w:rsid w:val="00962B1E"/>
+    <w:rsid w:val="00D32E5D"/>
     <w:pPr>
       <w:spacing w:after="100"/>
       <w:ind w:left="210"/>
@@ -32549,7 +32549,7 @@
     <w:next w:val="Normal"/>
     <w:uiPriority w:val="99"/>
     <w:unhideWhenUsed/>
-    <w:rsid w:val="00962B1E"/>
+    <w:rsid w:val="00D32E5D"/>
   </w:style>
 </w:styles>
 </file>

</xml_diff>